<commit_message>
docs: écriture d'une première version du rapport (à retravailler)
</commit_message>
<xml_diff>
--- a/Rapport.docx
+++ b/Rapport.docx
@@ -2,6 +2,16 @@
 <file path=word/document.xml><?xml version="1.0" encoding="utf-8"?>
 <w:document xmlns:wpc="http://schemas.microsoft.com/office/word/2010/wordprocessingCanvas" xmlns:cx="http://schemas.microsoft.com/office/drawing/2014/chartex" xmlns:cx1="http://schemas.microsoft.com/office/drawing/2015/9/8/chartex" xmlns:cx2="http://schemas.microsoft.com/office/drawing/2015/10/21/chartex" xmlns:cx3="http://schemas.microsoft.com/office/drawing/2016/5/9/chartex" xmlns:cx4="http://schemas.microsoft.com/office/drawing/2016/5/10/chartex" xmlns:cx5="http://schemas.microsoft.com/office/drawing/2016/5/11/chartex" xmlns:cx6="http://schemas.microsoft.com/office/drawing/2016/5/12/chartex" xmlns:cx7="http://schemas.microsoft.com/office/drawing/2016/5/13/chartex" xmlns:cx8="http://schemas.microsoft.com/office/drawing/2016/5/14/chartex" xmlns:mc="http://schemas.openxmlformats.org/markup-compatibility/2006" xmlns:aink="http://schemas.microsoft.com/office/drawing/2016/ink" xmlns:am3d="http://schemas.microsoft.com/office/drawing/2017/model3d" xmlns:o="urn:schemas-microsoft-com:office:office" xmlns:oel="http://schemas.microsoft.com/office/2019/extlst" xmlns:r="http://schemas.openxmlformats.org/officeDocument/2006/relationships" xmlns:m="http://schemas.openxmlformats.org/officeDocument/2006/math" xmlns:v="urn:schemas-microsoft-com:vml" xmlns:wp14="http://schemas.microsoft.com/office/word/2010/wordprocessingDrawing" xmlns:wp="http://schemas.openxmlformats.org/drawingml/2006/wordprocessingDrawing" xmlns:w10="urn:schemas-microsoft-com:office:word" xmlns:w="http://schemas.openxmlformats.org/wordprocessingml/2006/main" xmlns:w14="http://schemas.microsoft.com/office/word/2010/wordml" xmlns:w15="http://schemas.microsoft.com/office/word/2012/wordml" xmlns:w16cex="http://schemas.microsoft.com/office/word/2018/wordml/cex" xmlns:w16cid="http://schemas.microsoft.com/office/word/2016/wordml/cid" xmlns:w16="http://schemas.microsoft.com/office/word/2018/wordml" xmlns:w16du="http://schemas.microsoft.com/office/word/2023/wordml/word16du" xmlns:w16sdtdh="http://schemas.microsoft.com/office/word/2020/wordml/sdtdatahash" xmlns:w16sdtfl="http://schemas.microsoft.com/office/word/2024/wordml/sdtformatlock" xmlns:w16se="http://schemas.microsoft.com/office/word/2015/wordml/symex" xmlns:wpg="http://schemas.microsoft.com/office/word/2010/wordprocessingGroup" xmlns:wpi="http://schemas.microsoft.com/office/word/2010/wordprocessingInk" xmlns:wne="http://schemas.microsoft.com/office/word/2006/wordml" xmlns:wps="http://schemas.microsoft.com/office/word/2010/wordprocessingShape" mc:Ignorable="w14 w15 w16se w16cid w16 w16cex w16sdtdh w16sdtfl w16du wp14">
   <w:body>
+    <w:p>
+      <w:pPr>
+        <w:jc w:val="center"/>
+        <w:rPr>
+          <w:rFonts w:ascii="Euclid Circular A Bold" w:hAnsi="Euclid Circular A Bold" w:cs="Arial"/>
+          <w:sz w:val="28"/>
+          <w:szCs w:val="28"/>
+        </w:rPr>
+      </w:pPr>
+    </w:p>
     <w:p>
       <w:pPr>
         <w:jc w:val="center"/>
@@ -63,6 +73,13 @@
     </w:p>
     <w:p>
       <w:pPr>
+        <w:rPr>
+          <w:rFonts w:ascii="Euclid Circular A Bold" w:hAnsi="Euclid Circular A Bold" w:cs="Arial"/>
+        </w:rPr>
+      </w:pPr>
+    </w:p>
+    <w:p>
+      <w:pPr>
         <w:jc w:val="center"/>
         <w:rPr>
           <w:rFonts w:asciiTheme="minorHAnsi" w:hAnsiTheme="minorHAnsi" w:cstheme="minorHAnsi"/>
@@ -117,6 +134,16 @@
       <w:pPr>
         <w:jc w:val="center"/>
         <w:rPr>
+          <w:rFonts w:ascii="Euclid Circular A Bold" w:hAnsi="Euclid Circular A Bold" w:cs="Arial"/>
+          <w:sz w:val="36"/>
+          <w:szCs w:val="36"/>
+        </w:rPr>
+      </w:pPr>
+    </w:p>
+    <w:p>
+      <w:pPr>
+        <w:jc w:val="center"/>
+        <w:rPr>
           <w:rFonts w:asciiTheme="minorHAnsi" w:hAnsiTheme="minorHAnsi" w:cstheme="minorHAnsi"/>
           <w:i/>
           <w:iCs/>
@@ -212,6 +239,93 @@
     <w:p>
       <w:pPr>
         <w:jc w:val="center"/>
+        <w:rPr>
+          <w:rFonts w:ascii="Euclid Circular A Light" w:hAnsi="Euclid Circular A Light" w:cs="Arial"/>
+          <w:sz w:val="24"/>
+          <w:szCs w:val="24"/>
+        </w:rPr>
+      </w:pPr>
+    </w:p>
+    <w:p>
+      <w:pPr>
+        <w:jc w:val="center"/>
+        <w:rPr>
+          <w:rFonts w:ascii="Euclid Circular A Light" w:hAnsi="Euclid Circular A Light" w:cs="Arial"/>
+          <w:sz w:val="24"/>
+          <w:szCs w:val="24"/>
+        </w:rPr>
+      </w:pPr>
+    </w:p>
+    <w:p>
+      <w:pPr>
+        <w:jc w:val="center"/>
+        <w:rPr>
+          <w:rFonts w:ascii="Euclid Circular A Light" w:hAnsi="Euclid Circular A Light" w:cs="Arial"/>
+          <w:sz w:val="24"/>
+          <w:szCs w:val="24"/>
+        </w:rPr>
+      </w:pPr>
+    </w:p>
+    <w:p>
+      <w:pPr>
+        <w:rPr>
+          <w:rFonts w:ascii="Euclid Circular A Light" w:hAnsi="Euclid Circular A Light" w:cs="Arial"/>
+          <w:sz w:val="24"/>
+          <w:szCs w:val="24"/>
+        </w:rPr>
+      </w:pPr>
+    </w:p>
+    <w:p>
+      <w:pPr>
+        <w:rPr>
+          <w:rFonts w:ascii="Euclid Circular A Light" w:hAnsi="Euclid Circular A Light" w:cs="Arial"/>
+          <w:sz w:val="24"/>
+          <w:szCs w:val="24"/>
+        </w:rPr>
+      </w:pPr>
+    </w:p>
+    <w:p>
+      <w:pPr>
+        <w:jc w:val="center"/>
+        <w:rPr>
+          <w:rFonts w:ascii="Euclid Circular A Light" w:hAnsi="Euclid Circular A Light" w:cs="Arial"/>
+          <w:sz w:val="24"/>
+          <w:szCs w:val="24"/>
+        </w:rPr>
+      </w:pPr>
+    </w:p>
+    <w:p>
+      <w:pPr>
+        <w:jc w:val="center"/>
+        <w:rPr>
+          <w:rFonts w:ascii="Euclid Circular A Light" w:hAnsi="Euclid Circular A Light" w:cs="Arial"/>
+          <w:sz w:val="24"/>
+          <w:szCs w:val="24"/>
+        </w:rPr>
+      </w:pPr>
+    </w:p>
+    <w:p>
+      <w:pPr>
+        <w:jc w:val="center"/>
+        <w:rPr>
+          <w:rFonts w:ascii="Euclid Circular A Light" w:hAnsi="Euclid Circular A Light" w:cs="Arial"/>
+          <w:sz w:val="24"/>
+          <w:szCs w:val="24"/>
+        </w:rPr>
+      </w:pPr>
+    </w:p>
+    <w:p>
+      <w:pPr>
+        <w:jc w:val="center"/>
+        <w:rPr>
+          <w:rFonts w:ascii="Euclid Circular A Light" w:hAnsi="Euclid Circular A Light" w:cs="Arial"/>
+          <w:sz w:val="24"/>
+          <w:szCs w:val="24"/>
+        </w:rPr>
+      </w:pPr>
+    </w:p>
+    <w:p>
+      <w:pPr>
         <w:rPr>
           <w:rFonts w:ascii="Euclid Circular A Light" w:hAnsi="Euclid Circular A Light" w:cs="Arial"/>
           <w:sz w:val="24"/>
@@ -260,36 +374,3231 @@
         </w:p>
         <w:p>
           <w:pPr>
+            <w:pStyle w:val="TM1"/>
+            <w:tabs>
+              <w:tab w:val="left" w:pos="480"/>
+              <w:tab w:val="right" w:leader="dot" w:pos="9062"/>
+            </w:tabs>
             <w:rPr>
+              <w:rFonts w:asciiTheme="minorHAnsi" w:eastAsiaTheme="minorEastAsia" w:hAnsiTheme="minorHAnsi"/>
+              <w:noProof/>
+              <w:sz w:val="24"/>
+              <w:szCs w:val="24"/>
+              <w:lang w:eastAsia="fr-FR"/>
+            </w:rPr>
+          </w:pPr>
+          <w:r>
+            <w:fldChar w:fldCharType="begin"/>
+          </w:r>
+          <w:r>
+            <w:instrText xml:space="preserve"> TOC \o "1-3" \h \z \u </w:instrText>
+          </w:r>
+          <w:r>
+            <w:fldChar w:fldCharType="separate"/>
+          </w:r>
+          <w:hyperlink w:anchor="_Toc190442837" w:history="1">
+            <w:r>
+              <w:rPr>
+                <w:rStyle w:val="Lienhypertexte"/>
+                <w:noProof/>
+              </w:rPr>
+              <w:t>I.</w:t>
+            </w:r>
+            <w:r>
+              <w:rPr>
+                <w:rFonts w:asciiTheme="minorHAnsi" w:eastAsiaTheme="minorEastAsia" w:hAnsiTheme="minorHAnsi"/>
+                <w:noProof/>
+                <w:sz w:val="24"/>
+                <w:szCs w:val="24"/>
+                <w:lang w:eastAsia="fr-FR"/>
+              </w:rPr>
+              <w:tab/>
+            </w:r>
+            <w:r>
+              <w:rPr>
+                <w:rStyle w:val="Lienhypertexte"/>
+                <w:noProof/>
+              </w:rPr>
+              <w:t>Introduction</w:t>
+            </w:r>
+            <w:r>
+              <w:rPr>
+                <w:noProof/>
+                <w:webHidden/>
+              </w:rPr>
+              <w:tab/>
+            </w:r>
+            <w:r>
+              <w:rPr>
+                <w:noProof/>
+                <w:webHidden/>
+              </w:rPr>
+              <w:fldChar w:fldCharType="begin"/>
+            </w:r>
+            <w:r>
+              <w:rPr>
+                <w:noProof/>
+                <w:webHidden/>
+              </w:rPr>
+              <w:instrText xml:space="preserve"> PAGEREF _Toc190442837 \h </w:instrText>
+            </w:r>
+            <w:r>
+              <w:rPr>
+                <w:noProof/>
+                <w:webHidden/>
+              </w:rPr>
+            </w:r>
+            <w:r>
+              <w:rPr>
+                <w:noProof/>
+                <w:webHidden/>
+              </w:rPr>
+              <w:fldChar w:fldCharType="separate"/>
+            </w:r>
+            <w:r>
+              <w:rPr>
+                <w:noProof/>
+                <w:webHidden/>
+              </w:rPr>
+              <w:t>3</w:t>
+            </w:r>
+            <w:r>
+              <w:rPr>
+                <w:noProof/>
+                <w:webHidden/>
+              </w:rPr>
+              <w:fldChar w:fldCharType="end"/>
+            </w:r>
+          </w:hyperlink>
+        </w:p>
+        <w:p>
+          <w:pPr>
+            <w:pStyle w:val="TM2"/>
+            <w:tabs>
+              <w:tab w:val="left" w:pos="720"/>
+              <w:tab w:val="right" w:leader="dot" w:pos="9062"/>
+            </w:tabs>
+            <w:rPr>
+              <w:rFonts w:asciiTheme="minorHAnsi" w:eastAsiaTheme="minorEastAsia" w:hAnsiTheme="minorHAnsi"/>
+              <w:noProof/>
+              <w:sz w:val="24"/>
+              <w:szCs w:val="24"/>
+              <w:lang w:eastAsia="fr-FR"/>
+            </w:rPr>
+          </w:pPr>
+          <w:hyperlink w:anchor="_Toc190442838" w:history="1">
+            <w:r>
+              <w:rPr>
+                <w:rStyle w:val="Lienhypertexte"/>
+                <w:noProof/>
+              </w:rPr>
+              <w:t>1.</w:t>
+            </w:r>
+            <w:r>
+              <w:rPr>
+                <w:rFonts w:asciiTheme="minorHAnsi" w:eastAsiaTheme="minorEastAsia" w:hAnsiTheme="minorHAnsi"/>
+                <w:noProof/>
+                <w:sz w:val="24"/>
+                <w:szCs w:val="24"/>
+                <w:lang w:eastAsia="fr-FR"/>
+              </w:rPr>
+              <w:tab/>
+            </w:r>
+            <w:r>
+              <w:rPr>
+                <w:rStyle w:val="Lienhypertexte"/>
+                <w:noProof/>
+              </w:rPr>
+              <w:t>Objectifs du projet</w:t>
+            </w:r>
+            <w:r>
+              <w:rPr>
+                <w:noProof/>
+                <w:webHidden/>
+              </w:rPr>
+              <w:tab/>
+            </w:r>
+            <w:r>
+              <w:rPr>
+                <w:noProof/>
+                <w:webHidden/>
+              </w:rPr>
+              <w:fldChar w:fldCharType="begin"/>
+            </w:r>
+            <w:r>
+              <w:rPr>
+                <w:noProof/>
+                <w:webHidden/>
+              </w:rPr>
+              <w:instrText xml:space="preserve"> PAGEREF _Toc190442838 \h </w:instrText>
+            </w:r>
+            <w:r>
+              <w:rPr>
+                <w:noProof/>
+                <w:webHidden/>
+              </w:rPr>
+            </w:r>
+            <w:r>
+              <w:rPr>
+                <w:noProof/>
+                <w:webHidden/>
+              </w:rPr>
+              <w:fldChar w:fldCharType="separate"/>
+            </w:r>
+            <w:r>
+              <w:rPr>
+                <w:noProof/>
+                <w:webHidden/>
+              </w:rPr>
+              <w:t>3</w:t>
+            </w:r>
+            <w:r>
+              <w:rPr>
+                <w:noProof/>
+                <w:webHidden/>
+              </w:rPr>
+              <w:fldChar w:fldCharType="end"/>
+            </w:r>
+          </w:hyperlink>
+        </w:p>
+        <w:p>
+          <w:pPr>
+            <w:pStyle w:val="TM1"/>
+            <w:tabs>
+              <w:tab w:val="left" w:pos="480"/>
+              <w:tab w:val="right" w:leader="dot" w:pos="9062"/>
+            </w:tabs>
+            <w:rPr>
+              <w:rFonts w:asciiTheme="minorHAnsi" w:eastAsiaTheme="minorEastAsia" w:hAnsiTheme="minorHAnsi"/>
+              <w:noProof/>
+              <w:sz w:val="24"/>
+              <w:szCs w:val="24"/>
+              <w:lang w:eastAsia="fr-FR"/>
+            </w:rPr>
+          </w:pPr>
+          <w:hyperlink w:anchor="_Toc190442839" w:history="1">
+            <w:r>
+              <w:rPr>
+                <w:rStyle w:val="Lienhypertexte"/>
+                <w:noProof/>
+              </w:rPr>
+              <w:t>II.</w:t>
+            </w:r>
+            <w:r>
+              <w:rPr>
+                <w:rFonts w:asciiTheme="minorHAnsi" w:eastAsiaTheme="minorEastAsia" w:hAnsiTheme="minorHAnsi"/>
+                <w:noProof/>
+                <w:sz w:val="24"/>
+                <w:szCs w:val="24"/>
+                <w:lang w:eastAsia="fr-FR"/>
+              </w:rPr>
+              <w:tab/>
+            </w:r>
+            <w:r>
+              <w:rPr>
+                <w:rStyle w:val="Lienhypertexte"/>
+                <w:noProof/>
+              </w:rPr>
+              <w:t>Partie C++ (Client)</w:t>
+            </w:r>
+            <w:r>
+              <w:rPr>
+                <w:noProof/>
+                <w:webHidden/>
+              </w:rPr>
+              <w:tab/>
+            </w:r>
+            <w:r>
+              <w:rPr>
+                <w:noProof/>
+                <w:webHidden/>
+              </w:rPr>
+              <w:fldChar w:fldCharType="begin"/>
+            </w:r>
+            <w:r>
+              <w:rPr>
+                <w:noProof/>
+                <w:webHidden/>
+              </w:rPr>
+              <w:instrText xml:space="preserve"> PAGEREF _Toc190442839 \h </w:instrText>
+            </w:r>
+            <w:r>
+              <w:rPr>
+                <w:noProof/>
+                <w:webHidden/>
+              </w:rPr>
+            </w:r>
+            <w:r>
+              <w:rPr>
+                <w:noProof/>
+                <w:webHidden/>
+              </w:rPr>
+              <w:fldChar w:fldCharType="separate"/>
+            </w:r>
+            <w:r>
+              <w:rPr>
+                <w:noProof/>
+                <w:webHidden/>
+              </w:rPr>
+              <w:t>3</w:t>
+            </w:r>
+            <w:r>
+              <w:rPr>
+                <w:noProof/>
+                <w:webHidden/>
+              </w:rPr>
+              <w:fldChar w:fldCharType="end"/>
+            </w:r>
+          </w:hyperlink>
+        </w:p>
+        <w:p>
+          <w:pPr>
+            <w:pStyle w:val="TM2"/>
+            <w:tabs>
+              <w:tab w:val="left" w:pos="720"/>
+              <w:tab w:val="right" w:leader="dot" w:pos="9062"/>
+            </w:tabs>
+            <w:rPr>
+              <w:rFonts w:asciiTheme="minorHAnsi" w:eastAsiaTheme="minorEastAsia" w:hAnsiTheme="minorHAnsi"/>
+              <w:noProof/>
+              <w:sz w:val="24"/>
+              <w:szCs w:val="24"/>
+              <w:lang w:eastAsia="fr-FR"/>
+            </w:rPr>
+          </w:pPr>
+          <w:hyperlink w:anchor="_Toc190442840" w:history="1">
+            <w:r>
+              <w:rPr>
+                <w:rStyle w:val="Lienhypertexte"/>
+                <w:noProof/>
+              </w:rPr>
+              <w:t>1.</w:t>
+            </w:r>
+            <w:r>
+              <w:rPr>
+                <w:rFonts w:asciiTheme="minorHAnsi" w:eastAsiaTheme="minorEastAsia" w:hAnsiTheme="minorHAnsi"/>
+                <w:noProof/>
+                <w:sz w:val="24"/>
+                <w:szCs w:val="24"/>
+                <w:lang w:eastAsia="fr-FR"/>
+              </w:rPr>
+              <w:tab/>
+            </w:r>
+            <w:r>
+              <w:rPr>
+                <w:rStyle w:val="Lienhypertexte"/>
+                <w:noProof/>
+              </w:rPr>
+              <w:t>Présentation de la partie C++</w:t>
+            </w:r>
+            <w:r>
+              <w:rPr>
+                <w:noProof/>
+                <w:webHidden/>
+              </w:rPr>
+              <w:tab/>
+            </w:r>
+            <w:r>
+              <w:rPr>
+                <w:noProof/>
+                <w:webHidden/>
+              </w:rPr>
+              <w:fldChar w:fldCharType="begin"/>
+            </w:r>
+            <w:r>
+              <w:rPr>
+                <w:noProof/>
+                <w:webHidden/>
+              </w:rPr>
+              <w:instrText xml:space="preserve"> PAGEREF _Toc190442840 \h </w:instrText>
+            </w:r>
+            <w:r>
+              <w:rPr>
+                <w:noProof/>
+                <w:webHidden/>
+              </w:rPr>
+            </w:r>
+            <w:r>
+              <w:rPr>
+                <w:noProof/>
+                <w:webHidden/>
+              </w:rPr>
+              <w:fldChar w:fldCharType="separate"/>
+            </w:r>
+            <w:r>
+              <w:rPr>
+                <w:noProof/>
+                <w:webHidden/>
+              </w:rPr>
+              <w:t>3</w:t>
+            </w:r>
+            <w:r>
+              <w:rPr>
+                <w:noProof/>
+                <w:webHidden/>
+              </w:rPr>
+              <w:fldChar w:fldCharType="end"/>
+            </w:r>
+          </w:hyperlink>
+        </w:p>
+        <w:p>
+          <w:pPr>
+            <w:pStyle w:val="TM2"/>
+            <w:tabs>
+              <w:tab w:val="left" w:pos="720"/>
+              <w:tab w:val="right" w:leader="dot" w:pos="9062"/>
+            </w:tabs>
+            <w:rPr>
+              <w:rFonts w:asciiTheme="minorHAnsi" w:eastAsiaTheme="minorEastAsia" w:hAnsiTheme="minorHAnsi"/>
+              <w:noProof/>
+              <w:sz w:val="24"/>
+              <w:szCs w:val="24"/>
+              <w:lang w:eastAsia="fr-FR"/>
+            </w:rPr>
+          </w:pPr>
+          <w:hyperlink w:anchor="_Toc190442841" w:history="1">
+            <w:r>
+              <w:rPr>
+                <w:rStyle w:val="Lienhypertexte"/>
+                <w:noProof/>
+              </w:rPr>
+              <w:t>2.</w:t>
+            </w:r>
+            <w:r>
+              <w:rPr>
+                <w:rFonts w:asciiTheme="minorHAnsi" w:eastAsiaTheme="minorEastAsia" w:hAnsiTheme="minorHAnsi"/>
+                <w:noProof/>
+                <w:sz w:val="24"/>
+                <w:szCs w:val="24"/>
+                <w:lang w:eastAsia="fr-FR"/>
+              </w:rPr>
+              <w:tab/>
+            </w:r>
+            <w:r>
+              <w:rPr>
+                <w:rStyle w:val="Lienhypertexte"/>
+                <w:noProof/>
+              </w:rPr>
+              <w:t>Gestion des formes géométriques</w:t>
+            </w:r>
+            <w:r>
+              <w:rPr>
+                <w:noProof/>
+                <w:webHidden/>
+              </w:rPr>
+              <w:tab/>
+            </w:r>
+            <w:r>
+              <w:rPr>
+                <w:noProof/>
+                <w:webHidden/>
+              </w:rPr>
+              <w:fldChar w:fldCharType="begin"/>
+            </w:r>
+            <w:r>
+              <w:rPr>
+                <w:noProof/>
+                <w:webHidden/>
+              </w:rPr>
+              <w:instrText xml:space="preserve"> PAGEREF _Toc190442841 \h </w:instrText>
+            </w:r>
+            <w:r>
+              <w:rPr>
+                <w:noProof/>
+                <w:webHidden/>
+              </w:rPr>
+            </w:r>
+            <w:r>
+              <w:rPr>
+                <w:noProof/>
+                <w:webHidden/>
+              </w:rPr>
+              <w:fldChar w:fldCharType="separate"/>
+            </w:r>
+            <w:r>
+              <w:rPr>
+                <w:noProof/>
+                <w:webHidden/>
+              </w:rPr>
+              <w:t>4</w:t>
+            </w:r>
+            <w:r>
+              <w:rPr>
+                <w:noProof/>
+                <w:webHidden/>
+              </w:rPr>
+              <w:fldChar w:fldCharType="end"/>
+            </w:r>
+          </w:hyperlink>
+        </w:p>
+        <w:p>
+          <w:pPr>
+            <w:pStyle w:val="TM3"/>
+            <w:tabs>
+              <w:tab w:val="left" w:pos="960"/>
+              <w:tab w:val="right" w:leader="dot" w:pos="9062"/>
+            </w:tabs>
+            <w:rPr>
+              <w:rFonts w:asciiTheme="minorHAnsi" w:eastAsiaTheme="minorEastAsia" w:hAnsiTheme="minorHAnsi"/>
+              <w:noProof/>
+              <w:sz w:val="24"/>
+              <w:szCs w:val="24"/>
+              <w:lang w:eastAsia="fr-FR"/>
+            </w:rPr>
+          </w:pPr>
+          <w:hyperlink w:anchor="_Toc190442842" w:history="1">
+            <w:r>
+              <w:rPr>
+                <w:rStyle w:val="Lienhypertexte"/>
+                <w:noProof/>
+              </w:rPr>
+              <w:t>a.</w:t>
+            </w:r>
+            <w:r>
+              <w:rPr>
+                <w:rFonts w:asciiTheme="minorHAnsi" w:eastAsiaTheme="minorEastAsia" w:hAnsiTheme="minorHAnsi"/>
+                <w:noProof/>
+                <w:sz w:val="24"/>
+                <w:szCs w:val="24"/>
+                <w:lang w:eastAsia="fr-FR"/>
+              </w:rPr>
+              <w:tab/>
+            </w:r>
+            <w:r>
+              <w:rPr>
+                <w:rStyle w:val="Lienhypertexte"/>
+                <w:noProof/>
+              </w:rPr>
+              <w:t>Représentation d’un point</w:t>
+            </w:r>
+            <w:r>
+              <w:rPr>
+                <w:noProof/>
+                <w:webHidden/>
+              </w:rPr>
+              <w:tab/>
+            </w:r>
+            <w:r>
+              <w:rPr>
+                <w:noProof/>
+                <w:webHidden/>
+              </w:rPr>
+              <w:fldChar w:fldCharType="begin"/>
+            </w:r>
+            <w:r>
+              <w:rPr>
+                <w:noProof/>
+                <w:webHidden/>
+              </w:rPr>
+              <w:instrText xml:space="preserve"> PAGEREF _Toc190442842 \h </w:instrText>
+            </w:r>
+            <w:r>
+              <w:rPr>
+                <w:noProof/>
+                <w:webHidden/>
+              </w:rPr>
+            </w:r>
+            <w:r>
+              <w:rPr>
+                <w:noProof/>
+                <w:webHidden/>
+              </w:rPr>
+              <w:fldChar w:fldCharType="separate"/>
+            </w:r>
+            <w:r>
+              <w:rPr>
+                <w:noProof/>
+                <w:webHidden/>
+              </w:rPr>
+              <w:t>4</w:t>
+            </w:r>
+            <w:r>
+              <w:rPr>
+                <w:noProof/>
+                <w:webHidden/>
+              </w:rPr>
+              <w:fldChar w:fldCharType="end"/>
+            </w:r>
+          </w:hyperlink>
+        </w:p>
+        <w:p>
+          <w:pPr>
+            <w:pStyle w:val="TM3"/>
+            <w:tabs>
+              <w:tab w:val="left" w:pos="960"/>
+              <w:tab w:val="right" w:leader="dot" w:pos="9062"/>
+            </w:tabs>
+            <w:rPr>
+              <w:rFonts w:asciiTheme="minorHAnsi" w:eastAsiaTheme="minorEastAsia" w:hAnsiTheme="minorHAnsi"/>
+              <w:noProof/>
+              <w:sz w:val="24"/>
+              <w:szCs w:val="24"/>
+              <w:lang w:eastAsia="fr-FR"/>
+            </w:rPr>
+          </w:pPr>
+          <w:hyperlink w:anchor="_Toc190442843" w:history="1">
+            <w:r>
+              <w:rPr>
+                <w:rStyle w:val="Lienhypertexte"/>
+                <w:noProof/>
+              </w:rPr>
+              <w:t>b.</w:t>
+            </w:r>
+            <w:r>
+              <w:rPr>
+                <w:rFonts w:asciiTheme="minorHAnsi" w:eastAsiaTheme="minorEastAsia" w:hAnsiTheme="minorHAnsi"/>
+                <w:noProof/>
+                <w:sz w:val="24"/>
+                <w:szCs w:val="24"/>
+                <w:lang w:eastAsia="fr-FR"/>
+              </w:rPr>
+              <w:tab/>
+            </w:r>
+            <w:r>
+              <w:rPr>
+                <w:rStyle w:val="Lienhypertexte"/>
+                <w:noProof/>
+              </w:rPr>
+              <w:t>Représentation de formes</w:t>
+            </w:r>
+            <w:r>
+              <w:rPr>
+                <w:noProof/>
+                <w:webHidden/>
+              </w:rPr>
+              <w:tab/>
+            </w:r>
+            <w:r>
+              <w:rPr>
+                <w:noProof/>
+                <w:webHidden/>
+              </w:rPr>
+              <w:fldChar w:fldCharType="begin"/>
+            </w:r>
+            <w:r>
+              <w:rPr>
+                <w:noProof/>
+                <w:webHidden/>
+              </w:rPr>
+              <w:instrText xml:space="preserve"> PAGEREF _Toc190442843 \h </w:instrText>
+            </w:r>
+            <w:r>
+              <w:rPr>
+                <w:noProof/>
+                <w:webHidden/>
+              </w:rPr>
+            </w:r>
+            <w:r>
+              <w:rPr>
+                <w:noProof/>
+                <w:webHidden/>
+              </w:rPr>
+              <w:fldChar w:fldCharType="separate"/>
+            </w:r>
+            <w:r>
+              <w:rPr>
+                <w:noProof/>
+                <w:webHidden/>
+              </w:rPr>
+              <w:t>4</w:t>
+            </w:r>
+            <w:r>
+              <w:rPr>
+                <w:noProof/>
+                <w:webHidden/>
+              </w:rPr>
+              <w:fldChar w:fldCharType="end"/>
+            </w:r>
+          </w:hyperlink>
+        </w:p>
+        <w:p>
+          <w:pPr>
+            <w:pStyle w:val="TM2"/>
+            <w:tabs>
+              <w:tab w:val="left" w:pos="720"/>
+              <w:tab w:val="right" w:leader="dot" w:pos="9062"/>
+            </w:tabs>
+            <w:rPr>
+              <w:rFonts w:asciiTheme="minorHAnsi" w:eastAsiaTheme="minorEastAsia" w:hAnsiTheme="minorHAnsi"/>
+              <w:noProof/>
+              <w:sz w:val="24"/>
+              <w:szCs w:val="24"/>
+              <w:lang w:eastAsia="fr-FR"/>
+            </w:rPr>
+          </w:pPr>
+          <w:hyperlink w:anchor="_Toc190442844" w:history="1">
+            <w:r>
+              <w:rPr>
+                <w:rStyle w:val="Lienhypertexte"/>
+                <w:noProof/>
+              </w:rPr>
+              <w:t>3.</w:t>
+            </w:r>
+            <w:r>
+              <w:rPr>
+                <w:rFonts w:asciiTheme="minorHAnsi" w:eastAsiaTheme="minorEastAsia" w:hAnsiTheme="minorHAnsi"/>
+                <w:noProof/>
+                <w:sz w:val="24"/>
+                <w:szCs w:val="24"/>
+                <w:lang w:eastAsia="fr-FR"/>
+              </w:rPr>
+              <w:tab/>
+            </w:r>
+            <w:r>
+              <w:rPr>
+                <w:rStyle w:val="Lienhypertexte"/>
+                <w:noProof/>
+              </w:rPr>
+              <w:t>Gestion du Viewport</w:t>
+            </w:r>
+            <w:r>
+              <w:rPr>
+                <w:noProof/>
+                <w:webHidden/>
+              </w:rPr>
+              <w:tab/>
+            </w:r>
+            <w:r>
+              <w:rPr>
+                <w:noProof/>
+                <w:webHidden/>
+              </w:rPr>
+              <w:fldChar w:fldCharType="begin"/>
+            </w:r>
+            <w:r>
+              <w:rPr>
+                <w:noProof/>
+                <w:webHidden/>
+              </w:rPr>
+              <w:instrText xml:space="preserve"> PAGEREF _Toc190442844 \h </w:instrText>
+            </w:r>
+            <w:r>
+              <w:rPr>
+                <w:noProof/>
+                <w:webHidden/>
+              </w:rPr>
+            </w:r>
+            <w:r>
+              <w:rPr>
+                <w:noProof/>
+                <w:webHidden/>
+              </w:rPr>
+              <w:fldChar w:fldCharType="separate"/>
+            </w:r>
+            <w:r>
+              <w:rPr>
+                <w:noProof/>
+                <w:webHidden/>
+              </w:rPr>
+              <w:t>5</w:t>
+            </w:r>
+            <w:r>
+              <w:rPr>
+                <w:noProof/>
+                <w:webHidden/>
+              </w:rPr>
+              <w:fldChar w:fldCharType="end"/>
+            </w:r>
+          </w:hyperlink>
+        </w:p>
+        <w:p>
+          <w:pPr>
+            <w:pStyle w:val="TM3"/>
+            <w:tabs>
+              <w:tab w:val="left" w:pos="960"/>
+              <w:tab w:val="right" w:leader="dot" w:pos="9062"/>
+            </w:tabs>
+            <w:rPr>
+              <w:rFonts w:asciiTheme="minorHAnsi" w:eastAsiaTheme="minorEastAsia" w:hAnsiTheme="minorHAnsi"/>
+              <w:noProof/>
+              <w:sz w:val="24"/>
+              <w:szCs w:val="24"/>
+              <w:lang w:eastAsia="fr-FR"/>
+            </w:rPr>
+          </w:pPr>
+          <w:hyperlink w:anchor="_Toc190442845" w:history="1">
+            <w:r>
+              <w:rPr>
+                <w:rStyle w:val="Lienhypertexte"/>
+                <w:noProof/>
+              </w:rPr>
+              <w:t>a.</w:t>
+            </w:r>
+            <w:r>
+              <w:rPr>
+                <w:rFonts w:asciiTheme="minorHAnsi" w:eastAsiaTheme="minorEastAsia" w:hAnsiTheme="minorHAnsi"/>
+                <w:noProof/>
+                <w:sz w:val="24"/>
+                <w:szCs w:val="24"/>
+                <w:lang w:eastAsia="fr-FR"/>
+              </w:rPr>
+              <w:tab/>
+            </w:r>
+            <w:r>
+              <w:rPr>
+                <w:rStyle w:val="Lienhypertexte"/>
+                <w:noProof/>
+              </w:rPr>
+              <w:t>Rôle du Viewport</w:t>
+            </w:r>
+            <w:r>
+              <w:rPr>
+                <w:noProof/>
+                <w:webHidden/>
+              </w:rPr>
+              <w:tab/>
+            </w:r>
+            <w:r>
+              <w:rPr>
+                <w:noProof/>
+                <w:webHidden/>
+              </w:rPr>
+              <w:fldChar w:fldCharType="begin"/>
+            </w:r>
+            <w:r>
+              <w:rPr>
+                <w:noProof/>
+                <w:webHidden/>
+              </w:rPr>
+              <w:instrText xml:space="preserve"> PAGEREF _Toc190442845 \h </w:instrText>
+            </w:r>
+            <w:r>
+              <w:rPr>
+                <w:noProof/>
+                <w:webHidden/>
+              </w:rPr>
+            </w:r>
+            <w:r>
+              <w:rPr>
+                <w:noProof/>
+                <w:webHidden/>
+              </w:rPr>
+              <w:fldChar w:fldCharType="separate"/>
+            </w:r>
+            <w:r>
+              <w:rPr>
+                <w:noProof/>
+                <w:webHidden/>
+              </w:rPr>
+              <w:t>5</w:t>
+            </w:r>
+            <w:r>
+              <w:rPr>
+                <w:noProof/>
+                <w:webHidden/>
+              </w:rPr>
+              <w:fldChar w:fldCharType="end"/>
+            </w:r>
+          </w:hyperlink>
+        </w:p>
+        <w:p>
+          <w:pPr>
+            <w:pStyle w:val="TM3"/>
+            <w:tabs>
+              <w:tab w:val="left" w:pos="960"/>
+              <w:tab w:val="right" w:leader="dot" w:pos="9062"/>
+            </w:tabs>
+            <w:rPr>
+              <w:rFonts w:asciiTheme="minorHAnsi" w:eastAsiaTheme="minorEastAsia" w:hAnsiTheme="minorHAnsi"/>
+              <w:noProof/>
+              <w:sz w:val="24"/>
+              <w:szCs w:val="24"/>
+              <w:lang w:eastAsia="fr-FR"/>
+            </w:rPr>
+          </w:pPr>
+          <w:hyperlink w:anchor="_Toc190442846" w:history="1">
+            <w:r>
+              <w:rPr>
+                <w:rStyle w:val="Lienhypertexte"/>
+                <w:noProof/>
+              </w:rPr>
+              <w:t>b.</w:t>
+            </w:r>
+            <w:r>
+              <w:rPr>
+                <w:rFonts w:asciiTheme="minorHAnsi" w:eastAsiaTheme="minorEastAsia" w:hAnsiTheme="minorHAnsi"/>
+                <w:noProof/>
+                <w:sz w:val="24"/>
+                <w:szCs w:val="24"/>
+                <w:lang w:eastAsia="fr-FR"/>
+              </w:rPr>
+              <w:tab/>
+            </w:r>
+            <w:r>
+              <w:rPr>
+                <w:rStyle w:val="Lienhypertexte"/>
+                <w:noProof/>
+              </w:rPr>
+              <w:t>Attributs du Viewport</w:t>
+            </w:r>
+            <w:r>
+              <w:rPr>
+                <w:noProof/>
+                <w:webHidden/>
+              </w:rPr>
+              <w:tab/>
+            </w:r>
+            <w:r>
+              <w:rPr>
+                <w:noProof/>
+                <w:webHidden/>
+              </w:rPr>
+              <w:fldChar w:fldCharType="begin"/>
+            </w:r>
+            <w:r>
+              <w:rPr>
+                <w:noProof/>
+                <w:webHidden/>
+              </w:rPr>
+              <w:instrText xml:space="preserve"> PAGEREF _Toc190442846 \h </w:instrText>
+            </w:r>
+            <w:r>
+              <w:rPr>
+                <w:noProof/>
+                <w:webHidden/>
+              </w:rPr>
+            </w:r>
+            <w:r>
+              <w:rPr>
+                <w:noProof/>
+                <w:webHidden/>
+              </w:rPr>
+              <w:fldChar w:fldCharType="separate"/>
+            </w:r>
+            <w:r>
+              <w:rPr>
+                <w:noProof/>
+                <w:webHidden/>
+              </w:rPr>
+              <w:t>5</w:t>
+            </w:r>
+            <w:r>
+              <w:rPr>
+                <w:noProof/>
+                <w:webHidden/>
+              </w:rPr>
+              <w:fldChar w:fldCharType="end"/>
+            </w:r>
+          </w:hyperlink>
+        </w:p>
+        <w:p>
+          <w:pPr>
+            <w:pStyle w:val="TM3"/>
+            <w:tabs>
+              <w:tab w:val="left" w:pos="960"/>
+              <w:tab w:val="right" w:leader="dot" w:pos="9062"/>
+            </w:tabs>
+            <w:rPr>
+              <w:rFonts w:asciiTheme="minorHAnsi" w:eastAsiaTheme="minorEastAsia" w:hAnsiTheme="minorHAnsi"/>
+              <w:noProof/>
+              <w:sz w:val="24"/>
+              <w:szCs w:val="24"/>
+              <w:lang w:eastAsia="fr-FR"/>
+            </w:rPr>
+          </w:pPr>
+          <w:hyperlink w:anchor="_Toc190442847" w:history="1">
+            <w:r>
+              <w:rPr>
+                <w:rStyle w:val="Lienhypertexte"/>
+                <w:noProof/>
+              </w:rPr>
+              <w:t>c.</w:t>
+            </w:r>
+            <w:r>
+              <w:rPr>
+                <w:rFonts w:asciiTheme="minorHAnsi" w:eastAsiaTheme="minorEastAsia" w:hAnsiTheme="minorHAnsi"/>
+                <w:noProof/>
+                <w:sz w:val="24"/>
+                <w:szCs w:val="24"/>
+                <w:lang w:eastAsia="fr-FR"/>
+              </w:rPr>
+              <w:tab/>
+            </w:r>
+            <w:r>
+              <w:rPr>
+                <w:rStyle w:val="Lienhypertexte"/>
+                <w:noProof/>
+              </w:rPr>
+              <w:t>Transformation monde-écran</w:t>
+            </w:r>
+            <w:r>
+              <w:rPr>
+                <w:noProof/>
+                <w:webHidden/>
+              </w:rPr>
+              <w:tab/>
+            </w:r>
+            <w:r>
+              <w:rPr>
+                <w:noProof/>
+                <w:webHidden/>
+              </w:rPr>
+              <w:fldChar w:fldCharType="begin"/>
+            </w:r>
+            <w:r>
+              <w:rPr>
+                <w:noProof/>
+                <w:webHidden/>
+              </w:rPr>
+              <w:instrText xml:space="preserve"> PAGEREF _Toc190442847 \h </w:instrText>
+            </w:r>
+            <w:r>
+              <w:rPr>
+                <w:noProof/>
+                <w:webHidden/>
+              </w:rPr>
+            </w:r>
+            <w:r>
+              <w:rPr>
+                <w:noProof/>
+                <w:webHidden/>
+              </w:rPr>
+              <w:fldChar w:fldCharType="separate"/>
+            </w:r>
+            <w:r>
+              <w:rPr>
+                <w:noProof/>
+                <w:webHidden/>
+              </w:rPr>
+              <w:t>6</w:t>
+            </w:r>
+            <w:r>
+              <w:rPr>
+                <w:noProof/>
+                <w:webHidden/>
+              </w:rPr>
+              <w:fldChar w:fldCharType="end"/>
+            </w:r>
+          </w:hyperlink>
+        </w:p>
+        <w:p>
+          <w:pPr>
+            <w:pStyle w:val="TM2"/>
+            <w:tabs>
+              <w:tab w:val="left" w:pos="720"/>
+              <w:tab w:val="right" w:leader="dot" w:pos="9062"/>
+            </w:tabs>
+            <w:rPr>
+              <w:rFonts w:asciiTheme="minorHAnsi" w:eastAsiaTheme="minorEastAsia" w:hAnsiTheme="minorHAnsi"/>
+              <w:noProof/>
+              <w:sz w:val="24"/>
+              <w:szCs w:val="24"/>
+              <w:lang w:eastAsia="fr-FR"/>
+            </w:rPr>
+          </w:pPr>
+          <w:hyperlink w:anchor="_Toc190442848" w:history="1">
+            <w:r>
+              <w:rPr>
+                <w:rStyle w:val="Lienhypertexte"/>
+                <w:noProof/>
+              </w:rPr>
+              <w:t>4.</w:t>
+            </w:r>
+            <w:r>
+              <w:rPr>
+                <w:rFonts w:asciiTheme="minorHAnsi" w:eastAsiaTheme="minorEastAsia" w:hAnsiTheme="minorHAnsi"/>
+                <w:noProof/>
+                <w:sz w:val="24"/>
+                <w:szCs w:val="24"/>
+                <w:lang w:eastAsia="fr-FR"/>
+              </w:rPr>
+              <w:tab/>
+            </w:r>
+            <w:r>
+              <w:rPr>
+                <w:rStyle w:val="Lienhypertexte"/>
+                <w:noProof/>
+              </w:rPr>
+              <w:t>Client TCP/IP</w:t>
+            </w:r>
+            <w:r>
+              <w:rPr>
+                <w:noProof/>
+                <w:webHidden/>
+              </w:rPr>
+              <w:tab/>
+            </w:r>
+            <w:r>
+              <w:rPr>
+                <w:noProof/>
+                <w:webHidden/>
+              </w:rPr>
+              <w:fldChar w:fldCharType="begin"/>
+            </w:r>
+            <w:r>
+              <w:rPr>
+                <w:noProof/>
+                <w:webHidden/>
+              </w:rPr>
+              <w:instrText xml:space="preserve"> PAGEREF _Toc190442848 \h </w:instrText>
+            </w:r>
+            <w:r>
+              <w:rPr>
+                <w:noProof/>
+                <w:webHidden/>
+              </w:rPr>
+            </w:r>
+            <w:r>
+              <w:rPr>
+                <w:noProof/>
+                <w:webHidden/>
+              </w:rPr>
+              <w:fldChar w:fldCharType="separate"/>
+            </w:r>
+            <w:r>
+              <w:rPr>
+                <w:noProof/>
+                <w:webHidden/>
+              </w:rPr>
+              <w:t>7</w:t>
+            </w:r>
+            <w:r>
+              <w:rPr>
+                <w:noProof/>
+                <w:webHidden/>
+              </w:rPr>
+              <w:fldChar w:fldCharType="end"/>
+            </w:r>
+          </w:hyperlink>
+        </w:p>
+        <w:p>
+          <w:pPr>
+            <w:pStyle w:val="TM3"/>
+            <w:tabs>
+              <w:tab w:val="left" w:pos="960"/>
+              <w:tab w:val="right" w:leader="dot" w:pos="9062"/>
+            </w:tabs>
+            <w:rPr>
+              <w:rFonts w:asciiTheme="minorHAnsi" w:eastAsiaTheme="minorEastAsia" w:hAnsiTheme="minorHAnsi"/>
+              <w:noProof/>
+              <w:sz w:val="24"/>
+              <w:szCs w:val="24"/>
+              <w:lang w:eastAsia="fr-FR"/>
+            </w:rPr>
+          </w:pPr>
+          <w:hyperlink w:anchor="_Toc190442849" w:history="1">
+            <w:r>
+              <w:rPr>
+                <w:rStyle w:val="Lienhypertexte"/>
+                <w:noProof/>
+              </w:rPr>
+              <w:t>a.</w:t>
+            </w:r>
+            <w:r>
+              <w:rPr>
+                <w:rFonts w:asciiTheme="minorHAnsi" w:eastAsiaTheme="minorEastAsia" w:hAnsiTheme="minorHAnsi"/>
+                <w:noProof/>
+                <w:sz w:val="24"/>
+                <w:szCs w:val="24"/>
+                <w:lang w:eastAsia="fr-FR"/>
+              </w:rPr>
+              <w:tab/>
+            </w:r>
+            <w:r>
+              <w:rPr>
+                <w:rStyle w:val="Lienhypertexte"/>
+                <w:noProof/>
+              </w:rPr>
+              <w:t>Rôle du Client TCP/IP</w:t>
+            </w:r>
+            <w:r>
+              <w:rPr>
+                <w:noProof/>
+                <w:webHidden/>
+              </w:rPr>
+              <w:tab/>
+            </w:r>
+            <w:r>
+              <w:rPr>
+                <w:noProof/>
+                <w:webHidden/>
+              </w:rPr>
+              <w:fldChar w:fldCharType="begin"/>
+            </w:r>
+            <w:r>
+              <w:rPr>
+                <w:noProof/>
+                <w:webHidden/>
+              </w:rPr>
+              <w:instrText xml:space="preserve"> PAGEREF _Toc190442849 \h </w:instrText>
+            </w:r>
+            <w:r>
+              <w:rPr>
+                <w:noProof/>
+                <w:webHidden/>
+              </w:rPr>
+            </w:r>
+            <w:r>
+              <w:rPr>
+                <w:noProof/>
+                <w:webHidden/>
+              </w:rPr>
+              <w:fldChar w:fldCharType="separate"/>
+            </w:r>
+            <w:r>
+              <w:rPr>
+                <w:noProof/>
+                <w:webHidden/>
+              </w:rPr>
+              <w:t>7</w:t>
+            </w:r>
+            <w:r>
+              <w:rPr>
+                <w:noProof/>
+                <w:webHidden/>
+              </w:rPr>
+              <w:fldChar w:fldCharType="end"/>
+            </w:r>
+          </w:hyperlink>
+        </w:p>
+        <w:p>
+          <w:pPr>
+            <w:pStyle w:val="TM3"/>
+            <w:tabs>
+              <w:tab w:val="left" w:pos="960"/>
+              <w:tab w:val="right" w:leader="dot" w:pos="9062"/>
+            </w:tabs>
+            <w:rPr>
+              <w:rFonts w:asciiTheme="minorHAnsi" w:eastAsiaTheme="minorEastAsia" w:hAnsiTheme="minorHAnsi"/>
+              <w:noProof/>
+              <w:sz w:val="24"/>
+              <w:szCs w:val="24"/>
+              <w:lang w:eastAsia="fr-FR"/>
+            </w:rPr>
+          </w:pPr>
+          <w:hyperlink w:anchor="_Toc190442850" w:history="1">
+            <w:r>
+              <w:rPr>
+                <w:rStyle w:val="Lienhypertexte"/>
+                <w:noProof/>
+              </w:rPr>
+              <w:t>b.</w:t>
+            </w:r>
+            <w:r>
+              <w:rPr>
+                <w:rFonts w:asciiTheme="minorHAnsi" w:eastAsiaTheme="minorEastAsia" w:hAnsiTheme="minorHAnsi"/>
+                <w:noProof/>
+                <w:sz w:val="24"/>
+                <w:szCs w:val="24"/>
+                <w:lang w:eastAsia="fr-FR"/>
+              </w:rPr>
+              <w:tab/>
+            </w:r>
+            <w:r>
+              <w:rPr>
+                <w:rStyle w:val="Lienhypertexte"/>
+                <w:noProof/>
+              </w:rPr>
+              <w:t>Attributs du Client</w:t>
+            </w:r>
+            <w:r>
+              <w:rPr>
+                <w:noProof/>
+                <w:webHidden/>
+              </w:rPr>
+              <w:tab/>
+            </w:r>
+            <w:r>
+              <w:rPr>
+                <w:noProof/>
+                <w:webHidden/>
+              </w:rPr>
+              <w:fldChar w:fldCharType="begin"/>
+            </w:r>
+            <w:r>
+              <w:rPr>
+                <w:noProof/>
+                <w:webHidden/>
+              </w:rPr>
+              <w:instrText xml:space="preserve"> PAGEREF _Toc190442850 \h </w:instrText>
+            </w:r>
+            <w:r>
+              <w:rPr>
+                <w:noProof/>
+                <w:webHidden/>
+              </w:rPr>
+            </w:r>
+            <w:r>
+              <w:rPr>
+                <w:noProof/>
+                <w:webHidden/>
+              </w:rPr>
+              <w:fldChar w:fldCharType="separate"/>
+            </w:r>
+            <w:r>
+              <w:rPr>
+                <w:noProof/>
+                <w:webHidden/>
+              </w:rPr>
+              <w:t>7</w:t>
+            </w:r>
+            <w:r>
+              <w:rPr>
+                <w:noProof/>
+                <w:webHidden/>
+              </w:rPr>
+              <w:fldChar w:fldCharType="end"/>
+            </w:r>
+          </w:hyperlink>
+        </w:p>
+        <w:p>
+          <w:pPr>
+            <w:pStyle w:val="TM2"/>
+            <w:tabs>
+              <w:tab w:val="left" w:pos="720"/>
+              <w:tab w:val="right" w:leader="dot" w:pos="9062"/>
+            </w:tabs>
+            <w:rPr>
+              <w:rFonts w:asciiTheme="minorHAnsi" w:eastAsiaTheme="minorEastAsia" w:hAnsiTheme="minorHAnsi"/>
+              <w:noProof/>
+              <w:sz w:val="24"/>
+              <w:szCs w:val="24"/>
+              <w:lang w:eastAsia="fr-FR"/>
+            </w:rPr>
+          </w:pPr>
+          <w:hyperlink w:anchor="_Toc190442851" w:history="1">
+            <w:r>
+              <w:rPr>
+                <w:rStyle w:val="Lienhypertexte"/>
+                <w:noProof/>
+              </w:rPr>
+              <w:t>5.</w:t>
+            </w:r>
+            <w:r>
+              <w:rPr>
+                <w:rFonts w:asciiTheme="minorHAnsi" w:eastAsiaTheme="minorEastAsia" w:hAnsiTheme="minorHAnsi"/>
+                <w:noProof/>
+                <w:sz w:val="24"/>
+                <w:szCs w:val="24"/>
+                <w:lang w:eastAsia="fr-FR"/>
+              </w:rPr>
+              <w:tab/>
+            </w:r>
+            <w:r>
+              <w:rPr>
+                <w:rStyle w:val="Lienhypertexte"/>
+                <w:noProof/>
+              </w:rPr>
+              <w:t>Design Patterns</w:t>
+            </w:r>
+            <w:r>
+              <w:rPr>
+                <w:noProof/>
+                <w:webHidden/>
+              </w:rPr>
+              <w:tab/>
+            </w:r>
+            <w:r>
+              <w:rPr>
+                <w:noProof/>
+                <w:webHidden/>
+              </w:rPr>
+              <w:fldChar w:fldCharType="begin"/>
+            </w:r>
+            <w:r>
+              <w:rPr>
+                <w:noProof/>
+                <w:webHidden/>
+              </w:rPr>
+              <w:instrText xml:space="preserve"> PAGEREF _Toc190442851 \h </w:instrText>
+            </w:r>
+            <w:r>
+              <w:rPr>
+                <w:noProof/>
+                <w:webHidden/>
+              </w:rPr>
+            </w:r>
+            <w:r>
+              <w:rPr>
+                <w:noProof/>
+                <w:webHidden/>
+              </w:rPr>
+              <w:fldChar w:fldCharType="separate"/>
+            </w:r>
+            <w:r>
+              <w:rPr>
+                <w:noProof/>
+                <w:webHidden/>
+              </w:rPr>
+              <w:t>7</w:t>
+            </w:r>
+            <w:r>
+              <w:rPr>
+                <w:noProof/>
+                <w:webHidden/>
+              </w:rPr>
+              <w:fldChar w:fldCharType="end"/>
+            </w:r>
+          </w:hyperlink>
+        </w:p>
+        <w:p>
+          <w:pPr>
+            <w:pStyle w:val="TM3"/>
+            <w:tabs>
+              <w:tab w:val="left" w:pos="960"/>
+              <w:tab w:val="right" w:leader="dot" w:pos="9062"/>
+            </w:tabs>
+            <w:rPr>
+              <w:rFonts w:asciiTheme="minorHAnsi" w:eastAsiaTheme="minorEastAsia" w:hAnsiTheme="minorHAnsi"/>
+              <w:noProof/>
+              <w:sz w:val="24"/>
+              <w:szCs w:val="24"/>
+              <w:lang w:eastAsia="fr-FR"/>
+            </w:rPr>
+          </w:pPr>
+          <w:hyperlink w:anchor="_Toc190442852" w:history="1">
+            <w:r>
+              <w:rPr>
+                <w:rStyle w:val="Lienhypertexte"/>
+                <w:noProof/>
+                <w:lang w:val="en-US"/>
+              </w:rPr>
+              <w:t>a.</w:t>
+            </w:r>
+            <w:r>
+              <w:rPr>
+                <w:rFonts w:asciiTheme="minorHAnsi" w:eastAsiaTheme="minorEastAsia" w:hAnsiTheme="minorHAnsi"/>
+                <w:noProof/>
+                <w:sz w:val="24"/>
+                <w:szCs w:val="24"/>
+                <w:lang w:eastAsia="fr-FR"/>
+              </w:rPr>
+              <w:tab/>
+            </w:r>
+            <w:r>
+              <w:rPr>
+                <w:rStyle w:val="Lienhypertexte"/>
+                <w:noProof/>
+                <w:lang w:val="en-US"/>
+              </w:rPr>
+              <w:t>Pattern Chain Of Responsibility (COR)</w:t>
+            </w:r>
+            <w:r>
+              <w:rPr>
+                <w:noProof/>
+                <w:webHidden/>
+              </w:rPr>
+              <w:tab/>
+            </w:r>
+            <w:r>
+              <w:rPr>
+                <w:noProof/>
+                <w:webHidden/>
+              </w:rPr>
+              <w:fldChar w:fldCharType="begin"/>
+            </w:r>
+            <w:r>
+              <w:rPr>
+                <w:noProof/>
+                <w:webHidden/>
+              </w:rPr>
+              <w:instrText xml:space="preserve"> PAGEREF _Toc190442852 \h </w:instrText>
+            </w:r>
+            <w:r>
+              <w:rPr>
+                <w:noProof/>
+                <w:webHidden/>
+              </w:rPr>
+            </w:r>
+            <w:r>
+              <w:rPr>
+                <w:noProof/>
+                <w:webHidden/>
+              </w:rPr>
+              <w:fldChar w:fldCharType="separate"/>
+            </w:r>
+            <w:r>
+              <w:rPr>
+                <w:noProof/>
+                <w:webHidden/>
+              </w:rPr>
+              <w:t>7</w:t>
+            </w:r>
+            <w:r>
+              <w:rPr>
+                <w:noProof/>
+                <w:webHidden/>
+              </w:rPr>
+              <w:fldChar w:fldCharType="end"/>
+            </w:r>
+          </w:hyperlink>
+        </w:p>
+        <w:p>
+          <w:pPr>
+            <w:pStyle w:val="TM3"/>
+            <w:tabs>
+              <w:tab w:val="left" w:pos="960"/>
+              <w:tab w:val="right" w:leader="dot" w:pos="9062"/>
+            </w:tabs>
+            <w:rPr>
+              <w:rFonts w:asciiTheme="minorHAnsi" w:eastAsiaTheme="minorEastAsia" w:hAnsiTheme="minorHAnsi"/>
+              <w:noProof/>
+              <w:sz w:val="24"/>
+              <w:szCs w:val="24"/>
+              <w:lang w:eastAsia="fr-FR"/>
+            </w:rPr>
+          </w:pPr>
+          <w:hyperlink w:anchor="_Toc190442853" w:history="1">
+            <w:r>
+              <w:rPr>
+                <w:rStyle w:val="Lienhypertexte"/>
+                <w:noProof/>
+              </w:rPr>
+              <w:t>b.</w:t>
+            </w:r>
+            <w:r>
+              <w:rPr>
+                <w:rFonts w:asciiTheme="minorHAnsi" w:eastAsiaTheme="minorEastAsia" w:hAnsiTheme="minorHAnsi"/>
+                <w:noProof/>
+                <w:sz w:val="24"/>
+                <w:szCs w:val="24"/>
+                <w:lang w:eastAsia="fr-FR"/>
+              </w:rPr>
+              <w:tab/>
+            </w:r>
+            <w:r>
+              <w:rPr>
+                <w:rStyle w:val="Lienhypertexte"/>
+                <w:noProof/>
+              </w:rPr>
+              <w:t>Pattern Visitor</w:t>
+            </w:r>
+            <w:r>
+              <w:rPr>
+                <w:noProof/>
+                <w:webHidden/>
+              </w:rPr>
+              <w:tab/>
+            </w:r>
+            <w:r>
+              <w:rPr>
+                <w:noProof/>
+                <w:webHidden/>
+              </w:rPr>
+              <w:fldChar w:fldCharType="begin"/>
+            </w:r>
+            <w:r>
+              <w:rPr>
+                <w:noProof/>
+                <w:webHidden/>
+              </w:rPr>
+              <w:instrText xml:space="preserve"> PAGEREF _Toc190442853 \h </w:instrText>
+            </w:r>
+            <w:r>
+              <w:rPr>
+                <w:noProof/>
+                <w:webHidden/>
+              </w:rPr>
+            </w:r>
+            <w:r>
+              <w:rPr>
+                <w:noProof/>
+                <w:webHidden/>
+              </w:rPr>
+              <w:fldChar w:fldCharType="separate"/>
+            </w:r>
+            <w:r>
+              <w:rPr>
+                <w:noProof/>
+                <w:webHidden/>
+              </w:rPr>
+              <w:t>8</w:t>
+            </w:r>
+            <w:r>
+              <w:rPr>
+                <w:noProof/>
+                <w:webHidden/>
+              </w:rPr>
+              <w:fldChar w:fldCharType="end"/>
+            </w:r>
+          </w:hyperlink>
+        </w:p>
+        <w:p>
+          <w:pPr>
+            <w:pStyle w:val="TM3"/>
+            <w:tabs>
+              <w:tab w:val="left" w:pos="960"/>
+              <w:tab w:val="right" w:leader="dot" w:pos="9062"/>
+            </w:tabs>
+            <w:rPr>
+              <w:rFonts w:asciiTheme="minorHAnsi" w:eastAsiaTheme="minorEastAsia" w:hAnsiTheme="minorHAnsi"/>
+              <w:noProof/>
+              <w:sz w:val="24"/>
+              <w:szCs w:val="24"/>
+              <w:lang w:eastAsia="fr-FR"/>
+            </w:rPr>
+          </w:pPr>
+          <w:hyperlink w:anchor="_Toc190442854" w:history="1">
+            <w:r>
+              <w:rPr>
+                <w:rStyle w:val="Lienhypertexte"/>
+                <w:noProof/>
+              </w:rPr>
+              <w:t>c.</w:t>
+            </w:r>
+            <w:r>
+              <w:rPr>
+                <w:rFonts w:asciiTheme="minorHAnsi" w:eastAsiaTheme="minorEastAsia" w:hAnsiTheme="minorHAnsi"/>
+                <w:noProof/>
+                <w:sz w:val="24"/>
+                <w:szCs w:val="24"/>
+                <w:lang w:eastAsia="fr-FR"/>
+              </w:rPr>
+              <w:tab/>
+            </w:r>
+            <w:r>
+              <w:rPr>
+                <w:rStyle w:val="Lienhypertexte"/>
+                <w:noProof/>
+              </w:rPr>
+              <w:t>Pattern Singleton</w:t>
+            </w:r>
+            <w:r>
+              <w:rPr>
+                <w:noProof/>
+                <w:webHidden/>
+              </w:rPr>
+              <w:tab/>
+            </w:r>
+            <w:r>
+              <w:rPr>
+                <w:noProof/>
+                <w:webHidden/>
+              </w:rPr>
+              <w:fldChar w:fldCharType="begin"/>
+            </w:r>
+            <w:r>
+              <w:rPr>
+                <w:noProof/>
+                <w:webHidden/>
+              </w:rPr>
+              <w:instrText xml:space="preserve"> PAGEREF _Toc190442854 \h </w:instrText>
+            </w:r>
+            <w:r>
+              <w:rPr>
+                <w:noProof/>
+                <w:webHidden/>
+              </w:rPr>
+            </w:r>
+            <w:r>
+              <w:rPr>
+                <w:noProof/>
+                <w:webHidden/>
+              </w:rPr>
+              <w:fldChar w:fldCharType="separate"/>
+            </w:r>
+            <w:r>
+              <w:rPr>
+                <w:noProof/>
+                <w:webHidden/>
+              </w:rPr>
+              <w:t>10</w:t>
+            </w:r>
+            <w:r>
+              <w:rPr>
+                <w:noProof/>
+                <w:webHidden/>
+              </w:rPr>
+              <w:fldChar w:fldCharType="end"/>
+            </w:r>
+          </w:hyperlink>
+        </w:p>
+        <w:p>
+          <w:pPr>
+            <w:pStyle w:val="TM2"/>
+            <w:tabs>
+              <w:tab w:val="left" w:pos="720"/>
+              <w:tab w:val="right" w:leader="dot" w:pos="9062"/>
+            </w:tabs>
+            <w:rPr>
+              <w:rFonts w:asciiTheme="minorHAnsi" w:eastAsiaTheme="minorEastAsia" w:hAnsiTheme="minorHAnsi"/>
+              <w:noProof/>
+              <w:sz w:val="24"/>
+              <w:szCs w:val="24"/>
+              <w:lang w:eastAsia="fr-FR"/>
+            </w:rPr>
+          </w:pPr>
+          <w:hyperlink w:anchor="_Toc190442855" w:history="1">
+            <w:r>
+              <w:rPr>
+                <w:rStyle w:val="Lienhypertexte"/>
+                <w:noProof/>
+              </w:rPr>
+              <w:t>III.</w:t>
+            </w:r>
+            <w:r>
+              <w:rPr>
+                <w:rFonts w:asciiTheme="minorHAnsi" w:eastAsiaTheme="minorEastAsia" w:hAnsiTheme="minorHAnsi"/>
+                <w:noProof/>
+                <w:sz w:val="24"/>
+                <w:szCs w:val="24"/>
+                <w:lang w:eastAsia="fr-FR"/>
+              </w:rPr>
+              <w:tab/>
+            </w:r>
+            <w:r>
+              <w:rPr>
+                <w:rStyle w:val="Lienhypertexte"/>
+                <w:noProof/>
+              </w:rPr>
+              <w:t>Partie Java (Serveur)</w:t>
+            </w:r>
+            <w:r>
+              <w:rPr>
+                <w:noProof/>
+                <w:webHidden/>
+              </w:rPr>
+              <w:tab/>
+            </w:r>
+            <w:r>
+              <w:rPr>
+                <w:noProof/>
+                <w:webHidden/>
+              </w:rPr>
+              <w:fldChar w:fldCharType="begin"/>
+            </w:r>
+            <w:r>
+              <w:rPr>
+                <w:noProof/>
+                <w:webHidden/>
+              </w:rPr>
+              <w:instrText xml:space="preserve"> PAGEREF _Toc190442855 \h </w:instrText>
+            </w:r>
+            <w:r>
+              <w:rPr>
+                <w:noProof/>
+                <w:webHidden/>
+              </w:rPr>
+            </w:r>
+            <w:r>
+              <w:rPr>
+                <w:noProof/>
+                <w:webHidden/>
+              </w:rPr>
+              <w:fldChar w:fldCharType="separate"/>
+            </w:r>
+            <w:r>
+              <w:rPr>
+                <w:noProof/>
+                <w:webHidden/>
+              </w:rPr>
+              <w:t>10</w:t>
+            </w:r>
+            <w:r>
+              <w:rPr>
+                <w:noProof/>
+                <w:webHidden/>
+              </w:rPr>
+              <w:fldChar w:fldCharType="end"/>
+            </w:r>
+          </w:hyperlink>
+        </w:p>
+        <w:p>
+          <w:pPr>
+            <w:pStyle w:val="TM2"/>
+            <w:tabs>
+              <w:tab w:val="left" w:pos="720"/>
+              <w:tab w:val="right" w:leader="dot" w:pos="9062"/>
+            </w:tabs>
+            <w:rPr>
+              <w:rFonts w:asciiTheme="minorHAnsi" w:eastAsiaTheme="minorEastAsia" w:hAnsiTheme="minorHAnsi"/>
+              <w:noProof/>
+              <w:sz w:val="24"/>
+              <w:szCs w:val="24"/>
+              <w:lang w:eastAsia="fr-FR"/>
+            </w:rPr>
+          </w:pPr>
+          <w:hyperlink w:anchor="_Toc190442856" w:history="1">
+            <w:r>
+              <w:rPr>
+                <w:rStyle w:val="Lienhypertexte"/>
+                <w:noProof/>
+              </w:rPr>
+              <w:t>IV.</w:t>
+            </w:r>
+            <w:r>
+              <w:rPr>
+                <w:rFonts w:asciiTheme="minorHAnsi" w:eastAsiaTheme="minorEastAsia" w:hAnsiTheme="minorHAnsi"/>
+                <w:noProof/>
+                <w:sz w:val="24"/>
+                <w:szCs w:val="24"/>
+                <w:lang w:eastAsia="fr-FR"/>
+              </w:rPr>
+              <w:tab/>
+            </w:r>
+            <w:r>
+              <w:rPr>
+                <w:rStyle w:val="Lienhypertexte"/>
+                <w:noProof/>
+              </w:rPr>
+              <w:t>Extension OpenGL</w:t>
+            </w:r>
+            <w:r>
+              <w:rPr>
+                <w:noProof/>
+                <w:webHidden/>
+              </w:rPr>
+              <w:tab/>
+            </w:r>
+            <w:r>
+              <w:rPr>
+                <w:noProof/>
+                <w:webHidden/>
+              </w:rPr>
+              <w:fldChar w:fldCharType="begin"/>
+            </w:r>
+            <w:r>
+              <w:rPr>
+                <w:noProof/>
+                <w:webHidden/>
+              </w:rPr>
+              <w:instrText xml:space="preserve"> PAGEREF _Toc190442856 \h </w:instrText>
+            </w:r>
+            <w:r>
+              <w:rPr>
+                <w:noProof/>
+                <w:webHidden/>
+              </w:rPr>
+            </w:r>
+            <w:r>
+              <w:rPr>
+                <w:noProof/>
+                <w:webHidden/>
+              </w:rPr>
+              <w:fldChar w:fldCharType="separate"/>
+            </w:r>
+            <w:r>
+              <w:rPr>
+                <w:noProof/>
+                <w:webHidden/>
+              </w:rPr>
+              <w:t>10</w:t>
+            </w:r>
+            <w:r>
+              <w:rPr>
+                <w:noProof/>
+                <w:webHidden/>
+              </w:rPr>
+              <w:fldChar w:fldCharType="end"/>
+            </w:r>
+          </w:hyperlink>
+        </w:p>
+        <w:p>
+          <w:pPr>
+            <w:rPr>
+              <w:b/>
               <w:bCs/>
             </w:rPr>
           </w:pPr>
-          <w:fldSimple w:instr=" TOC \o &quot;1-3&quot; \h \z \u ">
-            <w:r>
-              <w:rPr>
-                <w:b/>
-                <w:bCs/>
-                <w:noProof/>
-              </w:rPr>
-              <w:t>Aucune entrée de table des matières n'a été trouvée.</w:t>
-            </w:r>
-          </w:fldSimple>
+          <w:r>
+            <w:rPr>
+              <w:b/>
+              <w:bCs/>
+            </w:rPr>
+            <w:fldChar w:fldCharType="end"/>
+          </w:r>
         </w:p>
       </w:sdtContent>
     </w:sdt>
-    <w:p>
-      <w:pPr>
-        <w:rPr>
-          <w:bCs/>
-        </w:rPr>
-      </w:pPr>
-    </w:p>
-    <w:p/>
+    <w:p/>
+    <w:p/>
+    <w:p/>
+    <w:p/>
+    <w:p/>
+    <w:p/>
+    <w:p/>
+    <w:p/>
+    <w:p/>
+    <w:p/>
+    <w:p/>
+    <w:p>
+      <w:pPr>
+        <w:pStyle w:val="Titre1"/>
+        <w:numPr>
+          <w:ilvl w:val="0"/>
+          <w:numId w:val="10"/>
+        </w:numPr>
+      </w:pPr>
+      <w:bookmarkStart w:id="0" w:name="_Toc190442837"/>
+      <w:r>
+        <w:lastRenderedPageBreak/>
+        <w:t>Introduction</w:t>
+      </w:r>
+      <w:bookmarkEnd w:id="0"/>
+    </w:p>
+    <w:p/>
+    <w:p>
+      <w:pPr>
+        <w:pStyle w:val="Titre2"/>
+        <w:numPr>
+          <w:ilvl w:val="0"/>
+          <w:numId w:val="12"/>
+        </w:numPr>
+      </w:pPr>
+      <w:bookmarkStart w:id="1" w:name="_Toc190442838"/>
+      <w:r>
+        <w:t>Objectifs du projet</w:t>
+      </w:r>
+      <w:bookmarkEnd w:id="1"/>
+    </w:p>
+    <w:p/>
+    <w:p>
+      <w:r>
+        <w:t>Dans le cadre de ce projet, il est demandé de concevoir et de développer une application distribuée permettant la gestion de formes géométriques en deux dimensions. Cette application repose sur une architecture client-serveur, où le client est implémenté en C++ et le serveur en Java.</w:t>
+      </w:r>
+    </w:p>
+    <w:p>
+      <w:r>
+        <w:t xml:space="preserve">L’objectif principal de ce projet est de fournir un programme permettant de </w:t>
+      </w:r>
+      <w:r>
+        <w:t>charger, sauvegarder</w:t>
+      </w:r>
+      <w:r>
+        <w:t>, manipuler et visualiser des formes géométriques 2D</w:t>
+      </w:r>
+      <w:r>
+        <w:t xml:space="preserve">, tout en étant extensible et robuste. Pour répondre à ces critères, </w:t>
+      </w:r>
+      <w:r>
+        <w:t>nous avons mis en place différentes stratégies architecturales et utilisé divers design patterns.</w:t>
+      </w:r>
+    </w:p>
+    <w:p>
+      <w:r>
+        <w:t>La partie client, développée en C++, se concentre sur la manipulation des formes géométriques. Elle offre différentes fonctionnalités permettant notamment de gérer les différentes opérations mathématiques nécessaires à la bonne visualisation des formes, comme la transformation monde-écran. Elle s’occupe également de transférer les formes via une connexion TCP/IP.</w:t>
+      </w:r>
+    </w:p>
+    <w:p>
+      <w:r>
+        <w:t>De son c</w:t>
+      </w:r>
+      <w:r>
+        <w:t>ô</w:t>
+      </w:r>
+      <w:r>
+        <w:t>té, la partie serveur, implémentée en Java, est dédiée au rendu graphique des formes reçues.</w:t>
+      </w:r>
+    </w:p>
+    <w:p>
+      <w:r>
+        <w:t>Ce rapport détaillera la conception, l’implémentation et les différentes fonctionnalités de l’application, en mettant en avant les choix techniques, les design patterns employés et les défis rencontrés au cours du développement.</w:t>
+      </w:r>
+    </w:p>
+    <w:p/>
+    <w:p/>
+    <w:p/>
+    <w:p/>
+    <w:p/>
+    <w:p/>
+    <w:p/>
+    <w:p/>
+    <w:p/>
+    <w:p/>
+    <w:p/>
+    <w:p/>
+    <w:p/>
+    <w:p/>
+    <w:p/>
+    <w:p>
+      <w:pPr>
+        <w:pStyle w:val="Titre1"/>
+        <w:numPr>
+          <w:ilvl w:val="0"/>
+          <w:numId w:val="10"/>
+        </w:numPr>
+      </w:pPr>
+      <w:bookmarkStart w:id="2" w:name="_Toc190442839"/>
+      <w:r>
+        <w:lastRenderedPageBreak/>
+        <w:t>Partie C++ (Client)</w:t>
+      </w:r>
+      <w:bookmarkEnd w:id="2"/>
+    </w:p>
+    <w:p/>
+    <w:p>
+      <w:pPr>
+        <w:pStyle w:val="Titre2"/>
+        <w:numPr>
+          <w:ilvl w:val="0"/>
+          <w:numId w:val="13"/>
+        </w:numPr>
+      </w:pPr>
+      <w:bookmarkStart w:id="3" w:name="_Toc190442840"/>
+      <w:r>
+        <w:t xml:space="preserve">Présentation de la partie </w:t>
+      </w:r>
+      <w:r>
+        <w:t>C++</w:t>
+      </w:r>
+      <w:bookmarkEnd w:id="3"/>
+    </w:p>
+    <w:p/>
+    <w:p>
+      <w:r>
+        <w:t xml:space="preserve">La partie client de notre projet est responsable de la gestion des formes géométriques en deux dimensions. </w:t>
+      </w:r>
+    </w:p>
+    <w:p/>
+    <w:p>
+      <w:pPr>
+        <w:pStyle w:val="Titre2"/>
+        <w:numPr>
+          <w:ilvl w:val="0"/>
+          <w:numId w:val="13"/>
+        </w:numPr>
+      </w:pPr>
+      <w:bookmarkStart w:id="4" w:name="_Toc190442841"/>
+      <w:r>
+        <w:t>Gestion des formes géométriques</w:t>
+      </w:r>
+      <w:bookmarkEnd w:id="4"/>
+    </w:p>
+    <w:p/>
+    <w:p>
+      <w:pPr>
+        <w:pStyle w:val="Titre3"/>
+        <w:numPr>
+          <w:ilvl w:val="0"/>
+          <w:numId w:val="14"/>
+        </w:numPr>
+      </w:pPr>
+      <w:bookmarkStart w:id="5" w:name="_Toc190442842"/>
+      <w:r>
+        <w:t>Représentation d’un point</w:t>
+      </w:r>
+      <w:bookmarkEnd w:id="5"/>
+    </w:p>
+    <w:p/>
+    <w:p>
+      <w:r>
+        <w:t>La représentation d’un point dans un espace bidimensionnel repose sur la classe « Vecteur2D ». Cette classe, comprenant deux coordonnées « x » et « y »</w:t>
+      </w:r>
+      <w:r>
+        <w:t>,</w:t>
+      </w:r>
+      <w:r>
+        <w:t xml:space="preserve"> constitue la base pour la gestion des formes géométriques en deux dimensions. </w:t>
+      </w:r>
+    </w:p>
+    <w:p>
+      <w:r>
+        <w:t>Elle</w:t>
+      </w:r>
+      <w:r>
+        <w:t xml:space="preserve"> permet de représenter un point </w:t>
+      </w:r>
+      <w:r>
+        <w:t>à l’aide d’un couple de réels et de réaliser dessus les opérations mathématiques fondamentales à savoir l’addition, la soustraction, la multiplication par un scalaire, ainsi que le calcul de la norme et du déterminent.</w:t>
+      </w:r>
+    </w:p>
+    <w:p>
+      <w:r>
+        <w:t>Toutes ces opérations sont notamment utilisées lors de la manipulation des formes.</w:t>
+      </w:r>
+      <w:r>
+        <w:t xml:space="preserve"> Cette classe se situe dans le dossier « geometrie » du projet.</w:t>
+      </w:r>
+    </w:p>
+    <w:p/>
+    <w:p>
+      <w:pPr>
+        <w:pStyle w:val="Titre3"/>
+        <w:numPr>
+          <w:ilvl w:val="0"/>
+          <w:numId w:val="14"/>
+        </w:numPr>
+      </w:pPr>
+      <w:bookmarkStart w:id="6" w:name="_Toc190442843"/>
+      <w:r>
+        <w:t>Représentation de formes</w:t>
+      </w:r>
+      <w:bookmarkEnd w:id="6"/>
+    </w:p>
+    <w:p/>
+    <w:p>
+      <w:r>
+        <w:t xml:space="preserve">Dans notre projet, les formes géométriques héritent d’une classe parent </w:t>
+      </w:r>
+      <w:r>
+        <w:t xml:space="preserve">(abstraite) </w:t>
+      </w:r>
+      <w:r>
+        <w:t xml:space="preserve">commune nommée « Forme ». Cette dernière, </w:t>
+      </w:r>
+      <w:r>
+        <w:t>définit les attributs et comportements communs à toutes les formes, notamment leur couleur.</w:t>
+      </w:r>
+    </w:p>
+    <w:p>
+      <w:r>
+        <w:t>Il existe deux types de formes :</w:t>
+      </w:r>
+    </w:p>
+    <w:p>
+      <w:pPr>
+        <w:pStyle w:val="Paragraphedeliste"/>
+        <w:numPr>
+          <w:ilvl w:val="0"/>
+          <w:numId w:val="15"/>
+        </w:numPr>
+      </w:pPr>
+      <w:r>
+        <w:t xml:space="preserve">Les formes </w:t>
+      </w:r>
+      <w:r>
+        <w:rPr>
+          <w:i/>
+          <w:iCs/>
+        </w:rPr>
+        <w:t>simples</w:t>
+      </w:r>
+      <w:r>
+        <w:t> : Il s’agit de formes élémentaires comme les cercles, les segments, les triangles ou les polygones. Elles sont définies par un certain nombre de points et une couleur</w:t>
+      </w:r>
+      <w:r>
+        <w:t>.</w:t>
+      </w:r>
+    </w:p>
+    <w:p>
+      <w:pPr>
+        <w:pStyle w:val="Paragraphedeliste"/>
+      </w:pPr>
+    </w:p>
+    <w:p>
+      <w:pPr>
+        <w:pStyle w:val="Paragraphedeliste"/>
+        <w:numPr>
+          <w:ilvl w:val="0"/>
+          <w:numId w:val="15"/>
+        </w:numPr>
+      </w:pPr>
+      <w:r>
+        <w:t xml:space="preserve">Les formes </w:t>
+      </w:r>
+      <w:r>
+        <w:rPr>
+          <w:i/>
+          <w:iCs/>
+        </w:rPr>
+        <w:t>composées</w:t>
+      </w:r>
+      <w:r>
+        <w:t> : Il s’agit de groupes de formes simples qui permettent de créer des structures géométriques plus complexes. Elles sont constituées de plusieurs formes simples</w:t>
+      </w:r>
+      <w:r>
+        <w:t xml:space="preserve"> ou composées</w:t>
+      </w:r>
+      <w:r>
+        <w:t xml:space="preserve"> et peuvent être manipulées comme une seule entité.</w:t>
+      </w:r>
+    </w:p>
+    <w:p>
+      <w:r>
+        <w:t>Nos formes simples sont représentées par les classes « Cercle », « Segment », « Triangle » et « Polygone ». Les formes composées sont-elles, représentées par une seule et unique classe nommée « Groupe ». Toutes ces classes sont situées dans le dossier « formes » de l’arborescence du projet.</w:t>
+      </w:r>
+    </w:p>
+    <w:p>
+      <w:r>
+        <w:t>Afin de répondre à des contraintes éprouvées au cours de la conception de l’application, chaque forme implémente différentes fonctions ayant pour but de permettre la réalisation d’actions dans d’autres partie du projet.</w:t>
+      </w:r>
+    </w:p>
+    <w:p>
+      <w:r>
+        <w:lastRenderedPageBreak/>
+        <w:t>Ces fonctions sont séparables en trois catégories :</w:t>
+      </w:r>
+    </w:p>
+    <w:p/>
+    <w:p>
+      <w:pPr>
+        <w:pStyle w:val="Paragraphedeliste"/>
+        <w:numPr>
+          <w:ilvl w:val="0"/>
+          <w:numId w:val="17"/>
+        </w:numPr>
+      </w:pPr>
+      <w:r>
+        <w:t>F</w:t>
+      </w:r>
+      <w:r>
+        <w:t xml:space="preserve">onctions de centrage – </w:t>
+      </w:r>
+      <w:r>
+        <w:rPr>
+          <w:i/>
+          <w:iCs/>
+        </w:rPr>
+        <w:t>bornes()</w:t>
+      </w:r>
+      <w:r>
+        <w:t xml:space="preserve"> et </w:t>
+      </w:r>
+      <w:r>
+        <w:rPr>
+          <w:i/>
+          <w:iCs/>
+        </w:rPr>
+        <w:t>calculerCentre()</w:t>
+      </w:r>
+    </w:p>
+    <w:p>
+      <w:r>
+        <w:t xml:space="preserve">Elles permettent de calculer les bornes et le centre d’une forme. Ces calculs sont notamment nécessaires pour centrer les formes à dessiner afin d’obtenir un affichage plus propre. </w:t>
+      </w:r>
+      <w:r>
+        <w:t>Le calcul du centre est relativement facile lorsqu’il s’agit de formes simples, cependant, lorsqu’on doit traiter des formes composées (groupe de formes simples), le problème devient plus complexe. C’est pour cela que nous avons implémenté une méthode permettant de récupérer les bornes d’une forme. Cette méthode s’appare</w:t>
+      </w:r>
+      <w:r>
+        <w:t>nte à ce que l’on appel plus communément un « GetBoundingBox</w:t>
+      </w:r>
+      <w:r>
+        <w:t xml:space="preserve"> </w:t>
+      </w:r>
+      <w:r>
+        <w:t>».</w:t>
+      </w:r>
+      <w:r>
+        <w:t xml:space="preserve"> </w:t>
+      </w:r>
+    </w:p>
+    <w:p/>
+    <w:p>
+      <w:pPr>
+        <w:pStyle w:val="Paragraphedeliste"/>
+        <w:numPr>
+          <w:ilvl w:val="0"/>
+          <w:numId w:val="17"/>
+        </w:numPr>
+      </w:pPr>
+      <w:r>
+        <w:t xml:space="preserve">Transformation monde-écran – </w:t>
+      </w:r>
+      <w:r>
+        <w:rPr>
+          <w:i/>
+          <w:iCs/>
+        </w:rPr>
+        <w:t>homothétie()</w:t>
+      </w:r>
+      <w:r>
+        <w:t xml:space="preserve"> </w:t>
+      </w:r>
+      <w:r>
+        <w:t xml:space="preserve">et </w:t>
+      </w:r>
+      <w:r>
+        <w:rPr>
+          <w:i/>
+          <w:iCs/>
+        </w:rPr>
+        <w:t>translation()</w:t>
+      </w:r>
+    </w:p>
+    <w:p>
+      <w:r>
+        <w:t>C</w:t>
+      </w:r>
+      <w:r>
+        <w:t>es deux fonctions permettent de réaliser une transformation monde-écran des coordonnées de la forme afin d’obtenir un affichage adapté aux dimensions de la fenêtre créée.</w:t>
+      </w:r>
+    </w:p>
+    <w:p/>
+    <w:p>
+      <w:pPr>
+        <w:pStyle w:val="Paragraphedeliste"/>
+        <w:numPr>
+          <w:ilvl w:val="0"/>
+          <w:numId w:val="17"/>
+        </w:numPr>
+      </w:pPr>
+      <w:r>
+        <w:t xml:space="preserve">Opérations mathématiques – </w:t>
+      </w:r>
+      <w:r>
+        <w:rPr>
+          <w:i/>
+          <w:iCs/>
+        </w:rPr>
+        <w:t>aire()</w:t>
+      </w:r>
+      <w:r>
+        <w:t xml:space="preserve"> </w:t>
+      </w:r>
+      <w:r>
+        <w:t xml:space="preserve">et </w:t>
+      </w:r>
+      <w:r>
+        <w:rPr>
+          <w:i/>
+          <w:iCs/>
+        </w:rPr>
+        <w:t>rotation()</w:t>
+      </w:r>
+    </w:p>
+    <w:p>
+      <w:r>
+        <w:t>Non-essentielles</w:t>
+      </w:r>
+      <w:r>
+        <w:t>.</w:t>
+      </w:r>
+    </w:p>
+    <w:p/>
+    <w:p>
+      <w:pPr>
+        <w:pStyle w:val="Titre2"/>
+        <w:numPr>
+          <w:ilvl w:val="0"/>
+          <w:numId w:val="13"/>
+        </w:numPr>
+      </w:pPr>
+      <w:bookmarkStart w:id="7" w:name="_Toc190442844"/>
+      <w:r>
+        <w:t>Gestion du Viewport</w:t>
+      </w:r>
+      <w:bookmarkEnd w:id="7"/>
+    </w:p>
+    <w:p/>
+    <w:p>
+      <w:pPr>
+        <w:pStyle w:val="Titre3"/>
+        <w:numPr>
+          <w:ilvl w:val="0"/>
+          <w:numId w:val="18"/>
+        </w:numPr>
+      </w:pPr>
+      <w:bookmarkStart w:id="8" w:name="_Toc190442845"/>
+      <w:r>
+        <w:t>Rôle du Viewport</w:t>
+      </w:r>
+      <w:bookmarkEnd w:id="8"/>
+    </w:p>
+    <w:p/>
+    <w:p>
+      <w:r>
+        <w:t>La classe « Viewport » permet de gérer la conversion des formes définies dans un espace de monde en formes adaptées à l’affichage sur l’écran. C’est notamment elle, qui s’occupe d’utiliser les fonctions présentes dans les classes formes afin de réaliser cette transformation.</w:t>
+      </w:r>
+    </w:p>
+    <w:p/>
+    <w:p>
+      <w:pPr>
+        <w:pStyle w:val="Titre3"/>
+        <w:numPr>
+          <w:ilvl w:val="0"/>
+          <w:numId w:val="18"/>
+        </w:numPr>
+      </w:pPr>
+      <w:bookmarkStart w:id="9" w:name="_Toc190442846"/>
+      <w:r>
+        <w:t>Attributs du Viewport</w:t>
+      </w:r>
+      <w:bookmarkEnd w:id="9"/>
+    </w:p>
+    <w:p/>
+    <w:p>
+      <w:r>
+        <w:t>Le Viewport est constitué</w:t>
+      </w:r>
+      <w:r>
+        <w:t xml:space="preserve"> de plusieurs champs permettant la réalisation de différents calculs. Les champs « _coinMin » et « _coinMax », définissent les limites du monde visible. Il</w:t>
+      </w:r>
+      <w:r>
+        <w:t xml:space="preserve">s </w:t>
+      </w:r>
+      <w:r>
+        <w:t xml:space="preserve">sont </w:t>
+      </w:r>
+      <w:r>
+        <w:t>différentiables des champs « _largeurEcran » et « _hauteurEcran » qui représentent eux, les dimensions de la fenêtre d’affichage.</w:t>
+      </w:r>
+      <w:r>
+        <w:t xml:space="preserve"> Le</w:t>
+      </w:r>
+      <w:r>
+        <w:t xml:space="preserve">s autres </w:t>
+      </w:r>
+      <w:r>
+        <w:t xml:space="preserve">champs, permettent de gérer la mise à l’échelle des formes, en calculant notamment </w:t>
+      </w:r>
+      <w:r>
+        <w:t>le facteur de zoom (« _facteurZoom »), à partir des échelles « _echelleX » et « _echelleY ».</w:t>
+      </w:r>
+    </w:p>
+    <w:p>
+      <w:pPr>
+        <w:jc w:val="center"/>
+      </w:pPr>
+    </w:p>
+    <w:p>
+      <w:pPr>
+        <w:jc w:val="center"/>
+      </w:pPr>
+    </w:p>
+    <w:p>
+      <w:pPr>
+        <w:jc w:val="center"/>
+      </w:pPr>
+    </w:p>
+    <w:p>
+      <w:pPr>
+        <w:jc w:val="center"/>
+        <w:rPr>
+          <w:rFonts w:eastAsiaTheme="minorEastAsia"/>
+        </w:rPr>
+      </w:pPr>
+      <w:r>
+        <w:rPr>
+          <w:rFonts w:eastAsiaTheme="minorEastAsia"/>
+        </w:rPr>
+        <w:t xml:space="preserve">            </w:t>
+      </w:r>
+    </w:p>
+    <w:p>
+      <w:pPr>
+        <w:rPr>
+          <w:rFonts w:eastAsiaTheme="minorEastAsia"/>
+        </w:rPr>
+      </w:pPr>
+      <w:r>
+        <w:rPr>
+          <w:rFonts w:eastAsiaTheme="minorEastAsia"/>
+        </w:rPr>
+        <w:lastRenderedPageBreak/>
+        <w:t>Voici quelques informations complémentaires sur ces calculs :</w:t>
+      </w:r>
+    </w:p>
+    <w:p>
+      <w:pPr>
+        <w:rPr>
+          <w:rFonts w:eastAsiaTheme="minorEastAsia"/>
+        </w:rPr>
+      </w:pPr>
+    </w:p>
+    <w:p>
+      <w:pPr>
+        <w:pStyle w:val="Paragraphedeliste"/>
+        <w:numPr>
+          <w:ilvl w:val="0"/>
+          <w:numId w:val="17"/>
+        </w:numPr>
+        <w:rPr>
+          <w:rFonts w:eastAsiaTheme="minorEastAsia"/>
+        </w:rPr>
+      </w:pPr>
+      <w:r>
+        <w:rPr>
+          <w:rFonts w:eastAsiaTheme="minorEastAsia"/>
+        </w:rPr>
+        <w:t>Calcul des échelles sur chaque axe</w:t>
+      </w:r>
+    </w:p>
+    <w:p>
+      <w:pPr>
+        <w:rPr>
+          <w:rFonts w:eastAsiaTheme="minorEastAsia"/>
+        </w:rPr>
+      </w:pPr>
+      <w:r>
+        <w:rPr>
+          <w:rFonts w:eastAsiaTheme="minorEastAsia"/>
+        </w:rPr>
+        <w:t>Pour transformer correctement les coordonnées du monde en pixels, on doit calculer deux facteurs d’échelle. Chaque facteur indique le nombre de pixels disponibles pour chaque unité de distance sur leur axe respectif.</w:t>
+      </w:r>
+    </w:p>
+    <w:p>
+      <w:pPr>
+        <w:rPr>
+          <w:rFonts w:eastAsiaTheme="minorEastAsia"/>
+        </w:rPr>
+      </w:pPr>
+      <m:oMathPara>
+        <m:oMath>
+          <m:r>
+            <w:rPr>
+              <w:rFonts w:ascii="Cambria Math" w:hAnsi="Cambria Math"/>
+            </w:rPr>
+            <m:t>echelleX=</m:t>
+          </m:r>
+          <m:f>
+            <m:fPr>
+              <m:ctrlPr>
+                <w:rPr>
+                  <w:rFonts w:ascii="Cambria Math" w:hAnsi="Cambria Math"/>
+                  <w:i/>
+                </w:rPr>
+              </m:ctrlPr>
+            </m:fPr>
+            <m:num>
+              <m:r>
+                <w:rPr>
+                  <w:rFonts w:ascii="Cambria Math" w:hAnsi="Cambria Math"/>
+                </w:rPr>
+                <m:t>largeurEcran</m:t>
+              </m:r>
+            </m:num>
+            <m:den>
+              <m:r>
+                <w:rPr>
+                  <w:rFonts w:ascii="Cambria Math" w:hAnsi="Cambria Math"/>
+                </w:rPr>
+                <m:t>coinMax.x-coinMin.x</m:t>
+              </m:r>
+            </m:den>
+          </m:f>
+          <m:r>
+            <w:rPr>
+              <w:rFonts w:ascii="Cambria Math" w:hAnsi="Cambria Math"/>
+            </w:rPr>
+            <m:t xml:space="preserve">       echelleY=</m:t>
+          </m:r>
+          <m:f>
+            <m:fPr>
+              <m:ctrlPr>
+                <w:rPr>
+                  <w:rFonts w:ascii="Cambria Math" w:hAnsi="Cambria Math"/>
+                  <w:i/>
+                </w:rPr>
+              </m:ctrlPr>
+            </m:fPr>
+            <m:num>
+              <m:r>
+                <w:rPr>
+                  <w:rFonts w:ascii="Cambria Math" w:hAnsi="Cambria Math"/>
+                </w:rPr>
+                <m:t>hauteurEcran</m:t>
+              </m:r>
+            </m:num>
+            <m:den>
+              <m:r>
+                <w:rPr>
+                  <w:rFonts w:ascii="Cambria Math" w:hAnsi="Cambria Math"/>
+                </w:rPr>
+                <m:t>coinMax.y-coinMin.y</m:t>
+              </m:r>
+            </m:den>
+          </m:f>
+        </m:oMath>
+      </m:oMathPara>
+    </w:p>
+    <w:p>
+      <w:pPr>
+        <w:rPr>
+          <w:rFonts w:eastAsiaTheme="minorEastAsia"/>
+        </w:rPr>
+      </w:pPr>
+    </w:p>
+    <w:p>
+      <w:pPr>
+        <w:pStyle w:val="Paragraphedeliste"/>
+        <w:numPr>
+          <w:ilvl w:val="0"/>
+          <w:numId w:val="17"/>
+        </w:numPr>
+        <w:rPr>
+          <w:rFonts w:eastAsiaTheme="minorEastAsia"/>
+        </w:rPr>
+      </w:pPr>
+      <w:r>
+        <w:rPr>
+          <w:rFonts w:eastAsiaTheme="minorEastAsia"/>
+        </w:rPr>
+        <w:t>Calcul du facteur de zoom</w:t>
+      </w:r>
+    </w:p>
+    <w:p>
+      <w:pPr>
+        <w:rPr>
+          <w:rFonts w:eastAsiaTheme="minorEastAsia"/>
+        </w:rPr>
+      </w:pPr>
+      <w:r>
+        <w:rPr>
+          <w:rFonts w:eastAsiaTheme="minorEastAsia"/>
+        </w:rPr>
+        <w:t>Afin d’ajuster les formes à la taille de l’écran, nous avons besoin d’appliquer un zoom (pouvant être négatif si l’on doit dézoomer). Cependant, les échelles (sur « x » et « y ») peuvent être différentes, c’est pourquoi il est essentiel de choisir le facteur d’échelle minimum pour éviter toute déformation de la forme.</w:t>
+      </w:r>
+    </w:p>
+    <w:p>
+      <w:pPr>
+        <w:rPr>
+          <w:rFonts w:eastAsiaTheme="minorEastAsia"/>
+        </w:rPr>
+      </w:pPr>
+      <m:oMathPara>
+        <m:oMath>
+          <m:r>
+            <w:rPr>
+              <w:rFonts w:ascii="Cambria Math" w:hAnsi="Cambria Math" w:cs="Cambria Math"/>
+            </w:rPr>
+            <m:t>facteurZoom</m:t>
+          </m:r>
+          <m:r>
+            <m:rPr>
+              <m:sty m:val="p"/>
+            </m:rPr>
+            <w:rPr>
+              <w:rFonts w:ascii="Cambria Math" w:hAnsi="Cambria Math" w:cs="Cambria Math"/>
+            </w:rPr>
+            <m:t>=</m:t>
+          </m:r>
+          <m:r>
+            <m:rPr>
+              <m:sty m:val="p"/>
+            </m:rPr>
+            <w:rPr>
+              <w:rFonts w:ascii="Cambria Math" w:eastAsiaTheme="minorEastAsia" w:hAnsi="Cambria Math"/>
+            </w:rPr>
+            <m:t>min</m:t>
+          </m:r>
+          <m:r>
+            <w:rPr>
+              <w:rFonts w:ascii="Cambria Math" w:eastAsiaTheme="minorEastAsia" w:hAnsi="Cambria Math"/>
+            </w:rPr>
+            <m:t>(echelleX, echelleY)</m:t>
+          </m:r>
+        </m:oMath>
+      </m:oMathPara>
+    </w:p>
+    <w:p>
+      <w:pPr>
+        <w:rPr>
+          <w:rFonts w:eastAsiaTheme="minorEastAsia"/>
+        </w:rPr>
+      </w:pPr>
+    </w:p>
+    <w:p>
+      <w:pPr>
+        <w:pStyle w:val="Titre3"/>
+        <w:numPr>
+          <w:ilvl w:val="0"/>
+          <w:numId w:val="18"/>
+        </w:numPr>
+        <w:rPr>
+          <w:rFonts w:eastAsiaTheme="minorEastAsia"/>
+        </w:rPr>
+      </w:pPr>
+      <w:bookmarkStart w:id="10" w:name="_Toc190442847"/>
+      <w:r>
+        <w:rPr>
+          <w:rFonts w:eastAsiaTheme="minorEastAsia"/>
+        </w:rPr>
+        <w:t>Transformation monde-écran</w:t>
+      </w:r>
+      <w:bookmarkEnd w:id="10"/>
+    </w:p>
+    <w:p/>
+    <w:p>
+      <w:r>
+        <w:t>Cette transformation permet de convertir les coordonnées du monde (modèle mathématique classique) en coordonnées écran (les pixels de la fenêtre d’affichage). Concrètement, elle réalise trois opérations successives dans un ordre précis :</w:t>
+      </w:r>
+    </w:p>
+    <w:p/>
+    <w:p>
+      <w:pPr>
+        <w:pStyle w:val="Paragraphedeliste"/>
+        <w:numPr>
+          <w:ilvl w:val="0"/>
+          <w:numId w:val="17"/>
+        </w:numPr>
+      </w:pPr>
+      <w:r>
+        <w:t>Translation pour centrer le monde</w:t>
+      </w:r>
+    </w:p>
+    <w:p>
+      <w:r>
+        <w:t>La première opération consiste à déplacer la forme en soustrayant le vecteur représentant le centre du monde. Cela permet de recentrer le système de coordonnées pour que le centre du monde corresponde à l’origine (0, 0).</w:t>
+      </w:r>
+    </w:p>
+    <w:p/>
+    <w:p>
+      <w:pPr>
+        <w:pStyle w:val="Paragraphedeliste"/>
+        <w:numPr>
+          <w:ilvl w:val="0"/>
+          <w:numId w:val="17"/>
+        </w:numPr>
+      </w:pPr>
+      <w:r>
+        <w:t>Homothétie pour zoomer</w:t>
+      </w:r>
+    </w:p>
+    <w:p>
+      <w:r>
+        <w:t>Une fois centrée, on applique une homothétie par rapport à l’origine (0, 0) avec le facteur de zoom. Cette opération permet d’ajuster le niveau de zoom de la scène.</w:t>
+      </w:r>
+    </w:p>
+    <w:p/>
+    <w:p/>
+    <w:p/>
+    <w:p/>
+    <w:p/>
+    <w:p>
+      <w:pPr>
+        <w:pStyle w:val="Paragraphedeliste"/>
+        <w:numPr>
+          <w:ilvl w:val="0"/>
+          <w:numId w:val="17"/>
+        </w:numPr>
+      </w:pPr>
+      <w:r>
+        <w:lastRenderedPageBreak/>
+        <w:t>Translation pour centrer l’écran</w:t>
+      </w:r>
+    </w:p>
+    <w:p>
+      <w:r>
+        <w:t>Pour finir, on applique une dernière translation de façon à placer l’origine (0, 0) au centre de l’écran. Ce vecteur de translation est calculé à partir de la moitié de la largeur et de la hauteur de l’écran, ce qui recentre la forme dans la fenêtre d’affichage. Cependant, il est important de comprendre que ce centrage ne signifie pas que le centre de la forme se trouvera forcément au centre de l’écran. En effet, si le centre de la forme ne se situe pas au centre du monde (dans le monde mathématique classique), alors son centre ne sera également pas centré sur la fenêtre (monde écran). C’est pour cela que nous avons implémenté d’autres méthodes afin d’avoir la possibilité de déplacer la forme au centre de l’écran (</w:t>
+      </w:r>
+      <w:r>
+        <w:t>voir III.2.b</w:t>
+      </w:r>
+      <w:r>
+        <w:t>)</w:t>
+      </w:r>
+      <w:r>
+        <w:t>.</w:t>
+      </w:r>
+    </w:p>
+    <w:p/>
+    <w:p>
+      <w:pPr>
+        <w:pStyle w:val="Titre2"/>
+        <w:numPr>
+          <w:ilvl w:val="0"/>
+          <w:numId w:val="13"/>
+        </w:numPr>
+      </w:pPr>
+      <w:bookmarkStart w:id="11" w:name="_Toc190442848"/>
+      <w:r>
+        <w:t>Client TCP/IP</w:t>
+      </w:r>
+      <w:bookmarkEnd w:id="11"/>
+    </w:p>
+    <w:p/>
+    <w:p>
+      <w:pPr>
+        <w:pStyle w:val="Titre3"/>
+        <w:numPr>
+          <w:ilvl w:val="0"/>
+          <w:numId w:val="22"/>
+        </w:numPr>
+      </w:pPr>
+      <w:bookmarkStart w:id="12" w:name="_Toc190442849"/>
+      <w:r>
+        <w:t>Rôle du Client TCP/IP</w:t>
+      </w:r>
+      <w:bookmarkEnd w:id="12"/>
+    </w:p>
+    <w:p/>
+    <w:p>
+      <w:r>
+        <w:t>Le client TCP/IP, implémenté dans la classe « Client » permet la communication entre la partie client (C++) et la partie serveur (Java). Elle rend notamment possible l’envoi et la réception de données entre une machine cliente et le serveur en fournissant diverses méthodes.</w:t>
+      </w:r>
+    </w:p>
+    <w:p/>
+    <w:p>
+      <w:pPr>
+        <w:pStyle w:val="Titre3"/>
+        <w:numPr>
+          <w:ilvl w:val="0"/>
+          <w:numId w:val="22"/>
+        </w:numPr>
+      </w:pPr>
+      <w:bookmarkStart w:id="13" w:name="_Toc190442850"/>
+      <w:r>
+        <w:t>Attributs du Client</w:t>
+      </w:r>
+      <w:bookmarkEnd w:id="13"/>
+    </w:p>
+    <w:p/>
+    <w:p>
+      <w:r>
+        <w:t>Le client est composé de plusieurs champs nécessaires à son bon fonctionnement</w:t>
+      </w:r>
+    </w:p>
+    <w:p/>
+    <w:p/>
+    <w:p/>
+    <w:p/>
+    <w:p>
+      <w:pPr>
+        <w:pStyle w:val="Titre2"/>
+        <w:numPr>
+          <w:ilvl w:val="0"/>
+          <w:numId w:val="13"/>
+        </w:numPr>
+      </w:pPr>
+      <w:bookmarkStart w:id="14" w:name="_Toc190442851"/>
+      <w:r>
+        <w:t>Design Patterns</w:t>
+      </w:r>
+      <w:bookmarkEnd w:id="14"/>
+    </w:p>
+    <w:p/>
+    <w:p>
+      <w:pPr>
+        <w:pStyle w:val="Titre3"/>
+        <w:numPr>
+          <w:ilvl w:val="0"/>
+          <w:numId w:val="20"/>
+        </w:numPr>
+        <w:rPr>
+          <w:lang w:val="en-US"/>
+        </w:rPr>
+      </w:pPr>
+      <w:bookmarkStart w:id="15" w:name="_Toc190442852"/>
+      <w:r>
+        <w:rPr>
+          <w:lang w:val="en-US"/>
+        </w:rPr>
+        <w:t>Pattern Chain Of Responsibility (COR)</w:t>
+      </w:r>
+      <w:bookmarkEnd w:id="15"/>
+    </w:p>
+    <w:p>
+      <w:pPr>
+        <w:rPr>
+          <w:lang w:val="en-US"/>
+        </w:rPr>
+      </w:pPr>
+    </w:p>
+    <w:p>
+      <w:r>
+        <w:t xml:space="preserve">Pour pouvoir </w:t>
+      </w:r>
+      <w:r>
+        <w:t>charger</w:t>
+      </w:r>
+      <w:r>
+        <w:t xml:space="preserve"> </w:t>
+      </w:r>
+      <w:r>
+        <w:t xml:space="preserve">efficacement les fichiers contenant les coordonnées de </w:t>
+      </w:r>
+      <w:r>
+        <w:t xml:space="preserve">nos </w:t>
+      </w:r>
+      <w:r>
+        <w:t xml:space="preserve">formes, nous avons implémenté le design pattern </w:t>
+      </w:r>
+      <w:r>
+        <w:rPr>
+          <w:i/>
+          <w:iCs/>
+        </w:rPr>
+        <w:t>Chain Of Responsibility</w:t>
+      </w:r>
+      <w:r>
+        <w:t xml:space="preserve">. Ce patron de conception nous a permis de gérer de manière flexible l’analyse d’une ligne </w:t>
+      </w:r>
+      <w:r>
+        <w:t xml:space="preserve">au format </w:t>
+      </w:r>
+      <w:r>
+        <w:rPr>
+          <w:i/>
+          <w:iCs/>
+        </w:rPr>
+        <w:t xml:space="preserve">char </w:t>
+      </w:r>
+      <w:r>
+        <w:t>et de retourner sa représentation sous forme de classe.</w:t>
+      </w:r>
+    </w:p>
+    <w:p>
+      <w:r>
+        <w:t>Voici le diagramme UML associé à cette partie :</w:t>
+      </w:r>
+    </w:p>
+    <w:p>
+      <w:r>
+        <w:rPr>
+          <w:noProof/>
+        </w:rPr>
+        <w:lastRenderedPageBreak/>
+        <w:drawing>
+          <wp:inline distT="0" distB="0" distL="0" distR="0" wp14:anchorId="021CF4A8" wp14:editId="35236552">
+            <wp:extent cx="5760720" cy="3583940"/>
+            <wp:effectExtent l="0" t="0" r="0" b="0"/>
+            <wp:docPr id="252902908" name="Image 1" descr="Une image contenant texte, diagramme, ligne, Parallèle&#10;&#10;Le contenu généré par l’IA peut être incorrect."/>
+            <wp:cNvGraphicFramePr>
+              <a:graphicFrameLocks xmlns:a="http://schemas.openxmlformats.org/drawingml/2006/main" noChangeAspect="1"/>
+            </wp:cNvGraphicFramePr>
+            <a:graphic xmlns:a="http://schemas.openxmlformats.org/drawingml/2006/main">
+              <a:graphicData uri="http://schemas.openxmlformats.org/drawingml/2006/picture">
+                <pic:pic xmlns:pic="http://schemas.openxmlformats.org/drawingml/2006/picture">
+                  <pic:nvPicPr>
+                    <pic:cNvPr id="252902908" name="Image 1" descr="Une image contenant texte, diagramme, ligne, Parallèle&#10;&#10;Le contenu généré par l’IA peut être incorrect."/>
+                    <pic:cNvPicPr/>
+                  </pic:nvPicPr>
+                  <pic:blipFill>
+                    <a:blip r:embed="rId8"/>
+                    <a:stretch>
+                      <a:fillRect/>
+                    </a:stretch>
+                  </pic:blipFill>
+                  <pic:spPr>
+                    <a:xfrm>
+                      <a:off x="0" y="0"/>
+                      <a:ext cx="5760720" cy="3583940"/>
+                    </a:xfrm>
+                    <a:prstGeom prst="rect">
+                      <a:avLst/>
+                    </a:prstGeom>
+                  </pic:spPr>
+                </pic:pic>
+              </a:graphicData>
+            </a:graphic>
+          </wp:inline>
+        </w:drawing>
+      </w:r>
+    </w:p>
+    <w:p>
+      <w:r>
+        <w:t>Ce patron de conception est basé sur une classe parent (abstraite) nommée « ChargeurForme »</w:t>
+      </w:r>
+      <w:r>
+        <w:t>,</w:t>
+      </w:r>
+      <w:r>
+        <w:t xml:space="preserve"> servant de point d’entrée pour le chargement des formes</w:t>
+      </w:r>
+      <w:r>
+        <w:t xml:space="preserve"> depuis des fichiers</w:t>
+      </w:r>
+      <w:r>
+        <w:t xml:space="preserve">. Elle est ensuite, implémentée par la classe « ChargeurFormeCOR » qui s’occupe de redéfinir la méthode </w:t>
+      </w:r>
+      <w:r>
+        <w:rPr>
+          <w:i/>
+          <w:iCs/>
+        </w:rPr>
+        <w:t>charger()</w:t>
+      </w:r>
+      <w:r>
+        <w:t> de la classe parent.</w:t>
+      </w:r>
+      <w:r>
+        <w:t xml:space="preserve"> Cette classe définie également une méthode abstraite </w:t>
+      </w:r>
+      <w:r>
+        <w:rPr>
+          <w:i/>
+          <w:iCs/>
+        </w:rPr>
+        <w:t>chargerTXT()</w:t>
+      </w:r>
+      <w:r>
+        <w:rPr>
+          <w:i/>
+          <w:iCs/>
+        </w:rPr>
+        <w:t xml:space="preserve"> </w:t>
+      </w:r>
+      <w:r>
+        <w:t xml:space="preserve">qui </w:t>
+      </w:r>
+      <w:r>
+        <w:t xml:space="preserve">sera notamment appelée dans la méthode </w:t>
+      </w:r>
+      <w:r>
+        <w:rPr>
+          <w:i/>
+          <w:iCs/>
+        </w:rPr>
+        <w:t>charger()</w:t>
+      </w:r>
+      <w:r>
+        <w:t>.</w:t>
+      </w:r>
+    </w:p>
+    <w:p>
+      <w:r>
+        <w:t>Chaque sous</w:t>
+      </w:r>
+      <w:r>
+        <w:t>-</w:t>
+      </w:r>
+      <w:r>
+        <w:t xml:space="preserve">classe s’occupe ensuite de définir la méthode </w:t>
+      </w:r>
+      <w:r>
+        <w:rPr>
+          <w:i/>
+          <w:iCs/>
+        </w:rPr>
+        <w:t>chargerTXT()</w:t>
+      </w:r>
+      <w:r>
+        <w:rPr>
+          <w:i/>
+          <w:iCs/>
+        </w:rPr>
+        <w:t xml:space="preserve"> </w:t>
+      </w:r>
+      <w:r>
+        <w:t>pour correspondre à la forme qu’elle représente.</w:t>
+      </w:r>
+      <w:r>
+        <w:t xml:space="preserve"> Cette approche rend facile l’extensibilité de l’application, étant donné qu’il </w:t>
+      </w:r>
+      <w:r>
+        <w:t>suffit d’ajouter une nouvelle méthode appropriée pour le chargement d’un nouveau type de fichier dans la classe « ChargeurFormeCOR » et de l’implémenter dans ses sous-classes.</w:t>
+      </w:r>
+    </w:p>
+    <w:p/>
+    <w:p>
+      <w:pPr>
+        <w:pStyle w:val="Titre3"/>
+        <w:numPr>
+          <w:ilvl w:val="0"/>
+          <w:numId w:val="20"/>
+        </w:numPr>
+      </w:pPr>
+      <w:bookmarkStart w:id="16" w:name="_Toc190442853"/>
+      <w:r>
+        <w:t>Pattern Visitor</w:t>
+      </w:r>
+      <w:bookmarkEnd w:id="16"/>
+    </w:p>
+    <w:p/>
+    <w:p>
+      <w:r>
+        <w:t>Nous avons également mis en œuvre le Design Pattern Visiteur afin de séparer les algorithmes de traitement des objets qu’ils manipulent. Ce parton nous a permis d’éviter d’alourdir nos classes formes avec des méthodes spécifiques à chaque type d’opération (dessin via TCP, dessin via OpenGL, sauvegarde).</w:t>
+      </w:r>
+    </w:p>
+    <w:p/>
+    <w:p/>
+    <w:p/>
+    <w:p/>
+    <w:p/>
+    <w:p/>
+    <w:p>
+      <w:r>
+        <w:lastRenderedPageBreak/>
+        <w:t>Voici le diagramme UML associé à cette partie :</w:t>
+      </w:r>
+    </w:p>
+    <w:p>
+      <w:r>
+        <w:drawing>
+          <wp:inline distT="0" distB="0" distL="0" distR="0" wp14:anchorId="2CFCD3C1" wp14:editId="0AF02432">
+            <wp:extent cx="5760720" cy="3318510"/>
+            <wp:effectExtent l="0" t="0" r="0" b="0"/>
+            <wp:docPr id="825084898" name="Image 1" descr="Une image contenant texte, diagramme, ligne, Police&#10;&#10;Le contenu généré par l’IA peut être incorrect."/>
+            <wp:cNvGraphicFramePr>
+              <a:graphicFrameLocks xmlns:a="http://schemas.openxmlformats.org/drawingml/2006/main" noChangeAspect="1"/>
+            </wp:cNvGraphicFramePr>
+            <a:graphic xmlns:a="http://schemas.openxmlformats.org/drawingml/2006/main">
+              <a:graphicData uri="http://schemas.openxmlformats.org/drawingml/2006/picture">
+                <pic:pic xmlns:pic="http://schemas.openxmlformats.org/drawingml/2006/picture">
+                  <pic:nvPicPr>
+                    <pic:cNvPr id="825084898" name="Image 1" descr="Une image contenant texte, diagramme, ligne, Police&#10;&#10;Le contenu généré par l’IA peut être incorrect."/>
+                    <pic:cNvPicPr/>
+                  </pic:nvPicPr>
+                  <pic:blipFill>
+                    <a:blip r:embed="rId9"/>
+                    <a:stretch>
+                      <a:fillRect/>
+                    </a:stretch>
+                  </pic:blipFill>
+                  <pic:spPr>
+                    <a:xfrm>
+                      <a:off x="0" y="0"/>
+                      <a:ext cx="5760720" cy="3318510"/>
+                    </a:xfrm>
+                    <a:prstGeom prst="rect">
+                      <a:avLst/>
+                    </a:prstGeom>
+                  </pic:spPr>
+                </pic:pic>
+              </a:graphicData>
+            </a:graphic>
+          </wp:inline>
+        </w:drawing>
+      </w:r>
+    </w:p>
+    <w:p>
+      <w:r>
+        <w:t>Ce patron de conception est basé sur une classe parent (abstraite) nommée « VisiteurForme », permettant de visiter une forme spécifique. Elle est ensuite implémentée par différentes sous classes s’occupant de gérer une partie métier spécifique.</w:t>
+      </w:r>
+    </w:p>
+    <w:p/>
+    <w:p>
+      <w:pPr>
+        <w:pStyle w:val="Paragraphedeliste"/>
+        <w:numPr>
+          <w:ilvl w:val="0"/>
+          <w:numId w:val="17"/>
+        </w:numPr>
+      </w:pPr>
+      <w:r>
+        <w:t>VisiteurDessinerTCP</w:t>
+      </w:r>
+    </w:p>
+    <w:p>
+      <w:r>
+        <w:t xml:space="preserve">C’est le visiteur le plus important du projet, étant donné que c’est lui qui s’occupe de faire le lien entre le client et le serveur. Les méthodes visiter de cette classe consiste simplement à construire une requête et de l’envoyer au serveur à l’aide de la classe dédiée évoqué au-dessus. </w:t>
+      </w:r>
+      <w:r>
+        <w:t>La requête est construite différemment en fonction de si on se trouve dans un groupe ou non. Dans tous les cas, la première requête contient les informations relatives à la fenêtre que l’on souhaite créer (informations définies par la classe « Viewport ». Voici le format de cette première requête :</w:t>
+      </w:r>
+    </w:p>
+    <w:p>
+      <w:pPr>
+        <w:rPr>
+          <w:rFonts w:eastAsiaTheme="minorEastAsia"/>
+        </w:rPr>
+      </w:pPr>
+      <m:oMathPara>
+        <m:oMath>
+          <m:r>
+            <w:rPr>
+              <w:rFonts w:ascii="Cambria Math" w:eastAsiaTheme="minorEastAsia" w:hAnsi="Cambria Math"/>
+            </w:rPr>
+            <m:t>largeurEcran hauteurEcran couleur</m:t>
+          </m:r>
+        </m:oMath>
+      </m:oMathPara>
+    </w:p>
+    <w:p>
+      <w:pPr>
+        <w:rPr>
+          <w:rFonts w:eastAsiaTheme="minorEastAsia"/>
+        </w:rPr>
+      </w:pPr>
+      <w:r>
+        <w:rPr>
+          <w:rFonts w:eastAsiaTheme="minorEastAsia"/>
+        </w:rPr>
+        <w:t>Les requêtes suivantes, contiennent les informations des formes au même format que le fichier d’entrée. Chaque forme est encapsulée dans une requête puis envoyée.</w:t>
+      </w:r>
+    </w:p>
+    <w:p>
+      <w:pPr>
+        <w:rPr>
+          <w:rFonts w:eastAsiaTheme="minorEastAsia"/>
+        </w:rPr>
+      </w:pPr>
+    </w:p>
+    <w:p>
+      <w:pPr>
+        <w:pStyle w:val="Paragraphedeliste"/>
+        <w:numPr>
+          <w:ilvl w:val="0"/>
+          <w:numId w:val="17"/>
+        </w:numPr>
+      </w:pPr>
+      <w:r>
+        <w:t>VisiteurSauvegarderTXT</w:t>
+      </w:r>
+    </w:p>
+    <w:p>
+      <w:r>
+        <w:t>Non-essentiel, il permet de sauvegarder une forme au format texte.</w:t>
+      </w:r>
+    </w:p>
+    <w:p/>
+    <w:p>
+      <w:pPr>
+        <w:pStyle w:val="Paragraphedeliste"/>
+        <w:numPr>
+          <w:ilvl w:val="0"/>
+          <w:numId w:val="17"/>
+        </w:numPr>
+      </w:pPr>
+      <w:r>
+        <w:t>VisiteurDessinerOpenGL</w:t>
+      </w:r>
+    </w:p>
+    <w:p>
+      <w:r>
+        <w:t xml:space="preserve">Rôle similaire au « VisiteurDessinerTCP » mais dans le cadre de l’utilisation d’OpenGL pour dessiner. Ses méthodes </w:t>
+      </w:r>
+      <w:r>
+        <w:rPr>
+          <w:i/>
+          <w:iCs/>
+        </w:rPr>
+        <w:t xml:space="preserve">visiter() </w:t>
+      </w:r>
+      <w:r>
+        <w:t>ne lancent donc aucune requête mais s’occupe simplement de dessiner dans une fenêtre OpenGL.</w:t>
+      </w:r>
+    </w:p>
+    <w:p>
+      <w:pPr>
+        <w:pStyle w:val="Titre3"/>
+        <w:numPr>
+          <w:ilvl w:val="0"/>
+          <w:numId w:val="20"/>
+        </w:numPr>
+      </w:pPr>
+      <w:bookmarkStart w:id="17" w:name="_Toc190442854"/>
+      <w:r>
+        <w:lastRenderedPageBreak/>
+        <w:t>Pattern Singleton</w:t>
+      </w:r>
+      <w:bookmarkEnd w:id="17"/>
+    </w:p>
+    <w:p/>
+    <w:p>
+      <w:r>
+        <w:t>Le pattern Singleton est utilisé dans notre projet pour garantir qu’une seule instance du client existe et est accessible globalement. Cette approche permet de centraliser la gestion du client et d’éviter des conflits liés à la création de multiples instances.</w:t>
+      </w:r>
+    </w:p>
+    <w:p/>
+    <w:p>
+      <w:pPr>
+        <w:pStyle w:val="Titre2"/>
+        <w:numPr>
+          <w:ilvl w:val="0"/>
+          <w:numId w:val="10"/>
+        </w:numPr>
+        <w:rPr>
+          <w:rFonts w:eastAsiaTheme="minorEastAsia"/>
+        </w:rPr>
+      </w:pPr>
+      <w:bookmarkStart w:id="18" w:name="_Toc190442855"/>
+      <w:r>
+        <w:rPr>
+          <w:rFonts w:eastAsiaTheme="minorEastAsia"/>
+        </w:rPr>
+        <w:t>Partie Java (Serveur)</w:t>
+      </w:r>
+      <w:bookmarkEnd w:id="18"/>
+    </w:p>
+    <w:p/>
+    <w:p/>
+    <w:p>
+      <w:pPr>
+        <w:pStyle w:val="Titre2"/>
+        <w:numPr>
+          <w:ilvl w:val="0"/>
+          <w:numId w:val="10"/>
+        </w:numPr>
+      </w:pPr>
+      <w:bookmarkStart w:id="19" w:name="_Toc190442856"/>
+      <w:r>
+        <w:t>Extension OpenGL</w:t>
+      </w:r>
+      <w:bookmarkEnd w:id="19"/>
+    </w:p>
+    <w:p>
+      <w:pPr>
+        <w:rPr>
+          <w:rFonts w:eastAsiaTheme="minorEastAsia"/>
+        </w:rPr>
+      </w:pPr>
+    </w:p>
     <w:p/>
     <w:sectPr>
-      <w:headerReference w:type="default" r:id="rId8"/>
-      <w:footerReference w:type="default" r:id="rId9"/>
-      <w:headerReference w:type="first" r:id="rId10"/>
+      <w:headerReference w:type="default" r:id="rId10"/>
+      <w:footerReference w:type="default" r:id="rId11"/>
+      <w:headerReference w:type="first" r:id="rId12"/>
       <w:pgSz w:w="11906" w:h="16838"/>
       <w:pgMar w:top="1417" w:right="1417" w:bottom="1417" w:left="1417" w:header="708" w:footer="708" w:gutter="0"/>
       <w:cols w:space="708"/>
@@ -632,6 +3941,95 @@
     </w:lvl>
   </w:abstractNum>
   <w:abstractNum w:abstractNumId="2" w15:restartNumberingAfterBreak="0">
+    <w:nsid w:val="0C1E16E4"/>
+    <w:multiLevelType w:val="hybridMultilevel"/>
+    <w:tmpl w:val="7B5047F4"/>
+    <w:lvl w:ilvl="0" w:tplc="040C0019">
+      <w:start w:val="1"/>
+      <w:numFmt w:val="lowerLetter"/>
+      <w:lvlText w:val="%1."/>
+      <w:lvlJc w:val="left"/>
+      <w:pPr>
+        <w:ind w:left="720" w:hanging="360"/>
+      </w:pPr>
+      <w:rPr>
+        <w:rFonts w:hint="default"/>
+      </w:rPr>
+    </w:lvl>
+    <w:lvl w:ilvl="1" w:tplc="040C0019" w:tentative="1">
+      <w:start w:val="1"/>
+      <w:numFmt w:val="lowerLetter"/>
+      <w:lvlText w:val="%2."/>
+      <w:lvlJc w:val="left"/>
+      <w:pPr>
+        <w:ind w:left="1440" w:hanging="360"/>
+      </w:pPr>
+    </w:lvl>
+    <w:lvl w:ilvl="2" w:tplc="040C001B" w:tentative="1">
+      <w:start w:val="1"/>
+      <w:numFmt w:val="lowerRoman"/>
+      <w:lvlText w:val="%3."/>
+      <w:lvlJc w:val="right"/>
+      <w:pPr>
+        <w:ind w:left="2160" w:hanging="180"/>
+      </w:pPr>
+    </w:lvl>
+    <w:lvl w:ilvl="3" w:tplc="040C000F" w:tentative="1">
+      <w:start w:val="1"/>
+      <w:numFmt w:val="decimal"/>
+      <w:lvlText w:val="%4."/>
+      <w:lvlJc w:val="left"/>
+      <w:pPr>
+        <w:ind w:left="2880" w:hanging="360"/>
+      </w:pPr>
+    </w:lvl>
+    <w:lvl w:ilvl="4" w:tplc="040C0019" w:tentative="1">
+      <w:start w:val="1"/>
+      <w:numFmt w:val="lowerLetter"/>
+      <w:lvlText w:val="%5."/>
+      <w:lvlJc w:val="left"/>
+      <w:pPr>
+        <w:ind w:left="3600" w:hanging="360"/>
+      </w:pPr>
+    </w:lvl>
+    <w:lvl w:ilvl="5" w:tplc="040C001B" w:tentative="1">
+      <w:start w:val="1"/>
+      <w:numFmt w:val="lowerRoman"/>
+      <w:lvlText w:val="%6."/>
+      <w:lvlJc w:val="right"/>
+      <w:pPr>
+        <w:ind w:left="4320" w:hanging="180"/>
+      </w:pPr>
+    </w:lvl>
+    <w:lvl w:ilvl="6" w:tplc="040C000F" w:tentative="1">
+      <w:start w:val="1"/>
+      <w:numFmt w:val="decimal"/>
+      <w:lvlText w:val="%7."/>
+      <w:lvlJc w:val="left"/>
+      <w:pPr>
+        <w:ind w:left="5040" w:hanging="360"/>
+      </w:pPr>
+    </w:lvl>
+    <w:lvl w:ilvl="7" w:tplc="040C0019" w:tentative="1">
+      <w:start w:val="1"/>
+      <w:numFmt w:val="lowerLetter"/>
+      <w:lvlText w:val="%8."/>
+      <w:lvlJc w:val="left"/>
+      <w:pPr>
+        <w:ind w:left="5760" w:hanging="360"/>
+      </w:pPr>
+    </w:lvl>
+    <w:lvl w:ilvl="8" w:tplc="040C001B" w:tentative="1">
+      <w:start w:val="1"/>
+      <w:numFmt w:val="lowerRoman"/>
+      <w:lvlText w:val="%9."/>
+      <w:lvlJc w:val="right"/>
+      <w:pPr>
+        <w:ind w:left="6480" w:hanging="180"/>
+      </w:pPr>
+    </w:lvl>
+  </w:abstractNum>
+  <w:abstractNum w:abstractNumId="3" w15:restartNumberingAfterBreak="0">
     <w:nsid w:val="0D581642"/>
     <w:multiLevelType w:val="hybridMultilevel"/>
     <w:tmpl w:val="8A009CEA"/>
@@ -720,7 +4118,185 @@
       </w:pPr>
     </w:lvl>
   </w:abstractNum>
-  <w:abstractNum w:abstractNumId="3" w15:restartNumberingAfterBreak="0">
+  <w:abstractNum w:abstractNumId="4" w15:restartNumberingAfterBreak="0">
+    <w:nsid w:val="0F927F54"/>
+    <w:multiLevelType w:val="hybridMultilevel"/>
+    <w:tmpl w:val="5F9A2FEA"/>
+    <w:lvl w:ilvl="0" w:tplc="6884EF2E">
+      <w:start w:val="1"/>
+      <w:numFmt w:val="upperRoman"/>
+      <w:lvlText w:val="%1."/>
+      <w:lvlJc w:val="left"/>
+      <w:pPr>
+        <w:ind w:left="1080" w:hanging="720"/>
+      </w:pPr>
+      <w:rPr>
+        <w:rFonts w:hint="default"/>
+      </w:rPr>
+    </w:lvl>
+    <w:lvl w:ilvl="1" w:tplc="040C0019" w:tentative="1">
+      <w:start w:val="1"/>
+      <w:numFmt w:val="lowerLetter"/>
+      <w:lvlText w:val="%2."/>
+      <w:lvlJc w:val="left"/>
+      <w:pPr>
+        <w:ind w:left="1440" w:hanging="360"/>
+      </w:pPr>
+    </w:lvl>
+    <w:lvl w:ilvl="2" w:tplc="040C001B" w:tentative="1">
+      <w:start w:val="1"/>
+      <w:numFmt w:val="lowerRoman"/>
+      <w:lvlText w:val="%3."/>
+      <w:lvlJc w:val="right"/>
+      <w:pPr>
+        <w:ind w:left="2160" w:hanging="180"/>
+      </w:pPr>
+    </w:lvl>
+    <w:lvl w:ilvl="3" w:tplc="040C000F" w:tentative="1">
+      <w:start w:val="1"/>
+      <w:numFmt w:val="decimal"/>
+      <w:lvlText w:val="%4."/>
+      <w:lvlJc w:val="left"/>
+      <w:pPr>
+        <w:ind w:left="2880" w:hanging="360"/>
+      </w:pPr>
+    </w:lvl>
+    <w:lvl w:ilvl="4" w:tplc="040C0019" w:tentative="1">
+      <w:start w:val="1"/>
+      <w:numFmt w:val="lowerLetter"/>
+      <w:lvlText w:val="%5."/>
+      <w:lvlJc w:val="left"/>
+      <w:pPr>
+        <w:ind w:left="3600" w:hanging="360"/>
+      </w:pPr>
+    </w:lvl>
+    <w:lvl w:ilvl="5" w:tplc="040C001B" w:tentative="1">
+      <w:start w:val="1"/>
+      <w:numFmt w:val="lowerRoman"/>
+      <w:lvlText w:val="%6."/>
+      <w:lvlJc w:val="right"/>
+      <w:pPr>
+        <w:ind w:left="4320" w:hanging="180"/>
+      </w:pPr>
+    </w:lvl>
+    <w:lvl w:ilvl="6" w:tplc="040C000F" w:tentative="1">
+      <w:start w:val="1"/>
+      <w:numFmt w:val="decimal"/>
+      <w:lvlText w:val="%7."/>
+      <w:lvlJc w:val="left"/>
+      <w:pPr>
+        <w:ind w:left="5040" w:hanging="360"/>
+      </w:pPr>
+    </w:lvl>
+    <w:lvl w:ilvl="7" w:tplc="040C0019" w:tentative="1">
+      <w:start w:val="1"/>
+      <w:numFmt w:val="lowerLetter"/>
+      <w:lvlText w:val="%8."/>
+      <w:lvlJc w:val="left"/>
+      <w:pPr>
+        <w:ind w:left="5760" w:hanging="360"/>
+      </w:pPr>
+    </w:lvl>
+    <w:lvl w:ilvl="8" w:tplc="040C001B" w:tentative="1">
+      <w:start w:val="1"/>
+      <w:numFmt w:val="lowerRoman"/>
+      <w:lvlText w:val="%9."/>
+      <w:lvlJc w:val="right"/>
+      <w:pPr>
+        <w:ind w:left="6480" w:hanging="180"/>
+      </w:pPr>
+    </w:lvl>
+  </w:abstractNum>
+  <w:abstractNum w:abstractNumId="5" w15:restartNumberingAfterBreak="0">
+    <w:nsid w:val="1B9F4786"/>
+    <w:multiLevelType w:val="hybridMultilevel"/>
+    <w:tmpl w:val="5986D9D2"/>
+    <w:lvl w:ilvl="0" w:tplc="040C000F">
+      <w:start w:val="1"/>
+      <w:numFmt w:val="decimal"/>
+      <w:lvlText w:val="%1."/>
+      <w:lvlJc w:val="left"/>
+      <w:pPr>
+        <w:ind w:left="720" w:hanging="360"/>
+      </w:pPr>
+      <w:rPr>
+        <w:rFonts w:hint="default"/>
+      </w:rPr>
+    </w:lvl>
+    <w:lvl w:ilvl="1" w:tplc="040C0019" w:tentative="1">
+      <w:start w:val="1"/>
+      <w:numFmt w:val="lowerLetter"/>
+      <w:lvlText w:val="%2."/>
+      <w:lvlJc w:val="left"/>
+      <w:pPr>
+        <w:ind w:left="1440" w:hanging="360"/>
+      </w:pPr>
+    </w:lvl>
+    <w:lvl w:ilvl="2" w:tplc="040C001B" w:tentative="1">
+      <w:start w:val="1"/>
+      <w:numFmt w:val="lowerRoman"/>
+      <w:lvlText w:val="%3."/>
+      <w:lvlJc w:val="right"/>
+      <w:pPr>
+        <w:ind w:left="2160" w:hanging="180"/>
+      </w:pPr>
+    </w:lvl>
+    <w:lvl w:ilvl="3" w:tplc="040C000F" w:tentative="1">
+      <w:start w:val="1"/>
+      <w:numFmt w:val="decimal"/>
+      <w:lvlText w:val="%4."/>
+      <w:lvlJc w:val="left"/>
+      <w:pPr>
+        <w:ind w:left="2880" w:hanging="360"/>
+      </w:pPr>
+    </w:lvl>
+    <w:lvl w:ilvl="4" w:tplc="040C0019" w:tentative="1">
+      <w:start w:val="1"/>
+      <w:numFmt w:val="lowerLetter"/>
+      <w:lvlText w:val="%5."/>
+      <w:lvlJc w:val="left"/>
+      <w:pPr>
+        <w:ind w:left="3600" w:hanging="360"/>
+      </w:pPr>
+    </w:lvl>
+    <w:lvl w:ilvl="5" w:tplc="040C001B" w:tentative="1">
+      <w:start w:val="1"/>
+      <w:numFmt w:val="lowerRoman"/>
+      <w:lvlText w:val="%6."/>
+      <w:lvlJc w:val="right"/>
+      <w:pPr>
+        <w:ind w:left="4320" w:hanging="180"/>
+      </w:pPr>
+    </w:lvl>
+    <w:lvl w:ilvl="6" w:tplc="040C000F" w:tentative="1">
+      <w:start w:val="1"/>
+      <w:numFmt w:val="decimal"/>
+      <w:lvlText w:val="%7."/>
+      <w:lvlJc w:val="left"/>
+      <w:pPr>
+        <w:ind w:left="5040" w:hanging="360"/>
+      </w:pPr>
+    </w:lvl>
+    <w:lvl w:ilvl="7" w:tplc="040C0019" w:tentative="1">
+      <w:start w:val="1"/>
+      <w:numFmt w:val="lowerLetter"/>
+      <w:lvlText w:val="%8."/>
+      <w:lvlJc w:val="left"/>
+      <w:pPr>
+        <w:ind w:left="5760" w:hanging="360"/>
+      </w:pPr>
+    </w:lvl>
+    <w:lvl w:ilvl="8" w:tplc="040C001B" w:tentative="1">
+      <w:start w:val="1"/>
+      <w:numFmt w:val="lowerRoman"/>
+      <w:lvlText w:val="%9."/>
+      <w:lvlJc w:val="right"/>
+      <w:pPr>
+        <w:ind w:left="6480" w:hanging="180"/>
+      </w:pPr>
+    </w:lvl>
+  </w:abstractNum>
+  <w:abstractNum w:abstractNumId="6" w15:restartNumberingAfterBreak="0">
     <w:nsid w:val="24064188"/>
     <w:multiLevelType w:val="hybridMultilevel"/>
     <w:tmpl w:val="1BD6257A"/>
@@ -809,7 +4385,7 @@
       </w:pPr>
     </w:lvl>
   </w:abstractNum>
-  <w:abstractNum w:abstractNumId="4" w15:restartNumberingAfterBreak="0">
+  <w:abstractNum w:abstractNumId="7" w15:restartNumberingAfterBreak="0">
     <w:nsid w:val="24FC061E"/>
     <w:multiLevelType w:val="hybridMultilevel"/>
     <w:tmpl w:val="B3FA1D02"/>
@@ -898,7 +4474,7 @@
       </w:pPr>
     </w:lvl>
   </w:abstractNum>
-  <w:abstractNum w:abstractNumId="5" w15:restartNumberingAfterBreak="0">
+  <w:abstractNum w:abstractNumId="8" w15:restartNumberingAfterBreak="0">
     <w:nsid w:val="2590349C"/>
     <w:multiLevelType w:val="hybridMultilevel"/>
     <w:tmpl w:val="55007254"/>
@@ -1010,7 +4586,7 @@
       </w:rPr>
     </w:lvl>
   </w:abstractNum>
-  <w:abstractNum w:abstractNumId="6" w15:restartNumberingAfterBreak="0">
+  <w:abstractNum w:abstractNumId="9" w15:restartNumberingAfterBreak="0">
     <w:nsid w:val="321D4155"/>
     <w:multiLevelType w:val="hybridMultilevel"/>
     <w:tmpl w:val="9EE07334"/>
@@ -1122,7 +4698,408 @@
       </w:rPr>
     </w:lvl>
   </w:abstractNum>
-  <w:abstractNum w:abstractNumId="7" w15:restartNumberingAfterBreak="0">
+  <w:abstractNum w:abstractNumId="10" w15:restartNumberingAfterBreak="0">
+    <w:nsid w:val="37EE5819"/>
+    <w:multiLevelType w:val="hybridMultilevel"/>
+    <w:tmpl w:val="B7D61F32"/>
+    <w:lvl w:ilvl="0" w:tplc="040C000F">
+      <w:start w:val="1"/>
+      <w:numFmt w:val="decimal"/>
+      <w:lvlText w:val="%1."/>
+      <w:lvlJc w:val="left"/>
+      <w:pPr>
+        <w:ind w:left="720" w:hanging="360"/>
+      </w:pPr>
+      <w:rPr>
+        <w:rFonts w:hint="default"/>
+      </w:rPr>
+    </w:lvl>
+    <w:lvl w:ilvl="1" w:tplc="040C0019" w:tentative="1">
+      <w:start w:val="1"/>
+      <w:numFmt w:val="lowerLetter"/>
+      <w:lvlText w:val="%2."/>
+      <w:lvlJc w:val="left"/>
+      <w:pPr>
+        <w:ind w:left="1440" w:hanging="360"/>
+      </w:pPr>
+    </w:lvl>
+    <w:lvl w:ilvl="2" w:tplc="040C001B" w:tentative="1">
+      <w:start w:val="1"/>
+      <w:numFmt w:val="lowerRoman"/>
+      <w:lvlText w:val="%3."/>
+      <w:lvlJc w:val="right"/>
+      <w:pPr>
+        <w:ind w:left="2160" w:hanging="180"/>
+      </w:pPr>
+    </w:lvl>
+    <w:lvl w:ilvl="3" w:tplc="040C000F" w:tentative="1">
+      <w:start w:val="1"/>
+      <w:numFmt w:val="decimal"/>
+      <w:lvlText w:val="%4."/>
+      <w:lvlJc w:val="left"/>
+      <w:pPr>
+        <w:ind w:left="2880" w:hanging="360"/>
+      </w:pPr>
+    </w:lvl>
+    <w:lvl w:ilvl="4" w:tplc="040C0019" w:tentative="1">
+      <w:start w:val="1"/>
+      <w:numFmt w:val="lowerLetter"/>
+      <w:lvlText w:val="%5."/>
+      <w:lvlJc w:val="left"/>
+      <w:pPr>
+        <w:ind w:left="3600" w:hanging="360"/>
+      </w:pPr>
+    </w:lvl>
+    <w:lvl w:ilvl="5" w:tplc="040C001B" w:tentative="1">
+      <w:start w:val="1"/>
+      <w:numFmt w:val="lowerRoman"/>
+      <w:lvlText w:val="%6."/>
+      <w:lvlJc w:val="right"/>
+      <w:pPr>
+        <w:ind w:left="4320" w:hanging="180"/>
+      </w:pPr>
+    </w:lvl>
+    <w:lvl w:ilvl="6" w:tplc="040C000F" w:tentative="1">
+      <w:start w:val="1"/>
+      <w:numFmt w:val="decimal"/>
+      <w:lvlText w:val="%7."/>
+      <w:lvlJc w:val="left"/>
+      <w:pPr>
+        <w:ind w:left="5040" w:hanging="360"/>
+      </w:pPr>
+    </w:lvl>
+    <w:lvl w:ilvl="7" w:tplc="040C0019" w:tentative="1">
+      <w:start w:val="1"/>
+      <w:numFmt w:val="lowerLetter"/>
+      <w:lvlText w:val="%8."/>
+      <w:lvlJc w:val="left"/>
+      <w:pPr>
+        <w:ind w:left="5760" w:hanging="360"/>
+      </w:pPr>
+    </w:lvl>
+    <w:lvl w:ilvl="8" w:tplc="040C001B" w:tentative="1">
+      <w:start w:val="1"/>
+      <w:numFmt w:val="lowerRoman"/>
+      <w:lvlText w:val="%9."/>
+      <w:lvlJc w:val="right"/>
+      <w:pPr>
+        <w:ind w:left="6480" w:hanging="180"/>
+      </w:pPr>
+    </w:lvl>
+  </w:abstractNum>
+  <w:abstractNum w:abstractNumId="11" w15:restartNumberingAfterBreak="0">
+    <w:nsid w:val="4398500B"/>
+    <w:multiLevelType w:val="hybridMultilevel"/>
+    <w:tmpl w:val="1B1087EC"/>
+    <w:lvl w:ilvl="0" w:tplc="040C0001">
+      <w:start w:val="1"/>
+      <w:numFmt w:val="bullet"/>
+      <w:lvlText w:val=""/>
+      <w:lvlJc w:val="left"/>
+      <w:pPr>
+        <w:ind w:left="720" w:hanging="360"/>
+      </w:pPr>
+      <w:rPr>
+        <w:rFonts w:ascii="Symbol" w:hAnsi="Symbol" w:hint="default"/>
+      </w:rPr>
+    </w:lvl>
+    <w:lvl w:ilvl="1" w:tplc="040C0003" w:tentative="1">
+      <w:start w:val="1"/>
+      <w:numFmt w:val="bullet"/>
+      <w:lvlText w:val="o"/>
+      <w:lvlJc w:val="left"/>
+      <w:pPr>
+        <w:ind w:left="1440" w:hanging="360"/>
+      </w:pPr>
+      <w:rPr>
+        <w:rFonts w:ascii="Courier New" w:hAnsi="Courier New" w:cs="Courier New" w:hint="default"/>
+      </w:rPr>
+    </w:lvl>
+    <w:lvl w:ilvl="2" w:tplc="040C0005" w:tentative="1">
+      <w:start w:val="1"/>
+      <w:numFmt w:val="bullet"/>
+      <w:lvlText w:val=""/>
+      <w:lvlJc w:val="left"/>
+      <w:pPr>
+        <w:ind w:left="2160" w:hanging="360"/>
+      </w:pPr>
+      <w:rPr>
+        <w:rFonts w:ascii="Wingdings" w:hAnsi="Wingdings" w:hint="default"/>
+      </w:rPr>
+    </w:lvl>
+    <w:lvl w:ilvl="3" w:tplc="040C0001" w:tentative="1">
+      <w:start w:val="1"/>
+      <w:numFmt w:val="bullet"/>
+      <w:lvlText w:val=""/>
+      <w:lvlJc w:val="left"/>
+      <w:pPr>
+        <w:ind w:left="2880" w:hanging="360"/>
+      </w:pPr>
+      <w:rPr>
+        <w:rFonts w:ascii="Symbol" w:hAnsi="Symbol" w:hint="default"/>
+      </w:rPr>
+    </w:lvl>
+    <w:lvl w:ilvl="4" w:tplc="040C0003" w:tentative="1">
+      <w:start w:val="1"/>
+      <w:numFmt w:val="bullet"/>
+      <w:lvlText w:val="o"/>
+      <w:lvlJc w:val="left"/>
+      <w:pPr>
+        <w:ind w:left="3600" w:hanging="360"/>
+      </w:pPr>
+      <w:rPr>
+        <w:rFonts w:ascii="Courier New" w:hAnsi="Courier New" w:cs="Courier New" w:hint="default"/>
+      </w:rPr>
+    </w:lvl>
+    <w:lvl w:ilvl="5" w:tplc="040C0005" w:tentative="1">
+      <w:start w:val="1"/>
+      <w:numFmt w:val="bullet"/>
+      <w:lvlText w:val=""/>
+      <w:lvlJc w:val="left"/>
+      <w:pPr>
+        <w:ind w:left="4320" w:hanging="360"/>
+      </w:pPr>
+      <w:rPr>
+        <w:rFonts w:ascii="Wingdings" w:hAnsi="Wingdings" w:hint="default"/>
+      </w:rPr>
+    </w:lvl>
+    <w:lvl w:ilvl="6" w:tplc="040C0001" w:tentative="1">
+      <w:start w:val="1"/>
+      <w:numFmt w:val="bullet"/>
+      <w:lvlText w:val=""/>
+      <w:lvlJc w:val="left"/>
+      <w:pPr>
+        <w:ind w:left="5040" w:hanging="360"/>
+      </w:pPr>
+      <w:rPr>
+        <w:rFonts w:ascii="Symbol" w:hAnsi="Symbol" w:hint="default"/>
+      </w:rPr>
+    </w:lvl>
+    <w:lvl w:ilvl="7" w:tplc="040C0003" w:tentative="1">
+      <w:start w:val="1"/>
+      <w:numFmt w:val="bullet"/>
+      <w:lvlText w:val="o"/>
+      <w:lvlJc w:val="left"/>
+      <w:pPr>
+        <w:ind w:left="5760" w:hanging="360"/>
+      </w:pPr>
+      <w:rPr>
+        <w:rFonts w:ascii="Courier New" w:hAnsi="Courier New" w:cs="Courier New" w:hint="default"/>
+      </w:rPr>
+    </w:lvl>
+    <w:lvl w:ilvl="8" w:tplc="040C0005" w:tentative="1">
+      <w:start w:val="1"/>
+      <w:numFmt w:val="bullet"/>
+      <w:lvlText w:val=""/>
+      <w:lvlJc w:val="left"/>
+      <w:pPr>
+        <w:ind w:left="6480" w:hanging="360"/>
+      </w:pPr>
+      <w:rPr>
+        <w:rFonts w:ascii="Wingdings" w:hAnsi="Wingdings" w:hint="default"/>
+      </w:rPr>
+    </w:lvl>
+  </w:abstractNum>
+  <w:abstractNum w:abstractNumId="12" w15:restartNumberingAfterBreak="0">
+    <w:nsid w:val="45BF7D02"/>
+    <w:multiLevelType w:val="hybridMultilevel"/>
+    <w:tmpl w:val="021AE3C4"/>
+    <w:lvl w:ilvl="0" w:tplc="040C0011">
+      <w:start w:val="1"/>
+      <w:numFmt w:val="decimal"/>
+      <w:lvlText w:val="%1)"/>
+      <w:lvlJc w:val="left"/>
+      <w:pPr>
+        <w:ind w:left="720" w:hanging="360"/>
+      </w:pPr>
+    </w:lvl>
+    <w:lvl w:ilvl="1" w:tplc="040C0019" w:tentative="1">
+      <w:start w:val="1"/>
+      <w:numFmt w:val="lowerLetter"/>
+      <w:lvlText w:val="%2."/>
+      <w:lvlJc w:val="left"/>
+      <w:pPr>
+        <w:ind w:left="1440" w:hanging="360"/>
+      </w:pPr>
+    </w:lvl>
+    <w:lvl w:ilvl="2" w:tplc="040C001B" w:tentative="1">
+      <w:start w:val="1"/>
+      <w:numFmt w:val="lowerRoman"/>
+      <w:lvlText w:val="%3."/>
+      <w:lvlJc w:val="right"/>
+      <w:pPr>
+        <w:ind w:left="2160" w:hanging="180"/>
+      </w:pPr>
+    </w:lvl>
+    <w:lvl w:ilvl="3" w:tplc="040C000F" w:tentative="1">
+      <w:start w:val="1"/>
+      <w:numFmt w:val="decimal"/>
+      <w:lvlText w:val="%4."/>
+      <w:lvlJc w:val="left"/>
+      <w:pPr>
+        <w:ind w:left="2880" w:hanging="360"/>
+      </w:pPr>
+    </w:lvl>
+    <w:lvl w:ilvl="4" w:tplc="040C0019" w:tentative="1">
+      <w:start w:val="1"/>
+      <w:numFmt w:val="lowerLetter"/>
+      <w:lvlText w:val="%5."/>
+      <w:lvlJc w:val="left"/>
+      <w:pPr>
+        <w:ind w:left="3600" w:hanging="360"/>
+      </w:pPr>
+    </w:lvl>
+    <w:lvl w:ilvl="5" w:tplc="040C001B" w:tentative="1">
+      <w:start w:val="1"/>
+      <w:numFmt w:val="lowerRoman"/>
+      <w:lvlText w:val="%6."/>
+      <w:lvlJc w:val="right"/>
+      <w:pPr>
+        <w:ind w:left="4320" w:hanging="180"/>
+      </w:pPr>
+    </w:lvl>
+    <w:lvl w:ilvl="6" w:tplc="040C000F" w:tentative="1">
+      <w:start w:val="1"/>
+      <w:numFmt w:val="decimal"/>
+      <w:lvlText w:val="%7."/>
+      <w:lvlJc w:val="left"/>
+      <w:pPr>
+        <w:ind w:left="5040" w:hanging="360"/>
+      </w:pPr>
+    </w:lvl>
+    <w:lvl w:ilvl="7" w:tplc="040C0019" w:tentative="1">
+      <w:start w:val="1"/>
+      <w:numFmt w:val="lowerLetter"/>
+      <w:lvlText w:val="%8."/>
+      <w:lvlJc w:val="left"/>
+      <w:pPr>
+        <w:ind w:left="5760" w:hanging="360"/>
+      </w:pPr>
+    </w:lvl>
+    <w:lvl w:ilvl="8" w:tplc="040C001B" w:tentative="1">
+      <w:start w:val="1"/>
+      <w:numFmt w:val="lowerRoman"/>
+      <w:lvlText w:val="%9."/>
+      <w:lvlJc w:val="right"/>
+      <w:pPr>
+        <w:ind w:left="6480" w:hanging="180"/>
+      </w:pPr>
+    </w:lvl>
+  </w:abstractNum>
+  <w:abstractNum w:abstractNumId="13" w15:restartNumberingAfterBreak="0">
+    <w:nsid w:val="4C3E3D4A"/>
+    <w:multiLevelType w:val="hybridMultilevel"/>
+    <w:tmpl w:val="242C2C32"/>
+    <w:lvl w:ilvl="0" w:tplc="040C0001">
+      <w:start w:val="1"/>
+      <w:numFmt w:val="bullet"/>
+      <w:lvlText w:val=""/>
+      <w:lvlJc w:val="left"/>
+      <w:pPr>
+        <w:ind w:left="720" w:hanging="360"/>
+      </w:pPr>
+      <w:rPr>
+        <w:rFonts w:ascii="Symbol" w:hAnsi="Symbol" w:hint="default"/>
+      </w:rPr>
+    </w:lvl>
+    <w:lvl w:ilvl="1" w:tplc="040C0003" w:tentative="1">
+      <w:start w:val="1"/>
+      <w:numFmt w:val="bullet"/>
+      <w:lvlText w:val="o"/>
+      <w:lvlJc w:val="left"/>
+      <w:pPr>
+        <w:ind w:left="1440" w:hanging="360"/>
+      </w:pPr>
+      <w:rPr>
+        <w:rFonts w:ascii="Courier New" w:hAnsi="Courier New" w:cs="Courier New" w:hint="default"/>
+      </w:rPr>
+    </w:lvl>
+    <w:lvl w:ilvl="2" w:tplc="040C0005" w:tentative="1">
+      <w:start w:val="1"/>
+      <w:numFmt w:val="bullet"/>
+      <w:lvlText w:val=""/>
+      <w:lvlJc w:val="left"/>
+      <w:pPr>
+        <w:ind w:left="2160" w:hanging="360"/>
+      </w:pPr>
+      <w:rPr>
+        <w:rFonts w:ascii="Wingdings" w:hAnsi="Wingdings" w:hint="default"/>
+      </w:rPr>
+    </w:lvl>
+    <w:lvl w:ilvl="3" w:tplc="040C0001" w:tentative="1">
+      <w:start w:val="1"/>
+      <w:numFmt w:val="bullet"/>
+      <w:lvlText w:val=""/>
+      <w:lvlJc w:val="left"/>
+      <w:pPr>
+        <w:ind w:left="2880" w:hanging="360"/>
+      </w:pPr>
+      <w:rPr>
+        <w:rFonts w:ascii="Symbol" w:hAnsi="Symbol" w:hint="default"/>
+      </w:rPr>
+    </w:lvl>
+    <w:lvl w:ilvl="4" w:tplc="040C0003" w:tentative="1">
+      <w:start w:val="1"/>
+      <w:numFmt w:val="bullet"/>
+      <w:lvlText w:val="o"/>
+      <w:lvlJc w:val="left"/>
+      <w:pPr>
+        <w:ind w:left="3600" w:hanging="360"/>
+      </w:pPr>
+      <w:rPr>
+        <w:rFonts w:ascii="Courier New" w:hAnsi="Courier New" w:cs="Courier New" w:hint="default"/>
+      </w:rPr>
+    </w:lvl>
+    <w:lvl w:ilvl="5" w:tplc="040C0005" w:tentative="1">
+      <w:start w:val="1"/>
+      <w:numFmt w:val="bullet"/>
+      <w:lvlText w:val=""/>
+      <w:lvlJc w:val="left"/>
+      <w:pPr>
+        <w:ind w:left="4320" w:hanging="360"/>
+      </w:pPr>
+      <w:rPr>
+        <w:rFonts w:ascii="Wingdings" w:hAnsi="Wingdings" w:hint="default"/>
+      </w:rPr>
+    </w:lvl>
+    <w:lvl w:ilvl="6" w:tplc="040C0001" w:tentative="1">
+      <w:start w:val="1"/>
+      <w:numFmt w:val="bullet"/>
+      <w:lvlText w:val=""/>
+      <w:lvlJc w:val="left"/>
+      <w:pPr>
+        <w:ind w:left="5040" w:hanging="360"/>
+      </w:pPr>
+      <w:rPr>
+        <w:rFonts w:ascii="Symbol" w:hAnsi="Symbol" w:hint="default"/>
+      </w:rPr>
+    </w:lvl>
+    <w:lvl w:ilvl="7" w:tplc="040C0003" w:tentative="1">
+      <w:start w:val="1"/>
+      <w:numFmt w:val="bullet"/>
+      <w:lvlText w:val="o"/>
+      <w:lvlJc w:val="left"/>
+      <w:pPr>
+        <w:ind w:left="5760" w:hanging="360"/>
+      </w:pPr>
+      <w:rPr>
+        <w:rFonts w:ascii="Courier New" w:hAnsi="Courier New" w:cs="Courier New" w:hint="default"/>
+      </w:rPr>
+    </w:lvl>
+    <w:lvl w:ilvl="8" w:tplc="040C0005" w:tentative="1">
+      <w:start w:val="1"/>
+      <w:numFmt w:val="bullet"/>
+      <w:lvlText w:val=""/>
+      <w:lvlJc w:val="left"/>
+      <w:pPr>
+        <w:ind w:left="6480" w:hanging="360"/>
+      </w:pPr>
+      <w:rPr>
+        <w:rFonts w:ascii="Wingdings" w:hAnsi="Wingdings" w:hint="default"/>
+      </w:rPr>
+    </w:lvl>
+  </w:abstractNum>
+  <w:abstractNum w:abstractNumId="14" w15:restartNumberingAfterBreak="0">
     <w:nsid w:val="4D0B56E1"/>
     <w:multiLevelType w:val="hybridMultilevel"/>
     <w:tmpl w:val="A1501268"/>
@@ -1211,7 +5188,185 @@
       </w:pPr>
     </w:lvl>
   </w:abstractNum>
-  <w:abstractNum w:abstractNumId="8" w15:restartNumberingAfterBreak="0">
+  <w:abstractNum w:abstractNumId="15" w15:restartNumberingAfterBreak="0">
+    <w:nsid w:val="4E542C35"/>
+    <w:multiLevelType w:val="hybridMultilevel"/>
+    <w:tmpl w:val="9CB68BB8"/>
+    <w:lvl w:ilvl="0" w:tplc="040C0019">
+      <w:start w:val="1"/>
+      <w:numFmt w:val="lowerLetter"/>
+      <w:lvlText w:val="%1."/>
+      <w:lvlJc w:val="left"/>
+      <w:pPr>
+        <w:ind w:left="720" w:hanging="360"/>
+      </w:pPr>
+      <w:rPr>
+        <w:rFonts w:hint="default"/>
+      </w:rPr>
+    </w:lvl>
+    <w:lvl w:ilvl="1" w:tplc="040C0019" w:tentative="1">
+      <w:start w:val="1"/>
+      <w:numFmt w:val="lowerLetter"/>
+      <w:lvlText w:val="%2."/>
+      <w:lvlJc w:val="left"/>
+      <w:pPr>
+        <w:ind w:left="1440" w:hanging="360"/>
+      </w:pPr>
+    </w:lvl>
+    <w:lvl w:ilvl="2" w:tplc="040C001B" w:tentative="1">
+      <w:start w:val="1"/>
+      <w:numFmt w:val="lowerRoman"/>
+      <w:lvlText w:val="%3."/>
+      <w:lvlJc w:val="right"/>
+      <w:pPr>
+        <w:ind w:left="2160" w:hanging="180"/>
+      </w:pPr>
+    </w:lvl>
+    <w:lvl w:ilvl="3" w:tplc="040C000F" w:tentative="1">
+      <w:start w:val="1"/>
+      <w:numFmt w:val="decimal"/>
+      <w:lvlText w:val="%4."/>
+      <w:lvlJc w:val="left"/>
+      <w:pPr>
+        <w:ind w:left="2880" w:hanging="360"/>
+      </w:pPr>
+    </w:lvl>
+    <w:lvl w:ilvl="4" w:tplc="040C0019" w:tentative="1">
+      <w:start w:val="1"/>
+      <w:numFmt w:val="lowerLetter"/>
+      <w:lvlText w:val="%5."/>
+      <w:lvlJc w:val="left"/>
+      <w:pPr>
+        <w:ind w:left="3600" w:hanging="360"/>
+      </w:pPr>
+    </w:lvl>
+    <w:lvl w:ilvl="5" w:tplc="040C001B" w:tentative="1">
+      <w:start w:val="1"/>
+      <w:numFmt w:val="lowerRoman"/>
+      <w:lvlText w:val="%6."/>
+      <w:lvlJc w:val="right"/>
+      <w:pPr>
+        <w:ind w:left="4320" w:hanging="180"/>
+      </w:pPr>
+    </w:lvl>
+    <w:lvl w:ilvl="6" w:tplc="040C000F" w:tentative="1">
+      <w:start w:val="1"/>
+      <w:numFmt w:val="decimal"/>
+      <w:lvlText w:val="%7."/>
+      <w:lvlJc w:val="left"/>
+      <w:pPr>
+        <w:ind w:left="5040" w:hanging="360"/>
+      </w:pPr>
+    </w:lvl>
+    <w:lvl w:ilvl="7" w:tplc="040C0019" w:tentative="1">
+      <w:start w:val="1"/>
+      <w:numFmt w:val="lowerLetter"/>
+      <w:lvlText w:val="%8."/>
+      <w:lvlJc w:val="left"/>
+      <w:pPr>
+        <w:ind w:left="5760" w:hanging="360"/>
+      </w:pPr>
+    </w:lvl>
+    <w:lvl w:ilvl="8" w:tplc="040C001B" w:tentative="1">
+      <w:start w:val="1"/>
+      <w:numFmt w:val="lowerRoman"/>
+      <w:lvlText w:val="%9."/>
+      <w:lvlJc w:val="right"/>
+      <w:pPr>
+        <w:ind w:left="6480" w:hanging="180"/>
+      </w:pPr>
+    </w:lvl>
+  </w:abstractNum>
+  <w:abstractNum w:abstractNumId="16" w15:restartNumberingAfterBreak="0">
+    <w:nsid w:val="4F4D0601"/>
+    <w:multiLevelType w:val="hybridMultilevel"/>
+    <w:tmpl w:val="507AAE72"/>
+    <w:lvl w:ilvl="0" w:tplc="040C000F">
+      <w:start w:val="1"/>
+      <w:numFmt w:val="decimal"/>
+      <w:lvlText w:val="%1."/>
+      <w:lvlJc w:val="left"/>
+      <w:pPr>
+        <w:ind w:left="720" w:hanging="360"/>
+      </w:pPr>
+      <w:rPr>
+        <w:rFonts w:hint="default"/>
+      </w:rPr>
+    </w:lvl>
+    <w:lvl w:ilvl="1" w:tplc="040C0019" w:tentative="1">
+      <w:start w:val="1"/>
+      <w:numFmt w:val="lowerLetter"/>
+      <w:lvlText w:val="%2."/>
+      <w:lvlJc w:val="left"/>
+      <w:pPr>
+        <w:ind w:left="1440" w:hanging="360"/>
+      </w:pPr>
+    </w:lvl>
+    <w:lvl w:ilvl="2" w:tplc="040C001B" w:tentative="1">
+      <w:start w:val="1"/>
+      <w:numFmt w:val="lowerRoman"/>
+      <w:lvlText w:val="%3."/>
+      <w:lvlJc w:val="right"/>
+      <w:pPr>
+        <w:ind w:left="2160" w:hanging="180"/>
+      </w:pPr>
+    </w:lvl>
+    <w:lvl w:ilvl="3" w:tplc="040C000F" w:tentative="1">
+      <w:start w:val="1"/>
+      <w:numFmt w:val="decimal"/>
+      <w:lvlText w:val="%4."/>
+      <w:lvlJc w:val="left"/>
+      <w:pPr>
+        <w:ind w:left="2880" w:hanging="360"/>
+      </w:pPr>
+    </w:lvl>
+    <w:lvl w:ilvl="4" w:tplc="040C0019" w:tentative="1">
+      <w:start w:val="1"/>
+      <w:numFmt w:val="lowerLetter"/>
+      <w:lvlText w:val="%5."/>
+      <w:lvlJc w:val="left"/>
+      <w:pPr>
+        <w:ind w:left="3600" w:hanging="360"/>
+      </w:pPr>
+    </w:lvl>
+    <w:lvl w:ilvl="5" w:tplc="040C001B" w:tentative="1">
+      <w:start w:val="1"/>
+      <w:numFmt w:val="lowerRoman"/>
+      <w:lvlText w:val="%6."/>
+      <w:lvlJc w:val="right"/>
+      <w:pPr>
+        <w:ind w:left="4320" w:hanging="180"/>
+      </w:pPr>
+    </w:lvl>
+    <w:lvl w:ilvl="6" w:tplc="040C000F" w:tentative="1">
+      <w:start w:val="1"/>
+      <w:numFmt w:val="decimal"/>
+      <w:lvlText w:val="%7."/>
+      <w:lvlJc w:val="left"/>
+      <w:pPr>
+        <w:ind w:left="5040" w:hanging="360"/>
+      </w:pPr>
+    </w:lvl>
+    <w:lvl w:ilvl="7" w:tplc="040C0019" w:tentative="1">
+      <w:start w:val="1"/>
+      <w:numFmt w:val="lowerLetter"/>
+      <w:lvlText w:val="%8."/>
+      <w:lvlJc w:val="left"/>
+      <w:pPr>
+        <w:ind w:left="5760" w:hanging="360"/>
+      </w:pPr>
+    </w:lvl>
+    <w:lvl w:ilvl="8" w:tplc="040C001B" w:tentative="1">
+      <w:start w:val="1"/>
+      <w:numFmt w:val="lowerRoman"/>
+      <w:lvlText w:val="%9."/>
+      <w:lvlJc w:val="right"/>
+      <w:pPr>
+        <w:ind w:left="6480" w:hanging="180"/>
+      </w:pPr>
+    </w:lvl>
+  </w:abstractNum>
+  <w:abstractNum w:abstractNumId="17" w15:restartNumberingAfterBreak="0">
     <w:nsid w:val="59376E90"/>
     <w:multiLevelType w:val="hybridMultilevel"/>
     <w:tmpl w:val="138C20F4"/>
@@ -1300,32 +5455,451 @@
       </w:pPr>
     </w:lvl>
   </w:abstractNum>
+  <w:abstractNum w:abstractNumId="18" w15:restartNumberingAfterBreak="0">
+    <w:nsid w:val="605B4492"/>
+    <w:multiLevelType w:val="hybridMultilevel"/>
+    <w:tmpl w:val="D204984C"/>
+    <w:lvl w:ilvl="0" w:tplc="040C0001">
+      <w:start w:val="1"/>
+      <w:numFmt w:val="bullet"/>
+      <w:lvlText w:val=""/>
+      <w:lvlJc w:val="left"/>
+      <w:pPr>
+        <w:ind w:left="720" w:hanging="360"/>
+      </w:pPr>
+      <w:rPr>
+        <w:rFonts w:ascii="Symbol" w:hAnsi="Symbol" w:hint="default"/>
+      </w:rPr>
+    </w:lvl>
+    <w:lvl w:ilvl="1" w:tplc="040C0003" w:tentative="1">
+      <w:start w:val="1"/>
+      <w:numFmt w:val="bullet"/>
+      <w:lvlText w:val="o"/>
+      <w:lvlJc w:val="left"/>
+      <w:pPr>
+        <w:ind w:left="1440" w:hanging="360"/>
+      </w:pPr>
+      <w:rPr>
+        <w:rFonts w:ascii="Courier New" w:hAnsi="Courier New" w:cs="Courier New" w:hint="default"/>
+      </w:rPr>
+    </w:lvl>
+    <w:lvl w:ilvl="2" w:tplc="040C0005" w:tentative="1">
+      <w:start w:val="1"/>
+      <w:numFmt w:val="bullet"/>
+      <w:lvlText w:val=""/>
+      <w:lvlJc w:val="left"/>
+      <w:pPr>
+        <w:ind w:left="2160" w:hanging="360"/>
+      </w:pPr>
+      <w:rPr>
+        <w:rFonts w:ascii="Wingdings" w:hAnsi="Wingdings" w:hint="default"/>
+      </w:rPr>
+    </w:lvl>
+    <w:lvl w:ilvl="3" w:tplc="040C0001" w:tentative="1">
+      <w:start w:val="1"/>
+      <w:numFmt w:val="bullet"/>
+      <w:lvlText w:val=""/>
+      <w:lvlJc w:val="left"/>
+      <w:pPr>
+        <w:ind w:left="2880" w:hanging="360"/>
+      </w:pPr>
+      <w:rPr>
+        <w:rFonts w:ascii="Symbol" w:hAnsi="Symbol" w:hint="default"/>
+      </w:rPr>
+    </w:lvl>
+    <w:lvl w:ilvl="4" w:tplc="040C0003" w:tentative="1">
+      <w:start w:val="1"/>
+      <w:numFmt w:val="bullet"/>
+      <w:lvlText w:val="o"/>
+      <w:lvlJc w:val="left"/>
+      <w:pPr>
+        <w:ind w:left="3600" w:hanging="360"/>
+      </w:pPr>
+      <w:rPr>
+        <w:rFonts w:ascii="Courier New" w:hAnsi="Courier New" w:cs="Courier New" w:hint="default"/>
+      </w:rPr>
+    </w:lvl>
+    <w:lvl w:ilvl="5" w:tplc="040C0005" w:tentative="1">
+      <w:start w:val="1"/>
+      <w:numFmt w:val="bullet"/>
+      <w:lvlText w:val=""/>
+      <w:lvlJc w:val="left"/>
+      <w:pPr>
+        <w:ind w:left="4320" w:hanging="360"/>
+      </w:pPr>
+      <w:rPr>
+        <w:rFonts w:ascii="Wingdings" w:hAnsi="Wingdings" w:hint="default"/>
+      </w:rPr>
+    </w:lvl>
+    <w:lvl w:ilvl="6" w:tplc="040C0001" w:tentative="1">
+      <w:start w:val="1"/>
+      <w:numFmt w:val="bullet"/>
+      <w:lvlText w:val=""/>
+      <w:lvlJc w:val="left"/>
+      <w:pPr>
+        <w:ind w:left="5040" w:hanging="360"/>
+      </w:pPr>
+      <w:rPr>
+        <w:rFonts w:ascii="Symbol" w:hAnsi="Symbol" w:hint="default"/>
+      </w:rPr>
+    </w:lvl>
+    <w:lvl w:ilvl="7" w:tplc="040C0003" w:tentative="1">
+      <w:start w:val="1"/>
+      <w:numFmt w:val="bullet"/>
+      <w:lvlText w:val="o"/>
+      <w:lvlJc w:val="left"/>
+      <w:pPr>
+        <w:ind w:left="5760" w:hanging="360"/>
+      </w:pPr>
+      <w:rPr>
+        <w:rFonts w:ascii="Courier New" w:hAnsi="Courier New" w:cs="Courier New" w:hint="default"/>
+      </w:rPr>
+    </w:lvl>
+    <w:lvl w:ilvl="8" w:tplc="040C0005" w:tentative="1">
+      <w:start w:val="1"/>
+      <w:numFmt w:val="bullet"/>
+      <w:lvlText w:val=""/>
+      <w:lvlJc w:val="left"/>
+      <w:pPr>
+        <w:ind w:left="6480" w:hanging="360"/>
+      </w:pPr>
+      <w:rPr>
+        <w:rFonts w:ascii="Wingdings" w:hAnsi="Wingdings" w:hint="default"/>
+      </w:rPr>
+    </w:lvl>
+  </w:abstractNum>
+  <w:abstractNum w:abstractNumId="19" w15:restartNumberingAfterBreak="0">
+    <w:nsid w:val="63446846"/>
+    <w:multiLevelType w:val="hybridMultilevel"/>
+    <w:tmpl w:val="05689EB0"/>
+    <w:lvl w:ilvl="0" w:tplc="040C000F">
+      <w:start w:val="5"/>
+      <w:numFmt w:val="decimal"/>
+      <w:lvlText w:val="%1."/>
+      <w:lvlJc w:val="left"/>
+      <w:pPr>
+        <w:ind w:left="720" w:hanging="360"/>
+      </w:pPr>
+      <w:rPr>
+        <w:rFonts w:hint="default"/>
+      </w:rPr>
+    </w:lvl>
+    <w:lvl w:ilvl="1" w:tplc="040C0019" w:tentative="1">
+      <w:start w:val="1"/>
+      <w:numFmt w:val="lowerLetter"/>
+      <w:lvlText w:val="%2."/>
+      <w:lvlJc w:val="left"/>
+      <w:pPr>
+        <w:ind w:left="1440" w:hanging="360"/>
+      </w:pPr>
+    </w:lvl>
+    <w:lvl w:ilvl="2" w:tplc="040C001B" w:tentative="1">
+      <w:start w:val="1"/>
+      <w:numFmt w:val="lowerRoman"/>
+      <w:lvlText w:val="%3."/>
+      <w:lvlJc w:val="right"/>
+      <w:pPr>
+        <w:ind w:left="2160" w:hanging="180"/>
+      </w:pPr>
+    </w:lvl>
+    <w:lvl w:ilvl="3" w:tplc="040C000F" w:tentative="1">
+      <w:start w:val="1"/>
+      <w:numFmt w:val="decimal"/>
+      <w:lvlText w:val="%4."/>
+      <w:lvlJc w:val="left"/>
+      <w:pPr>
+        <w:ind w:left="2880" w:hanging="360"/>
+      </w:pPr>
+    </w:lvl>
+    <w:lvl w:ilvl="4" w:tplc="040C0019" w:tentative="1">
+      <w:start w:val="1"/>
+      <w:numFmt w:val="lowerLetter"/>
+      <w:lvlText w:val="%5."/>
+      <w:lvlJc w:val="left"/>
+      <w:pPr>
+        <w:ind w:left="3600" w:hanging="360"/>
+      </w:pPr>
+    </w:lvl>
+    <w:lvl w:ilvl="5" w:tplc="040C001B" w:tentative="1">
+      <w:start w:val="1"/>
+      <w:numFmt w:val="lowerRoman"/>
+      <w:lvlText w:val="%6."/>
+      <w:lvlJc w:val="right"/>
+      <w:pPr>
+        <w:ind w:left="4320" w:hanging="180"/>
+      </w:pPr>
+    </w:lvl>
+    <w:lvl w:ilvl="6" w:tplc="040C000F" w:tentative="1">
+      <w:start w:val="1"/>
+      <w:numFmt w:val="decimal"/>
+      <w:lvlText w:val="%7."/>
+      <w:lvlJc w:val="left"/>
+      <w:pPr>
+        <w:ind w:left="5040" w:hanging="360"/>
+      </w:pPr>
+    </w:lvl>
+    <w:lvl w:ilvl="7" w:tplc="040C0019" w:tentative="1">
+      <w:start w:val="1"/>
+      <w:numFmt w:val="lowerLetter"/>
+      <w:lvlText w:val="%8."/>
+      <w:lvlJc w:val="left"/>
+      <w:pPr>
+        <w:ind w:left="5760" w:hanging="360"/>
+      </w:pPr>
+    </w:lvl>
+    <w:lvl w:ilvl="8" w:tplc="040C001B" w:tentative="1">
+      <w:start w:val="1"/>
+      <w:numFmt w:val="lowerRoman"/>
+      <w:lvlText w:val="%9."/>
+      <w:lvlJc w:val="right"/>
+      <w:pPr>
+        <w:ind w:left="6480" w:hanging="180"/>
+      </w:pPr>
+    </w:lvl>
+  </w:abstractNum>
+  <w:abstractNum w:abstractNumId="20" w15:restartNumberingAfterBreak="0">
+    <w:nsid w:val="66DE107C"/>
+    <w:multiLevelType w:val="hybridMultilevel"/>
+    <w:tmpl w:val="D2F80F6C"/>
+    <w:lvl w:ilvl="0" w:tplc="040C0019">
+      <w:start w:val="1"/>
+      <w:numFmt w:val="lowerLetter"/>
+      <w:lvlText w:val="%1."/>
+      <w:lvlJc w:val="left"/>
+      <w:pPr>
+        <w:ind w:left="720" w:hanging="360"/>
+      </w:pPr>
+      <w:rPr>
+        <w:rFonts w:hint="default"/>
+      </w:rPr>
+    </w:lvl>
+    <w:lvl w:ilvl="1" w:tplc="040C0019" w:tentative="1">
+      <w:start w:val="1"/>
+      <w:numFmt w:val="lowerLetter"/>
+      <w:lvlText w:val="%2."/>
+      <w:lvlJc w:val="left"/>
+      <w:pPr>
+        <w:ind w:left="1440" w:hanging="360"/>
+      </w:pPr>
+    </w:lvl>
+    <w:lvl w:ilvl="2" w:tplc="040C001B" w:tentative="1">
+      <w:start w:val="1"/>
+      <w:numFmt w:val="lowerRoman"/>
+      <w:lvlText w:val="%3."/>
+      <w:lvlJc w:val="right"/>
+      <w:pPr>
+        <w:ind w:left="2160" w:hanging="180"/>
+      </w:pPr>
+    </w:lvl>
+    <w:lvl w:ilvl="3" w:tplc="040C000F" w:tentative="1">
+      <w:start w:val="1"/>
+      <w:numFmt w:val="decimal"/>
+      <w:lvlText w:val="%4."/>
+      <w:lvlJc w:val="left"/>
+      <w:pPr>
+        <w:ind w:left="2880" w:hanging="360"/>
+      </w:pPr>
+    </w:lvl>
+    <w:lvl w:ilvl="4" w:tplc="040C0019" w:tentative="1">
+      <w:start w:val="1"/>
+      <w:numFmt w:val="lowerLetter"/>
+      <w:lvlText w:val="%5."/>
+      <w:lvlJc w:val="left"/>
+      <w:pPr>
+        <w:ind w:left="3600" w:hanging="360"/>
+      </w:pPr>
+    </w:lvl>
+    <w:lvl w:ilvl="5" w:tplc="040C001B" w:tentative="1">
+      <w:start w:val="1"/>
+      <w:numFmt w:val="lowerRoman"/>
+      <w:lvlText w:val="%6."/>
+      <w:lvlJc w:val="right"/>
+      <w:pPr>
+        <w:ind w:left="4320" w:hanging="180"/>
+      </w:pPr>
+    </w:lvl>
+    <w:lvl w:ilvl="6" w:tplc="040C000F" w:tentative="1">
+      <w:start w:val="1"/>
+      <w:numFmt w:val="decimal"/>
+      <w:lvlText w:val="%7."/>
+      <w:lvlJc w:val="left"/>
+      <w:pPr>
+        <w:ind w:left="5040" w:hanging="360"/>
+      </w:pPr>
+    </w:lvl>
+    <w:lvl w:ilvl="7" w:tplc="040C0019" w:tentative="1">
+      <w:start w:val="1"/>
+      <w:numFmt w:val="lowerLetter"/>
+      <w:lvlText w:val="%8."/>
+      <w:lvlJc w:val="left"/>
+      <w:pPr>
+        <w:ind w:left="5760" w:hanging="360"/>
+      </w:pPr>
+    </w:lvl>
+    <w:lvl w:ilvl="8" w:tplc="040C001B" w:tentative="1">
+      <w:start w:val="1"/>
+      <w:numFmt w:val="lowerRoman"/>
+      <w:lvlText w:val="%9."/>
+      <w:lvlJc w:val="right"/>
+      <w:pPr>
+        <w:ind w:left="6480" w:hanging="180"/>
+      </w:pPr>
+    </w:lvl>
+  </w:abstractNum>
+  <w:abstractNum w:abstractNumId="21" w15:restartNumberingAfterBreak="0">
+    <w:nsid w:val="73932A0A"/>
+    <w:multiLevelType w:val="hybridMultilevel"/>
+    <w:tmpl w:val="F01017D8"/>
+    <w:lvl w:ilvl="0" w:tplc="040C0019">
+      <w:start w:val="1"/>
+      <w:numFmt w:val="lowerLetter"/>
+      <w:lvlText w:val="%1."/>
+      <w:lvlJc w:val="left"/>
+      <w:pPr>
+        <w:ind w:left="720" w:hanging="360"/>
+      </w:pPr>
+      <w:rPr>
+        <w:rFonts w:hint="default"/>
+      </w:rPr>
+    </w:lvl>
+    <w:lvl w:ilvl="1" w:tplc="040C0019" w:tentative="1">
+      <w:start w:val="1"/>
+      <w:numFmt w:val="lowerLetter"/>
+      <w:lvlText w:val="%2."/>
+      <w:lvlJc w:val="left"/>
+      <w:pPr>
+        <w:ind w:left="1440" w:hanging="360"/>
+      </w:pPr>
+    </w:lvl>
+    <w:lvl w:ilvl="2" w:tplc="040C001B" w:tentative="1">
+      <w:start w:val="1"/>
+      <w:numFmt w:val="lowerRoman"/>
+      <w:lvlText w:val="%3."/>
+      <w:lvlJc w:val="right"/>
+      <w:pPr>
+        <w:ind w:left="2160" w:hanging="180"/>
+      </w:pPr>
+    </w:lvl>
+    <w:lvl w:ilvl="3" w:tplc="040C000F" w:tentative="1">
+      <w:start w:val="1"/>
+      <w:numFmt w:val="decimal"/>
+      <w:lvlText w:val="%4."/>
+      <w:lvlJc w:val="left"/>
+      <w:pPr>
+        <w:ind w:left="2880" w:hanging="360"/>
+      </w:pPr>
+    </w:lvl>
+    <w:lvl w:ilvl="4" w:tplc="040C0019" w:tentative="1">
+      <w:start w:val="1"/>
+      <w:numFmt w:val="lowerLetter"/>
+      <w:lvlText w:val="%5."/>
+      <w:lvlJc w:val="left"/>
+      <w:pPr>
+        <w:ind w:left="3600" w:hanging="360"/>
+      </w:pPr>
+    </w:lvl>
+    <w:lvl w:ilvl="5" w:tplc="040C001B" w:tentative="1">
+      <w:start w:val="1"/>
+      <w:numFmt w:val="lowerRoman"/>
+      <w:lvlText w:val="%6."/>
+      <w:lvlJc w:val="right"/>
+      <w:pPr>
+        <w:ind w:left="4320" w:hanging="180"/>
+      </w:pPr>
+    </w:lvl>
+    <w:lvl w:ilvl="6" w:tplc="040C000F" w:tentative="1">
+      <w:start w:val="1"/>
+      <w:numFmt w:val="decimal"/>
+      <w:lvlText w:val="%7."/>
+      <w:lvlJc w:val="left"/>
+      <w:pPr>
+        <w:ind w:left="5040" w:hanging="360"/>
+      </w:pPr>
+    </w:lvl>
+    <w:lvl w:ilvl="7" w:tplc="040C0019" w:tentative="1">
+      <w:start w:val="1"/>
+      <w:numFmt w:val="lowerLetter"/>
+      <w:lvlText w:val="%8."/>
+      <w:lvlJc w:val="left"/>
+      <w:pPr>
+        <w:ind w:left="5760" w:hanging="360"/>
+      </w:pPr>
+    </w:lvl>
+    <w:lvl w:ilvl="8" w:tplc="040C001B" w:tentative="1">
+      <w:start w:val="1"/>
+      <w:numFmt w:val="lowerRoman"/>
+      <w:lvlText w:val="%9."/>
+      <w:lvlJc w:val="right"/>
+      <w:pPr>
+        <w:ind w:left="6480" w:hanging="180"/>
+      </w:pPr>
+    </w:lvl>
+  </w:abstractNum>
   <w:num w:numId="1" w16cid:durableId="366762349">
-    <w:abstractNumId w:val="8"/>
+    <w:abstractNumId w:val="17"/>
   </w:num>
   <w:num w:numId="2" w16cid:durableId="785344682">
     <w:abstractNumId w:val="0"/>
   </w:num>
   <w:num w:numId="3" w16cid:durableId="1029256568">
-    <w:abstractNumId w:val="7"/>
+    <w:abstractNumId w:val="14"/>
   </w:num>
   <w:num w:numId="4" w16cid:durableId="965548697">
-    <w:abstractNumId w:val="3"/>
+    <w:abstractNumId w:val="6"/>
   </w:num>
   <w:num w:numId="5" w16cid:durableId="2064254029">
     <w:abstractNumId w:val="1"/>
   </w:num>
   <w:num w:numId="6" w16cid:durableId="518080298">
+    <w:abstractNumId w:val="7"/>
+  </w:num>
+  <w:num w:numId="7" w16cid:durableId="1219711019">
+    <w:abstractNumId w:val="3"/>
+  </w:num>
+  <w:num w:numId="8" w16cid:durableId="324091261">
+    <w:abstractNumId w:val="9"/>
+  </w:num>
+  <w:num w:numId="9" w16cid:durableId="1726176819">
+    <w:abstractNumId w:val="8"/>
+  </w:num>
+  <w:num w:numId="10" w16cid:durableId="1791312677">
     <w:abstractNumId w:val="4"/>
   </w:num>
-  <w:num w:numId="7" w16cid:durableId="1219711019">
+  <w:num w:numId="11" w16cid:durableId="983850167">
+    <w:abstractNumId w:val="5"/>
+  </w:num>
+  <w:num w:numId="12" w16cid:durableId="932855125">
+    <w:abstractNumId w:val="16"/>
+  </w:num>
+  <w:num w:numId="13" w16cid:durableId="1128208087">
+    <w:abstractNumId w:val="10"/>
+  </w:num>
+  <w:num w:numId="14" w16cid:durableId="1209758562">
     <w:abstractNumId w:val="2"/>
   </w:num>
-  <w:num w:numId="8" w16cid:durableId="324091261">
-    <w:abstractNumId w:val="6"/>
+  <w:num w:numId="15" w16cid:durableId="388843613">
+    <w:abstractNumId w:val="18"/>
   </w:num>
-  <w:num w:numId="9" w16cid:durableId="1726176819">
-    <w:abstractNumId w:val="5"/>
+  <w:num w:numId="16" w16cid:durableId="353460081">
+    <w:abstractNumId w:val="13"/>
+  </w:num>
+  <w:num w:numId="17" w16cid:durableId="1642466385">
+    <w:abstractNumId w:val="11"/>
+  </w:num>
+  <w:num w:numId="18" w16cid:durableId="1117456123">
+    <w:abstractNumId w:val="21"/>
+  </w:num>
+  <w:num w:numId="19" w16cid:durableId="924458077">
+    <w:abstractNumId w:val="12"/>
+  </w:num>
+  <w:num w:numId="20" w16cid:durableId="1827432817">
+    <w:abstractNumId w:val="20"/>
+  </w:num>
+  <w:num w:numId="21" w16cid:durableId="625888307">
+    <w:abstractNumId w:val="19"/>
+  </w:num>
+  <w:num w:numId="22" w16cid:durableId="1917936097">
+    <w:abstractNumId w:val="15"/>
   </w:num>
 </w:numbering>
 </file>
@@ -1767,7 +6341,7 @@
     <w:uiPriority w:val="9"/>
     <w:unhideWhenUsed/>
     <w:qFormat/>
-    <w:rsid w:val="003B03F7"/>
+    <w:rsid w:val="00597536"/>
     <w:pPr>
       <w:keepNext/>
       <w:keepLines/>
@@ -1776,6 +6350,7 @@
     </w:pPr>
     <w:rPr>
       <w:rFonts w:eastAsiaTheme="majorEastAsia" w:cstheme="majorBidi"/>
+      <w:b/>
       <w:sz w:val="26"/>
       <w:szCs w:val="26"/>
     </w:rPr>
@@ -1788,7 +6363,7 @@
     <w:uiPriority w:val="9"/>
     <w:unhideWhenUsed/>
     <w:qFormat/>
-    <w:rsid w:val="0061300C"/>
+    <w:rsid w:val="007B250C"/>
     <w:pPr>
       <w:keepNext/>
       <w:keepLines/>
@@ -1797,6 +6372,7 @@
     </w:pPr>
     <w:rPr>
       <w:rFonts w:eastAsiaTheme="majorEastAsia" w:cstheme="majorBidi"/>
+      <w:b/>
       <w:sz w:val="24"/>
       <w:szCs w:val="24"/>
     </w:rPr>
@@ -1950,9 +6526,10 @@
     <w:basedOn w:val="Policepardfaut"/>
     <w:link w:val="Titre2"/>
     <w:uiPriority w:val="9"/>
-    <w:rsid w:val="003B03F7"/>
+    <w:rsid w:val="00597536"/>
     <w:rPr>
       <w:rFonts w:ascii="Calibri" w:eastAsiaTheme="majorEastAsia" w:hAnsi="Calibri" w:cstheme="majorBidi"/>
+      <w:b/>
       <w:sz w:val="26"/>
       <w:szCs w:val="26"/>
     </w:rPr>
@@ -1981,9 +6558,10 @@
     <w:basedOn w:val="Policepardfaut"/>
     <w:link w:val="Titre3"/>
     <w:uiPriority w:val="9"/>
-    <w:rsid w:val="0061300C"/>
+    <w:rsid w:val="007B250C"/>
     <w:rPr>
       <w:rFonts w:ascii="Calibri" w:eastAsiaTheme="majorEastAsia" w:hAnsi="Calibri" w:cstheme="majorBidi"/>
+      <w:b/>
       <w:sz w:val="24"/>
       <w:szCs w:val="24"/>
     </w:rPr>
@@ -2013,6 +6591,16 @@
       <w:spacing w:after="100"/>
       <w:ind w:left="480"/>
     </w:pPr>
+  </w:style>
+  <w:style w:type="character" w:styleId="Textedelespacerserv">
+    <w:name w:val="Placeholder Text"/>
+    <w:basedOn w:val="Policepardfaut"/>
+    <w:uiPriority w:val="99"/>
+    <w:semiHidden/>
+    <w:rsid w:val="00B7187B"/>
+    <w:rPr>
+      <w:color w:val="666666"/>
+    </w:rPr>
   </w:style>
 </w:styles>
 </file>

</xml_diff>

<commit_message>
docs: ajout d'une partie de OpenGL au rapport
</commit_message>
<xml_diff>
--- a/Rapport.docx
+++ b/Rapport.docx
@@ -2,6 +2,26 @@
 <file path=word/document.xml><?xml version="1.0" encoding="utf-8"?>
 <w:document xmlns:wpc="http://schemas.microsoft.com/office/word/2010/wordprocessingCanvas" xmlns:cx="http://schemas.microsoft.com/office/drawing/2014/chartex" xmlns:cx1="http://schemas.microsoft.com/office/drawing/2015/9/8/chartex" xmlns:cx2="http://schemas.microsoft.com/office/drawing/2015/10/21/chartex" xmlns:cx3="http://schemas.microsoft.com/office/drawing/2016/5/9/chartex" xmlns:cx4="http://schemas.microsoft.com/office/drawing/2016/5/10/chartex" xmlns:cx5="http://schemas.microsoft.com/office/drawing/2016/5/11/chartex" xmlns:cx6="http://schemas.microsoft.com/office/drawing/2016/5/12/chartex" xmlns:cx7="http://schemas.microsoft.com/office/drawing/2016/5/13/chartex" xmlns:cx8="http://schemas.microsoft.com/office/drawing/2016/5/14/chartex" xmlns:mc="http://schemas.openxmlformats.org/markup-compatibility/2006" xmlns:aink="http://schemas.microsoft.com/office/drawing/2016/ink" xmlns:am3d="http://schemas.microsoft.com/office/drawing/2017/model3d" xmlns:o="urn:schemas-microsoft-com:office:office" xmlns:oel="http://schemas.microsoft.com/office/2019/extlst" xmlns:r="http://schemas.openxmlformats.org/officeDocument/2006/relationships" xmlns:m="http://schemas.openxmlformats.org/officeDocument/2006/math" xmlns:v="urn:schemas-microsoft-com:vml" xmlns:wp14="http://schemas.microsoft.com/office/word/2010/wordprocessingDrawing" xmlns:wp="http://schemas.openxmlformats.org/drawingml/2006/wordprocessingDrawing" xmlns:w10="urn:schemas-microsoft-com:office:word" xmlns:w="http://schemas.openxmlformats.org/wordprocessingml/2006/main" xmlns:w14="http://schemas.microsoft.com/office/word/2010/wordml" xmlns:w15="http://schemas.microsoft.com/office/word/2012/wordml" xmlns:w16cex="http://schemas.microsoft.com/office/word/2018/wordml/cex" xmlns:w16cid="http://schemas.microsoft.com/office/word/2016/wordml/cid" xmlns:w16="http://schemas.microsoft.com/office/word/2018/wordml" xmlns:w16du="http://schemas.microsoft.com/office/word/2023/wordml/word16du" xmlns:w16sdtdh="http://schemas.microsoft.com/office/word/2020/wordml/sdtdatahash" xmlns:w16sdtfl="http://schemas.microsoft.com/office/word/2024/wordml/sdtformatlock" xmlns:w16se="http://schemas.microsoft.com/office/word/2015/wordml/symex" xmlns:wpg="http://schemas.microsoft.com/office/word/2010/wordprocessingGroup" xmlns:wpi="http://schemas.microsoft.com/office/word/2010/wordprocessingInk" xmlns:wne="http://schemas.microsoft.com/office/word/2006/wordml" xmlns:wps="http://schemas.microsoft.com/office/word/2010/wordprocessingShape" mc:Ignorable="w14 w15 w16se w16cid w16 w16cex w16sdtdh w16sdtfl w16du wp14">
   <w:body>
+    <w:p>
+      <w:pPr>
+        <w:jc w:val="center"/>
+        <w:rPr>
+          <w:rFonts w:ascii="Euclid Circular A Bold" w:hAnsi="Euclid Circular A Bold" w:cs="Arial"/>
+          <w:sz w:val="28"/>
+          <w:szCs w:val="28"/>
+        </w:rPr>
+      </w:pPr>
+    </w:p>
+    <w:p>
+      <w:pPr>
+        <w:jc w:val="center"/>
+        <w:rPr>
+          <w:rFonts w:ascii="Euclid Circular A Bold" w:hAnsi="Euclid Circular A Bold" w:cs="Arial"/>
+          <w:sz w:val="28"/>
+          <w:szCs w:val="28"/>
+        </w:rPr>
+      </w:pPr>
+    </w:p>
     <w:p>
       <w:pPr>
         <w:jc w:val="center"/>
@@ -225,26 +245,6 @@
         </w:rPr>
         <w:t>SCHMITT Hugo</w:t>
       </w:r>
-    </w:p>
-    <w:p>
-      <w:pPr>
-        <w:jc w:val="center"/>
-        <w:rPr>
-          <w:rFonts w:ascii="Euclid Circular A Light" w:hAnsi="Euclid Circular A Light" w:cs="Arial"/>
-          <w:sz w:val="24"/>
-          <w:szCs w:val="24"/>
-        </w:rPr>
-      </w:pPr>
-    </w:p>
-    <w:p>
-      <w:pPr>
-        <w:jc w:val="center"/>
-        <w:rPr>
-          <w:rFonts w:ascii="Euclid Circular A Light" w:hAnsi="Euclid Circular A Light" w:cs="Arial"/>
-          <w:sz w:val="24"/>
-          <w:szCs w:val="24"/>
-        </w:rPr>
-      </w:pPr>
     </w:p>
     <w:p>
       <w:pPr>
@@ -2210,7 +2210,6 @@
     <w:p/>
     <w:p/>
     <w:p/>
-    <w:p/>
     <w:p>
       <w:pPr>
         <w:pStyle w:val="Titre1"/>
@@ -2679,6 +2678,9 @@
       <w:r>
         <w:t>La classe « Viewport » permet de gérer la conversion des formes définies dans un espace de monde en formes adaptées à l’affichage sur l’écran. C’est notamment elle, qui s’occupe d’utiliser les fonctions présentes dans les classes formes afin de réaliser cette transformation.</w:t>
       </w:r>
+      <w:r>
+        <w:t xml:space="preserve"> Elle est située dans le dossier « graphique ».</w:t>
+      </w:r>
     </w:p>
     <w:p/>
     <w:p>
@@ -2727,32 +2729,24 @@
     </w:p>
     <w:p>
       <w:pPr>
-        <w:jc w:val="center"/>
-      </w:pPr>
-    </w:p>
-    <w:p>
-      <w:pPr>
-        <w:jc w:val="center"/>
-      </w:pPr>
-    </w:p>
-    <w:p>
-      <w:pPr>
-        <w:jc w:val="center"/>
-      </w:pPr>
-    </w:p>
-    <w:p>
-      <w:pPr>
-        <w:jc w:val="center"/>
         <w:rPr>
           <w:rFonts w:eastAsiaTheme="minorEastAsia"/>
         </w:rPr>
       </w:pPr>
-      <w:r>
+    </w:p>
+    <w:p>
+      <w:pPr>
         <w:rPr>
           <w:rFonts w:eastAsiaTheme="minorEastAsia"/>
         </w:rPr>
-        <w:t xml:space="preserve">            </w:t>
-      </w:r>
+      </w:pPr>
+    </w:p>
+    <w:p>
+      <w:pPr>
+        <w:rPr>
+          <w:rFonts w:eastAsiaTheme="minorEastAsia"/>
+        </w:rPr>
+      </w:pPr>
     </w:p>
     <w:p>
       <w:pPr>
@@ -3284,53 +3278,71 @@
       <w:r>
         <w:t xml:space="preserve"> Cette classe définie également une méthode abstraite </w:t>
       </w:r>
+      <w:proofErr w:type="spellStart"/>
       <w:r>
         <w:rPr>
           <w:i/>
           <w:iCs/>
         </w:rPr>
-        <w:t>chargerTXT()</w:t>
-      </w:r>
+        <w:t>chargerTXT</w:t>
+      </w:r>
+      <w:proofErr w:type="spellEnd"/>
       <w:r>
         <w:rPr>
           <w:i/>
           <w:iCs/>
         </w:rPr>
-        <w:t xml:space="preserve"> </w:t>
-      </w:r>
-      <w:r>
-        <w:t xml:space="preserve">qui </w:t>
-      </w:r>
-      <w:r>
-        <w:t xml:space="preserve">sera notamment appelée dans la méthode </w:t>
+        <w:t>()</w:t>
       </w:r>
       <w:r>
         <w:rPr>
           <w:i/>
           <w:iCs/>
         </w:rPr>
-        <w:t>charger()</w:t>
-      </w:r>
-      <w:r>
-        <w:t>.</w:t>
-      </w:r>
-    </w:p>
-    <w:p>
-      <w:r>
-        <w:t>Chaque sous</w:t>
-      </w:r>
-      <w:r>
-        <w:t>-</w:t>
-      </w:r>
-      <w:r>
-        <w:t xml:space="preserve">classe s’occupe ensuite de définir la méthode </w:t>
+        <w:t xml:space="preserve"> </w:t>
+      </w:r>
+      <w:r>
+        <w:t xml:space="preserve">qui </w:t>
+      </w:r>
+      <w:r>
+        <w:t xml:space="preserve">sera notamment appelée dans la méthode </w:t>
       </w:r>
       <w:r>
         <w:rPr>
           <w:i/>
           <w:iCs/>
         </w:rPr>
-        <w:t>chargerTXT()</w:t>
+        <w:t>charger()</w:t>
+      </w:r>
+      <w:r>
+        <w:t>.</w:t>
+      </w:r>
+    </w:p>
+    <w:p>
+      <w:r>
+        <w:t>Chaque sous</w:t>
+      </w:r>
+      <w:r>
+        <w:t>-</w:t>
+      </w:r>
+      <w:r>
+        <w:t xml:space="preserve">classe s’occupe ensuite de définir la méthode </w:t>
+      </w:r>
+      <w:proofErr w:type="spellStart"/>
+      <w:r>
+        <w:rPr>
+          <w:i/>
+          <w:iCs/>
+        </w:rPr>
+        <w:t>chargerTXT</w:t>
+      </w:r>
+      <w:proofErr w:type="spellEnd"/>
+      <w:r>
+        <w:rPr>
+          <w:i/>
+          <w:iCs/>
+        </w:rPr>
+        <w:t>()</w:t>
       </w:r>
       <w:r>
         <w:rPr>
@@ -3384,6 +3396,9 @@
     </w:p>
     <w:p>
       <w:r>
+        <w:rPr>
+          <w:noProof/>
+        </w:rPr>
         <w:drawing>
           <wp:inline distT="0" distB="0" distL="0" distR="0" wp14:anchorId="2CFCD3C1" wp14:editId="0AF02432">
             <wp:extent cx="5760720" cy="3318510"/>
@@ -3550,6 +3565,59 @@
         <w:t>Le pattern Singleton est utilisé dans notre projet pour garantir qu’une seule instance du client existe et est accessible globalement. Cette approche permet de centraliser la gestion du client et d’éviter des conflits liés à la création de multiples instances.</w:t>
       </w:r>
     </w:p>
+    <w:p>
+      <w:r>
+        <w:t>Voici le diagramme UML associé à cette partie :</w:t>
+      </w:r>
+    </w:p>
+    <w:p>
+      <w:pPr>
+        <w:jc w:val="center"/>
+      </w:pPr>
+      <w:r>
+        <w:drawing>
+          <wp:inline distT="0" distB="0" distL="0" distR="0" wp14:anchorId="414383AE" wp14:editId="7C74C3E0">
+            <wp:extent cx="3533775" cy="3733800"/>
+            <wp:effectExtent l="0" t="0" r="9525" b="0"/>
+            <wp:docPr id="1438442023" name="Image 1" descr="Une image contenant texte, capture d’écran, diagramme, ligne&#10;&#10;Le contenu généré par l’IA peut être incorrect."/>
+            <wp:cNvGraphicFramePr>
+              <a:graphicFrameLocks xmlns:a="http://schemas.openxmlformats.org/drawingml/2006/main" noChangeAspect="1"/>
+            </wp:cNvGraphicFramePr>
+            <a:graphic xmlns:a="http://schemas.openxmlformats.org/drawingml/2006/main">
+              <a:graphicData uri="http://schemas.openxmlformats.org/drawingml/2006/picture">
+                <pic:pic xmlns:pic="http://schemas.openxmlformats.org/drawingml/2006/picture">
+                  <pic:nvPicPr>
+                    <pic:cNvPr id="1438442023" name="Image 1" descr="Une image contenant texte, capture d’écran, diagramme, ligne&#10;&#10;Le contenu généré par l’IA peut être incorrect."/>
+                    <pic:cNvPicPr/>
+                  </pic:nvPicPr>
+                  <pic:blipFill>
+                    <a:blip r:embed="rId10">
+                      <a:extLst>
+                        <a:ext uri="{28A0092B-C50C-407E-A947-70E740481C1C}">
+                          <a14:useLocalDpi xmlns:a14="http://schemas.microsoft.com/office/drawing/2010/main" val="0"/>
+                        </a:ext>
+                      </a:extLst>
+                    </a:blip>
+                    <a:stretch>
+                      <a:fillRect/>
+                    </a:stretch>
+                  </pic:blipFill>
+                  <pic:spPr>
+                    <a:xfrm>
+                      <a:off x="0" y="0"/>
+                      <a:ext cx="3533775" cy="3733800"/>
+                    </a:xfrm>
+                    <a:prstGeom prst="rect">
+                      <a:avLst/>
+                    </a:prstGeom>
+                  </pic:spPr>
+                </pic:pic>
+              </a:graphicData>
+            </a:graphic>
+          </wp:inline>
+        </w:drawing>
+      </w:r>
+    </w:p>
     <w:p/>
     <w:p>
       <w:pPr>
@@ -3573,6 +3641,14 @@
     </w:p>
     <w:p/>
     <w:p/>
+    <w:p/>
+    <w:p/>
+    <w:p/>
+    <w:p/>
+    <w:p/>
+    <w:p/>
+    <w:p/>
+    <w:p/>
     <w:p>
       <w:pPr>
         <w:pStyle w:val="Titre2"/>
@@ -3583,6 +3659,7 @@
       </w:pPr>
       <w:bookmarkStart w:id="19" w:name="_Toc190442856"/>
       <w:r>
+        <w:lastRenderedPageBreak/>
         <w:t>Extension OpenGL</w:t>
       </w:r>
       <w:bookmarkEnd w:id="19"/>
@@ -3594,11 +3671,203 @@
         </w:rPr>
       </w:pPr>
     </w:p>
+    <w:p>
+      <w:pPr>
+        <w:pStyle w:val="Titre2"/>
+        <w:numPr>
+          <w:ilvl w:val="0"/>
+          <w:numId w:val="23"/>
+        </w:numPr>
+      </w:pPr>
+      <w:r>
+        <w:t>Présentation de l’extension</w:t>
+      </w:r>
+    </w:p>
+    <w:p/>
+    <w:p>
+      <w:r>
+        <w:t>Cette extension permet de dessiner une forme directement via le langage C++, sans avoir besoin de passer par le client TCP/IP</w:t>
+      </w:r>
+      <w:r>
+        <w:t xml:space="preserve"> pour transférer les formes aux serveur Java</w:t>
+      </w:r>
+      <w:r>
+        <w:t>. Pour se faire, nous avons utilisé la librairie OpenGL permettant de dessiner très efficacement nos formes</w:t>
+      </w:r>
+      <w:r>
+        <w:t xml:space="preserve"> en</w:t>
+      </w:r>
+      <w:r>
+        <w:t xml:space="preserve"> deux dimensions.</w:t>
+      </w:r>
+      <w:r>
+        <w:t xml:space="preserve"> Il s’agit d’une sorte de version amélioré </w:t>
+      </w:r>
+      <w:r>
+        <w:t>de la partie Java, tout en s’inspirant du mode de fonctionnement de cette dernière.</w:t>
+      </w:r>
+    </w:p>
+    <w:p/>
+    <w:p>
+      <w:pPr>
+        <w:pStyle w:val="Titre2"/>
+        <w:numPr>
+          <w:ilvl w:val="0"/>
+          <w:numId w:val="23"/>
+        </w:numPr>
+      </w:pPr>
+      <w:r>
+        <w:t>Structure et Classes</w:t>
+      </w:r>
+    </w:p>
+    <w:p/>
+    <w:p>
+      <w:r>
+        <w:t>Cette partie est basé, tout comme la partie Java, sur l’architecture MVC pour assurer une bonne répartition des tâches.</w:t>
+      </w:r>
+    </w:p>
+    <w:p/>
+    <w:p>
+      <w:pPr>
+        <w:pStyle w:val="Titre3"/>
+        <w:numPr>
+          <w:ilvl w:val="0"/>
+          <w:numId w:val="26"/>
+        </w:numPr>
+      </w:pPr>
+      <w:r>
+        <w:t>Modèle</w:t>
+      </w:r>
+    </w:p>
+    <w:p/>
+    <w:p>
+      <w:r>
+        <w:t>Le modèle contient l’ensemble des classes essentielles au bon fonctionnement d’OpenGL au sein de notre projet. Voici les rôles des différentes classes présente au sein du modèle :</w:t>
+      </w:r>
+    </w:p>
+    <w:p/>
+    <w:p>
+      <w:pPr>
+        <w:pStyle w:val="Paragraphedeliste"/>
+        <w:numPr>
+          <w:ilvl w:val="0"/>
+          <w:numId w:val="17"/>
+        </w:numPr>
+      </w:pPr>
+      <w:r>
+        <w:t>GLAD (GL Loader)</w:t>
+      </w:r>
+    </w:p>
+    <w:p>
+      <w:r>
+        <w:t>GLAD est un chargeur de fonctions OpenGL. Il est nécessaire pour charger dynamiquement les fonctions OpenGL dont nous avons besoins étant donné qu’OpenGL n’expose pas directement toutes ses fonctions.</w:t>
+      </w:r>
+    </w:p>
+    <w:p/>
+    <w:p>
+      <w:pPr>
+        <w:pStyle w:val="Paragraphedeliste"/>
+        <w:numPr>
+          <w:ilvl w:val="0"/>
+          <w:numId w:val="17"/>
+        </w:numPr>
+      </w:pPr>
+      <w:r>
+        <w:t>GLFW</w:t>
+      </w:r>
+    </w:p>
+    <w:p>
+      <w:r>
+        <w:t>GLFW est une bibliothèque qui gère la création de fenêtre sous Windows. Il est nécessaire étant donné qu’OpenGL ne fournit pas d’outils pour créer une fenêtre, c’est donc GLFW qui s’en charge dans notre projet.</w:t>
+      </w:r>
+    </w:p>
+    <w:p/>
+    <w:p>
+      <w:pPr>
+        <w:pStyle w:val="Paragraphedeliste"/>
+        <w:numPr>
+          <w:ilvl w:val="0"/>
+          <w:numId w:val="17"/>
+        </w:numPr>
+      </w:pPr>
+      <w:r>
+        <w:t>KHR (Khronos Group Headers)</w:t>
+      </w:r>
+    </w:p>
+    <w:p>
+      <w:r>
+        <w:t>Cette partie n’est pas essentiels au fonctionnement de l’extension, mais elle contient notamment</w:t>
+      </w:r>
+      <w:r>
+        <w:t xml:space="preserve"> certains fichiers relatifs aux extensions OpenGL.</w:t>
+      </w:r>
+    </w:p>
+    <w:p/>
+    <w:p/>
+    <w:p/>
+    <w:p>
+      <w:pPr>
+        <w:pStyle w:val="Titre3"/>
+        <w:numPr>
+          <w:ilvl w:val="0"/>
+          <w:numId w:val="26"/>
+        </w:numPr>
+      </w:pPr>
+      <w:r>
+        <w:lastRenderedPageBreak/>
+        <w:t>Vue</w:t>
+      </w:r>
+    </w:p>
+    <w:p/>
+    <w:p>
+      <w:r>
+        <w:t>C’est la partie qui gère la fenêtre de l’extension. Elle est composée d’une seule classe nommée « FenetreOpenGL » qui contient l’ensemble du code permettant d’exécuter correctement notre fenêtre GLFW.</w:t>
+      </w:r>
+    </w:p>
+    <w:p/>
+    <w:p>
+      <w:pPr>
+        <w:pStyle w:val="Titre3"/>
+        <w:numPr>
+          <w:ilvl w:val="0"/>
+          <w:numId w:val="26"/>
+        </w:numPr>
+      </w:pPr>
+      <w:r>
+        <w:t>Contrôleur</w:t>
+      </w:r>
+    </w:p>
+    <w:p/>
+    <w:p>
+      <w:r>
+        <w:t>Pour finir, le contrôleur, représenté par la classe « ControleurFenetreOpenGL » s’occupe de faire le lien entre l’application principale, le modèle de l’extension et la fenêtre GLFW. C’est notamment cette classe qui</w:t>
+      </w:r>
+      <w:r>
+        <w:t xml:space="preserve"> se charge de créer la fenêtre d’affichage et de lancer son exécution.</w:t>
+      </w:r>
+    </w:p>
+    <w:p/>
+    <w:p>
+      <w:pPr>
+        <w:pStyle w:val="Titre2"/>
+        <w:numPr>
+          <w:ilvl w:val="0"/>
+          <w:numId w:val="23"/>
+        </w:numPr>
+      </w:pPr>
+      <w:r>
+        <w:t>Fonctionnement</w:t>
+      </w:r>
+    </w:p>
+    <w:p/>
+    <w:p/>
+    <w:p/>
+    <w:p/>
     <w:p/>
     <w:sectPr>
-      <w:headerReference w:type="default" r:id="rId10"/>
-      <w:footerReference w:type="default" r:id="rId11"/>
-      <w:headerReference w:type="first" r:id="rId12"/>
+      <w:headerReference w:type="default" r:id="rId11"/>
+      <w:footerReference w:type="default" r:id="rId12"/>
+      <w:headerReference w:type="first" r:id="rId13"/>
       <w:pgSz w:w="11906" w:h="16838"/>
       <w:pgMar w:top="1417" w:right="1417" w:bottom="1417" w:left="1417" w:header="708" w:footer="708" w:gutter="0"/>
       <w:cols w:space="708"/>
@@ -3763,6 +4032,95 @@
 <file path=word/numbering.xml><?xml version="1.0" encoding="utf-8"?>
 <w:numbering xmlns:wpc="http://schemas.microsoft.com/office/word/2010/wordprocessingCanvas" xmlns:cx="http://schemas.microsoft.com/office/drawing/2014/chartex" xmlns:cx1="http://schemas.microsoft.com/office/drawing/2015/9/8/chartex" xmlns:cx2="http://schemas.microsoft.com/office/drawing/2015/10/21/chartex" xmlns:cx3="http://schemas.microsoft.com/office/drawing/2016/5/9/chartex" xmlns:cx4="http://schemas.microsoft.com/office/drawing/2016/5/10/chartex" xmlns:cx5="http://schemas.microsoft.com/office/drawing/2016/5/11/chartex" xmlns:cx6="http://schemas.microsoft.com/office/drawing/2016/5/12/chartex" xmlns:cx7="http://schemas.microsoft.com/office/drawing/2016/5/13/chartex" xmlns:cx8="http://schemas.microsoft.com/office/drawing/2016/5/14/chartex" xmlns:mc="http://schemas.openxmlformats.org/markup-compatibility/2006" xmlns:aink="http://schemas.microsoft.com/office/drawing/2016/ink" xmlns:am3d="http://schemas.microsoft.com/office/drawing/2017/model3d" xmlns:o="urn:schemas-microsoft-com:office:office" xmlns:oel="http://schemas.microsoft.com/office/2019/extlst" xmlns:r="http://schemas.openxmlformats.org/officeDocument/2006/relationships" xmlns:m="http://schemas.openxmlformats.org/officeDocument/2006/math" xmlns:v="urn:schemas-microsoft-com:vml" xmlns:wp14="http://schemas.microsoft.com/office/word/2010/wordprocessingDrawing" xmlns:wp="http://schemas.openxmlformats.org/drawingml/2006/wordprocessingDrawing" xmlns:w10="urn:schemas-microsoft-com:office:word" xmlns:w="http://schemas.openxmlformats.org/wordprocessingml/2006/main" xmlns:w14="http://schemas.microsoft.com/office/word/2010/wordml" xmlns:w15="http://schemas.microsoft.com/office/word/2012/wordml" xmlns:w16cex="http://schemas.microsoft.com/office/word/2018/wordml/cex" xmlns:w16cid="http://schemas.microsoft.com/office/word/2016/wordml/cid" xmlns:w16="http://schemas.microsoft.com/office/word/2018/wordml" xmlns:w16du="http://schemas.microsoft.com/office/word/2023/wordml/word16du" xmlns:w16sdtdh="http://schemas.microsoft.com/office/word/2020/wordml/sdtdatahash" xmlns:w16sdtfl="http://schemas.microsoft.com/office/word/2024/wordml/sdtformatlock" xmlns:w16se="http://schemas.microsoft.com/office/word/2015/wordml/symex" xmlns:wpg="http://schemas.microsoft.com/office/word/2010/wordprocessingGroup" xmlns:wpi="http://schemas.microsoft.com/office/word/2010/wordprocessingInk" xmlns:wne="http://schemas.microsoft.com/office/word/2006/wordml" xmlns:wps="http://schemas.microsoft.com/office/word/2010/wordprocessingShape" mc:Ignorable="w14 w15 w16se w16cid w16 w16cex w16sdtdh w16sdtfl w16du wp14">
   <w:abstractNum w:abstractNumId="0" w15:restartNumberingAfterBreak="0">
+    <w:nsid w:val="02D13E31"/>
+    <w:multiLevelType w:val="hybridMultilevel"/>
+    <w:tmpl w:val="3DA69C60"/>
+    <w:lvl w:ilvl="0" w:tplc="040C0019">
+      <w:start w:val="1"/>
+      <w:numFmt w:val="lowerLetter"/>
+      <w:lvlText w:val="%1."/>
+      <w:lvlJc w:val="left"/>
+      <w:pPr>
+        <w:ind w:left="720" w:hanging="360"/>
+      </w:pPr>
+      <w:rPr>
+        <w:rFonts w:hint="default"/>
+      </w:rPr>
+    </w:lvl>
+    <w:lvl w:ilvl="1" w:tplc="040C0019" w:tentative="1">
+      <w:start w:val="1"/>
+      <w:numFmt w:val="lowerLetter"/>
+      <w:lvlText w:val="%2."/>
+      <w:lvlJc w:val="left"/>
+      <w:pPr>
+        <w:ind w:left="1440" w:hanging="360"/>
+      </w:pPr>
+    </w:lvl>
+    <w:lvl w:ilvl="2" w:tplc="040C001B" w:tentative="1">
+      <w:start w:val="1"/>
+      <w:numFmt w:val="lowerRoman"/>
+      <w:lvlText w:val="%3."/>
+      <w:lvlJc w:val="right"/>
+      <w:pPr>
+        <w:ind w:left="2160" w:hanging="180"/>
+      </w:pPr>
+    </w:lvl>
+    <w:lvl w:ilvl="3" w:tplc="040C000F" w:tentative="1">
+      <w:start w:val="1"/>
+      <w:numFmt w:val="decimal"/>
+      <w:lvlText w:val="%4."/>
+      <w:lvlJc w:val="left"/>
+      <w:pPr>
+        <w:ind w:left="2880" w:hanging="360"/>
+      </w:pPr>
+    </w:lvl>
+    <w:lvl w:ilvl="4" w:tplc="040C0019" w:tentative="1">
+      <w:start w:val="1"/>
+      <w:numFmt w:val="lowerLetter"/>
+      <w:lvlText w:val="%5."/>
+      <w:lvlJc w:val="left"/>
+      <w:pPr>
+        <w:ind w:left="3600" w:hanging="360"/>
+      </w:pPr>
+    </w:lvl>
+    <w:lvl w:ilvl="5" w:tplc="040C001B" w:tentative="1">
+      <w:start w:val="1"/>
+      <w:numFmt w:val="lowerRoman"/>
+      <w:lvlText w:val="%6."/>
+      <w:lvlJc w:val="right"/>
+      <w:pPr>
+        <w:ind w:left="4320" w:hanging="180"/>
+      </w:pPr>
+    </w:lvl>
+    <w:lvl w:ilvl="6" w:tplc="040C000F" w:tentative="1">
+      <w:start w:val="1"/>
+      <w:numFmt w:val="decimal"/>
+      <w:lvlText w:val="%7."/>
+      <w:lvlJc w:val="left"/>
+      <w:pPr>
+        <w:ind w:left="5040" w:hanging="360"/>
+      </w:pPr>
+    </w:lvl>
+    <w:lvl w:ilvl="7" w:tplc="040C0019" w:tentative="1">
+      <w:start w:val="1"/>
+      <w:numFmt w:val="lowerLetter"/>
+      <w:lvlText w:val="%8."/>
+      <w:lvlJc w:val="left"/>
+      <w:pPr>
+        <w:ind w:left="5760" w:hanging="360"/>
+      </w:pPr>
+    </w:lvl>
+    <w:lvl w:ilvl="8" w:tplc="040C001B" w:tentative="1">
+      <w:start w:val="1"/>
+      <w:numFmt w:val="lowerRoman"/>
+      <w:lvlText w:val="%9."/>
+      <w:lvlJc w:val="right"/>
+      <w:pPr>
+        <w:ind w:left="6480" w:hanging="180"/>
+      </w:pPr>
+    </w:lvl>
+  </w:abstractNum>
+  <w:abstractNum w:abstractNumId="1" w15:restartNumberingAfterBreak="0">
     <w:nsid w:val="09F9493A"/>
     <w:multiLevelType w:val="hybridMultilevel"/>
     <w:tmpl w:val="2F564EDC"/>
@@ -3851,7 +4209,7 @@
       </w:pPr>
     </w:lvl>
   </w:abstractNum>
-  <w:abstractNum w:abstractNumId="1" w15:restartNumberingAfterBreak="0">
+  <w:abstractNum w:abstractNumId="2" w15:restartNumberingAfterBreak="0">
     <w:nsid w:val="0AA5088C"/>
     <w:multiLevelType w:val="hybridMultilevel"/>
     <w:tmpl w:val="679EA498"/>
@@ -3940,7 +4298,7 @@
       </w:pPr>
     </w:lvl>
   </w:abstractNum>
-  <w:abstractNum w:abstractNumId="2" w15:restartNumberingAfterBreak="0">
+  <w:abstractNum w:abstractNumId="3" w15:restartNumberingAfterBreak="0">
     <w:nsid w:val="0C1E16E4"/>
     <w:multiLevelType w:val="hybridMultilevel"/>
     <w:tmpl w:val="7B5047F4"/>
@@ -4029,7 +4387,96 @@
       </w:pPr>
     </w:lvl>
   </w:abstractNum>
-  <w:abstractNum w:abstractNumId="3" w15:restartNumberingAfterBreak="0">
+  <w:abstractNum w:abstractNumId="4" w15:restartNumberingAfterBreak="0">
+    <w:nsid w:val="0CB94D56"/>
+    <w:multiLevelType w:val="hybridMultilevel"/>
+    <w:tmpl w:val="B2DADA3A"/>
+    <w:lvl w:ilvl="0" w:tplc="040C0019">
+      <w:start w:val="1"/>
+      <w:numFmt w:val="lowerLetter"/>
+      <w:lvlText w:val="%1."/>
+      <w:lvlJc w:val="left"/>
+      <w:pPr>
+        <w:ind w:left="720" w:hanging="360"/>
+      </w:pPr>
+      <w:rPr>
+        <w:rFonts w:hint="default"/>
+      </w:rPr>
+    </w:lvl>
+    <w:lvl w:ilvl="1" w:tplc="040C0019" w:tentative="1">
+      <w:start w:val="1"/>
+      <w:numFmt w:val="lowerLetter"/>
+      <w:lvlText w:val="%2."/>
+      <w:lvlJc w:val="left"/>
+      <w:pPr>
+        <w:ind w:left="1440" w:hanging="360"/>
+      </w:pPr>
+    </w:lvl>
+    <w:lvl w:ilvl="2" w:tplc="040C001B" w:tentative="1">
+      <w:start w:val="1"/>
+      <w:numFmt w:val="lowerRoman"/>
+      <w:lvlText w:val="%3."/>
+      <w:lvlJc w:val="right"/>
+      <w:pPr>
+        <w:ind w:left="2160" w:hanging="180"/>
+      </w:pPr>
+    </w:lvl>
+    <w:lvl w:ilvl="3" w:tplc="040C000F" w:tentative="1">
+      <w:start w:val="1"/>
+      <w:numFmt w:val="decimal"/>
+      <w:lvlText w:val="%4."/>
+      <w:lvlJc w:val="left"/>
+      <w:pPr>
+        <w:ind w:left="2880" w:hanging="360"/>
+      </w:pPr>
+    </w:lvl>
+    <w:lvl w:ilvl="4" w:tplc="040C0019" w:tentative="1">
+      <w:start w:val="1"/>
+      <w:numFmt w:val="lowerLetter"/>
+      <w:lvlText w:val="%5."/>
+      <w:lvlJc w:val="left"/>
+      <w:pPr>
+        <w:ind w:left="3600" w:hanging="360"/>
+      </w:pPr>
+    </w:lvl>
+    <w:lvl w:ilvl="5" w:tplc="040C001B" w:tentative="1">
+      <w:start w:val="1"/>
+      <w:numFmt w:val="lowerRoman"/>
+      <w:lvlText w:val="%6."/>
+      <w:lvlJc w:val="right"/>
+      <w:pPr>
+        <w:ind w:left="4320" w:hanging="180"/>
+      </w:pPr>
+    </w:lvl>
+    <w:lvl w:ilvl="6" w:tplc="040C000F" w:tentative="1">
+      <w:start w:val="1"/>
+      <w:numFmt w:val="decimal"/>
+      <w:lvlText w:val="%7."/>
+      <w:lvlJc w:val="left"/>
+      <w:pPr>
+        <w:ind w:left="5040" w:hanging="360"/>
+      </w:pPr>
+    </w:lvl>
+    <w:lvl w:ilvl="7" w:tplc="040C0019" w:tentative="1">
+      <w:start w:val="1"/>
+      <w:numFmt w:val="lowerLetter"/>
+      <w:lvlText w:val="%8."/>
+      <w:lvlJc w:val="left"/>
+      <w:pPr>
+        <w:ind w:left="5760" w:hanging="360"/>
+      </w:pPr>
+    </w:lvl>
+    <w:lvl w:ilvl="8" w:tplc="040C001B" w:tentative="1">
+      <w:start w:val="1"/>
+      <w:numFmt w:val="lowerRoman"/>
+      <w:lvlText w:val="%9."/>
+      <w:lvlJc w:val="right"/>
+      <w:pPr>
+        <w:ind w:left="6480" w:hanging="180"/>
+      </w:pPr>
+    </w:lvl>
+  </w:abstractNum>
+  <w:abstractNum w:abstractNumId="5" w15:restartNumberingAfterBreak="0">
     <w:nsid w:val="0D581642"/>
     <w:multiLevelType w:val="hybridMultilevel"/>
     <w:tmpl w:val="8A009CEA"/>
@@ -4118,7 +4565,7 @@
       </w:pPr>
     </w:lvl>
   </w:abstractNum>
-  <w:abstractNum w:abstractNumId="4" w15:restartNumberingAfterBreak="0">
+  <w:abstractNum w:abstractNumId="6" w15:restartNumberingAfterBreak="0">
     <w:nsid w:val="0F927F54"/>
     <w:multiLevelType w:val="hybridMultilevel"/>
     <w:tmpl w:val="5F9A2FEA"/>
@@ -4207,7 +4654,96 @@
       </w:pPr>
     </w:lvl>
   </w:abstractNum>
-  <w:abstractNum w:abstractNumId="5" w15:restartNumberingAfterBreak="0">
+  <w:abstractNum w:abstractNumId="7" w15:restartNumberingAfterBreak="0">
+    <w:nsid w:val="14F53A2D"/>
+    <w:multiLevelType w:val="hybridMultilevel"/>
+    <w:tmpl w:val="D0EA4C06"/>
+    <w:lvl w:ilvl="0" w:tplc="040C000F">
+      <w:start w:val="1"/>
+      <w:numFmt w:val="decimal"/>
+      <w:lvlText w:val="%1."/>
+      <w:lvlJc w:val="left"/>
+      <w:pPr>
+        <w:ind w:left="720" w:hanging="360"/>
+      </w:pPr>
+      <w:rPr>
+        <w:rFonts w:hint="default"/>
+      </w:rPr>
+    </w:lvl>
+    <w:lvl w:ilvl="1" w:tplc="040C0019" w:tentative="1">
+      <w:start w:val="1"/>
+      <w:numFmt w:val="lowerLetter"/>
+      <w:lvlText w:val="%2."/>
+      <w:lvlJc w:val="left"/>
+      <w:pPr>
+        <w:ind w:left="1440" w:hanging="360"/>
+      </w:pPr>
+    </w:lvl>
+    <w:lvl w:ilvl="2" w:tplc="040C001B" w:tentative="1">
+      <w:start w:val="1"/>
+      <w:numFmt w:val="lowerRoman"/>
+      <w:lvlText w:val="%3."/>
+      <w:lvlJc w:val="right"/>
+      <w:pPr>
+        <w:ind w:left="2160" w:hanging="180"/>
+      </w:pPr>
+    </w:lvl>
+    <w:lvl w:ilvl="3" w:tplc="040C000F" w:tentative="1">
+      <w:start w:val="1"/>
+      <w:numFmt w:val="decimal"/>
+      <w:lvlText w:val="%4."/>
+      <w:lvlJc w:val="left"/>
+      <w:pPr>
+        <w:ind w:left="2880" w:hanging="360"/>
+      </w:pPr>
+    </w:lvl>
+    <w:lvl w:ilvl="4" w:tplc="040C0019" w:tentative="1">
+      <w:start w:val="1"/>
+      <w:numFmt w:val="lowerLetter"/>
+      <w:lvlText w:val="%5."/>
+      <w:lvlJc w:val="left"/>
+      <w:pPr>
+        <w:ind w:left="3600" w:hanging="360"/>
+      </w:pPr>
+    </w:lvl>
+    <w:lvl w:ilvl="5" w:tplc="040C001B" w:tentative="1">
+      <w:start w:val="1"/>
+      <w:numFmt w:val="lowerRoman"/>
+      <w:lvlText w:val="%6."/>
+      <w:lvlJc w:val="right"/>
+      <w:pPr>
+        <w:ind w:left="4320" w:hanging="180"/>
+      </w:pPr>
+    </w:lvl>
+    <w:lvl w:ilvl="6" w:tplc="040C000F" w:tentative="1">
+      <w:start w:val="1"/>
+      <w:numFmt w:val="decimal"/>
+      <w:lvlText w:val="%7."/>
+      <w:lvlJc w:val="left"/>
+      <w:pPr>
+        <w:ind w:left="5040" w:hanging="360"/>
+      </w:pPr>
+    </w:lvl>
+    <w:lvl w:ilvl="7" w:tplc="040C0019" w:tentative="1">
+      <w:start w:val="1"/>
+      <w:numFmt w:val="lowerLetter"/>
+      <w:lvlText w:val="%8."/>
+      <w:lvlJc w:val="left"/>
+      <w:pPr>
+        <w:ind w:left="5760" w:hanging="360"/>
+      </w:pPr>
+    </w:lvl>
+    <w:lvl w:ilvl="8" w:tplc="040C001B" w:tentative="1">
+      <w:start w:val="1"/>
+      <w:numFmt w:val="lowerRoman"/>
+      <w:lvlText w:val="%9."/>
+      <w:lvlJc w:val="right"/>
+      <w:pPr>
+        <w:ind w:left="6480" w:hanging="180"/>
+      </w:pPr>
+    </w:lvl>
+  </w:abstractNum>
+  <w:abstractNum w:abstractNumId="8" w15:restartNumberingAfterBreak="0">
     <w:nsid w:val="1B9F4786"/>
     <w:multiLevelType w:val="hybridMultilevel"/>
     <w:tmpl w:val="5986D9D2"/>
@@ -4296,7 +4832,7 @@
       </w:pPr>
     </w:lvl>
   </w:abstractNum>
-  <w:abstractNum w:abstractNumId="6" w15:restartNumberingAfterBreak="0">
+  <w:abstractNum w:abstractNumId="9" w15:restartNumberingAfterBreak="0">
     <w:nsid w:val="24064188"/>
     <w:multiLevelType w:val="hybridMultilevel"/>
     <w:tmpl w:val="1BD6257A"/>
@@ -4385,7 +4921,7 @@
       </w:pPr>
     </w:lvl>
   </w:abstractNum>
-  <w:abstractNum w:abstractNumId="7" w15:restartNumberingAfterBreak="0">
+  <w:abstractNum w:abstractNumId="10" w15:restartNumberingAfterBreak="0">
     <w:nsid w:val="24FC061E"/>
     <w:multiLevelType w:val="hybridMultilevel"/>
     <w:tmpl w:val="B3FA1D02"/>
@@ -4474,7 +5010,7 @@
       </w:pPr>
     </w:lvl>
   </w:abstractNum>
-  <w:abstractNum w:abstractNumId="8" w15:restartNumberingAfterBreak="0">
+  <w:abstractNum w:abstractNumId="11" w15:restartNumberingAfterBreak="0">
     <w:nsid w:val="2590349C"/>
     <w:multiLevelType w:val="hybridMultilevel"/>
     <w:tmpl w:val="55007254"/>
@@ -4586,7 +5122,96 @@
       </w:rPr>
     </w:lvl>
   </w:abstractNum>
-  <w:abstractNum w:abstractNumId="9" w15:restartNumberingAfterBreak="0">
+  <w:abstractNum w:abstractNumId="12" w15:restartNumberingAfterBreak="0">
+    <w:nsid w:val="316D6CA5"/>
+    <w:multiLevelType w:val="hybridMultilevel"/>
+    <w:tmpl w:val="704CA354"/>
+    <w:lvl w:ilvl="0" w:tplc="040C0019">
+      <w:start w:val="1"/>
+      <w:numFmt w:val="lowerLetter"/>
+      <w:lvlText w:val="%1."/>
+      <w:lvlJc w:val="left"/>
+      <w:pPr>
+        <w:ind w:left="720" w:hanging="360"/>
+      </w:pPr>
+      <w:rPr>
+        <w:rFonts w:hint="default"/>
+      </w:rPr>
+    </w:lvl>
+    <w:lvl w:ilvl="1" w:tplc="040C0019" w:tentative="1">
+      <w:start w:val="1"/>
+      <w:numFmt w:val="lowerLetter"/>
+      <w:lvlText w:val="%2."/>
+      <w:lvlJc w:val="left"/>
+      <w:pPr>
+        <w:ind w:left="1440" w:hanging="360"/>
+      </w:pPr>
+    </w:lvl>
+    <w:lvl w:ilvl="2" w:tplc="040C001B" w:tentative="1">
+      <w:start w:val="1"/>
+      <w:numFmt w:val="lowerRoman"/>
+      <w:lvlText w:val="%3."/>
+      <w:lvlJc w:val="right"/>
+      <w:pPr>
+        <w:ind w:left="2160" w:hanging="180"/>
+      </w:pPr>
+    </w:lvl>
+    <w:lvl w:ilvl="3" w:tplc="040C000F" w:tentative="1">
+      <w:start w:val="1"/>
+      <w:numFmt w:val="decimal"/>
+      <w:lvlText w:val="%4."/>
+      <w:lvlJc w:val="left"/>
+      <w:pPr>
+        <w:ind w:left="2880" w:hanging="360"/>
+      </w:pPr>
+    </w:lvl>
+    <w:lvl w:ilvl="4" w:tplc="040C0019" w:tentative="1">
+      <w:start w:val="1"/>
+      <w:numFmt w:val="lowerLetter"/>
+      <w:lvlText w:val="%5."/>
+      <w:lvlJc w:val="left"/>
+      <w:pPr>
+        <w:ind w:left="3600" w:hanging="360"/>
+      </w:pPr>
+    </w:lvl>
+    <w:lvl w:ilvl="5" w:tplc="040C001B" w:tentative="1">
+      <w:start w:val="1"/>
+      <w:numFmt w:val="lowerRoman"/>
+      <w:lvlText w:val="%6."/>
+      <w:lvlJc w:val="right"/>
+      <w:pPr>
+        <w:ind w:left="4320" w:hanging="180"/>
+      </w:pPr>
+    </w:lvl>
+    <w:lvl w:ilvl="6" w:tplc="040C000F" w:tentative="1">
+      <w:start w:val="1"/>
+      <w:numFmt w:val="decimal"/>
+      <w:lvlText w:val="%7."/>
+      <w:lvlJc w:val="left"/>
+      <w:pPr>
+        <w:ind w:left="5040" w:hanging="360"/>
+      </w:pPr>
+    </w:lvl>
+    <w:lvl w:ilvl="7" w:tplc="040C0019" w:tentative="1">
+      <w:start w:val="1"/>
+      <w:numFmt w:val="lowerLetter"/>
+      <w:lvlText w:val="%8."/>
+      <w:lvlJc w:val="left"/>
+      <w:pPr>
+        <w:ind w:left="5760" w:hanging="360"/>
+      </w:pPr>
+    </w:lvl>
+    <w:lvl w:ilvl="8" w:tplc="040C001B" w:tentative="1">
+      <w:start w:val="1"/>
+      <w:numFmt w:val="lowerRoman"/>
+      <w:lvlText w:val="%9."/>
+      <w:lvlJc w:val="right"/>
+      <w:pPr>
+        <w:ind w:left="6480" w:hanging="180"/>
+      </w:pPr>
+    </w:lvl>
+  </w:abstractNum>
+  <w:abstractNum w:abstractNumId="13" w15:restartNumberingAfterBreak="0">
     <w:nsid w:val="321D4155"/>
     <w:multiLevelType w:val="hybridMultilevel"/>
     <w:tmpl w:val="9EE07334"/>
@@ -4698,7 +5323,7 @@
       </w:rPr>
     </w:lvl>
   </w:abstractNum>
-  <w:abstractNum w:abstractNumId="10" w15:restartNumberingAfterBreak="0">
+  <w:abstractNum w:abstractNumId="14" w15:restartNumberingAfterBreak="0">
     <w:nsid w:val="37EE5819"/>
     <w:multiLevelType w:val="hybridMultilevel"/>
     <w:tmpl w:val="B7D61F32"/>
@@ -4787,10 +5412,10 @@
       </w:pPr>
     </w:lvl>
   </w:abstractNum>
-  <w:abstractNum w:abstractNumId="11" w15:restartNumberingAfterBreak="0">
+  <w:abstractNum w:abstractNumId="15" w15:restartNumberingAfterBreak="0">
     <w:nsid w:val="4398500B"/>
     <w:multiLevelType w:val="hybridMultilevel"/>
-    <w:tmpl w:val="1B1087EC"/>
+    <w:tmpl w:val="EBBAD9CC"/>
     <w:lvl w:ilvl="0" w:tplc="040C0001">
       <w:start w:val="1"/>
       <w:numFmt w:val="bullet"/>
@@ -4900,7 +5525,7 @@
       </w:rPr>
     </w:lvl>
   </w:abstractNum>
-  <w:abstractNum w:abstractNumId="12" w15:restartNumberingAfterBreak="0">
+  <w:abstractNum w:abstractNumId="16" w15:restartNumberingAfterBreak="0">
     <w:nsid w:val="45BF7D02"/>
     <w:multiLevelType w:val="hybridMultilevel"/>
     <w:tmpl w:val="021AE3C4"/>
@@ -4986,7 +5611,7 @@
       </w:pPr>
     </w:lvl>
   </w:abstractNum>
-  <w:abstractNum w:abstractNumId="13" w15:restartNumberingAfterBreak="0">
+  <w:abstractNum w:abstractNumId="17" w15:restartNumberingAfterBreak="0">
     <w:nsid w:val="4C3E3D4A"/>
     <w:multiLevelType w:val="hybridMultilevel"/>
     <w:tmpl w:val="242C2C32"/>
@@ -5099,7 +5724,7 @@
       </w:rPr>
     </w:lvl>
   </w:abstractNum>
-  <w:abstractNum w:abstractNumId="14" w15:restartNumberingAfterBreak="0">
+  <w:abstractNum w:abstractNumId="18" w15:restartNumberingAfterBreak="0">
     <w:nsid w:val="4D0B56E1"/>
     <w:multiLevelType w:val="hybridMultilevel"/>
     <w:tmpl w:val="A1501268"/>
@@ -5188,7 +5813,7 @@
       </w:pPr>
     </w:lvl>
   </w:abstractNum>
-  <w:abstractNum w:abstractNumId="15" w15:restartNumberingAfterBreak="0">
+  <w:abstractNum w:abstractNumId="19" w15:restartNumberingAfterBreak="0">
     <w:nsid w:val="4E542C35"/>
     <w:multiLevelType w:val="hybridMultilevel"/>
     <w:tmpl w:val="9CB68BB8"/>
@@ -5277,7 +5902,7 @@
       </w:pPr>
     </w:lvl>
   </w:abstractNum>
-  <w:abstractNum w:abstractNumId="16" w15:restartNumberingAfterBreak="0">
+  <w:abstractNum w:abstractNumId="20" w15:restartNumberingAfterBreak="0">
     <w:nsid w:val="4F4D0601"/>
     <w:multiLevelType w:val="hybridMultilevel"/>
     <w:tmpl w:val="507AAE72"/>
@@ -5366,7 +5991,96 @@
       </w:pPr>
     </w:lvl>
   </w:abstractNum>
-  <w:abstractNum w:abstractNumId="17" w15:restartNumberingAfterBreak="0">
+  <w:abstractNum w:abstractNumId="21" w15:restartNumberingAfterBreak="0">
+    <w:nsid w:val="55B66932"/>
+    <w:multiLevelType w:val="hybridMultilevel"/>
+    <w:tmpl w:val="5540D64E"/>
+    <w:lvl w:ilvl="0" w:tplc="040C0019">
+      <w:start w:val="1"/>
+      <w:numFmt w:val="lowerLetter"/>
+      <w:lvlText w:val="%1."/>
+      <w:lvlJc w:val="left"/>
+      <w:pPr>
+        <w:ind w:left="720" w:hanging="360"/>
+      </w:pPr>
+      <w:rPr>
+        <w:rFonts w:hint="default"/>
+      </w:rPr>
+    </w:lvl>
+    <w:lvl w:ilvl="1" w:tplc="040C0019" w:tentative="1">
+      <w:start w:val="1"/>
+      <w:numFmt w:val="lowerLetter"/>
+      <w:lvlText w:val="%2."/>
+      <w:lvlJc w:val="left"/>
+      <w:pPr>
+        <w:ind w:left="1440" w:hanging="360"/>
+      </w:pPr>
+    </w:lvl>
+    <w:lvl w:ilvl="2" w:tplc="040C001B" w:tentative="1">
+      <w:start w:val="1"/>
+      <w:numFmt w:val="lowerRoman"/>
+      <w:lvlText w:val="%3."/>
+      <w:lvlJc w:val="right"/>
+      <w:pPr>
+        <w:ind w:left="2160" w:hanging="180"/>
+      </w:pPr>
+    </w:lvl>
+    <w:lvl w:ilvl="3" w:tplc="040C000F" w:tentative="1">
+      <w:start w:val="1"/>
+      <w:numFmt w:val="decimal"/>
+      <w:lvlText w:val="%4."/>
+      <w:lvlJc w:val="left"/>
+      <w:pPr>
+        <w:ind w:left="2880" w:hanging="360"/>
+      </w:pPr>
+    </w:lvl>
+    <w:lvl w:ilvl="4" w:tplc="040C0019" w:tentative="1">
+      <w:start w:val="1"/>
+      <w:numFmt w:val="lowerLetter"/>
+      <w:lvlText w:val="%5."/>
+      <w:lvlJc w:val="left"/>
+      <w:pPr>
+        <w:ind w:left="3600" w:hanging="360"/>
+      </w:pPr>
+    </w:lvl>
+    <w:lvl w:ilvl="5" w:tplc="040C001B" w:tentative="1">
+      <w:start w:val="1"/>
+      <w:numFmt w:val="lowerRoman"/>
+      <w:lvlText w:val="%6."/>
+      <w:lvlJc w:val="right"/>
+      <w:pPr>
+        <w:ind w:left="4320" w:hanging="180"/>
+      </w:pPr>
+    </w:lvl>
+    <w:lvl w:ilvl="6" w:tplc="040C000F" w:tentative="1">
+      <w:start w:val="1"/>
+      <w:numFmt w:val="decimal"/>
+      <w:lvlText w:val="%7."/>
+      <w:lvlJc w:val="left"/>
+      <w:pPr>
+        <w:ind w:left="5040" w:hanging="360"/>
+      </w:pPr>
+    </w:lvl>
+    <w:lvl w:ilvl="7" w:tplc="040C0019" w:tentative="1">
+      <w:start w:val="1"/>
+      <w:numFmt w:val="lowerLetter"/>
+      <w:lvlText w:val="%8."/>
+      <w:lvlJc w:val="left"/>
+      <w:pPr>
+        <w:ind w:left="5760" w:hanging="360"/>
+      </w:pPr>
+    </w:lvl>
+    <w:lvl w:ilvl="8" w:tplc="040C001B" w:tentative="1">
+      <w:start w:val="1"/>
+      <w:numFmt w:val="lowerRoman"/>
+      <w:lvlText w:val="%9."/>
+      <w:lvlJc w:val="right"/>
+      <w:pPr>
+        <w:ind w:left="6480" w:hanging="180"/>
+      </w:pPr>
+    </w:lvl>
+  </w:abstractNum>
+  <w:abstractNum w:abstractNumId="22" w15:restartNumberingAfterBreak="0">
     <w:nsid w:val="59376E90"/>
     <w:multiLevelType w:val="hybridMultilevel"/>
     <w:tmpl w:val="138C20F4"/>
@@ -5455,7 +6169,7 @@
       </w:pPr>
     </w:lvl>
   </w:abstractNum>
-  <w:abstractNum w:abstractNumId="18" w15:restartNumberingAfterBreak="0">
+  <w:abstractNum w:abstractNumId="23" w15:restartNumberingAfterBreak="0">
     <w:nsid w:val="605B4492"/>
     <w:multiLevelType w:val="hybridMultilevel"/>
     <w:tmpl w:val="D204984C"/>
@@ -5568,7 +6282,7 @@
       </w:rPr>
     </w:lvl>
   </w:abstractNum>
-  <w:abstractNum w:abstractNumId="19" w15:restartNumberingAfterBreak="0">
+  <w:abstractNum w:abstractNumId="24" w15:restartNumberingAfterBreak="0">
     <w:nsid w:val="63446846"/>
     <w:multiLevelType w:val="hybridMultilevel"/>
     <w:tmpl w:val="05689EB0"/>
@@ -5657,7 +6371,7 @@
       </w:pPr>
     </w:lvl>
   </w:abstractNum>
-  <w:abstractNum w:abstractNumId="20" w15:restartNumberingAfterBreak="0">
+  <w:abstractNum w:abstractNumId="25" w15:restartNumberingAfterBreak="0">
     <w:nsid w:val="66DE107C"/>
     <w:multiLevelType w:val="hybridMultilevel"/>
     <w:tmpl w:val="D2F80F6C"/>
@@ -5746,7 +6460,7 @@
       </w:pPr>
     </w:lvl>
   </w:abstractNum>
-  <w:abstractNum w:abstractNumId="21" w15:restartNumberingAfterBreak="0">
+  <w:abstractNum w:abstractNumId="26" w15:restartNumberingAfterBreak="0">
     <w:nsid w:val="73932A0A"/>
     <w:multiLevelType w:val="hybridMultilevel"/>
     <w:tmpl w:val="F01017D8"/>
@@ -5836,70 +6550,85 @@
     </w:lvl>
   </w:abstractNum>
   <w:num w:numId="1" w16cid:durableId="366762349">
+    <w:abstractNumId w:val="22"/>
+  </w:num>
+  <w:num w:numId="2" w16cid:durableId="785344682">
+    <w:abstractNumId w:val="1"/>
+  </w:num>
+  <w:num w:numId="3" w16cid:durableId="1029256568">
+    <w:abstractNumId w:val="18"/>
+  </w:num>
+  <w:num w:numId="4" w16cid:durableId="965548697">
+    <w:abstractNumId w:val="9"/>
+  </w:num>
+  <w:num w:numId="5" w16cid:durableId="2064254029">
+    <w:abstractNumId w:val="2"/>
+  </w:num>
+  <w:num w:numId="6" w16cid:durableId="518080298">
+    <w:abstractNumId w:val="10"/>
+  </w:num>
+  <w:num w:numId="7" w16cid:durableId="1219711019">
+    <w:abstractNumId w:val="5"/>
+  </w:num>
+  <w:num w:numId="8" w16cid:durableId="324091261">
+    <w:abstractNumId w:val="13"/>
+  </w:num>
+  <w:num w:numId="9" w16cid:durableId="1726176819">
+    <w:abstractNumId w:val="11"/>
+  </w:num>
+  <w:num w:numId="10" w16cid:durableId="1791312677">
+    <w:abstractNumId w:val="6"/>
+  </w:num>
+  <w:num w:numId="11" w16cid:durableId="983850167">
+    <w:abstractNumId w:val="8"/>
+  </w:num>
+  <w:num w:numId="12" w16cid:durableId="932855125">
+    <w:abstractNumId w:val="20"/>
+  </w:num>
+  <w:num w:numId="13" w16cid:durableId="1128208087">
+    <w:abstractNumId w:val="14"/>
+  </w:num>
+  <w:num w:numId="14" w16cid:durableId="1209758562">
+    <w:abstractNumId w:val="3"/>
+  </w:num>
+  <w:num w:numId="15" w16cid:durableId="388843613">
+    <w:abstractNumId w:val="23"/>
+  </w:num>
+  <w:num w:numId="16" w16cid:durableId="353460081">
     <w:abstractNumId w:val="17"/>
   </w:num>
-  <w:num w:numId="2" w16cid:durableId="785344682">
+  <w:num w:numId="17" w16cid:durableId="1642466385">
+    <w:abstractNumId w:val="15"/>
+  </w:num>
+  <w:num w:numId="18" w16cid:durableId="1117456123">
+    <w:abstractNumId w:val="26"/>
+  </w:num>
+  <w:num w:numId="19" w16cid:durableId="924458077">
+    <w:abstractNumId w:val="16"/>
+  </w:num>
+  <w:num w:numId="20" w16cid:durableId="1827432817">
+    <w:abstractNumId w:val="25"/>
+  </w:num>
+  <w:num w:numId="21" w16cid:durableId="625888307">
+    <w:abstractNumId w:val="24"/>
+  </w:num>
+  <w:num w:numId="22" w16cid:durableId="1917936097">
+    <w:abstractNumId w:val="19"/>
+  </w:num>
+  <w:num w:numId="23" w16cid:durableId="346366136">
+    <w:abstractNumId w:val="7"/>
+  </w:num>
+  <w:num w:numId="24" w16cid:durableId="588974095">
+    <w:abstractNumId w:val="4"/>
+  </w:num>
+  <w:num w:numId="25" w16cid:durableId="1233006788">
     <w:abstractNumId w:val="0"/>
   </w:num>
-  <w:num w:numId="3" w16cid:durableId="1029256568">
-    <w:abstractNumId w:val="14"/>
-  </w:num>
-  <w:num w:numId="4" w16cid:durableId="965548697">
-    <w:abstractNumId w:val="6"/>
-  </w:num>
-  <w:num w:numId="5" w16cid:durableId="2064254029">
-    <w:abstractNumId w:val="1"/>
-  </w:num>
-  <w:num w:numId="6" w16cid:durableId="518080298">
-    <w:abstractNumId w:val="7"/>
-  </w:num>
-  <w:num w:numId="7" w16cid:durableId="1219711019">
-    <w:abstractNumId w:val="3"/>
-  </w:num>
-  <w:num w:numId="8" w16cid:durableId="324091261">
-    <w:abstractNumId w:val="9"/>
-  </w:num>
-  <w:num w:numId="9" w16cid:durableId="1726176819">
-    <w:abstractNumId w:val="8"/>
-  </w:num>
-  <w:num w:numId="10" w16cid:durableId="1791312677">
-    <w:abstractNumId w:val="4"/>
-  </w:num>
-  <w:num w:numId="11" w16cid:durableId="983850167">
-    <w:abstractNumId w:val="5"/>
-  </w:num>
-  <w:num w:numId="12" w16cid:durableId="932855125">
-    <w:abstractNumId w:val="16"/>
-  </w:num>
-  <w:num w:numId="13" w16cid:durableId="1128208087">
-    <w:abstractNumId w:val="10"/>
-  </w:num>
-  <w:num w:numId="14" w16cid:durableId="1209758562">
-    <w:abstractNumId w:val="2"/>
-  </w:num>
-  <w:num w:numId="15" w16cid:durableId="388843613">
-    <w:abstractNumId w:val="18"/>
-  </w:num>
-  <w:num w:numId="16" w16cid:durableId="353460081">
-    <w:abstractNumId w:val="13"/>
-  </w:num>
-  <w:num w:numId="17" w16cid:durableId="1642466385">
-    <w:abstractNumId w:val="11"/>
-  </w:num>
-  <w:num w:numId="18" w16cid:durableId="1117456123">
+  <w:num w:numId="26" w16cid:durableId="1425876091">
     <w:abstractNumId w:val="21"/>
   </w:num>
-  <w:num w:numId="19" w16cid:durableId="924458077">
+  <w:num w:numId="27" w16cid:durableId="1218318191">
     <w:abstractNumId w:val="12"/>
-  </w:num>
-  <w:num w:numId="20" w16cid:durableId="1827432817">
-    <w:abstractNumId w:val="20"/>
-  </w:num>
-  <w:num w:numId="21" w16cid:durableId="625888307">
-    <w:abstractNumId w:val="19"/>
-  </w:num>
-  <w:num w:numId="22" w16cid:durableId="1917936097">
-    <w:abstractNumId w:val="15"/>
   </w:num>
 </w:numbering>
 </file>

</xml_diff>

<commit_message>
feat: début rapport serveur
</commit_message>
<xml_diff>
--- a/Rapport.docx
+++ b/Rapport.docx
@@ -3575,6 +3575,9 @@
         <w:jc w:val="center"/>
       </w:pPr>
       <w:r>
+        <w:rPr>
+          <w:noProof/>
+        </w:rPr>
         <w:drawing>
           <wp:inline distT="0" distB="0" distL="0" distR="0" wp14:anchorId="414383AE" wp14:editId="7C74C3E0">
             <wp:extent cx="3533775" cy="3733800"/>
@@ -3628,19 +3631,62 @@
         </w:numPr>
         <w:rPr>
           <w:rFonts w:eastAsiaTheme="minorEastAsia"/>
+          <w:sz w:val="32"/>
+          <w:szCs w:val="32"/>
         </w:rPr>
       </w:pPr>
       <w:bookmarkStart w:id="18" w:name="_Toc190442855"/>
       <w:r>
         <w:rPr>
           <w:rFonts w:eastAsiaTheme="minorEastAsia"/>
+          <w:sz w:val="32"/>
+          <w:szCs w:val="32"/>
         </w:rPr>
         <w:t>Partie Java (Serveur)</w:t>
       </w:r>
       <w:bookmarkEnd w:id="18"/>
     </w:p>
     <w:p/>
-    <w:p/>
+    <w:p>
+      <w:pPr>
+        <w:pStyle w:val="Titre2"/>
+        <w:numPr>
+          <w:ilvl w:val="0"/>
+          <w:numId w:val="23"/>
+        </w:numPr>
+      </w:pPr>
+      <w:r>
+        <w:t>Présentation de la partie Java</w:t>
+      </w:r>
+    </w:p>
+    <w:p/>
+    <w:p>
+      <w:r>
+        <w:t>La partie java consiste en l’implémentation d’un serveur permettant de dessiner des formes, réceptionnées à partir d’un client.</w:t>
+      </w:r>
+    </w:p>
+    <w:p/>
+    <w:p>
+      <w:pPr>
+        <w:pStyle w:val="Titre2"/>
+        <w:numPr>
+          <w:ilvl w:val="0"/>
+          <w:numId w:val="23"/>
+        </w:numPr>
+      </w:pPr>
+      <w:r>
+        <w:t>Connexion au client</w:t>
+      </w:r>
+    </w:p>
+    <w:p/>
+    <w:p>
+      <w:r>
+        <w:t xml:space="preserve">La connexion au Client se fait de manière à ce que plusieurs clients puissent se connecter et envoyer des informations au serveur, et que celui-ci les traite de manière parallèle. Cela est permis grâce à la classe Interlocuteur, qui comme son nom l’indique sert </w:t>
+      </w:r>
+      <w:r>
+        <w:t>d’interlocuteur pour chaque connexion entre un client et le serveur. Cette classe dérive en effet de la classe Thread, qui possède une méthode run qui permet d’avoir plusieurs threads s’exécutant en même temps.</w:t>
+      </w:r>
+    </w:p>
     <w:p/>
     <w:p/>
     <w:p/>
@@ -3659,7 +3705,6 @@
       </w:pPr>
       <w:bookmarkStart w:id="19" w:name="_Toc190442856"/>
       <w:r>
-        <w:lastRenderedPageBreak/>
         <w:t>Extension OpenGL</w:t>
       </w:r>
       <w:bookmarkEnd w:id="19"/>
@@ -3778,6 +3823,7 @@
     </w:p>
     <w:p>
       <w:r>
+        <w:lastRenderedPageBreak/>
         <w:t>GLFW est une bibliothèque qui gère la création de fenêtre sous Windows. Il est nécessaire étant donné qu’OpenGL ne fournit pas d’outils pour créer une fenêtre, c’est donc GLFW qui s’en charge dans notre projet.</w:t>
       </w:r>
     </w:p>
@@ -3814,7 +3860,6 @@
         </w:numPr>
       </w:pPr>
       <w:r>
-        <w:lastRenderedPageBreak/>
         <w:t>Vue</w:t>
       </w:r>
     </w:p>
@@ -5324,6 +5369,95 @@
     </w:lvl>
   </w:abstractNum>
   <w:abstractNum w:abstractNumId="14" w15:restartNumberingAfterBreak="0">
+    <w:nsid w:val="353A2400"/>
+    <w:multiLevelType w:val="hybridMultilevel"/>
+    <w:tmpl w:val="FEE2ACBA"/>
+    <w:lvl w:ilvl="0" w:tplc="040C000F">
+      <w:start w:val="1"/>
+      <w:numFmt w:val="decimal"/>
+      <w:lvlText w:val="%1."/>
+      <w:lvlJc w:val="left"/>
+      <w:pPr>
+        <w:ind w:left="720" w:hanging="360"/>
+      </w:pPr>
+      <w:rPr>
+        <w:rFonts w:hint="default"/>
+      </w:rPr>
+    </w:lvl>
+    <w:lvl w:ilvl="1" w:tplc="040C0019" w:tentative="1">
+      <w:start w:val="1"/>
+      <w:numFmt w:val="lowerLetter"/>
+      <w:lvlText w:val="%2."/>
+      <w:lvlJc w:val="left"/>
+      <w:pPr>
+        <w:ind w:left="1440" w:hanging="360"/>
+      </w:pPr>
+    </w:lvl>
+    <w:lvl w:ilvl="2" w:tplc="040C001B" w:tentative="1">
+      <w:start w:val="1"/>
+      <w:numFmt w:val="lowerRoman"/>
+      <w:lvlText w:val="%3."/>
+      <w:lvlJc w:val="right"/>
+      <w:pPr>
+        <w:ind w:left="2160" w:hanging="180"/>
+      </w:pPr>
+    </w:lvl>
+    <w:lvl w:ilvl="3" w:tplc="040C000F" w:tentative="1">
+      <w:start w:val="1"/>
+      <w:numFmt w:val="decimal"/>
+      <w:lvlText w:val="%4."/>
+      <w:lvlJc w:val="left"/>
+      <w:pPr>
+        <w:ind w:left="2880" w:hanging="360"/>
+      </w:pPr>
+    </w:lvl>
+    <w:lvl w:ilvl="4" w:tplc="040C0019" w:tentative="1">
+      <w:start w:val="1"/>
+      <w:numFmt w:val="lowerLetter"/>
+      <w:lvlText w:val="%5."/>
+      <w:lvlJc w:val="left"/>
+      <w:pPr>
+        <w:ind w:left="3600" w:hanging="360"/>
+      </w:pPr>
+    </w:lvl>
+    <w:lvl w:ilvl="5" w:tplc="040C001B" w:tentative="1">
+      <w:start w:val="1"/>
+      <w:numFmt w:val="lowerRoman"/>
+      <w:lvlText w:val="%6."/>
+      <w:lvlJc w:val="right"/>
+      <w:pPr>
+        <w:ind w:left="4320" w:hanging="180"/>
+      </w:pPr>
+    </w:lvl>
+    <w:lvl w:ilvl="6" w:tplc="040C000F" w:tentative="1">
+      <w:start w:val="1"/>
+      <w:numFmt w:val="decimal"/>
+      <w:lvlText w:val="%7."/>
+      <w:lvlJc w:val="left"/>
+      <w:pPr>
+        <w:ind w:left="5040" w:hanging="360"/>
+      </w:pPr>
+    </w:lvl>
+    <w:lvl w:ilvl="7" w:tplc="040C0019" w:tentative="1">
+      <w:start w:val="1"/>
+      <w:numFmt w:val="lowerLetter"/>
+      <w:lvlText w:val="%8."/>
+      <w:lvlJc w:val="left"/>
+      <w:pPr>
+        <w:ind w:left="5760" w:hanging="360"/>
+      </w:pPr>
+    </w:lvl>
+    <w:lvl w:ilvl="8" w:tplc="040C001B" w:tentative="1">
+      <w:start w:val="1"/>
+      <w:numFmt w:val="lowerRoman"/>
+      <w:lvlText w:val="%9."/>
+      <w:lvlJc w:val="right"/>
+      <w:pPr>
+        <w:ind w:left="6480" w:hanging="180"/>
+      </w:pPr>
+    </w:lvl>
+  </w:abstractNum>
+  <w:abstractNum w:abstractNumId="15" w15:restartNumberingAfterBreak="0">
     <w:nsid w:val="37EE5819"/>
     <w:multiLevelType w:val="hybridMultilevel"/>
     <w:tmpl w:val="B7D61F32"/>
@@ -5412,7 +5546,7 @@
       </w:pPr>
     </w:lvl>
   </w:abstractNum>
-  <w:abstractNum w:abstractNumId="15" w15:restartNumberingAfterBreak="0">
+  <w:abstractNum w:abstractNumId="16" w15:restartNumberingAfterBreak="0">
     <w:nsid w:val="4398500B"/>
     <w:multiLevelType w:val="hybridMultilevel"/>
     <w:tmpl w:val="EBBAD9CC"/>
@@ -5525,7 +5659,7 @@
       </w:rPr>
     </w:lvl>
   </w:abstractNum>
-  <w:abstractNum w:abstractNumId="16" w15:restartNumberingAfterBreak="0">
+  <w:abstractNum w:abstractNumId="17" w15:restartNumberingAfterBreak="0">
     <w:nsid w:val="45BF7D02"/>
     <w:multiLevelType w:val="hybridMultilevel"/>
     <w:tmpl w:val="021AE3C4"/>
@@ -5611,7 +5745,7 @@
       </w:pPr>
     </w:lvl>
   </w:abstractNum>
-  <w:abstractNum w:abstractNumId="17" w15:restartNumberingAfterBreak="0">
+  <w:abstractNum w:abstractNumId="18" w15:restartNumberingAfterBreak="0">
     <w:nsid w:val="4C3E3D4A"/>
     <w:multiLevelType w:val="hybridMultilevel"/>
     <w:tmpl w:val="242C2C32"/>
@@ -5724,7 +5858,7 @@
       </w:rPr>
     </w:lvl>
   </w:abstractNum>
-  <w:abstractNum w:abstractNumId="18" w15:restartNumberingAfterBreak="0">
+  <w:abstractNum w:abstractNumId="19" w15:restartNumberingAfterBreak="0">
     <w:nsid w:val="4D0B56E1"/>
     <w:multiLevelType w:val="hybridMultilevel"/>
     <w:tmpl w:val="A1501268"/>
@@ -5813,7 +5947,7 @@
       </w:pPr>
     </w:lvl>
   </w:abstractNum>
-  <w:abstractNum w:abstractNumId="19" w15:restartNumberingAfterBreak="0">
+  <w:abstractNum w:abstractNumId="20" w15:restartNumberingAfterBreak="0">
     <w:nsid w:val="4E542C35"/>
     <w:multiLevelType w:val="hybridMultilevel"/>
     <w:tmpl w:val="9CB68BB8"/>
@@ -5902,7 +6036,7 @@
       </w:pPr>
     </w:lvl>
   </w:abstractNum>
-  <w:abstractNum w:abstractNumId="20" w15:restartNumberingAfterBreak="0">
+  <w:abstractNum w:abstractNumId="21" w15:restartNumberingAfterBreak="0">
     <w:nsid w:val="4F4D0601"/>
     <w:multiLevelType w:val="hybridMultilevel"/>
     <w:tmpl w:val="507AAE72"/>
@@ -5991,7 +6125,7 @@
       </w:pPr>
     </w:lvl>
   </w:abstractNum>
-  <w:abstractNum w:abstractNumId="21" w15:restartNumberingAfterBreak="0">
+  <w:abstractNum w:abstractNumId="22" w15:restartNumberingAfterBreak="0">
     <w:nsid w:val="55B66932"/>
     <w:multiLevelType w:val="hybridMultilevel"/>
     <w:tmpl w:val="5540D64E"/>
@@ -6080,7 +6214,7 @@
       </w:pPr>
     </w:lvl>
   </w:abstractNum>
-  <w:abstractNum w:abstractNumId="22" w15:restartNumberingAfterBreak="0">
+  <w:abstractNum w:abstractNumId="23" w15:restartNumberingAfterBreak="0">
     <w:nsid w:val="59376E90"/>
     <w:multiLevelType w:val="hybridMultilevel"/>
     <w:tmpl w:val="138C20F4"/>
@@ -6169,7 +6303,7 @@
       </w:pPr>
     </w:lvl>
   </w:abstractNum>
-  <w:abstractNum w:abstractNumId="23" w15:restartNumberingAfterBreak="0">
+  <w:abstractNum w:abstractNumId="24" w15:restartNumberingAfterBreak="0">
     <w:nsid w:val="605B4492"/>
     <w:multiLevelType w:val="hybridMultilevel"/>
     <w:tmpl w:val="D204984C"/>
@@ -6282,7 +6416,7 @@
       </w:rPr>
     </w:lvl>
   </w:abstractNum>
-  <w:abstractNum w:abstractNumId="24" w15:restartNumberingAfterBreak="0">
+  <w:abstractNum w:abstractNumId="25" w15:restartNumberingAfterBreak="0">
     <w:nsid w:val="63446846"/>
     <w:multiLevelType w:val="hybridMultilevel"/>
     <w:tmpl w:val="05689EB0"/>
@@ -6371,7 +6505,7 @@
       </w:pPr>
     </w:lvl>
   </w:abstractNum>
-  <w:abstractNum w:abstractNumId="25" w15:restartNumberingAfterBreak="0">
+  <w:abstractNum w:abstractNumId="26" w15:restartNumberingAfterBreak="0">
     <w:nsid w:val="66DE107C"/>
     <w:multiLevelType w:val="hybridMultilevel"/>
     <w:tmpl w:val="D2F80F6C"/>
@@ -6460,7 +6594,7 @@
       </w:pPr>
     </w:lvl>
   </w:abstractNum>
-  <w:abstractNum w:abstractNumId="26" w15:restartNumberingAfterBreak="0">
+  <w:abstractNum w:abstractNumId="27" w15:restartNumberingAfterBreak="0">
     <w:nsid w:val="73932A0A"/>
     <w:multiLevelType w:val="hybridMultilevel"/>
     <w:tmpl w:val="F01017D8"/>
@@ -6550,13 +6684,13 @@
     </w:lvl>
   </w:abstractNum>
   <w:num w:numId="1" w16cid:durableId="366762349">
-    <w:abstractNumId w:val="22"/>
+    <w:abstractNumId w:val="23"/>
   </w:num>
   <w:num w:numId="2" w16cid:durableId="785344682">
     <w:abstractNumId w:val="1"/>
   </w:num>
   <w:num w:numId="3" w16cid:durableId="1029256568">
-    <w:abstractNumId w:val="18"/>
+    <w:abstractNumId w:val="19"/>
   </w:num>
   <w:num w:numId="4" w16cid:durableId="965548697">
     <w:abstractNumId w:val="9"/>
@@ -6583,37 +6717,37 @@
     <w:abstractNumId w:val="8"/>
   </w:num>
   <w:num w:numId="12" w16cid:durableId="932855125">
-    <w:abstractNumId w:val="20"/>
+    <w:abstractNumId w:val="21"/>
   </w:num>
   <w:num w:numId="13" w16cid:durableId="1128208087">
-    <w:abstractNumId w:val="14"/>
+    <w:abstractNumId w:val="15"/>
   </w:num>
   <w:num w:numId="14" w16cid:durableId="1209758562">
     <w:abstractNumId w:val="3"/>
   </w:num>
   <w:num w:numId="15" w16cid:durableId="388843613">
-    <w:abstractNumId w:val="23"/>
+    <w:abstractNumId w:val="24"/>
   </w:num>
   <w:num w:numId="16" w16cid:durableId="353460081">
+    <w:abstractNumId w:val="18"/>
+  </w:num>
+  <w:num w:numId="17" w16cid:durableId="1642466385">
+    <w:abstractNumId w:val="16"/>
+  </w:num>
+  <w:num w:numId="18" w16cid:durableId="1117456123">
+    <w:abstractNumId w:val="27"/>
+  </w:num>
+  <w:num w:numId="19" w16cid:durableId="924458077">
     <w:abstractNumId w:val="17"/>
   </w:num>
-  <w:num w:numId="17" w16cid:durableId="1642466385">
-    <w:abstractNumId w:val="15"/>
-  </w:num>
-  <w:num w:numId="18" w16cid:durableId="1117456123">
+  <w:num w:numId="20" w16cid:durableId="1827432817">
     <w:abstractNumId w:val="26"/>
   </w:num>
-  <w:num w:numId="19" w16cid:durableId="924458077">
-    <w:abstractNumId w:val="16"/>
-  </w:num>
-  <w:num w:numId="20" w16cid:durableId="1827432817">
+  <w:num w:numId="21" w16cid:durableId="625888307">
     <w:abstractNumId w:val="25"/>
   </w:num>
-  <w:num w:numId="21" w16cid:durableId="625888307">
-    <w:abstractNumId w:val="24"/>
-  </w:num>
   <w:num w:numId="22" w16cid:durableId="1917936097">
-    <w:abstractNumId w:val="19"/>
+    <w:abstractNumId w:val="20"/>
   </w:num>
   <w:num w:numId="23" w16cid:durableId="346366136">
     <w:abstractNumId w:val="7"/>
@@ -6625,10 +6759,13 @@
     <w:abstractNumId w:val="0"/>
   </w:num>
   <w:num w:numId="26" w16cid:durableId="1425876091">
-    <w:abstractNumId w:val="21"/>
+    <w:abstractNumId w:val="22"/>
   </w:num>
   <w:num w:numId="27" w16cid:durableId="1218318191">
     <w:abstractNumId w:val="12"/>
+  </w:num>
+  <w:num w:numId="28" w16cid:durableId="1192956174">
+    <w:abstractNumId w:val="14"/>
   </w:num>
 </w:numbering>
 </file>

</xml_diff>

<commit_message>
feat: fin du rapport pour la partie serveur
</commit_message>
<xml_diff>
--- a/Rapport.docx
+++ b/Rapport.docx
@@ -396,7 +396,7 @@
           <w:r>
             <w:fldChar w:fldCharType="separate"/>
           </w:r>
-          <w:hyperlink w:anchor="_Toc190442837" w:history="1">
+          <w:hyperlink w:anchor="_Toc192421976" w:history="1">
             <w:r>
               <w:rPr>
                 <w:rStyle w:val="Lienhypertexte"/>
@@ -440,7 +440,7 @@
                 <w:noProof/>
                 <w:webHidden/>
               </w:rPr>
-              <w:instrText xml:space="preserve"> PAGEREF _Toc190442837 \h </w:instrText>
+              <w:instrText xml:space="preserve"> PAGEREF _Toc192421976 \h </w:instrText>
             </w:r>
             <w:r>
               <w:rPr>
@@ -486,7 +486,7 @@
               <w:lang w:eastAsia="fr-FR"/>
             </w:rPr>
           </w:pPr>
-          <w:hyperlink w:anchor="_Toc190442838" w:history="1">
+          <w:hyperlink w:anchor="_Toc192421977" w:history="1">
             <w:r>
               <w:rPr>
                 <w:rStyle w:val="Lienhypertexte"/>
@@ -530,7 +530,7 @@
                 <w:noProof/>
                 <w:webHidden/>
               </w:rPr>
-              <w:instrText xml:space="preserve"> PAGEREF _Toc190442838 \h </w:instrText>
+              <w:instrText xml:space="preserve"> PAGEREF _Toc192421977 \h </w:instrText>
             </w:r>
             <w:r>
               <w:rPr>
@@ -576,7 +576,7 @@
               <w:lang w:eastAsia="fr-FR"/>
             </w:rPr>
           </w:pPr>
-          <w:hyperlink w:anchor="_Toc190442839" w:history="1">
+          <w:hyperlink w:anchor="_Toc192421978" w:history="1">
             <w:r>
               <w:rPr>
                 <w:rStyle w:val="Lienhypertexte"/>
@@ -620,7 +620,7 @@
                 <w:noProof/>
                 <w:webHidden/>
               </w:rPr>
-              <w:instrText xml:space="preserve"> PAGEREF _Toc190442839 \h </w:instrText>
+              <w:instrText xml:space="preserve"> PAGEREF _Toc192421978 \h </w:instrText>
             </w:r>
             <w:r>
               <w:rPr>
@@ -640,7 +640,7 @@
                 <w:noProof/>
                 <w:webHidden/>
               </w:rPr>
-              <w:t>3</w:t>
+              <w:t>4</w:t>
             </w:r>
             <w:r>
               <w:rPr>
@@ -666,7 +666,7 @@
               <w:lang w:eastAsia="fr-FR"/>
             </w:rPr>
           </w:pPr>
-          <w:hyperlink w:anchor="_Toc190442840" w:history="1">
+          <w:hyperlink w:anchor="_Toc192421979" w:history="1">
             <w:r>
               <w:rPr>
                 <w:rStyle w:val="Lienhypertexte"/>
@@ -710,7 +710,7 @@
                 <w:noProof/>
                 <w:webHidden/>
               </w:rPr>
-              <w:instrText xml:space="preserve"> PAGEREF _Toc190442840 \h </w:instrText>
+              <w:instrText xml:space="preserve"> PAGEREF _Toc192421979 \h </w:instrText>
             </w:r>
             <w:r>
               <w:rPr>
@@ -730,7 +730,7 @@
                 <w:noProof/>
                 <w:webHidden/>
               </w:rPr>
-              <w:t>3</w:t>
+              <w:t>4</w:t>
             </w:r>
             <w:r>
               <w:rPr>
@@ -756,7 +756,7 @@
               <w:lang w:eastAsia="fr-FR"/>
             </w:rPr>
           </w:pPr>
-          <w:hyperlink w:anchor="_Toc190442841" w:history="1">
+          <w:hyperlink w:anchor="_Toc192421980" w:history="1">
             <w:r>
               <w:rPr>
                 <w:rStyle w:val="Lienhypertexte"/>
@@ -800,7 +800,7 @@
                 <w:noProof/>
                 <w:webHidden/>
               </w:rPr>
-              <w:instrText xml:space="preserve"> PAGEREF _Toc190442841 \h </w:instrText>
+              <w:instrText xml:space="preserve"> PAGEREF _Toc192421980 \h </w:instrText>
             </w:r>
             <w:r>
               <w:rPr>
@@ -846,7 +846,7 @@
               <w:lang w:eastAsia="fr-FR"/>
             </w:rPr>
           </w:pPr>
-          <w:hyperlink w:anchor="_Toc190442842" w:history="1">
+          <w:hyperlink w:anchor="_Toc192421981" w:history="1">
             <w:r>
               <w:rPr>
                 <w:rStyle w:val="Lienhypertexte"/>
@@ -890,7 +890,7 @@
                 <w:noProof/>
                 <w:webHidden/>
               </w:rPr>
-              <w:instrText xml:space="preserve"> PAGEREF _Toc190442842 \h </w:instrText>
+              <w:instrText xml:space="preserve"> PAGEREF _Toc192421981 \h </w:instrText>
             </w:r>
             <w:r>
               <w:rPr>
@@ -936,7 +936,7 @@
               <w:lang w:eastAsia="fr-FR"/>
             </w:rPr>
           </w:pPr>
-          <w:hyperlink w:anchor="_Toc190442843" w:history="1">
+          <w:hyperlink w:anchor="_Toc192421982" w:history="1">
             <w:r>
               <w:rPr>
                 <w:rStyle w:val="Lienhypertexte"/>
@@ -980,7 +980,7 @@
                 <w:noProof/>
                 <w:webHidden/>
               </w:rPr>
-              <w:instrText xml:space="preserve"> PAGEREF _Toc190442843 \h </w:instrText>
+              <w:instrText xml:space="preserve"> PAGEREF _Toc192421982 \h </w:instrText>
             </w:r>
             <w:r>
               <w:rPr>
@@ -1026,7 +1026,7 @@
               <w:lang w:eastAsia="fr-FR"/>
             </w:rPr>
           </w:pPr>
-          <w:hyperlink w:anchor="_Toc190442844" w:history="1">
+          <w:hyperlink w:anchor="_Toc192421983" w:history="1">
             <w:r>
               <w:rPr>
                 <w:rStyle w:val="Lienhypertexte"/>
@@ -1070,7 +1070,7 @@
                 <w:noProof/>
                 <w:webHidden/>
               </w:rPr>
-              <w:instrText xml:space="preserve"> PAGEREF _Toc190442844 \h </w:instrText>
+              <w:instrText xml:space="preserve"> PAGEREF _Toc192421983 \h </w:instrText>
             </w:r>
             <w:r>
               <w:rPr>
@@ -1116,7 +1116,7 @@
               <w:lang w:eastAsia="fr-FR"/>
             </w:rPr>
           </w:pPr>
-          <w:hyperlink w:anchor="_Toc190442845" w:history="1">
+          <w:hyperlink w:anchor="_Toc192421984" w:history="1">
             <w:r>
               <w:rPr>
                 <w:rStyle w:val="Lienhypertexte"/>
@@ -1160,7 +1160,7 @@
                 <w:noProof/>
                 <w:webHidden/>
               </w:rPr>
-              <w:instrText xml:space="preserve"> PAGEREF _Toc190442845 \h </w:instrText>
+              <w:instrText xml:space="preserve"> PAGEREF _Toc192421984 \h </w:instrText>
             </w:r>
             <w:r>
               <w:rPr>
@@ -1206,7 +1206,7 @@
               <w:lang w:eastAsia="fr-FR"/>
             </w:rPr>
           </w:pPr>
-          <w:hyperlink w:anchor="_Toc190442846" w:history="1">
+          <w:hyperlink w:anchor="_Toc192421985" w:history="1">
             <w:r>
               <w:rPr>
                 <w:rStyle w:val="Lienhypertexte"/>
@@ -1250,7 +1250,7 @@
                 <w:noProof/>
                 <w:webHidden/>
               </w:rPr>
-              <w:instrText xml:space="preserve"> PAGEREF _Toc190442846 \h </w:instrText>
+              <w:instrText xml:space="preserve"> PAGEREF _Toc192421985 \h </w:instrText>
             </w:r>
             <w:r>
               <w:rPr>
@@ -1270,7 +1270,7 @@
                 <w:noProof/>
                 <w:webHidden/>
               </w:rPr>
-              <w:t>5</w:t>
+              <w:t>6</w:t>
             </w:r>
             <w:r>
               <w:rPr>
@@ -1296,7 +1296,7 @@
               <w:lang w:eastAsia="fr-FR"/>
             </w:rPr>
           </w:pPr>
-          <w:hyperlink w:anchor="_Toc190442847" w:history="1">
+          <w:hyperlink w:anchor="_Toc192421986" w:history="1">
             <w:r>
               <w:rPr>
                 <w:rStyle w:val="Lienhypertexte"/>
@@ -1340,7 +1340,7 @@
                 <w:noProof/>
                 <w:webHidden/>
               </w:rPr>
-              <w:instrText xml:space="preserve"> PAGEREF _Toc190442847 \h </w:instrText>
+              <w:instrText xml:space="preserve"> PAGEREF _Toc192421986 \h </w:instrText>
             </w:r>
             <w:r>
               <w:rPr>
@@ -1386,7 +1386,7 @@
               <w:lang w:eastAsia="fr-FR"/>
             </w:rPr>
           </w:pPr>
-          <w:hyperlink w:anchor="_Toc190442848" w:history="1">
+          <w:hyperlink w:anchor="_Toc192421987" w:history="1">
             <w:r>
               <w:rPr>
                 <w:rStyle w:val="Lienhypertexte"/>
@@ -1430,7 +1430,7 @@
                 <w:noProof/>
                 <w:webHidden/>
               </w:rPr>
-              <w:instrText xml:space="preserve"> PAGEREF _Toc190442848 \h </w:instrText>
+              <w:instrText xml:space="preserve"> PAGEREF _Toc192421987 \h </w:instrText>
             </w:r>
             <w:r>
               <w:rPr>
@@ -1476,7 +1476,7 @@
               <w:lang w:eastAsia="fr-FR"/>
             </w:rPr>
           </w:pPr>
-          <w:hyperlink w:anchor="_Toc190442849" w:history="1">
+          <w:hyperlink w:anchor="_Toc192421988" w:history="1">
             <w:r>
               <w:rPr>
                 <w:rStyle w:val="Lienhypertexte"/>
@@ -1520,7 +1520,7 @@
                 <w:noProof/>
                 <w:webHidden/>
               </w:rPr>
-              <w:instrText xml:space="preserve"> PAGEREF _Toc190442849 \h </w:instrText>
+              <w:instrText xml:space="preserve"> PAGEREF _Toc192421988 \h </w:instrText>
             </w:r>
             <w:r>
               <w:rPr>
@@ -1566,7 +1566,7 @@
               <w:lang w:eastAsia="fr-FR"/>
             </w:rPr>
           </w:pPr>
-          <w:hyperlink w:anchor="_Toc190442850" w:history="1">
+          <w:hyperlink w:anchor="_Toc192421989" w:history="1">
             <w:r>
               <w:rPr>
                 <w:rStyle w:val="Lienhypertexte"/>
@@ -1610,7 +1610,7 @@
                 <w:noProof/>
                 <w:webHidden/>
               </w:rPr>
-              <w:instrText xml:space="preserve"> PAGEREF _Toc190442850 \h </w:instrText>
+              <w:instrText xml:space="preserve"> PAGEREF _Toc192421989 \h </w:instrText>
             </w:r>
             <w:r>
               <w:rPr>
@@ -1656,7 +1656,7 @@
               <w:lang w:eastAsia="fr-FR"/>
             </w:rPr>
           </w:pPr>
-          <w:hyperlink w:anchor="_Toc190442851" w:history="1">
+          <w:hyperlink w:anchor="_Toc192421990" w:history="1">
             <w:r>
               <w:rPr>
                 <w:rStyle w:val="Lienhypertexte"/>
@@ -1700,7 +1700,7 @@
                 <w:noProof/>
                 <w:webHidden/>
               </w:rPr>
-              <w:instrText xml:space="preserve"> PAGEREF _Toc190442851 \h </w:instrText>
+              <w:instrText xml:space="preserve"> PAGEREF _Toc192421990 \h </w:instrText>
             </w:r>
             <w:r>
               <w:rPr>
@@ -1746,7 +1746,7 @@
               <w:lang w:eastAsia="fr-FR"/>
             </w:rPr>
           </w:pPr>
-          <w:hyperlink w:anchor="_Toc190442852" w:history="1">
+          <w:hyperlink w:anchor="_Toc192421991" w:history="1">
             <w:r>
               <w:rPr>
                 <w:rStyle w:val="Lienhypertexte"/>
@@ -1792,7 +1792,7 @@
                 <w:noProof/>
                 <w:webHidden/>
               </w:rPr>
-              <w:instrText xml:space="preserve"> PAGEREF _Toc190442852 \h </w:instrText>
+              <w:instrText xml:space="preserve"> PAGEREF _Toc192421991 \h </w:instrText>
             </w:r>
             <w:r>
               <w:rPr>
@@ -1812,7 +1812,7 @@
                 <w:noProof/>
                 <w:webHidden/>
               </w:rPr>
-              <w:t>7</w:t>
+              <w:t>8</w:t>
             </w:r>
             <w:r>
               <w:rPr>
@@ -1838,7 +1838,7 @@
               <w:lang w:eastAsia="fr-FR"/>
             </w:rPr>
           </w:pPr>
-          <w:hyperlink w:anchor="_Toc190442853" w:history="1">
+          <w:hyperlink w:anchor="_Toc192421992" w:history="1">
             <w:r>
               <w:rPr>
                 <w:rStyle w:val="Lienhypertexte"/>
@@ -1882,7 +1882,7 @@
                 <w:noProof/>
                 <w:webHidden/>
               </w:rPr>
-              <w:instrText xml:space="preserve"> PAGEREF _Toc190442853 \h </w:instrText>
+              <w:instrText xml:space="preserve"> PAGEREF _Toc192421992 \h </w:instrText>
             </w:r>
             <w:r>
               <w:rPr>
@@ -1928,7 +1928,7 @@
               <w:lang w:eastAsia="fr-FR"/>
             </w:rPr>
           </w:pPr>
-          <w:hyperlink w:anchor="_Toc190442854" w:history="1">
+          <w:hyperlink w:anchor="_Toc192421993" w:history="1">
             <w:r>
               <w:rPr>
                 <w:rStyle w:val="Lienhypertexte"/>
@@ -1972,7 +1972,97 @@
                 <w:noProof/>
                 <w:webHidden/>
               </w:rPr>
-              <w:instrText xml:space="preserve"> PAGEREF _Toc190442854 \h </w:instrText>
+              <w:instrText xml:space="preserve"> PAGEREF _Toc192421993 \h </w:instrText>
+            </w:r>
+            <w:r>
+              <w:rPr>
+                <w:noProof/>
+                <w:webHidden/>
+              </w:rPr>
+            </w:r>
+            <w:r>
+              <w:rPr>
+                <w:noProof/>
+                <w:webHidden/>
+              </w:rPr>
+              <w:fldChar w:fldCharType="separate"/>
+            </w:r>
+            <w:r>
+              <w:rPr>
+                <w:noProof/>
+                <w:webHidden/>
+              </w:rPr>
+              <w:t>10</w:t>
+            </w:r>
+            <w:r>
+              <w:rPr>
+                <w:noProof/>
+                <w:webHidden/>
+              </w:rPr>
+              <w:fldChar w:fldCharType="end"/>
+            </w:r>
+          </w:hyperlink>
+        </w:p>
+        <w:p>
+          <w:pPr>
+            <w:pStyle w:val="TM1"/>
+            <w:tabs>
+              <w:tab w:val="left" w:pos="480"/>
+              <w:tab w:val="right" w:leader="dot" w:pos="9062"/>
+            </w:tabs>
+            <w:rPr>
+              <w:rFonts w:asciiTheme="minorHAnsi" w:eastAsiaTheme="minorEastAsia" w:hAnsiTheme="minorHAnsi"/>
+              <w:noProof/>
+              <w:sz w:val="24"/>
+              <w:szCs w:val="24"/>
+              <w:lang w:eastAsia="fr-FR"/>
+            </w:rPr>
+          </w:pPr>
+          <w:hyperlink w:anchor="_Toc192421994" w:history="1">
+            <w:r>
+              <w:rPr>
+                <w:rStyle w:val="Lienhypertexte"/>
+                <w:noProof/>
+              </w:rPr>
+              <w:t>III.</w:t>
+            </w:r>
+            <w:r>
+              <w:rPr>
+                <w:rFonts w:asciiTheme="minorHAnsi" w:eastAsiaTheme="minorEastAsia" w:hAnsiTheme="minorHAnsi"/>
+                <w:noProof/>
+                <w:sz w:val="24"/>
+                <w:szCs w:val="24"/>
+                <w:lang w:eastAsia="fr-FR"/>
+              </w:rPr>
+              <w:tab/>
+            </w:r>
+            <w:r>
+              <w:rPr>
+                <w:rStyle w:val="Lienhypertexte"/>
+                <w:noProof/>
+              </w:rPr>
+              <w:t>Partie Java (Serveur)</w:t>
+            </w:r>
+            <w:r>
+              <w:rPr>
+                <w:noProof/>
+                <w:webHidden/>
+              </w:rPr>
+              <w:tab/>
+            </w:r>
+            <w:r>
+              <w:rPr>
+                <w:noProof/>
+                <w:webHidden/>
+              </w:rPr>
+              <w:fldChar w:fldCharType="begin"/>
+            </w:r>
+            <w:r>
+              <w:rPr>
+                <w:noProof/>
+                <w:webHidden/>
+              </w:rPr>
+              <w:instrText xml:space="preserve"> PAGEREF _Toc192421994 \h </w:instrText>
             </w:r>
             <w:r>
               <w:rPr>
@@ -2018,13 +2108,13 @@
               <w:lang w:eastAsia="fr-FR"/>
             </w:rPr>
           </w:pPr>
-          <w:hyperlink w:anchor="_Toc190442855" w:history="1">
+          <w:hyperlink w:anchor="_Toc192421995" w:history="1">
             <w:r>
               <w:rPr>
                 <w:rStyle w:val="Lienhypertexte"/>
                 <w:noProof/>
               </w:rPr>
-              <w:t>III.</w:t>
+              <w:t>1.</w:t>
             </w:r>
             <w:r>
               <w:rPr>
@@ -2041,7 +2131,7 @@
                 <w:rStyle w:val="Lienhypertexte"/>
                 <w:noProof/>
               </w:rPr>
-              <w:t>Partie Java (Serveur)</w:t>
+              <w:t>Présentation de la partie Java</w:t>
             </w:r>
             <w:r>
               <w:rPr>
@@ -2062,7 +2152,7 @@
                 <w:noProof/>
                 <w:webHidden/>
               </w:rPr>
-              <w:instrText xml:space="preserve"> PAGEREF _Toc190442855 \h </w:instrText>
+              <w:instrText xml:space="preserve"> PAGEREF _Toc192421995 \h </w:instrText>
             </w:r>
             <w:r>
               <w:rPr>
@@ -2108,13 +2198,13 @@
               <w:lang w:eastAsia="fr-FR"/>
             </w:rPr>
           </w:pPr>
-          <w:hyperlink w:anchor="_Toc190442856" w:history="1">
+          <w:hyperlink w:anchor="_Toc192421996" w:history="1">
             <w:r>
               <w:rPr>
                 <w:rStyle w:val="Lienhypertexte"/>
                 <w:noProof/>
               </w:rPr>
-              <w:t>IV.</w:t>
+              <w:t>2.</w:t>
             </w:r>
             <w:r>
               <w:rPr>
@@ -2131,6 +2221,638 @@
                 <w:rStyle w:val="Lienhypertexte"/>
                 <w:noProof/>
               </w:rPr>
+              <w:t>Connexion au client</w:t>
+            </w:r>
+            <w:r>
+              <w:rPr>
+                <w:noProof/>
+                <w:webHidden/>
+              </w:rPr>
+              <w:tab/>
+            </w:r>
+            <w:r>
+              <w:rPr>
+                <w:noProof/>
+                <w:webHidden/>
+              </w:rPr>
+              <w:fldChar w:fldCharType="begin"/>
+            </w:r>
+            <w:r>
+              <w:rPr>
+                <w:noProof/>
+                <w:webHidden/>
+              </w:rPr>
+              <w:instrText xml:space="preserve"> PAGEREF _Toc192421996 \h </w:instrText>
+            </w:r>
+            <w:r>
+              <w:rPr>
+                <w:noProof/>
+                <w:webHidden/>
+              </w:rPr>
+            </w:r>
+            <w:r>
+              <w:rPr>
+                <w:noProof/>
+                <w:webHidden/>
+              </w:rPr>
+              <w:fldChar w:fldCharType="separate"/>
+            </w:r>
+            <w:r>
+              <w:rPr>
+                <w:noProof/>
+                <w:webHidden/>
+              </w:rPr>
+              <w:t>11</w:t>
+            </w:r>
+            <w:r>
+              <w:rPr>
+                <w:noProof/>
+                <w:webHidden/>
+              </w:rPr>
+              <w:fldChar w:fldCharType="end"/>
+            </w:r>
+          </w:hyperlink>
+        </w:p>
+        <w:p>
+          <w:pPr>
+            <w:pStyle w:val="TM2"/>
+            <w:tabs>
+              <w:tab w:val="left" w:pos="720"/>
+              <w:tab w:val="right" w:leader="dot" w:pos="9062"/>
+            </w:tabs>
+            <w:rPr>
+              <w:rFonts w:asciiTheme="minorHAnsi" w:eastAsiaTheme="minorEastAsia" w:hAnsiTheme="minorHAnsi"/>
+              <w:noProof/>
+              <w:sz w:val="24"/>
+              <w:szCs w:val="24"/>
+              <w:lang w:eastAsia="fr-FR"/>
+            </w:rPr>
+          </w:pPr>
+          <w:hyperlink w:anchor="_Toc192421997" w:history="1">
+            <w:r>
+              <w:rPr>
+                <w:rStyle w:val="Lienhypertexte"/>
+                <w:noProof/>
+              </w:rPr>
+              <w:t>3.</w:t>
+            </w:r>
+            <w:r>
+              <w:rPr>
+                <w:rFonts w:asciiTheme="minorHAnsi" w:eastAsiaTheme="minorEastAsia" w:hAnsiTheme="minorHAnsi"/>
+                <w:noProof/>
+                <w:sz w:val="24"/>
+                <w:szCs w:val="24"/>
+                <w:lang w:eastAsia="fr-FR"/>
+              </w:rPr>
+              <w:tab/>
+            </w:r>
+            <w:r>
+              <w:rPr>
+                <w:rStyle w:val="Lienhypertexte"/>
+                <w:noProof/>
+              </w:rPr>
+              <w:t>Réception des données</w:t>
+            </w:r>
+            <w:r>
+              <w:rPr>
+                <w:noProof/>
+                <w:webHidden/>
+              </w:rPr>
+              <w:tab/>
+            </w:r>
+            <w:r>
+              <w:rPr>
+                <w:noProof/>
+                <w:webHidden/>
+              </w:rPr>
+              <w:fldChar w:fldCharType="begin"/>
+            </w:r>
+            <w:r>
+              <w:rPr>
+                <w:noProof/>
+                <w:webHidden/>
+              </w:rPr>
+              <w:instrText xml:space="preserve"> PAGEREF _Toc192421997 \h </w:instrText>
+            </w:r>
+            <w:r>
+              <w:rPr>
+                <w:noProof/>
+                <w:webHidden/>
+              </w:rPr>
+            </w:r>
+            <w:r>
+              <w:rPr>
+                <w:noProof/>
+                <w:webHidden/>
+              </w:rPr>
+              <w:fldChar w:fldCharType="separate"/>
+            </w:r>
+            <w:r>
+              <w:rPr>
+                <w:noProof/>
+                <w:webHidden/>
+              </w:rPr>
+              <w:t>11</w:t>
+            </w:r>
+            <w:r>
+              <w:rPr>
+                <w:noProof/>
+                <w:webHidden/>
+              </w:rPr>
+              <w:fldChar w:fldCharType="end"/>
+            </w:r>
+          </w:hyperlink>
+        </w:p>
+        <w:p>
+          <w:pPr>
+            <w:pStyle w:val="TM2"/>
+            <w:tabs>
+              <w:tab w:val="left" w:pos="720"/>
+              <w:tab w:val="right" w:leader="dot" w:pos="9062"/>
+            </w:tabs>
+            <w:rPr>
+              <w:rFonts w:asciiTheme="minorHAnsi" w:eastAsiaTheme="minorEastAsia" w:hAnsiTheme="minorHAnsi"/>
+              <w:noProof/>
+              <w:sz w:val="24"/>
+              <w:szCs w:val="24"/>
+              <w:lang w:eastAsia="fr-FR"/>
+            </w:rPr>
+          </w:pPr>
+          <w:hyperlink w:anchor="_Toc192421998" w:history="1">
+            <w:r>
+              <w:rPr>
+                <w:rStyle w:val="Lienhypertexte"/>
+                <w:noProof/>
+              </w:rPr>
+              <w:t>4.</w:t>
+            </w:r>
+            <w:r>
+              <w:rPr>
+                <w:rFonts w:asciiTheme="minorHAnsi" w:eastAsiaTheme="minorEastAsia" w:hAnsiTheme="minorHAnsi"/>
+                <w:noProof/>
+                <w:sz w:val="24"/>
+                <w:szCs w:val="24"/>
+                <w:lang w:eastAsia="fr-FR"/>
+              </w:rPr>
+              <w:tab/>
+            </w:r>
+            <w:r>
+              <w:rPr>
+                <w:rStyle w:val="Lienhypertexte"/>
+                <w:noProof/>
+              </w:rPr>
+              <w:t>Design Pattern</w:t>
+            </w:r>
+            <w:r>
+              <w:rPr>
+                <w:noProof/>
+                <w:webHidden/>
+              </w:rPr>
+              <w:tab/>
+            </w:r>
+            <w:r>
+              <w:rPr>
+                <w:noProof/>
+                <w:webHidden/>
+              </w:rPr>
+              <w:fldChar w:fldCharType="begin"/>
+            </w:r>
+            <w:r>
+              <w:rPr>
+                <w:noProof/>
+                <w:webHidden/>
+              </w:rPr>
+              <w:instrText xml:space="preserve"> PAGEREF _Toc192421998 \h </w:instrText>
+            </w:r>
+            <w:r>
+              <w:rPr>
+                <w:noProof/>
+                <w:webHidden/>
+              </w:rPr>
+            </w:r>
+            <w:r>
+              <w:rPr>
+                <w:noProof/>
+                <w:webHidden/>
+              </w:rPr>
+              <w:fldChar w:fldCharType="separate"/>
+            </w:r>
+            <w:r>
+              <w:rPr>
+                <w:noProof/>
+                <w:webHidden/>
+              </w:rPr>
+              <w:t>11</w:t>
+            </w:r>
+            <w:r>
+              <w:rPr>
+                <w:noProof/>
+                <w:webHidden/>
+              </w:rPr>
+              <w:fldChar w:fldCharType="end"/>
+            </w:r>
+          </w:hyperlink>
+        </w:p>
+        <w:p>
+          <w:pPr>
+            <w:pStyle w:val="TM3"/>
+            <w:tabs>
+              <w:tab w:val="left" w:pos="960"/>
+              <w:tab w:val="right" w:leader="dot" w:pos="9062"/>
+            </w:tabs>
+            <w:rPr>
+              <w:rFonts w:asciiTheme="minorHAnsi" w:eastAsiaTheme="minorEastAsia" w:hAnsiTheme="minorHAnsi"/>
+              <w:noProof/>
+              <w:sz w:val="24"/>
+              <w:szCs w:val="24"/>
+              <w:lang w:eastAsia="fr-FR"/>
+            </w:rPr>
+          </w:pPr>
+          <w:hyperlink w:anchor="_Toc192421999" w:history="1">
+            <w:r>
+              <w:rPr>
+                <w:rStyle w:val="Lienhypertexte"/>
+                <w:noProof/>
+                <w:lang w:val="en-US"/>
+              </w:rPr>
+              <w:t>a.</w:t>
+            </w:r>
+            <w:r>
+              <w:rPr>
+                <w:rFonts w:asciiTheme="minorHAnsi" w:eastAsiaTheme="minorEastAsia" w:hAnsiTheme="minorHAnsi"/>
+                <w:noProof/>
+                <w:sz w:val="24"/>
+                <w:szCs w:val="24"/>
+                <w:lang w:eastAsia="fr-FR"/>
+              </w:rPr>
+              <w:tab/>
+            </w:r>
+            <w:r>
+              <w:rPr>
+                <w:rStyle w:val="Lienhypertexte"/>
+                <w:noProof/>
+                <w:lang w:val="en-US"/>
+              </w:rPr>
+              <w:t>Pattern Chain Of Responsibility (COR)</w:t>
+            </w:r>
+            <w:r>
+              <w:rPr>
+                <w:noProof/>
+                <w:webHidden/>
+              </w:rPr>
+              <w:tab/>
+            </w:r>
+            <w:r>
+              <w:rPr>
+                <w:noProof/>
+                <w:webHidden/>
+              </w:rPr>
+              <w:fldChar w:fldCharType="begin"/>
+            </w:r>
+            <w:r>
+              <w:rPr>
+                <w:noProof/>
+                <w:webHidden/>
+              </w:rPr>
+              <w:instrText xml:space="preserve"> PAGEREF _Toc192421999 \h </w:instrText>
+            </w:r>
+            <w:r>
+              <w:rPr>
+                <w:noProof/>
+                <w:webHidden/>
+              </w:rPr>
+            </w:r>
+            <w:r>
+              <w:rPr>
+                <w:noProof/>
+                <w:webHidden/>
+              </w:rPr>
+              <w:fldChar w:fldCharType="separate"/>
+            </w:r>
+            <w:r>
+              <w:rPr>
+                <w:noProof/>
+                <w:webHidden/>
+              </w:rPr>
+              <w:t>11</w:t>
+            </w:r>
+            <w:r>
+              <w:rPr>
+                <w:noProof/>
+                <w:webHidden/>
+              </w:rPr>
+              <w:fldChar w:fldCharType="end"/>
+            </w:r>
+          </w:hyperlink>
+        </w:p>
+        <w:p>
+          <w:pPr>
+            <w:pStyle w:val="TM2"/>
+            <w:tabs>
+              <w:tab w:val="left" w:pos="720"/>
+              <w:tab w:val="right" w:leader="dot" w:pos="9062"/>
+            </w:tabs>
+            <w:rPr>
+              <w:rFonts w:asciiTheme="minorHAnsi" w:eastAsiaTheme="minorEastAsia" w:hAnsiTheme="minorHAnsi"/>
+              <w:noProof/>
+              <w:sz w:val="24"/>
+              <w:szCs w:val="24"/>
+              <w:lang w:eastAsia="fr-FR"/>
+            </w:rPr>
+          </w:pPr>
+          <w:hyperlink w:anchor="_Toc192422000" w:history="1">
+            <w:r>
+              <w:rPr>
+                <w:rStyle w:val="Lienhypertexte"/>
+                <w:noProof/>
+              </w:rPr>
+              <w:t>5.</w:t>
+            </w:r>
+            <w:r>
+              <w:rPr>
+                <w:rFonts w:asciiTheme="minorHAnsi" w:eastAsiaTheme="minorEastAsia" w:hAnsiTheme="minorHAnsi"/>
+                <w:noProof/>
+                <w:sz w:val="24"/>
+                <w:szCs w:val="24"/>
+                <w:lang w:eastAsia="fr-FR"/>
+              </w:rPr>
+              <w:tab/>
+            </w:r>
+            <w:r>
+              <w:rPr>
+                <w:rStyle w:val="Lienhypertexte"/>
+                <w:noProof/>
+              </w:rPr>
+              <w:t>Gestion de l’affichage</w:t>
+            </w:r>
+            <w:r>
+              <w:rPr>
+                <w:noProof/>
+                <w:webHidden/>
+              </w:rPr>
+              <w:tab/>
+            </w:r>
+            <w:r>
+              <w:rPr>
+                <w:noProof/>
+                <w:webHidden/>
+              </w:rPr>
+              <w:fldChar w:fldCharType="begin"/>
+            </w:r>
+            <w:r>
+              <w:rPr>
+                <w:noProof/>
+                <w:webHidden/>
+              </w:rPr>
+              <w:instrText xml:space="preserve"> PAGEREF _Toc192422000 \h </w:instrText>
+            </w:r>
+            <w:r>
+              <w:rPr>
+                <w:noProof/>
+                <w:webHidden/>
+              </w:rPr>
+            </w:r>
+            <w:r>
+              <w:rPr>
+                <w:noProof/>
+                <w:webHidden/>
+              </w:rPr>
+              <w:fldChar w:fldCharType="separate"/>
+            </w:r>
+            <w:r>
+              <w:rPr>
+                <w:noProof/>
+                <w:webHidden/>
+              </w:rPr>
+              <w:t>11</w:t>
+            </w:r>
+            <w:r>
+              <w:rPr>
+                <w:noProof/>
+                <w:webHidden/>
+              </w:rPr>
+              <w:fldChar w:fldCharType="end"/>
+            </w:r>
+          </w:hyperlink>
+        </w:p>
+        <w:p>
+          <w:pPr>
+            <w:pStyle w:val="TM2"/>
+            <w:tabs>
+              <w:tab w:val="left" w:pos="720"/>
+              <w:tab w:val="right" w:leader="dot" w:pos="9062"/>
+            </w:tabs>
+            <w:rPr>
+              <w:rFonts w:asciiTheme="minorHAnsi" w:eastAsiaTheme="minorEastAsia" w:hAnsiTheme="minorHAnsi"/>
+              <w:noProof/>
+              <w:sz w:val="24"/>
+              <w:szCs w:val="24"/>
+              <w:lang w:eastAsia="fr-FR"/>
+            </w:rPr>
+          </w:pPr>
+          <w:hyperlink w:anchor="_Toc192422001" w:history="1">
+            <w:r>
+              <w:rPr>
+                <w:rStyle w:val="Lienhypertexte"/>
+                <w:noProof/>
+              </w:rPr>
+              <w:t>6.</w:t>
+            </w:r>
+            <w:r>
+              <w:rPr>
+                <w:rFonts w:asciiTheme="minorHAnsi" w:eastAsiaTheme="minorEastAsia" w:hAnsiTheme="minorHAnsi"/>
+                <w:noProof/>
+                <w:sz w:val="24"/>
+                <w:szCs w:val="24"/>
+                <w:lang w:eastAsia="fr-FR"/>
+              </w:rPr>
+              <w:tab/>
+            </w:r>
+            <w:r>
+              <w:rPr>
+                <w:rStyle w:val="Lienhypertexte"/>
+                <w:noProof/>
+              </w:rPr>
+              <w:t>Fonctionnement de Controleur</w:t>
+            </w:r>
+            <w:r>
+              <w:rPr>
+                <w:noProof/>
+                <w:webHidden/>
+              </w:rPr>
+              <w:tab/>
+            </w:r>
+            <w:r>
+              <w:rPr>
+                <w:noProof/>
+                <w:webHidden/>
+              </w:rPr>
+              <w:fldChar w:fldCharType="begin"/>
+            </w:r>
+            <w:r>
+              <w:rPr>
+                <w:noProof/>
+                <w:webHidden/>
+              </w:rPr>
+              <w:instrText xml:space="preserve"> PAGEREF _Toc192422001 \h </w:instrText>
+            </w:r>
+            <w:r>
+              <w:rPr>
+                <w:noProof/>
+                <w:webHidden/>
+              </w:rPr>
+            </w:r>
+            <w:r>
+              <w:rPr>
+                <w:noProof/>
+                <w:webHidden/>
+              </w:rPr>
+              <w:fldChar w:fldCharType="separate"/>
+            </w:r>
+            <w:r>
+              <w:rPr>
+                <w:noProof/>
+                <w:webHidden/>
+              </w:rPr>
+              <w:t>12</w:t>
+            </w:r>
+            <w:r>
+              <w:rPr>
+                <w:noProof/>
+                <w:webHidden/>
+              </w:rPr>
+              <w:fldChar w:fldCharType="end"/>
+            </w:r>
+          </w:hyperlink>
+        </w:p>
+        <w:p>
+          <w:pPr>
+            <w:pStyle w:val="TM2"/>
+            <w:tabs>
+              <w:tab w:val="left" w:pos="720"/>
+              <w:tab w:val="right" w:leader="dot" w:pos="9062"/>
+            </w:tabs>
+            <w:rPr>
+              <w:rFonts w:asciiTheme="minorHAnsi" w:eastAsiaTheme="minorEastAsia" w:hAnsiTheme="minorHAnsi"/>
+              <w:noProof/>
+              <w:sz w:val="24"/>
+              <w:szCs w:val="24"/>
+              <w:lang w:eastAsia="fr-FR"/>
+            </w:rPr>
+          </w:pPr>
+          <w:hyperlink w:anchor="_Toc192422002" w:history="1">
+            <w:r>
+              <w:rPr>
+                <w:rStyle w:val="Lienhypertexte"/>
+                <w:noProof/>
+              </w:rPr>
+              <w:t>7.</w:t>
+            </w:r>
+            <w:r>
+              <w:rPr>
+                <w:rFonts w:asciiTheme="minorHAnsi" w:eastAsiaTheme="minorEastAsia" w:hAnsiTheme="minorHAnsi"/>
+                <w:noProof/>
+                <w:sz w:val="24"/>
+                <w:szCs w:val="24"/>
+                <w:lang w:eastAsia="fr-FR"/>
+              </w:rPr>
+              <w:tab/>
+            </w:r>
+            <w:r>
+              <w:rPr>
+                <w:rStyle w:val="Lienhypertexte"/>
+                <w:noProof/>
+              </w:rPr>
+              <w:t>Fonctionnement d’Interlocuteur</w:t>
+            </w:r>
+            <w:r>
+              <w:rPr>
+                <w:noProof/>
+                <w:webHidden/>
+              </w:rPr>
+              <w:tab/>
+            </w:r>
+            <w:r>
+              <w:rPr>
+                <w:noProof/>
+                <w:webHidden/>
+              </w:rPr>
+              <w:fldChar w:fldCharType="begin"/>
+            </w:r>
+            <w:r>
+              <w:rPr>
+                <w:noProof/>
+                <w:webHidden/>
+              </w:rPr>
+              <w:instrText xml:space="preserve"> PAGEREF _Toc192422002 \h </w:instrText>
+            </w:r>
+            <w:r>
+              <w:rPr>
+                <w:noProof/>
+                <w:webHidden/>
+              </w:rPr>
+            </w:r>
+            <w:r>
+              <w:rPr>
+                <w:noProof/>
+                <w:webHidden/>
+              </w:rPr>
+              <w:fldChar w:fldCharType="separate"/>
+            </w:r>
+            <w:r>
+              <w:rPr>
+                <w:noProof/>
+                <w:webHidden/>
+              </w:rPr>
+              <w:t>12</w:t>
+            </w:r>
+            <w:r>
+              <w:rPr>
+                <w:noProof/>
+                <w:webHidden/>
+              </w:rPr>
+              <w:fldChar w:fldCharType="end"/>
+            </w:r>
+          </w:hyperlink>
+        </w:p>
+        <w:p>
+          <w:pPr>
+            <w:pStyle w:val="TM2"/>
+            <w:tabs>
+              <w:tab w:val="left" w:pos="720"/>
+              <w:tab w:val="right" w:leader="dot" w:pos="9062"/>
+            </w:tabs>
+            <w:rPr>
+              <w:rFonts w:asciiTheme="minorHAnsi" w:eastAsiaTheme="minorEastAsia" w:hAnsiTheme="minorHAnsi"/>
+              <w:noProof/>
+              <w:sz w:val="24"/>
+              <w:szCs w:val="24"/>
+              <w:lang w:eastAsia="fr-FR"/>
+            </w:rPr>
+          </w:pPr>
+          <w:hyperlink w:anchor="_Toc192422003" w:history="1">
+            <w:r>
+              <w:rPr>
+                <w:rStyle w:val="Lienhypertexte"/>
+                <w:noProof/>
+              </w:rPr>
+              <w:t>IV.</w:t>
+            </w:r>
+            <w:r>
+              <w:rPr>
+                <w:rFonts w:asciiTheme="minorHAnsi" w:eastAsiaTheme="minorEastAsia" w:hAnsiTheme="minorHAnsi"/>
+                <w:noProof/>
+                <w:sz w:val="24"/>
+                <w:szCs w:val="24"/>
+                <w:lang w:eastAsia="fr-FR"/>
+              </w:rPr>
+              <w:tab/>
+            </w:r>
+            <w:r>
+              <w:rPr>
+                <w:rStyle w:val="Lienhypertexte"/>
+                <w:noProof/>
+              </w:rPr>
               <w:t>Extension OpenGL</w:t>
             </w:r>
             <w:r>
@@ -2152,7 +2874,7 @@
                 <w:noProof/>
                 <w:webHidden/>
               </w:rPr>
-              <w:instrText xml:space="preserve"> PAGEREF _Toc190442856 \h </w:instrText>
+              <w:instrText xml:space="preserve"> PAGEREF _Toc192422003 \h </w:instrText>
             </w:r>
             <w:r>
               <w:rPr>
@@ -2172,7 +2894,547 @@
                 <w:noProof/>
                 <w:webHidden/>
               </w:rPr>
-              <w:t>10</w:t>
+              <w:t>12</w:t>
+            </w:r>
+            <w:r>
+              <w:rPr>
+                <w:noProof/>
+                <w:webHidden/>
+              </w:rPr>
+              <w:fldChar w:fldCharType="end"/>
+            </w:r>
+          </w:hyperlink>
+        </w:p>
+        <w:p>
+          <w:pPr>
+            <w:pStyle w:val="TM2"/>
+            <w:tabs>
+              <w:tab w:val="left" w:pos="720"/>
+              <w:tab w:val="right" w:leader="dot" w:pos="9062"/>
+            </w:tabs>
+            <w:rPr>
+              <w:rFonts w:asciiTheme="minorHAnsi" w:eastAsiaTheme="minorEastAsia" w:hAnsiTheme="minorHAnsi"/>
+              <w:noProof/>
+              <w:sz w:val="24"/>
+              <w:szCs w:val="24"/>
+              <w:lang w:eastAsia="fr-FR"/>
+            </w:rPr>
+          </w:pPr>
+          <w:hyperlink w:anchor="_Toc192422004" w:history="1">
+            <w:r>
+              <w:rPr>
+                <w:rStyle w:val="Lienhypertexte"/>
+                <w:noProof/>
+              </w:rPr>
+              <w:t>b.</w:t>
+            </w:r>
+            <w:r>
+              <w:rPr>
+                <w:rFonts w:asciiTheme="minorHAnsi" w:eastAsiaTheme="minorEastAsia" w:hAnsiTheme="minorHAnsi"/>
+                <w:noProof/>
+                <w:sz w:val="24"/>
+                <w:szCs w:val="24"/>
+                <w:lang w:eastAsia="fr-FR"/>
+              </w:rPr>
+              <w:tab/>
+            </w:r>
+            <w:r>
+              <w:rPr>
+                <w:rStyle w:val="Lienhypertexte"/>
+                <w:noProof/>
+              </w:rPr>
+              <w:t>Présentation de l’extension</w:t>
+            </w:r>
+            <w:r>
+              <w:rPr>
+                <w:noProof/>
+                <w:webHidden/>
+              </w:rPr>
+              <w:tab/>
+            </w:r>
+            <w:r>
+              <w:rPr>
+                <w:noProof/>
+                <w:webHidden/>
+              </w:rPr>
+              <w:fldChar w:fldCharType="begin"/>
+            </w:r>
+            <w:r>
+              <w:rPr>
+                <w:noProof/>
+                <w:webHidden/>
+              </w:rPr>
+              <w:instrText xml:space="preserve"> PAGEREF _Toc192422004 \h </w:instrText>
+            </w:r>
+            <w:r>
+              <w:rPr>
+                <w:noProof/>
+                <w:webHidden/>
+              </w:rPr>
+            </w:r>
+            <w:r>
+              <w:rPr>
+                <w:noProof/>
+                <w:webHidden/>
+              </w:rPr>
+              <w:fldChar w:fldCharType="separate"/>
+            </w:r>
+            <w:r>
+              <w:rPr>
+                <w:noProof/>
+                <w:webHidden/>
+              </w:rPr>
+              <w:t>12</w:t>
+            </w:r>
+            <w:r>
+              <w:rPr>
+                <w:noProof/>
+                <w:webHidden/>
+              </w:rPr>
+              <w:fldChar w:fldCharType="end"/>
+            </w:r>
+          </w:hyperlink>
+        </w:p>
+        <w:p>
+          <w:pPr>
+            <w:pStyle w:val="TM2"/>
+            <w:tabs>
+              <w:tab w:val="left" w:pos="720"/>
+              <w:tab w:val="right" w:leader="dot" w:pos="9062"/>
+            </w:tabs>
+            <w:rPr>
+              <w:rFonts w:asciiTheme="minorHAnsi" w:eastAsiaTheme="minorEastAsia" w:hAnsiTheme="minorHAnsi"/>
+              <w:noProof/>
+              <w:sz w:val="24"/>
+              <w:szCs w:val="24"/>
+              <w:lang w:eastAsia="fr-FR"/>
+            </w:rPr>
+          </w:pPr>
+          <w:hyperlink w:anchor="_Toc192422005" w:history="1">
+            <w:r>
+              <w:rPr>
+                <w:rStyle w:val="Lienhypertexte"/>
+                <w:noProof/>
+              </w:rPr>
+              <w:t>c.</w:t>
+            </w:r>
+            <w:r>
+              <w:rPr>
+                <w:rFonts w:asciiTheme="minorHAnsi" w:eastAsiaTheme="minorEastAsia" w:hAnsiTheme="minorHAnsi"/>
+                <w:noProof/>
+                <w:sz w:val="24"/>
+                <w:szCs w:val="24"/>
+                <w:lang w:eastAsia="fr-FR"/>
+              </w:rPr>
+              <w:tab/>
+            </w:r>
+            <w:r>
+              <w:rPr>
+                <w:rStyle w:val="Lienhypertexte"/>
+                <w:noProof/>
+              </w:rPr>
+              <w:t>Structure et Classes</w:t>
+            </w:r>
+            <w:r>
+              <w:rPr>
+                <w:noProof/>
+                <w:webHidden/>
+              </w:rPr>
+              <w:tab/>
+            </w:r>
+            <w:r>
+              <w:rPr>
+                <w:noProof/>
+                <w:webHidden/>
+              </w:rPr>
+              <w:fldChar w:fldCharType="begin"/>
+            </w:r>
+            <w:r>
+              <w:rPr>
+                <w:noProof/>
+                <w:webHidden/>
+              </w:rPr>
+              <w:instrText xml:space="preserve"> PAGEREF _Toc192422005 \h </w:instrText>
+            </w:r>
+            <w:r>
+              <w:rPr>
+                <w:noProof/>
+                <w:webHidden/>
+              </w:rPr>
+            </w:r>
+            <w:r>
+              <w:rPr>
+                <w:noProof/>
+                <w:webHidden/>
+              </w:rPr>
+              <w:fldChar w:fldCharType="separate"/>
+            </w:r>
+            <w:r>
+              <w:rPr>
+                <w:noProof/>
+                <w:webHidden/>
+              </w:rPr>
+              <w:t>12</w:t>
+            </w:r>
+            <w:r>
+              <w:rPr>
+                <w:noProof/>
+                <w:webHidden/>
+              </w:rPr>
+              <w:fldChar w:fldCharType="end"/>
+            </w:r>
+          </w:hyperlink>
+        </w:p>
+        <w:p>
+          <w:pPr>
+            <w:pStyle w:val="TM3"/>
+            <w:tabs>
+              <w:tab w:val="left" w:pos="960"/>
+              <w:tab w:val="right" w:leader="dot" w:pos="9062"/>
+            </w:tabs>
+            <w:rPr>
+              <w:rFonts w:asciiTheme="minorHAnsi" w:eastAsiaTheme="minorEastAsia" w:hAnsiTheme="minorHAnsi"/>
+              <w:noProof/>
+              <w:sz w:val="24"/>
+              <w:szCs w:val="24"/>
+              <w:lang w:eastAsia="fr-FR"/>
+            </w:rPr>
+          </w:pPr>
+          <w:hyperlink w:anchor="_Toc192422006" w:history="1">
+            <w:r>
+              <w:rPr>
+                <w:rStyle w:val="Lienhypertexte"/>
+                <w:noProof/>
+              </w:rPr>
+              <w:t>a.</w:t>
+            </w:r>
+            <w:r>
+              <w:rPr>
+                <w:rFonts w:asciiTheme="minorHAnsi" w:eastAsiaTheme="minorEastAsia" w:hAnsiTheme="minorHAnsi"/>
+                <w:noProof/>
+                <w:sz w:val="24"/>
+                <w:szCs w:val="24"/>
+                <w:lang w:eastAsia="fr-FR"/>
+              </w:rPr>
+              <w:tab/>
+            </w:r>
+            <w:r>
+              <w:rPr>
+                <w:rStyle w:val="Lienhypertexte"/>
+                <w:noProof/>
+              </w:rPr>
+              <w:t>Modèle</w:t>
+            </w:r>
+            <w:r>
+              <w:rPr>
+                <w:noProof/>
+                <w:webHidden/>
+              </w:rPr>
+              <w:tab/>
+            </w:r>
+            <w:r>
+              <w:rPr>
+                <w:noProof/>
+                <w:webHidden/>
+              </w:rPr>
+              <w:fldChar w:fldCharType="begin"/>
+            </w:r>
+            <w:r>
+              <w:rPr>
+                <w:noProof/>
+                <w:webHidden/>
+              </w:rPr>
+              <w:instrText xml:space="preserve"> PAGEREF _Toc192422006 \h </w:instrText>
+            </w:r>
+            <w:r>
+              <w:rPr>
+                <w:noProof/>
+                <w:webHidden/>
+              </w:rPr>
+            </w:r>
+            <w:r>
+              <w:rPr>
+                <w:noProof/>
+                <w:webHidden/>
+              </w:rPr>
+              <w:fldChar w:fldCharType="separate"/>
+            </w:r>
+            <w:r>
+              <w:rPr>
+                <w:noProof/>
+                <w:webHidden/>
+              </w:rPr>
+              <w:t>13</w:t>
+            </w:r>
+            <w:r>
+              <w:rPr>
+                <w:noProof/>
+                <w:webHidden/>
+              </w:rPr>
+              <w:fldChar w:fldCharType="end"/>
+            </w:r>
+          </w:hyperlink>
+        </w:p>
+        <w:p>
+          <w:pPr>
+            <w:pStyle w:val="TM3"/>
+            <w:tabs>
+              <w:tab w:val="left" w:pos="960"/>
+              <w:tab w:val="right" w:leader="dot" w:pos="9062"/>
+            </w:tabs>
+            <w:rPr>
+              <w:rFonts w:asciiTheme="minorHAnsi" w:eastAsiaTheme="minorEastAsia" w:hAnsiTheme="minorHAnsi"/>
+              <w:noProof/>
+              <w:sz w:val="24"/>
+              <w:szCs w:val="24"/>
+              <w:lang w:eastAsia="fr-FR"/>
+            </w:rPr>
+          </w:pPr>
+          <w:hyperlink w:anchor="_Toc192422007" w:history="1">
+            <w:r>
+              <w:rPr>
+                <w:rStyle w:val="Lienhypertexte"/>
+                <w:noProof/>
+              </w:rPr>
+              <w:t>b.</w:t>
+            </w:r>
+            <w:r>
+              <w:rPr>
+                <w:rFonts w:asciiTheme="minorHAnsi" w:eastAsiaTheme="minorEastAsia" w:hAnsiTheme="minorHAnsi"/>
+                <w:noProof/>
+                <w:sz w:val="24"/>
+                <w:szCs w:val="24"/>
+                <w:lang w:eastAsia="fr-FR"/>
+              </w:rPr>
+              <w:tab/>
+            </w:r>
+            <w:r>
+              <w:rPr>
+                <w:rStyle w:val="Lienhypertexte"/>
+                <w:noProof/>
+              </w:rPr>
+              <w:t>Vue</w:t>
+            </w:r>
+            <w:r>
+              <w:rPr>
+                <w:noProof/>
+                <w:webHidden/>
+              </w:rPr>
+              <w:tab/>
+            </w:r>
+            <w:r>
+              <w:rPr>
+                <w:noProof/>
+                <w:webHidden/>
+              </w:rPr>
+              <w:fldChar w:fldCharType="begin"/>
+            </w:r>
+            <w:r>
+              <w:rPr>
+                <w:noProof/>
+                <w:webHidden/>
+              </w:rPr>
+              <w:instrText xml:space="preserve"> PAGEREF _Toc192422007 \h </w:instrText>
+            </w:r>
+            <w:r>
+              <w:rPr>
+                <w:noProof/>
+                <w:webHidden/>
+              </w:rPr>
+            </w:r>
+            <w:r>
+              <w:rPr>
+                <w:noProof/>
+                <w:webHidden/>
+              </w:rPr>
+              <w:fldChar w:fldCharType="separate"/>
+            </w:r>
+            <w:r>
+              <w:rPr>
+                <w:noProof/>
+                <w:webHidden/>
+              </w:rPr>
+              <w:t>13</w:t>
+            </w:r>
+            <w:r>
+              <w:rPr>
+                <w:noProof/>
+                <w:webHidden/>
+              </w:rPr>
+              <w:fldChar w:fldCharType="end"/>
+            </w:r>
+          </w:hyperlink>
+        </w:p>
+        <w:p>
+          <w:pPr>
+            <w:pStyle w:val="TM3"/>
+            <w:tabs>
+              <w:tab w:val="left" w:pos="960"/>
+              <w:tab w:val="right" w:leader="dot" w:pos="9062"/>
+            </w:tabs>
+            <w:rPr>
+              <w:rFonts w:asciiTheme="minorHAnsi" w:eastAsiaTheme="minorEastAsia" w:hAnsiTheme="minorHAnsi"/>
+              <w:noProof/>
+              <w:sz w:val="24"/>
+              <w:szCs w:val="24"/>
+              <w:lang w:eastAsia="fr-FR"/>
+            </w:rPr>
+          </w:pPr>
+          <w:hyperlink w:anchor="_Toc192422008" w:history="1">
+            <w:r>
+              <w:rPr>
+                <w:rStyle w:val="Lienhypertexte"/>
+                <w:noProof/>
+              </w:rPr>
+              <w:t>c.</w:t>
+            </w:r>
+            <w:r>
+              <w:rPr>
+                <w:rFonts w:asciiTheme="minorHAnsi" w:eastAsiaTheme="minorEastAsia" w:hAnsiTheme="minorHAnsi"/>
+                <w:noProof/>
+                <w:sz w:val="24"/>
+                <w:szCs w:val="24"/>
+                <w:lang w:eastAsia="fr-FR"/>
+              </w:rPr>
+              <w:tab/>
+            </w:r>
+            <w:r>
+              <w:rPr>
+                <w:rStyle w:val="Lienhypertexte"/>
+                <w:noProof/>
+              </w:rPr>
+              <w:t>Contrôleur</w:t>
+            </w:r>
+            <w:r>
+              <w:rPr>
+                <w:noProof/>
+                <w:webHidden/>
+              </w:rPr>
+              <w:tab/>
+            </w:r>
+            <w:r>
+              <w:rPr>
+                <w:noProof/>
+                <w:webHidden/>
+              </w:rPr>
+              <w:fldChar w:fldCharType="begin"/>
+            </w:r>
+            <w:r>
+              <w:rPr>
+                <w:noProof/>
+                <w:webHidden/>
+              </w:rPr>
+              <w:instrText xml:space="preserve"> PAGEREF _Toc192422008 \h </w:instrText>
+            </w:r>
+            <w:r>
+              <w:rPr>
+                <w:noProof/>
+                <w:webHidden/>
+              </w:rPr>
+            </w:r>
+            <w:r>
+              <w:rPr>
+                <w:noProof/>
+                <w:webHidden/>
+              </w:rPr>
+              <w:fldChar w:fldCharType="separate"/>
+            </w:r>
+            <w:r>
+              <w:rPr>
+                <w:noProof/>
+                <w:webHidden/>
+              </w:rPr>
+              <w:t>13</w:t>
+            </w:r>
+            <w:r>
+              <w:rPr>
+                <w:noProof/>
+                <w:webHidden/>
+              </w:rPr>
+              <w:fldChar w:fldCharType="end"/>
+            </w:r>
+          </w:hyperlink>
+        </w:p>
+        <w:p>
+          <w:pPr>
+            <w:pStyle w:val="TM2"/>
+            <w:tabs>
+              <w:tab w:val="left" w:pos="720"/>
+              <w:tab w:val="right" w:leader="dot" w:pos="9062"/>
+            </w:tabs>
+            <w:rPr>
+              <w:rFonts w:asciiTheme="minorHAnsi" w:eastAsiaTheme="minorEastAsia" w:hAnsiTheme="minorHAnsi"/>
+              <w:noProof/>
+              <w:sz w:val="24"/>
+              <w:szCs w:val="24"/>
+              <w:lang w:eastAsia="fr-FR"/>
+            </w:rPr>
+          </w:pPr>
+          <w:hyperlink w:anchor="_Toc192422009" w:history="1">
+            <w:r>
+              <w:rPr>
+                <w:rStyle w:val="Lienhypertexte"/>
+                <w:noProof/>
+              </w:rPr>
+              <w:t>d.</w:t>
+            </w:r>
+            <w:r>
+              <w:rPr>
+                <w:rFonts w:asciiTheme="minorHAnsi" w:eastAsiaTheme="minorEastAsia" w:hAnsiTheme="minorHAnsi"/>
+                <w:noProof/>
+                <w:sz w:val="24"/>
+                <w:szCs w:val="24"/>
+                <w:lang w:eastAsia="fr-FR"/>
+              </w:rPr>
+              <w:tab/>
+            </w:r>
+            <w:r>
+              <w:rPr>
+                <w:rStyle w:val="Lienhypertexte"/>
+                <w:noProof/>
+              </w:rPr>
+              <w:t>Fonctionnement</w:t>
+            </w:r>
+            <w:r>
+              <w:rPr>
+                <w:noProof/>
+                <w:webHidden/>
+              </w:rPr>
+              <w:tab/>
+            </w:r>
+            <w:r>
+              <w:rPr>
+                <w:noProof/>
+                <w:webHidden/>
+              </w:rPr>
+              <w:fldChar w:fldCharType="begin"/>
+            </w:r>
+            <w:r>
+              <w:rPr>
+                <w:noProof/>
+                <w:webHidden/>
+              </w:rPr>
+              <w:instrText xml:space="preserve"> PAGEREF _Toc192422009 \h </w:instrText>
+            </w:r>
+            <w:r>
+              <w:rPr>
+                <w:noProof/>
+                <w:webHidden/>
+              </w:rPr>
+            </w:r>
+            <w:r>
+              <w:rPr>
+                <w:noProof/>
+                <w:webHidden/>
+              </w:rPr>
+              <w:fldChar w:fldCharType="separate"/>
+            </w:r>
+            <w:r>
+              <w:rPr>
+                <w:noProof/>
+                <w:webHidden/>
+              </w:rPr>
+              <w:t>13</w:t>
             </w:r>
             <w:r>
               <w:rPr>
@@ -2195,6 +3457,7 @@
               <w:b/>
               <w:bCs/>
             </w:rPr>
+            <w:lastRenderedPageBreak/>
             <w:fldChar w:fldCharType="end"/>
           </w:r>
         </w:p>
@@ -2218,9 +3481,8 @@
           <w:numId w:val="10"/>
         </w:numPr>
       </w:pPr>
-      <w:bookmarkStart w:id="0" w:name="_Toc190442837"/>
-      <w:r>
-        <w:lastRenderedPageBreak/>
+      <w:bookmarkStart w:id="0" w:name="_Toc192421976"/>
+      <w:r>
         <w:t>Introduction</w:t>
       </w:r>
       <w:bookmarkEnd w:id="0"/>
@@ -2234,7 +3496,7 @@
           <w:numId w:val="12"/>
         </w:numPr>
       </w:pPr>
-      <w:bookmarkStart w:id="1" w:name="_Toc190442838"/>
+      <w:bookmarkStart w:id="1" w:name="_Toc192421977"/>
       <w:r>
         <w:t>Objectifs du projet</w:t>
       </w:r>
@@ -2307,9 +3569,8 @@
           <w:numId w:val="10"/>
         </w:numPr>
       </w:pPr>
-      <w:bookmarkStart w:id="2" w:name="_Toc190442839"/>
-      <w:r>
-        <w:lastRenderedPageBreak/>
+      <w:bookmarkStart w:id="2" w:name="_Toc192421978"/>
+      <w:r>
         <w:t>Partie C++ (Client)</w:t>
       </w:r>
       <w:bookmarkEnd w:id="2"/>
@@ -2323,7 +3584,7 @@
           <w:numId w:val="13"/>
         </w:numPr>
       </w:pPr>
-      <w:bookmarkStart w:id="3" w:name="_Toc190442840"/>
+      <w:bookmarkStart w:id="3" w:name="_Toc192421979"/>
       <w:r>
         <w:t xml:space="preserve">Présentation de la partie </w:t>
       </w:r>
@@ -2347,7 +3608,7 @@
           <w:numId w:val="13"/>
         </w:numPr>
       </w:pPr>
-      <w:bookmarkStart w:id="4" w:name="_Toc190442841"/>
+      <w:bookmarkStart w:id="4" w:name="_Toc192421980"/>
       <w:r>
         <w:t>Gestion des formes géométriques</w:t>
       </w:r>
@@ -2362,7 +3623,7 @@
           <w:numId w:val="14"/>
         </w:numPr>
       </w:pPr>
-      <w:bookmarkStart w:id="5" w:name="_Toc190442842"/>
+      <w:bookmarkStart w:id="5" w:name="_Toc192421981"/>
       <w:r>
         <w:t>Représentation d’un point</w:t>
       </w:r>
@@ -2408,7 +3669,7 @@
           <w:numId w:val="14"/>
         </w:numPr>
       </w:pPr>
-      <w:bookmarkStart w:id="6" w:name="_Toc190442843"/>
+      <w:bookmarkStart w:id="6" w:name="_Toc192421982"/>
       <w:r>
         <w:t>Représentation de formes</w:t>
       </w:r>
@@ -2431,6 +3692,7 @@
     </w:p>
     <w:p>
       <w:r>
+        <w:lastRenderedPageBreak/>
         <w:t>Il existe deux types de formes :</w:t>
       </w:r>
     </w:p>
@@ -2504,7 +3766,6 @@
     </w:p>
     <w:p>
       <w:r>
-        <w:lastRenderedPageBreak/>
         <w:t>Ces fonctions sont séparables en trois catégories :</w:t>
       </w:r>
     </w:p>
@@ -2652,7 +3913,7 @@
           <w:numId w:val="13"/>
         </w:numPr>
       </w:pPr>
-      <w:bookmarkStart w:id="7" w:name="_Toc190442844"/>
+      <w:bookmarkStart w:id="7" w:name="_Toc192421983"/>
       <w:r>
         <w:t>Gestion du Viewport</w:t>
       </w:r>
@@ -2667,7 +3928,7 @@
           <w:numId w:val="18"/>
         </w:numPr>
       </w:pPr>
-      <w:bookmarkStart w:id="8" w:name="_Toc190442845"/>
+      <w:bookmarkStart w:id="8" w:name="_Toc192421984"/>
       <w:r>
         <w:t>Rôle du Viewport</w:t>
       </w:r>
@@ -2691,7 +3952,7 @@
           <w:numId w:val="18"/>
         </w:numPr>
       </w:pPr>
-      <w:bookmarkStart w:id="9" w:name="_Toc190442846"/>
+      <w:bookmarkStart w:id="9" w:name="_Toc192421985"/>
       <w:r>
         <w:t>Attributs du Viewport</w:t>
       </w:r>
@@ -2758,7 +4019,6 @@
         <w:rPr>
           <w:rFonts w:eastAsiaTheme="minorEastAsia"/>
         </w:rPr>
-        <w:lastRenderedPageBreak/>
         <w:t>Voici quelques informations complémentaires sur ces calculs :</w:t>
       </w:r>
     </w:p>
@@ -2972,7 +4232,7 @@
           <w:rFonts w:eastAsiaTheme="minorEastAsia"/>
         </w:rPr>
       </w:pPr>
-      <w:bookmarkStart w:id="10" w:name="_Toc190442847"/>
+      <w:bookmarkStart w:id="10" w:name="_Toc192421986"/>
       <w:r>
         <w:rPr>
           <w:rFonts w:eastAsiaTheme="minorEastAsia"/>
@@ -3037,7 +4297,6 @@
         </w:numPr>
       </w:pPr>
       <w:r>
-        <w:lastRenderedPageBreak/>
         <w:t>Translation pour centrer l’écran</w:t>
       </w:r>
     </w:p>
@@ -3064,7 +4323,7 @@
           <w:numId w:val="13"/>
         </w:numPr>
       </w:pPr>
-      <w:bookmarkStart w:id="11" w:name="_Toc190442848"/>
+      <w:bookmarkStart w:id="11" w:name="_Toc192421987"/>
       <w:r>
         <w:t>Client TCP/IP</w:t>
       </w:r>
@@ -3079,7 +4338,7 @@
           <w:numId w:val="22"/>
         </w:numPr>
       </w:pPr>
-      <w:bookmarkStart w:id="12" w:name="_Toc190442849"/>
+      <w:bookmarkStart w:id="12" w:name="_Toc192421988"/>
       <w:r>
         <w:t>Rôle du Client TCP/IP</w:t>
       </w:r>
@@ -3100,7 +4359,7 @@
           <w:numId w:val="22"/>
         </w:numPr>
       </w:pPr>
-      <w:bookmarkStart w:id="13" w:name="_Toc190442850"/>
+      <w:bookmarkStart w:id="13" w:name="_Toc192421989"/>
       <w:r>
         <w:t>Attributs du Client</w:t>
       </w:r>
@@ -3124,7 +4383,7 @@
           <w:numId w:val="13"/>
         </w:numPr>
       </w:pPr>
-      <w:bookmarkStart w:id="14" w:name="_Toc190442851"/>
+      <w:bookmarkStart w:id="14" w:name="_Toc192421990"/>
       <w:r>
         <w:t>Design Patterns</w:t>
       </w:r>
@@ -3142,11 +4401,12 @@
           <w:lang w:val="en-US"/>
         </w:rPr>
       </w:pPr>
-      <w:bookmarkStart w:id="15" w:name="_Toc190442852"/>
+      <w:bookmarkStart w:id="15" w:name="_Toc192421991"/>
       <w:r>
         <w:rPr>
           <w:lang w:val="en-US"/>
         </w:rPr>
+        <w:lastRenderedPageBreak/>
         <w:t>Pattern Chain Of Responsibility (COR)</w:t>
       </w:r>
       <w:bookmarkEnd w:id="15"/>
@@ -3211,7 +4471,6 @@
         <w:rPr>
           <w:noProof/>
         </w:rPr>
-        <w:lastRenderedPageBreak/>
         <w:drawing>
           <wp:inline distT="0" distB="0" distL="0" distR="0" wp14:anchorId="021CF4A8" wp14:editId="35236552">
             <wp:extent cx="5760720" cy="3583940"/>
@@ -3370,7 +4629,7 @@
           <w:numId w:val="20"/>
         </w:numPr>
       </w:pPr>
-      <w:bookmarkStart w:id="16" w:name="_Toc190442853"/>
+      <w:bookmarkStart w:id="16" w:name="_Toc192421992"/>
       <w:r>
         <w:t>Pattern Visitor</w:t>
       </w:r>
@@ -3390,7 +4649,6 @@
     <w:p/>
     <w:p>
       <w:r>
-        <w:lastRenderedPageBreak/>
         <w:t>Voici le diagramme UML associé à cette partie :</w:t>
       </w:r>
     </w:p>
@@ -3508,6 +4766,7 @@
         </w:numPr>
       </w:pPr>
       <w:r>
+        <w:lastRenderedPageBreak/>
         <w:t>VisiteurSauvegarderTXT</w:t>
       </w:r>
     </w:p>
@@ -3552,9 +4811,8 @@
           <w:numId w:val="20"/>
         </w:numPr>
       </w:pPr>
-      <w:bookmarkStart w:id="17" w:name="_Toc190442854"/>
-      <w:r>
-        <w:lastRenderedPageBreak/>
+      <w:bookmarkStart w:id="17" w:name="_Toc192421993"/>
+      <w:r>
         <w:t>Pattern Singleton</w:t>
       </w:r>
       <w:bookmarkEnd w:id="17"/>
@@ -3624,45 +4882,619 @@
     <w:p/>
     <w:p>
       <w:pPr>
+        <w:pStyle w:val="Titre1"/>
+        <w:numPr>
+          <w:ilvl w:val="0"/>
+          <w:numId w:val="10"/>
+        </w:numPr>
+      </w:pPr>
+      <w:bookmarkStart w:id="18" w:name="_Toc192421994"/>
+      <w:r>
+        <w:t>Partie Java (Serveur)</w:t>
+      </w:r>
+      <w:bookmarkEnd w:id="18"/>
+    </w:p>
+    <w:p/>
+    <w:p>
+      <w:pPr>
+        <w:pStyle w:val="Titre2"/>
+        <w:numPr>
+          <w:ilvl w:val="0"/>
+          <w:numId w:val="23"/>
+        </w:numPr>
+      </w:pPr>
+      <w:bookmarkStart w:id="19" w:name="_Toc192421995"/>
+      <w:r>
+        <w:t>Présentation de la partie Java</w:t>
+      </w:r>
+      <w:bookmarkEnd w:id="19"/>
+    </w:p>
+    <w:p/>
+    <w:p>
+      <w:r>
+        <w:t>La partie java consiste en l’implémentation d’un serveur permettant de dessiner des formes, réceptionnées à partir d’un client.</w:t>
+      </w:r>
+    </w:p>
+    <w:p/>
+    <w:p>
+      <w:pPr>
+        <w:pStyle w:val="Titre2"/>
+        <w:numPr>
+          <w:ilvl w:val="0"/>
+          <w:numId w:val="23"/>
+        </w:numPr>
+      </w:pPr>
+      <w:bookmarkStart w:id="20" w:name="_Toc192421996"/>
+      <w:r>
+        <w:t>Connexion au client</w:t>
+      </w:r>
+      <w:bookmarkEnd w:id="20"/>
+    </w:p>
+    <w:p/>
+    <w:p>
+      <w:r>
+        <w:t xml:space="preserve">La connexion au Client se fait de manière à ce que plusieurs clients puissent se connecter et envoyer des informations au serveur, et que celui-ci les traite de manière parallèle. Cela est permis grâce à la classe </w:t>
+      </w:r>
+      <w:r>
+        <w:rPr>
+          <w:i/>
+          <w:iCs/>
+        </w:rPr>
+        <w:t>Interlocuteur</w:t>
+      </w:r>
+      <w:r>
+        <w:t xml:space="preserve">, qui comme son nom l’indique sert </w:t>
+      </w:r>
+      <w:r>
+        <w:t>d’interlocuteur pour chaque connexion entre un client et le serveur. Cette classe dérive en effet de la classe Thread, qui possède une méthode run qui permet d’avoir plusieurs threads s’exécutant en même temps.</w:t>
+      </w:r>
+    </w:p>
+    <w:p>
+      <w:pPr>
+        <w:pStyle w:val="Titre2"/>
+        <w:numPr>
+          <w:ilvl w:val="0"/>
+          <w:numId w:val="23"/>
+        </w:numPr>
+      </w:pPr>
+      <w:bookmarkStart w:id="21" w:name="_Toc192421997"/>
+      <w:r>
+        <w:t>Réception des données</w:t>
+      </w:r>
+      <w:bookmarkEnd w:id="21"/>
+    </w:p>
+    <w:p/>
+    <w:p>
+      <w:r>
+        <w:t>La convention pour la réception des données du client par le serveur est la suivante :</w:t>
+      </w:r>
+    </w:p>
+    <w:p>
+      <w:r>
+        <w:t xml:space="preserve">Le serveur va recevoir un nombre indéterminé de lignes contenant des chaines de caractère. La première ligne </w:t>
+      </w:r>
+      <w:r>
+        <w:t>correspondra</w:t>
+      </w:r>
+      <w:r>
+        <w:t xml:space="preserve"> aux informations qui seront utiles lors du dessin : largeur de la fenêtre, hauteur de la fenêtre, et la couleur des formes. Les données reçues après cela correspondront aux formes à dessiner, qui seront décrites par le nombre de </w:t>
+      </w:r>
+      <w:r>
+        <w:t>sommets</w:t>
+      </w:r>
+      <w:r>
+        <w:t xml:space="preserve"> de la forme suivi des coordonnées des </w:t>
+      </w:r>
+      <w:r>
+        <w:t>sommets</w:t>
+      </w:r>
+      <w:r>
+        <w:t xml:space="preserve">. </w:t>
+      </w:r>
+    </w:p>
+    <w:p>
+      <w:r>
+        <w:t>Le serveur va ainsi lire toutes les lignes envoyées, et va les traiter correctement</w:t>
+      </w:r>
+      <w:r>
+        <w:t xml:space="preserve"> en fonction du nombre de </w:t>
+      </w:r>
+      <w:r>
+        <w:t>sommets</w:t>
+      </w:r>
+      <w:r>
+        <w:t xml:space="preserve"> de la forme</w:t>
+      </w:r>
+      <w:r>
+        <w:t>.</w:t>
+      </w:r>
+      <w:r>
+        <w:t xml:space="preserve"> </w:t>
+      </w:r>
+    </w:p>
+    <w:p/>
+    <w:p>
+      <w:pPr>
+        <w:pStyle w:val="Titre2"/>
+        <w:numPr>
+          <w:ilvl w:val="0"/>
+          <w:numId w:val="23"/>
+        </w:numPr>
+      </w:pPr>
+      <w:bookmarkStart w:id="22" w:name="_Toc192421998"/>
+      <w:r>
+        <w:t xml:space="preserve">Design </w:t>
+      </w:r>
+      <w:r>
+        <w:t>Pattern</w:t>
+      </w:r>
+      <w:bookmarkEnd w:id="22"/>
+    </w:p>
+    <w:p>
+      <w:pPr>
+        <w:pStyle w:val="Paragraphedeliste"/>
+      </w:pPr>
+    </w:p>
+    <w:p>
+      <w:pPr>
+        <w:pStyle w:val="Titre3"/>
+        <w:numPr>
+          <w:ilvl w:val="0"/>
+          <w:numId w:val="30"/>
+        </w:numPr>
+        <w:rPr>
+          <w:lang w:val="en-US"/>
+        </w:rPr>
+      </w:pPr>
+      <w:bookmarkStart w:id="23" w:name="_Toc192421999"/>
+      <w:r>
+        <w:rPr>
+          <w:lang w:val="en-US"/>
+        </w:rPr>
+        <w:t xml:space="preserve">Pattern </w:t>
+      </w:r>
+      <w:r>
+        <w:rPr>
+          <w:lang w:val="en-US"/>
+        </w:rPr>
+        <w:t>Chain Of Responsibility (COR)</w:t>
+      </w:r>
+      <w:bookmarkEnd w:id="23"/>
+    </w:p>
+    <w:p>
+      <w:pPr>
+        <w:rPr>
+          <w:lang w:val="en-US"/>
+        </w:rPr>
+      </w:pPr>
+    </w:p>
+    <w:p>
+      <w:r>
+        <w:t xml:space="preserve">Le design </w:t>
+      </w:r>
+      <w:r>
+        <w:t>pattern</w:t>
+      </w:r>
+      <w:r>
+        <w:t xml:space="preserve"> COR est mis en place pour traiter correctement les lignes envoyées</w:t>
+      </w:r>
+      <w:r>
+        <w:t xml:space="preserve"> après la première</w:t>
+      </w:r>
+      <w:r>
+        <w:t xml:space="preserve">. En effet, il y a plusieurs formes qui peuvent être dessinés : </w:t>
+      </w:r>
+      <w:r>
+        <w:t>un segment, un cercle, un triangle ou  encore un polygone quelconque fermé</w:t>
+      </w:r>
+      <w:r>
+        <w:t xml:space="preserve">. Pour cela, le design </w:t>
+      </w:r>
+      <w:r>
+        <w:t>pattern</w:t>
+      </w:r>
+      <w:r>
+        <w:t xml:space="preserve"> va permettre à ce que chaque ligne soit traitée par la bonne fonction, qui correspond aux caractéristiques de la ligne.</w:t>
+      </w:r>
+      <w:r>
+        <w:t xml:space="preserve"> </w:t>
+      </w:r>
+    </w:p>
+    <w:p>
+      <w:r>
+        <w:t>Ainsi,</w:t>
+      </w:r>
+      <w:r>
+        <w:t xml:space="preserve"> chaque </w:t>
+      </w:r>
+      <w:proofErr w:type="spellStart"/>
+      <w:r>
+        <w:rPr>
+          <w:i/>
+          <w:iCs/>
+        </w:rPr>
+        <w:t>ParserFormeCOR</w:t>
+      </w:r>
+      <w:proofErr w:type="spellEnd"/>
+      <w:r>
+        <w:t xml:space="preserve"> va lire le </w:t>
+      </w:r>
+      <w:r>
+        <w:rPr>
+          <w:i/>
+          <w:iCs/>
+        </w:rPr>
+        <w:t>String</w:t>
+      </w:r>
+      <w:r>
+        <w:t xml:space="preserve"> qui correspond à la ligne, et celui qui correspond au nombre de sommets de la forme va retourner un élément </w:t>
+      </w:r>
+      <w:r>
+        <w:rPr>
+          <w:i/>
+          <w:iCs/>
+        </w:rPr>
+        <w:t>Shape</w:t>
+      </w:r>
+      <w:r>
+        <w:t xml:space="preserve"> que l’on pourra ensuite dessiner. Ce design </w:t>
+      </w:r>
+      <w:r>
+        <w:t>pattern</w:t>
+      </w:r>
+      <w:r>
+        <w:t xml:space="preserve"> est donc utilisé pour toutes les lignes envoyées par le Client (sauf la première donc), et chaque élément </w:t>
+      </w:r>
+      <w:r>
+        <w:rPr>
+          <w:i/>
+          <w:iCs/>
+        </w:rPr>
+        <w:t>Shape</w:t>
+      </w:r>
+      <w:r>
+        <w:t xml:space="preserve"> retourné sera ajouté à la liste de formes à dessiner.</w:t>
+      </w:r>
+    </w:p>
+    <w:p/>
+    <w:p>
+      <w:pPr>
+        <w:pStyle w:val="Titre2"/>
+        <w:numPr>
+          <w:ilvl w:val="0"/>
+          <w:numId w:val="23"/>
+        </w:numPr>
+      </w:pPr>
+      <w:bookmarkStart w:id="24" w:name="_Toc192422000"/>
+      <w:r>
+        <w:t>Gestion de l’</w:t>
+      </w:r>
+      <w:r>
+        <w:t>affichage</w:t>
+      </w:r>
+      <w:bookmarkEnd w:id="24"/>
+    </w:p>
+    <w:p/>
+    <w:p>
+      <w:r>
+        <w:t xml:space="preserve">La classe </w:t>
+      </w:r>
+      <w:proofErr w:type="spellStart"/>
+      <w:r>
+        <w:rPr>
+          <w:i/>
+          <w:iCs/>
+        </w:rPr>
+        <w:t>Fenetre</w:t>
+      </w:r>
+      <w:proofErr w:type="spellEnd"/>
+      <w:r>
+        <w:t xml:space="preserve"> gère l'affichage des formes en utilisant le rendu actif (active rendering) via un </w:t>
+      </w:r>
+      <w:proofErr w:type="spellStart"/>
+      <w:r>
+        <w:rPr>
+          <w:i/>
+          <w:iCs/>
+        </w:rPr>
+        <w:t>BufferStrategy</w:t>
+      </w:r>
+      <w:proofErr w:type="spellEnd"/>
+      <w:r>
+        <w:t xml:space="preserve"> pour optimiser la fluidité du dessin. L'affichage repose sur une boucle de rendu dans la méthode run(), où le contexte graphique est régulièrement mis à jour pour dessiner les formes stockées</w:t>
+      </w:r>
+      <w:r>
+        <w:t xml:space="preserve"> dans la liste </w:t>
+      </w:r>
+      <w:proofErr w:type="spellStart"/>
+      <w:r>
+        <w:rPr>
+          <w:i/>
+          <w:iCs/>
+        </w:rPr>
+        <w:t>shapes</w:t>
+      </w:r>
+      <w:proofErr w:type="spellEnd"/>
+      <w:r>
+        <w:t>. La fenêtre prend en charge le redimensionnement en recalculant les facteurs d'échelle (</w:t>
+      </w:r>
+      <w:proofErr w:type="spellStart"/>
+      <w:r>
+        <w:t>scaleX</w:t>
+      </w:r>
+      <w:proofErr w:type="spellEnd"/>
+      <w:r>
+        <w:t xml:space="preserve"> et </w:t>
+      </w:r>
+      <w:proofErr w:type="spellStart"/>
+      <w:r>
+        <w:t>scaleY</w:t>
+      </w:r>
+      <w:proofErr w:type="spellEnd"/>
+      <w:r>
+        <w:t xml:space="preserve">), assurant ainsi une adaptation dynamique du contenu. Un repère centré est </w:t>
+      </w:r>
+      <w:r>
+        <w:lastRenderedPageBreak/>
+        <w:t>également affiché pour guider la disposition des formes. La gestion des couleurs est réalisée par un tableau de couleurs prédéfini, appliqué lors du rendu des formes.</w:t>
+      </w:r>
+    </w:p>
+    <w:p/>
+    <w:p>
+      <w:pPr>
+        <w:pStyle w:val="Titre2"/>
+        <w:numPr>
+          <w:ilvl w:val="0"/>
+          <w:numId w:val="23"/>
+        </w:numPr>
+      </w:pPr>
+      <w:bookmarkStart w:id="25" w:name="_Toc192422001"/>
+      <w:r>
+        <w:t>Fonctionnement de</w:t>
+      </w:r>
+      <w:r>
+        <w:t xml:space="preserve"> </w:t>
+      </w:r>
+      <w:proofErr w:type="spellStart"/>
+      <w:r>
+        <w:t>Controleur</w:t>
+      </w:r>
+      <w:bookmarkEnd w:id="25"/>
+      <w:proofErr w:type="spellEnd"/>
+    </w:p>
+    <w:p/>
+    <w:p>
+      <w:r>
+        <w:t xml:space="preserve">La classe </w:t>
+      </w:r>
+      <w:proofErr w:type="spellStart"/>
+      <w:r>
+        <w:rPr>
+          <w:i/>
+          <w:iCs/>
+        </w:rPr>
+        <w:t>Controleur</w:t>
+      </w:r>
+      <w:proofErr w:type="spellEnd"/>
+      <w:r>
+        <w:t xml:space="preserve"> assure la liaison entre la vue (</w:t>
+      </w:r>
+      <w:proofErr w:type="spellStart"/>
+      <w:r>
+        <w:rPr>
+          <w:i/>
+          <w:iCs/>
+        </w:rPr>
+        <w:t>Fenetre</w:t>
+      </w:r>
+      <w:proofErr w:type="spellEnd"/>
+      <w:r>
+        <w:t xml:space="preserve">) et le modèle, en gérant la création de la fenêtre d'affichage et le traitement des formes à dessiner. Elle implémente le design pattern Chain of </w:t>
+      </w:r>
+      <w:proofErr w:type="spellStart"/>
+      <w:r>
+        <w:t>Responsibility</w:t>
+      </w:r>
+      <w:proofErr w:type="spellEnd"/>
+      <w:r>
+        <w:t xml:space="preserve"> (COR) à travers la méthode </w:t>
+      </w:r>
+      <w:proofErr w:type="spellStart"/>
+      <w:r>
+        <w:rPr>
+          <w:i/>
+          <w:iCs/>
+        </w:rPr>
+        <w:t>ParsingProcess</w:t>
+      </w:r>
+      <w:proofErr w:type="spellEnd"/>
+      <w:r>
+        <w:t>, qui enchaîne plusieurs parseurs spécialisés afin d'identifier et d'instancier la forme correcte à partir d'une ligne de texte.</w:t>
+      </w:r>
+    </w:p>
+    <w:p/>
+    <w:p>
+      <w:pPr>
+        <w:pStyle w:val="Titre2"/>
+        <w:numPr>
+          <w:ilvl w:val="0"/>
+          <w:numId w:val="23"/>
+        </w:numPr>
+      </w:pPr>
+      <w:bookmarkStart w:id="26" w:name="_Toc192422002"/>
+      <w:r>
+        <w:t>Fonctionnement d’</w:t>
+      </w:r>
+      <w:r>
+        <w:t>Interlocuteur</w:t>
+      </w:r>
+      <w:bookmarkEnd w:id="26"/>
+    </w:p>
+    <w:p/>
+    <w:p>
+      <w:r>
+        <w:t>La</w:t>
+      </w:r>
+      <w:r>
+        <w:t xml:space="preserve"> classe </w:t>
+      </w:r>
+      <w:r>
+        <w:rPr>
+          <w:i/>
+          <w:iCs/>
+        </w:rPr>
+        <w:t>Interlocuteur</w:t>
+      </w:r>
+      <w:r>
+        <w:t xml:space="preserve"> joue </w:t>
+      </w:r>
+      <w:r>
+        <w:t>donc le rôle d’un interlocuteur entre le serveur et le client</w:t>
+      </w:r>
+      <w:r>
+        <w:t xml:space="preserve">, recevant des instructions d'un client via un socket. Lors de la première ligne reçue, elle initialise la fenêtre </w:t>
+      </w:r>
+      <w:r>
+        <w:t xml:space="preserve">à travers le contrôleur </w:t>
+      </w:r>
+      <w:r>
+        <w:t xml:space="preserve">en extrayant ses dimensions et la couleur des formes à partir d'une expression régulière. Ensuite, chaque ligne suivante est interprétée comme une forme géométrique et transmise au </w:t>
+      </w:r>
+      <w:proofErr w:type="spellStart"/>
+      <w:r>
+        <w:rPr>
+          <w:i/>
+          <w:iCs/>
+        </w:rPr>
+        <w:t>Controleur</w:t>
+      </w:r>
+      <w:proofErr w:type="spellEnd"/>
+      <w:r>
+        <w:t xml:space="preserve">, qui la parse avec </w:t>
+      </w:r>
+      <w:proofErr w:type="spellStart"/>
+      <w:r>
+        <w:rPr>
+          <w:i/>
+          <w:iCs/>
+        </w:rPr>
+        <w:t>ParsingProcess</w:t>
+      </w:r>
+      <w:proofErr w:type="spellEnd"/>
+      <w:r>
+        <w:t xml:space="preserve"> et l'ajoute à la fenêtre via </w:t>
+      </w:r>
+      <w:proofErr w:type="spellStart"/>
+      <w:r>
+        <w:rPr>
+          <w:i/>
+          <w:iCs/>
+        </w:rPr>
+        <w:t>ajouterForme</w:t>
+      </w:r>
+      <w:proofErr w:type="spellEnd"/>
+      <w:r>
+        <w:rPr>
+          <w:i/>
+          <w:iCs/>
+        </w:rPr>
+        <w:t>()</w:t>
+      </w:r>
+      <w:r>
+        <w:t xml:space="preserve">. Une fois les formes traitées, un </w:t>
+      </w:r>
+      <w:proofErr w:type="spellStart"/>
+      <w:r>
+        <w:rPr>
+          <w:i/>
+          <w:iCs/>
+        </w:rPr>
+        <w:t>SwingWorker</w:t>
+      </w:r>
+      <w:proofErr w:type="spellEnd"/>
+      <w:r>
+        <w:t xml:space="preserve"> exécute </w:t>
+      </w:r>
+      <w:proofErr w:type="spellStart"/>
+      <w:r>
+        <w:rPr>
+          <w:i/>
+          <w:iCs/>
+        </w:rPr>
+        <w:t>controleur.run</w:t>
+      </w:r>
+      <w:proofErr w:type="spellEnd"/>
+      <w:r>
+        <w:rPr>
+          <w:i/>
+          <w:iCs/>
+        </w:rPr>
+        <w:t>()</w:t>
+      </w:r>
+      <w:r>
+        <w:t xml:space="preserve"> en arrière-plan, lançant ainsi le rendu graphique asynchrone de la fenêtre.</w:t>
+      </w:r>
+    </w:p>
+    <w:p/>
+    <w:p/>
+    <w:p/>
+    <w:p>
+      <w:pPr>
         <w:pStyle w:val="Titre2"/>
         <w:numPr>
           <w:ilvl w:val="0"/>
           <w:numId w:val="10"/>
         </w:numPr>
+      </w:pPr>
+      <w:bookmarkStart w:id="27" w:name="_Toc192422003"/>
+      <w:r>
+        <w:t>Extension OpenGL</w:t>
+      </w:r>
+      <w:bookmarkEnd w:id="27"/>
+    </w:p>
+    <w:p>
+      <w:pPr>
         <w:rPr>
           <w:rFonts w:eastAsiaTheme="minorEastAsia"/>
-          <w:sz w:val="32"/>
-          <w:szCs w:val="32"/>
-        </w:rPr>
-      </w:pPr>
-      <w:bookmarkStart w:id="18" w:name="_Toc190442855"/>
-      <w:r>
-        <w:rPr>
-          <w:rFonts w:eastAsiaTheme="minorEastAsia"/>
-          <w:sz w:val="32"/>
-          <w:szCs w:val="32"/>
-        </w:rPr>
-        <w:t>Partie Java (Serveur)</w:t>
-      </w:r>
-      <w:bookmarkEnd w:id="18"/>
-    </w:p>
-    <w:p/>
+        </w:rPr>
+      </w:pPr>
+    </w:p>
     <w:p>
       <w:pPr>
         <w:pStyle w:val="Titre2"/>
         <w:numPr>
           <w:ilvl w:val="0"/>
-          <w:numId w:val="23"/>
+          <w:numId w:val="30"/>
         </w:numPr>
       </w:pPr>
-      <w:r>
-        <w:t>Présentation de la partie Java</w:t>
-      </w:r>
-    </w:p>
-    <w:p/>
-    <w:p>
-      <w:r>
-        <w:t>La partie java consiste en l’implémentation d’un serveur permettant de dessiner des formes, réceptionnées à partir d’un client.</w:t>
+      <w:bookmarkStart w:id="28" w:name="_Toc192422004"/>
+      <w:r>
+        <w:t>Présentation de l’extension</w:t>
+      </w:r>
+      <w:bookmarkEnd w:id="28"/>
+    </w:p>
+    <w:p/>
+    <w:p>
+      <w:r>
+        <w:t>Cette extension permet de dessiner une forme directement via le langage C++, sans avoir besoin de passer par le client TCP/IP</w:t>
+      </w:r>
+      <w:r>
+        <w:t xml:space="preserve"> pour transférer les formes aux serveur Java</w:t>
+      </w:r>
+      <w:r>
+        <w:t>. Pour se faire, nous avons utilisé la librairie OpenGL permettant de dessiner très efficacement nos formes</w:t>
+      </w:r>
+      <w:r>
+        <w:t xml:space="preserve"> en</w:t>
+      </w:r>
+      <w:r>
+        <w:t xml:space="preserve"> deux dimensions.</w:t>
+      </w:r>
+      <w:r>
+        <w:t xml:space="preserve"> Il s’agit d’une sorte de version amélioré </w:t>
+      </w:r>
+      <w:r>
+        <w:t>de la partie Java, tout en s’inspirant du mode de fonctionnement de cette dernière.</w:t>
       </w:r>
     </w:p>
     <w:p/>
@@ -3671,99 +5503,14 @@
         <w:pStyle w:val="Titre2"/>
         <w:numPr>
           <w:ilvl w:val="0"/>
-          <w:numId w:val="23"/>
+          <w:numId w:val="30"/>
         </w:numPr>
       </w:pPr>
-      <w:r>
-        <w:t>Connexion au client</w:t>
-      </w:r>
-    </w:p>
-    <w:p/>
-    <w:p>
-      <w:r>
-        <w:t xml:space="preserve">La connexion au Client se fait de manière à ce que plusieurs clients puissent se connecter et envoyer des informations au serveur, et que celui-ci les traite de manière parallèle. Cela est permis grâce à la classe Interlocuteur, qui comme son nom l’indique sert </w:t>
-      </w:r>
-      <w:r>
-        <w:t>d’interlocuteur pour chaque connexion entre un client et le serveur. Cette classe dérive en effet de la classe Thread, qui possède une méthode run qui permet d’avoir plusieurs threads s’exécutant en même temps.</w:t>
-      </w:r>
-    </w:p>
-    <w:p/>
-    <w:p/>
-    <w:p/>
-    <w:p/>
-    <w:p/>
-    <w:p/>
-    <w:p/>
-    <w:p/>
-    <w:p>
-      <w:pPr>
-        <w:pStyle w:val="Titre2"/>
-        <w:numPr>
-          <w:ilvl w:val="0"/>
-          <w:numId w:val="10"/>
-        </w:numPr>
-      </w:pPr>
-      <w:bookmarkStart w:id="19" w:name="_Toc190442856"/>
-      <w:r>
-        <w:t>Extension OpenGL</w:t>
-      </w:r>
-      <w:bookmarkEnd w:id="19"/>
-    </w:p>
-    <w:p>
-      <w:pPr>
-        <w:rPr>
-          <w:rFonts w:eastAsiaTheme="minorEastAsia"/>
-        </w:rPr>
-      </w:pPr>
-    </w:p>
-    <w:p>
-      <w:pPr>
-        <w:pStyle w:val="Titre2"/>
-        <w:numPr>
-          <w:ilvl w:val="0"/>
-          <w:numId w:val="23"/>
-        </w:numPr>
-      </w:pPr>
-      <w:r>
-        <w:t>Présentation de l’extension</w:t>
-      </w:r>
-    </w:p>
-    <w:p/>
-    <w:p>
-      <w:r>
-        <w:t>Cette extension permet de dessiner une forme directement via le langage C++, sans avoir besoin de passer par le client TCP/IP</w:t>
-      </w:r>
-      <w:r>
-        <w:t xml:space="preserve"> pour transférer les formes aux serveur Java</w:t>
-      </w:r>
-      <w:r>
-        <w:t>. Pour se faire, nous avons utilisé la librairie OpenGL permettant de dessiner très efficacement nos formes</w:t>
-      </w:r>
-      <w:r>
-        <w:t xml:space="preserve"> en</w:t>
-      </w:r>
-      <w:r>
-        <w:t xml:space="preserve"> deux dimensions.</w:t>
-      </w:r>
-      <w:r>
-        <w:t xml:space="preserve"> Il s’agit d’une sorte de version amélioré </w:t>
-      </w:r>
-      <w:r>
-        <w:t>de la partie Java, tout en s’inspirant du mode de fonctionnement de cette dernière.</w:t>
-      </w:r>
-    </w:p>
-    <w:p/>
-    <w:p>
-      <w:pPr>
-        <w:pStyle w:val="Titre2"/>
-        <w:numPr>
-          <w:ilvl w:val="0"/>
-          <w:numId w:val="23"/>
-        </w:numPr>
-      </w:pPr>
+      <w:bookmarkStart w:id="29" w:name="_Toc192422005"/>
       <w:r>
         <w:t>Structure et Classes</w:t>
       </w:r>
+      <w:bookmarkEnd w:id="29"/>
     </w:p>
     <w:p/>
     <w:p>
@@ -3780,9 +5527,12 @@
           <w:numId w:val="26"/>
         </w:numPr>
       </w:pPr>
-      <w:r>
+      <w:bookmarkStart w:id="30" w:name="_Toc192422006"/>
+      <w:r>
+        <w:lastRenderedPageBreak/>
         <w:t>Modèle</w:t>
       </w:r>
+      <w:bookmarkEnd w:id="30"/>
     </w:p>
     <w:p/>
     <w:p>
@@ -3823,7 +5573,6 @@
     </w:p>
     <w:p>
       <w:r>
-        <w:lastRenderedPageBreak/>
         <w:t>GLFW est une bibliothèque qui gère la création de fenêtre sous Windows. Il est nécessaire étant donné qu’OpenGL ne fournit pas d’outils pour créer une fenêtre, c’est donc GLFW qui s’en charge dans notre projet.</w:t>
       </w:r>
     </w:p>
@@ -3859,9 +5608,11 @@
           <w:numId w:val="26"/>
         </w:numPr>
       </w:pPr>
+      <w:bookmarkStart w:id="31" w:name="_Toc192422007"/>
       <w:r>
         <w:t>Vue</w:t>
       </w:r>
+      <w:bookmarkEnd w:id="31"/>
     </w:p>
     <w:p/>
     <w:p>
@@ -3878,9 +5629,11 @@
           <w:numId w:val="26"/>
         </w:numPr>
       </w:pPr>
+      <w:bookmarkStart w:id="32" w:name="_Toc192422008"/>
       <w:r>
         <w:t>Contrôleur</w:t>
       </w:r>
+      <w:bookmarkEnd w:id="32"/>
     </w:p>
     <w:p/>
     <w:p>
@@ -3897,12 +5650,14 @@
         <w:pStyle w:val="Titre2"/>
         <w:numPr>
           <w:ilvl w:val="0"/>
-          <w:numId w:val="23"/>
+          <w:numId w:val="30"/>
         </w:numPr>
       </w:pPr>
+      <w:bookmarkStart w:id="33" w:name="_Toc192422009"/>
       <w:r>
         <w:t>Fonctionnement</w:t>
       </w:r>
+      <w:bookmarkEnd w:id="33"/>
     </w:p>
     <w:p/>
     <w:p/>
@@ -4878,6 +6633,95 @@
     </w:lvl>
   </w:abstractNum>
   <w:abstractNum w:abstractNumId="9" w15:restartNumberingAfterBreak="0">
+    <w:nsid w:val="1DD769DF"/>
+    <w:multiLevelType w:val="hybridMultilevel"/>
+    <w:tmpl w:val="DBA6274C"/>
+    <w:lvl w:ilvl="0" w:tplc="040C0019">
+      <w:start w:val="1"/>
+      <w:numFmt w:val="lowerLetter"/>
+      <w:lvlText w:val="%1."/>
+      <w:lvlJc w:val="left"/>
+      <w:pPr>
+        <w:ind w:left="720" w:hanging="360"/>
+      </w:pPr>
+      <w:rPr>
+        <w:rFonts w:hint="default"/>
+      </w:rPr>
+    </w:lvl>
+    <w:lvl w:ilvl="1" w:tplc="040C0019" w:tentative="1">
+      <w:start w:val="1"/>
+      <w:numFmt w:val="lowerLetter"/>
+      <w:lvlText w:val="%2."/>
+      <w:lvlJc w:val="left"/>
+      <w:pPr>
+        <w:ind w:left="1440" w:hanging="360"/>
+      </w:pPr>
+    </w:lvl>
+    <w:lvl w:ilvl="2" w:tplc="040C001B" w:tentative="1">
+      <w:start w:val="1"/>
+      <w:numFmt w:val="lowerRoman"/>
+      <w:lvlText w:val="%3."/>
+      <w:lvlJc w:val="right"/>
+      <w:pPr>
+        <w:ind w:left="2160" w:hanging="180"/>
+      </w:pPr>
+    </w:lvl>
+    <w:lvl w:ilvl="3" w:tplc="040C000F" w:tentative="1">
+      <w:start w:val="1"/>
+      <w:numFmt w:val="decimal"/>
+      <w:lvlText w:val="%4."/>
+      <w:lvlJc w:val="left"/>
+      <w:pPr>
+        <w:ind w:left="2880" w:hanging="360"/>
+      </w:pPr>
+    </w:lvl>
+    <w:lvl w:ilvl="4" w:tplc="040C0019" w:tentative="1">
+      <w:start w:val="1"/>
+      <w:numFmt w:val="lowerLetter"/>
+      <w:lvlText w:val="%5."/>
+      <w:lvlJc w:val="left"/>
+      <w:pPr>
+        <w:ind w:left="3600" w:hanging="360"/>
+      </w:pPr>
+    </w:lvl>
+    <w:lvl w:ilvl="5" w:tplc="040C001B" w:tentative="1">
+      <w:start w:val="1"/>
+      <w:numFmt w:val="lowerRoman"/>
+      <w:lvlText w:val="%6."/>
+      <w:lvlJc w:val="right"/>
+      <w:pPr>
+        <w:ind w:left="4320" w:hanging="180"/>
+      </w:pPr>
+    </w:lvl>
+    <w:lvl w:ilvl="6" w:tplc="040C000F" w:tentative="1">
+      <w:start w:val="1"/>
+      <w:numFmt w:val="decimal"/>
+      <w:lvlText w:val="%7."/>
+      <w:lvlJc w:val="left"/>
+      <w:pPr>
+        <w:ind w:left="5040" w:hanging="360"/>
+      </w:pPr>
+    </w:lvl>
+    <w:lvl w:ilvl="7" w:tplc="040C0019" w:tentative="1">
+      <w:start w:val="1"/>
+      <w:numFmt w:val="lowerLetter"/>
+      <w:lvlText w:val="%8."/>
+      <w:lvlJc w:val="left"/>
+      <w:pPr>
+        <w:ind w:left="5760" w:hanging="360"/>
+      </w:pPr>
+    </w:lvl>
+    <w:lvl w:ilvl="8" w:tplc="040C001B" w:tentative="1">
+      <w:start w:val="1"/>
+      <w:numFmt w:val="lowerRoman"/>
+      <w:lvlText w:val="%9."/>
+      <w:lvlJc w:val="right"/>
+      <w:pPr>
+        <w:ind w:left="6480" w:hanging="180"/>
+      </w:pPr>
+    </w:lvl>
+  </w:abstractNum>
+  <w:abstractNum w:abstractNumId="10" w15:restartNumberingAfterBreak="0">
     <w:nsid w:val="24064188"/>
     <w:multiLevelType w:val="hybridMultilevel"/>
     <w:tmpl w:val="1BD6257A"/>
@@ -4966,7 +6810,96 @@
       </w:pPr>
     </w:lvl>
   </w:abstractNum>
-  <w:abstractNum w:abstractNumId="10" w15:restartNumberingAfterBreak="0">
+  <w:abstractNum w:abstractNumId="11" w15:restartNumberingAfterBreak="0">
+    <w:nsid w:val="24DB25C0"/>
+    <w:multiLevelType w:val="hybridMultilevel"/>
+    <w:tmpl w:val="F0847C82"/>
+    <w:lvl w:ilvl="0" w:tplc="040C0019">
+      <w:start w:val="1"/>
+      <w:numFmt w:val="lowerLetter"/>
+      <w:lvlText w:val="%1."/>
+      <w:lvlJc w:val="left"/>
+      <w:pPr>
+        <w:ind w:left="720" w:hanging="360"/>
+      </w:pPr>
+      <w:rPr>
+        <w:rFonts w:hint="default"/>
+      </w:rPr>
+    </w:lvl>
+    <w:lvl w:ilvl="1" w:tplc="040C0019" w:tentative="1">
+      <w:start w:val="1"/>
+      <w:numFmt w:val="lowerLetter"/>
+      <w:lvlText w:val="%2."/>
+      <w:lvlJc w:val="left"/>
+      <w:pPr>
+        <w:ind w:left="1440" w:hanging="360"/>
+      </w:pPr>
+    </w:lvl>
+    <w:lvl w:ilvl="2" w:tplc="040C001B" w:tentative="1">
+      <w:start w:val="1"/>
+      <w:numFmt w:val="lowerRoman"/>
+      <w:lvlText w:val="%3."/>
+      <w:lvlJc w:val="right"/>
+      <w:pPr>
+        <w:ind w:left="2160" w:hanging="180"/>
+      </w:pPr>
+    </w:lvl>
+    <w:lvl w:ilvl="3" w:tplc="040C000F" w:tentative="1">
+      <w:start w:val="1"/>
+      <w:numFmt w:val="decimal"/>
+      <w:lvlText w:val="%4."/>
+      <w:lvlJc w:val="left"/>
+      <w:pPr>
+        <w:ind w:left="2880" w:hanging="360"/>
+      </w:pPr>
+    </w:lvl>
+    <w:lvl w:ilvl="4" w:tplc="040C0019" w:tentative="1">
+      <w:start w:val="1"/>
+      <w:numFmt w:val="lowerLetter"/>
+      <w:lvlText w:val="%5."/>
+      <w:lvlJc w:val="left"/>
+      <w:pPr>
+        <w:ind w:left="3600" w:hanging="360"/>
+      </w:pPr>
+    </w:lvl>
+    <w:lvl w:ilvl="5" w:tplc="040C001B" w:tentative="1">
+      <w:start w:val="1"/>
+      <w:numFmt w:val="lowerRoman"/>
+      <w:lvlText w:val="%6."/>
+      <w:lvlJc w:val="right"/>
+      <w:pPr>
+        <w:ind w:left="4320" w:hanging="180"/>
+      </w:pPr>
+    </w:lvl>
+    <w:lvl w:ilvl="6" w:tplc="040C000F" w:tentative="1">
+      <w:start w:val="1"/>
+      <w:numFmt w:val="decimal"/>
+      <w:lvlText w:val="%7."/>
+      <w:lvlJc w:val="left"/>
+      <w:pPr>
+        <w:ind w:left="5040" w:hanging="360"/>
+      </w:pPr>
+    </w:lvl>
+    <w:lvl w:ilvl="7" w:tplc="040C0019" w:tentative="1">
+      <w:start w:val="1"/>
+      <w:numFmt w:val="lowerLetter"/>
+      <w:lvlText w:val="%8."/>
+      <w:lvlJc w:val="left"/>
+      <w:pPr>
+        <w:ind w:left="5760" w:hanging="360"/>
+      </w:pPr>
+    </w:lvl>
+    <w:lvl w:ilvl="8" w:tplc="040C001B" w:tentative="1">
+      <w:start w:val="1"/>
+      <w:numFmt w:val="lowerRoman"/>
+      <w:lvlText w:val="%9."/>
+      <w:lvlJc w:val="right"/>
+      <w:pPr>
+        <w:ind w:left="6480" w:hanging="180"/>
+      </w:pPr>
+    </w:lvl>
+  </w:abstractNum>
+  <w:abstractNum w:abstractNumId="12" w15:restartNumberingAfterBreak="0">
     <w:nsid w:val="24FC061E"/>
     <w:multiLevelType w:val="hybridMultilevel"/>
     <w:tmpl w:val="B3FA1D02"/>
@@ -5055,7 +6988,7 @@
       </w:pPr>
     </w:lvl>
   </w:abstractNum>
-  <w:abstractNum w:abstractNumId="11" w15:restartNumberingAfterBreak="0">
+  <w:abstractNum w:abstractNumId="13" w15:restartNumberingAfterBreak="0">
     <w:nsid w:val="2590349C"/>
     <w:multiLevelType w:val="hybridMultilevel"/>
     <w:tmpl w:val="55007254"/>
@@ -5167,7 +7100,7 @@
       </w:rPr>
     </w:lvl>
   </w:abstractNum>
-  <w:abstractNum w:abstractNumId="12" w15:restartNumberingAfterBreak="0">
+  <w:abstractNum w:abstractNumId="14" w15:restartNumberingAfterBreak="0">
     <w:nsid w:val="316D6CA5"/>
     <w:multiLevelType w:val="hybridMultilevel"/>
     <w:tmpl w:val="704CA354"/>
@@ -5256,7 +7189,7 @@
       </w:pPr>
     </w:lvl>
   </w:abstractNum>
-  <w:abstractNum w:abstractNumId="13" w15:restartNumberingAfterBreak="0">
+  <w:abstractNum w:abstractNumId="15" w15:restartNumberingAfterBreak="0">
     <w:nsid w:val="321D4155"/>
     <w:multiLevelType w:val="hybridMultilevel"/>
     <w:tmpl w:val="9EE07334"/>
@@ -5368,7 +7301,7 @@
       </w:rPr>
     </w:lvl>
   </w:abstractNum>
-  <w:abstractNum w:abstractNumId="14" w15:restartNumberingAfterBreak="0">
+  <w:abstractNum w:abstractNumId="16" w15:restartNumberingAfterBreak="0">
     <w:nsid w:val="353A2400"/>
     <w:multiLevelType w:val="hybridMultilevel"/>
     <w:tmpl w:val="FEE2ACBA"/>
@@ -5457,7 +7390,7 @@
       </w:pPr>
     </w:lvl>
   </w:abstractNum>
-  <w:abstractNum w:abstractNumId="15" w15:restartNumberingAfterBreak="0">
+  <w:abstractNum w:abstractNumId="17" w15:restartNumberingAfterBreak="0">
     <w:nsid w:val="37EE5819"/>
     <w:multiLevelType w:val="hybridMultilevel"/>
     <w:tmpl w:val="B7D61F32"/>
@@ -5546,7 +7479,98 @@
       </w:pPr>
     </w:lvl>
   </w:abstractNum>
-  <w:abstractNum w:abstractNumId="16" w15:restartNumberingAfterBreak="0">
+  <w:abstractNum w:abstractNumId="18" w15:restartNumberingAfterBreak="0">
+    <w:nsid w:val="42C95A2C"/>
+    <w:multiLevelType w:val="hybridMultilevel"/>
+    <w:tmpl w:val="052A789C"/>
+    <w:lvl w:ilvl="0" w:tplc="8D685C06">
+      <w:start w:val="1"/>
+      <w:numFmt w:val="lowerLetter"/>
+      <w:lvlText w:val="%1."/>
+      <w:lvlJc w:val="left"/>
+      <w:pPr>
+        <w:ind w:left="720" w:hanging="360"/>
+      </w:pPr>
+      <w:rPr>
+        <w:rFonts w:hint="default"/>
+        <w:sz w:val="28"/>
+        <w:szCs w:val="28"/>
+      </w:rPr>
+    </w:lvl>
+    <w:lvl w:ilvl="1" w:tplc="040C0019" w:tentative="1">
+      <w:start w:val="1"/>
+      <w:numFmt w:val="lowerLetter"/>
+      <w:lvlText w:val="%2."/>
+      <w:lvlJc w:val="left"/>
+      <w:pPr>
+        <w:ind w:left="1440" w:hanging="360"/>
+      </w:pPr>
+    </w:lvl>
+    <w:lvl w:ilvl="2" w:tplc="040C001B" w:tentative="1">
+      <w:start w:val="1"/>
+      <w:numFmt w:val="lowerRoman"/>
+      <w:lvlText w:val="%3."/>
+      <w:lvlJc w:val="right"/>
+      <w:pPr>
+        <w:ind w:left="2160" w:hanging="180"/>
+      </w:pPr>
+    </w:lvl>
+    <w:lvl w:ilvl="3" w:tplc="040C000F" w:tentative="1">
+      <w:start w:val="1"/>
+      <w:numFmt w:val="decimal"/>
+      <w:lvlText w:val="%4."/>
+      <w:lvlJc w:val="left"/>
+      <w:pPr>
+        <w:ind w:left="2880" w:hanging="360"/>
+      </w:pPr>
+    </w:lvl>
+    <w:lvl w:ilvl="4" w:tplc="040C0019" w:tentative="1">
+      <w:start w:val="1"/>
+      <w:numFmt w:val="lowerLetter"/>
+      <w:lvlText w:val="%5."/>
+      <w:lvlJc w:val="left"/>
+      <w:pPr>
+        <w:ind w:left="3600" w:hanging="360"/>
+      </w:pPr>
+    </w:lvl>
+    <w:lvl w:ilvl="5" w:tplc="040C001B" w:tentative="1">
+      <w:start w:val="1"/>
+      <w:numFmt w:val="lowerRoman"/>
+      <w:lvlText w:val="%6."/>
+      <w:lvlJc w:val="right"/>
+      <w:pPr>
+        <w:ind w:left="4320" w:hanging="180"/>
+      </w:pPr>
+    </w:lvl>
+    <w:lvl w:ilvl="6" w:tplc="040C000F" w:tentative="1">
+      <w:start w:val="1"/>
+      <w:numFmt w:val="decimal"/>
+      <w:lvlText w:val="%7."/>
+      <w:lvlJc w:val="left"/>
+      <w:pPr>
+        <w:ind w:left="5040" w:hanging="360"/>
+      </w:pPr>
+    </w:lvl>
+    <w:lvl w:ilvl="7" w:tplc="040C0019" w:tentative="1">
+      <w:start w:val="1"/>
+      <w:numFmt w:val="lowerLetter"/>
+      <w:lvlText w:val="%8."/>
+      <w:lvlJc w:val="left"/>
+      <w:pPr>
+        <w:ind w:left="5760" w:hanging="360"/>
+      </w:pPr>
+    </w:lvl>
+    <w:lvl w:ilvl="8" w:tplc="040C001B" w:tentative="1">
+      <w:start w:val="1"/>
+      <w:numFmt w:val="lowerRoman"/>
+      <w:lvlText w:val="%9."/>
+      <w:lvlJc w:val="right"/>
+      <w:pPr>
+        <w:ind w:left="6480" w:hanging="180"/>
+      </w:pPr>
+    </w:lvl>
+  </w:abstractNum>
+  <w:abstractNum w:abstractNumId="19" w15:restartNumberingAfterBreak="0">
     <w:nsid w:val="4398500B"/>
     <w:multiLevelType w:val="hybridMultilevel"/>
     <w:tmpl w:val="EBBAD9CC"/>
@@ -5659,7 +7683,7 @@
       </w:rPr>
     </w:lvl>
   </w:abstractNum>
-  <w:abstractNum w:abstractNumId="17" w15:restartNumberingAfterBreak="0">
+  <w:abstractNum w:abstractNumId="20" w15:restartNumberingAfterBreak="0">
     <w:nsid w:val="45BF7D02"/>
     <w:multiLevelType w:val="hybridMultilevel"/>
     <w:tmpl w:val="021AE3C4"/>
@@ -5745,7 +7769,7 @@
       </w:pPr>
     </w:lvl>
   </w:abstractNum>
-  <w:abstractNum w:abstractNumId="18" w15:restartNumberingAfterBreak="0">
+  <w:abstractNum w:abstractNumId="21" w15:restartNumberingAfterBreak="0">
     <w:nsid w:val="4C3E3D4A"/>
     <w:multiLevelType w:val="hybridMultilevel"/>
     <w:tmpl w:val="242C2C32"/>
@@ -5858,7 +7882,7 @@
       </w:rPr>
     </w:lvl>
   </w:abstractNum>
-  <w:abstractNum w:abstractNumId="19" w15:restartNumberingAfterBreak="0">
+  <w:abstractNum w:abstractNumId="22" w15:restartNumberingAfterBreak="0">
     <w:nsid w:val="4D0B56E1"/>
     <w:multiLevelType w:val="hybridMultilevel"/>
     <w:tmpl w:val="A1501268"/>
@@ -5947,7 +7971,7 @@
       </w:pPr>
     </w:lvl>
   </w:abstractNum>
-  <w:abstractNum w:abstractNumId="20" w15:restartNumberingAfterBreak="0">
+  <w:abstractNum w:abstractNumId="23" w15:restartNumberingAfterBreak="0">
     <w:nsid w:val="4E542C35"/>
     <w:multiLevelType w:val="hybridMultilevel"/>
     <w:tmpl w:val="9CB68BB8"/>
@@ -6036,7 +8060,7 @@
       </w:pPr>
     </w:lvl>
   </w:abstractNum>
-  <w:abstractNum w:abstractNumId="21" w15:restartNumberingAfterBreak="0">
+  <w:abstractNum w:abstractNumId="24" w15:restartNumberingAfterBreak="0">
     <w:nsid w:val="4F4D0601"/>
     <w:multiLevelType w:val="hybridMultilevel"/>
     <w:tmpl w:val="507AAE72"/>
@@ -6125,7 +8149,7 @@
       </w:pPr>
     </w:lvl>
   </w:abstractNum>
-  <w:abstractNum w:abstractNumId="22" w15:restartNumberingAfterBreak="0">
+  <w:abstractNum w:abstractNumId="25" w15:restartNumberingAfterBreak="0">
     <w:nsid w:val="55B66932"/>
     <w:multiLevelType w:val="hybridMultilevel"/>
     <w:tmpl w:val="5540D64E"/>
@@ -6214,7 +8238,7 @@
       </w:pPr>
     </w:lvl>
   </w:abstractNum>
-  <w:abstractNum w:abstractNumId="23" w15:restartNumberingAfterBreak="0">
+  <w:abstractNum w:abstractNumId="26" w15:restartNumberingAfterBreak="0">
     <w:nsid w:val="59376E90"/>
     <w:multiLevelType w:val="hybridMultilevel"/>
     <w:tmpl w:val="138C20F4"/>
@@ -6303,7 +8327,7 @@
       </w:pPr>
     </w:lvl>
   </w:abstractNum>
-  <w:abstractNum w:abstractNumId="24" w15:restartNumberingAfterBreak="0">
+  <w:abstractNum w:abstractNumId="27" w15:restartNumberingAfterBreak="0">
     <w:nsid w:val="605B4492"/>
     <w:multiLevelType w:val="hybridMultilevel"/>
     <w:tmpl w:val="D204984C"/>
@@ -6416,7 +8440,7 @@
       </w:rPr>
     </w:lvl>
   </w:abstractNum>
-  <w:abstractNum w:abstractNumId="25" w15:restartNumberingAfterBreak="0">
+  <w:abstractNum w:abstractNumId="28" w15:restartNumberingAfterBreak="0">
     <w:nsid w:val="63446846"/>
     <w:multiLevelType w:val="hybridMultilevel"/>
     <w:tmpl w:val="05689EB0"/>
@@ -6505,7 +8529,7 @@
       </w:pPr>
     </w:lvl>
   </w:abstractNum>
-  <w:abstractNum w:abstractNumId="26" w15:restartNumberingAfterBreak="0">
+  <w:abstractNum w:abstractNumId="29" w15:restartNumberingAfterBreak="0">
     <w:nsid w:val="66DE107C"/>
     <w:multiLevelType w:val="hybridMultilevel"/>
     <w:tmpl w:val="D2F80F6C"/>
@@ -6594,7 +8618,7 @@
       </w:pPr>
     </w:lvl>
   </w:abstractNum>
-  <w:abstractNum w:abstractNumId="27" w15:restartNumberingAfterBreak="0">
+  <w:abstractNum w:abstractNumId="30" w15:restartNumberingAfterBreak="0">
     <w:nsid w:val="73932A0A"/>
     <w:multiLevelType w:val="hybridMultilevel"/>
     <w:tmpl w:val="F01017D8"/>
@@ -6684,31 +8708,31 @@
     </w:lvl>
   </w:abstractNum>
   <w:num w:numId="1" w16cid:durableId="366762349">
-    <w:abstractNumId w:val="23"/>
+    <w:abstractNumId w:val="26"/>
   </w:num>
   <w:num w:numId="2" w16cid:durableId="785344682">
     <w:abstractNumId w:val="1"/>
   </w:num>
   <w:num w:numId="3" w16cid:durableId="1029256568">
-    <w:abstractNumId w:val="19"/>
+    <w:abstractNumId w:val="22"/>
   </w:num>
   <w:num w:numId="4" w16cid:durableId="965548697">
-    <w:abstractNumId w:val="9"/>
+    <w:abstractNumId w:val="10"/>
   </w:num>
   <w:num w:numId="5" w16cid:durableId="2064254029">
     <w:abstractNumId w:val="2"/>
   </w:num>
   <w:num w:numId="6" w16cid:durableId="518080298">
-    <w:abstractNumId w:val="10"/>
+    <w:abstractNumId w:val="12"/>
   </w:num>
   <w:num w:numId="7" w16cid:durableId="1219711019">
     <w:abstractNumId w:val="5"/>
   </w:num>
   <w:num w:numId="8" w16cid:durableId="324091261">
-    <w:abstractNumId w:val="13"/>
+    <w:abstractNumId w:val="15"/>
   </w:num>
   <w:num w:numId="9" w16cid:durableId="1726176819">
-    <w:abstractNumId w:val="11"/>
+    <w:abstractNumId w:val="13"/>
   </w:num>
   <w:num w:numId="10" w16cid:durableId="1791312677">
     <w:abstractNumId w:val="6"/>
@@ -6717,37 +8741,37 @@
     <w:abstractNumId w:val="8"/>
   </w:num>
   <w:num w:numId="12" w16cid:durableId="932855125">
-    <w:abstractNumId w:val="21"/>
+    <w:abstractNumId w:val="24"/>
   </w:num>
   <w:num w:numId="13" w16cid:durableId="1128208087">
-    <w:abstractNumId w:val="15"/>
+    <w:abstractNumId w:val="17"/>
   </w:num>
   <w:num w:numId="14" w16cid:durableId="1209758562">
     <w:abstractNumId w:val="3"/>
   </w:num>
   <w:num w:numId="15" w16cid:durableId="388843613">
-    <w:abstractNumId w:val="24"/>
+    <w:abstractNumId w:val="27"/>
   </w:num>
   <w:num w:numId="16" w16cid:durableId="353460081">
-    <w:abstractNumId w:val="18"/>
+    <w:abstractNumId w:val="21"/>
   </w:num>
   <w:num w:numId="17" w16cid:durableId="1642466385">
-    <w:abstractNumId w:val="16"/>
+    <w:abstractNumId w:val="19"/>
   </w:num>
   <w:num w:numId="18" w16cid:durableId="1117456123">
-    <w:abstractNumId w:val="27"/>
+    <w:abstractNumId w:val="30"/>
   </w:num>
   <w:num w:numId="19" w16cid:durableId="924458077">
-    <w:abstractNumId w:val="17"/>
+    <w:abstractNumId w:val="20"/>
   </w:num>
   <w:num w:numId="20" w16cid:durableId="1827432817">
-    <w:abstractNumId w:val="26"/>
+    <w:abstractNumId w:val="29"/>
   </w:num>
   <w:num w:numId="21" w16cid:durableId="625888307">
-    <w:abstractNumId w:val="25"/>
+    <w:abstractNumId w:val="28"/>
   </w:num>
   <w:num w:numId="22" w16cid:durableId="1917936097">
-    <w:abstractNumId w:val="20"/>
+    <w:abstractNumId w:val="23"/>
   </w:num>
   <w:num w:numId="23" w16cid:durableId="346366136">
     <w:abstractNumId w:val="7"/>
@@ -6759,13 +8783,22 @@
     <w:abstractNumId w:val="0"/>
   </w:num>
   <w:num w:numId="26" w16cid:durableId="1425876091">
-    <w:abstractNumId w:val="22"/>
+    <w:abstractNumId w:val="25"/>
   </w:num>
   <w:num w:numId="27" w16cid:durableId="1218318191">
-    <w:abstractNumId w:val="12"/>
+    <w:abstractNumId w:val="14"/>
   </w:num>
   <w:num w:numId="28" w16cid:durableId="1192956174">
-    <w:abstractNumId w:val="14"/>
+    <w:abstractNumId w:val="16"/>
+  </w:num>
+  <w:num w:numId="29" w16cid:durableId="1531339635">
+    <w:abstractNumId w:val="9"/>
+  </w:num>
+  <w:num w:numId="30" w16cid:durableId="1428506028">
+    <w:abstractNumId w:val="18"/>
+  </w:num>
+  <w:num w:numId="31" w16cid:durableId="1206060351">
+    <w:abstractNumId w:val="11"/>
   </w:num>
 </w:numbering>
 </file>

</xml_diff>

<commit_message>
fix: correctifs du visiteur dessiner opengl
</commit_message>
<xml_diff>
--- a/Rapport.docx
+++ b/Rapport.docx
@@ -3463,16 +3463,6 @@
         </w:p>
       </w:sdtContent>
     </w:sdt>
-    <w:p/>
-    <w:p/>
-    <w:p/>
-    <w:p/>
-    <w:p/>
-    <w:p/>
-    <w:p/>
-    <w:p/>
-    <w:p/>
-    <w:p/>
     <w:p>
       <w:pPr>
         <w:pStyle w:val="Titre1"/>
@@ -3560,7 +3550,6 @@
     <w:p/>
     <w:p/>
     <w:p/>
-    <w:p/>
     <w:p>
       <w:pPr>
         <w:pStyle w:val="Titre1"/>
@@ -3571,6 +3560,7 @@
       </w:pPr>
       <w:bookmarkStart w:id="2" w:name="_Toc192421978"/>
       <w:r>
+        <w:lastRenderedPageBreak/>
         <w:t>Partie C++ (Client)</w:t>
       </w:r>
       <w:bookmarkEnd w:id="2"/>
@@ -3692,7 +3682,6 @@
     </w:p>
     <w:p>
       <w:r>
-        <w:lastRenderedPageBreak/>
         <w:t>Il existe deux types de formes :</w:t>
       </w:r>
     </w:p>
@@ -3766,6 +3755,7 @@
     </w:p>
     <w:p>
       <w:r>
+        <w:lastRenderedPageBreak/>
         <w:t>Ces fonctions sont séparables en trois catégories :</w:t>
       </w:r>
     </w:p>
@@ -4019,6 +4009,7 @@
         <w:rPr>
           <w:rFonts w:eastAsiaTheme="minorEastAsia"/>
         </w:rPr>
+        <w:lastRenderedPageBreak/>
         <w:t>Voici quelques informations complémentaires sur ces calculs :</w:t>
       </w:r>
     </w:p>
@@ -4297,6 +4288,7 @@
         </w:numPr>
       </w:pPr>
       <w:r>
+        <w:lastRenderedPageBreak/>
         <w:t>Translation pour centrer l’écran</w:t>
       </w:r>
     </w:p>
@@ -4373,8 +4365,6 @@
     </w:p>
     <w:p/>
     <w:p/>
-    <w:p/>
-    <w:p/>
     <w:p>
       <w:pPr>
         <w:pStyle w:val="Titre2"/>
@@ -4406,8 +4396,21 @@
         <w:rPr>
           <w:lang w:val="en-US"/>
         </w:rPr>
-        <w:lastRenderedPageBreak/>
-        <w:t>Pattern Chain Of Responsibility (COR)</w:t>
+        <w:t xml:space="preserve">Pattern Chain </w:t>
+      </w:r>
+      <w:proofErr w:type="gramStart"/>
+      <w:r>
+        <w:rPr>
+          <w:lang w:val="en-US"/>
+        </w:rPr>
+        <w:t>Of</w:t>
+      </w:r>
+      <w:proofErr w:type="gramEnd"/>
+      <w:r>
+        <w:rPr>
+          <w:lang w:val="en-US"/>
+        </w:rPr>
+        <w:t xml:space="preserve"> Responsibility (COR)</w:t>
       </w:r>
       <w:bookmarkEnd w:id="15"/>
     </w:p>
@@ -4471,6 +4474,7 @@
         <w:rPr>
           <w:noProof/>
         </w:rPr>
+        <w:lastRenderedPageBreak/>
         <w:drawing>
           <wp:inline distT="0" distB="0" distL="0" distR="0" wp14:anchorId="021CF4A8" wp14:editId="35236552">
             <wp:extent cx="5760720" cy="3583940"/>
@@ -4649,6 +4653,7 @@
     <w:p/>
     <w:p>
       <w:r>
+        <w:lastRenderedPageBreak/>
         <w:t>Voici le diagramme UML associé à cette partie :</w:t>
       </w:r>
     </w:p>
@@ -4766,7 +4771,6 @@
         </w:numPr>
       </w:pPr>
       <w:r>
-        <w:lastRenderedPageBreak/>
         <w:t>VisiteurSauvegarderTXT</w:t>
       </w:r>
     </w:p>
@@ -4813,6 +4817,7 @@
       </w:pPr>
       <w:bookmarkStart w:id="17" w:name="_Toc192421993"/>
       <w:r>
+        <w:lastRenderedPageBreak/>
         <w:t>Pattern Singleton</w:t>
       </w:r>
       <w:bookmarkEnd w:id="17"/>
@@ -4933,7 +4938,15 @@
     <w:p/>
     <w:p>
       <w:r>
-        <w:t xml:space="preserve">La connexion au Client se fait de manière à ce que plusieurs clients puissent se connecter et envoyer des informations au serveur, et que celui-ci les traite de manière parallèle. Cela est permis grâce à la classe </w:t>
+        <w:t xml:space="preserve">La connexion au Client se fait </w:t>
+      </w:r>
+      <w:proofErr w:type="gramStart"/>
+      <w:r>
+        <w:t>de manière à ce</w:t>
+      </w:r>
+      <w:proofErr w:type="gramEnd"/>
+      <w:r>
+        <w:t xml:space="preserve"> que plusieurs clients puissent se connecter et envoyer des informations au serveur, et que celui-ci les traite de manière parallèle. Cela est permis grâce à la classe </w:t>
       </w:r>
       <w:r>
         <w:rPr>
@@ -4959,6 +4972,7 @@
       </w:pPr>
       <w:bookmarkStart w:id="21" w:name="_Toc192421997"/>
       <w:r>
+        <w:lastRenderedPageBreak/>
         <w:t>Réception des données</w:t>
       </w:r>
       <w:bookmarkEnd w:id="21"/>
@@ -5057,7 +5071,21 @@
         <w:rPr>
           <w:lang w:val="en-US"/>
         </w:rPr>
-        <w:t>Chain Of Responsibility (COR)</w:t>
+        <w:t xml:space="preserve">Chain </w:t>
+      </w:r>
+      <w:proofErr w:type="gramStart"/>
+      <w:r>
+        <w:rPr>
+          <w:lang w:val="en-US"/>
+        </w:rPr>
+        <w:t>Of</w:t>
+      </w:r>
+      <w:proofErr w:type="gramEnd"/>
+      <w:r>
+        <w:rPr>
+          <w:lang w:val="en-US"/>
+        </w:rPr>
+        <w:t xml:space="preserve"> Responsibility (COR)</w:t>
       </w:r>
       <w:bookmarkEnd w:id="23"/>
     </w:p>
@@ -5085,7 +5113,15 @@
         <w:t xml:space="preserve">. En effet, il y a plusieurs formes qui peuvent être dessinés : </w:t>
       </w:r>
       <w:r>
-        <w:t>un segment, un cercle, un triangle ou  encore un polygone quelconque fermé</w:t>
+        <w:t xml:space="preserve">un segment, un cercle, un triangle </w:t>
+      </w:r>
+      <w:proofErr w:type="gramStart"/>
+      <w:r>
+        <w:t>ou  encore</w:t>
+      </w:r>
+      <w:proofErr w:type="gramEnd"/>
+      <w:r>
+        <w:t xml:space="preserve"> un polygone quelconque fermé</w:t>
       </w:r>
       <w:r>
         <w:t xml:space="preserve">. Pour cela, le design </w:t>
@@ -5102,10 +5138,7 @@
     </w:p>
     <w:p>
       <w:r>
-        <w:t>Ainsi,</w:t>
-      </w:r>
-      <w:r>
-        <w:t xml:space="preserve"> chaque </w:t>
+        <w:t xml:space="preserve">Ainsi, chaque </w:t>
       </w:r>
       <w:proofErr w:type="spellStart"/>
       <w:r>
@@ -5232,11 +5265,7 @@
       </w:r>
       <w:proofErr w:type="spellEnd"/>
       <w:r>
-        <w:t xml:space="preserve">), assurant ainsi une adaptation dynamique du contenu. Un repère centré est </w:t>
-      </w:r>
-      <w:r>
-        <w:lastRenderedPageBreak/>
-        <w:t>également affiché pour guider la disposition des formes. La gestion des couleurs est réalisée par un tableau de couleurs prédéfini, appliqué lors du rendu des formes.</w:t>
+        <w:t>), assurant ainsi une adaptation dynamique du contenu. Un repère centré est également affiché pour guider la disposition des formes. La gestion des couleurs est réalisée par un tableau de couleurs prédéfini, appliqué lors du rendu des formes.</w:t>
       </w:r>
     </w:p>
     <w:p/>
@@ -5253,21 +5282,15 @@
         <w:t>Fonctionnement de</w:t>
       </w:r>
       <w:r>
-        <w:t xml:space="preserve"> </w:t>
-      </w:r>
-      <w:proofErr w:type="spellStart"/>
-      <w:r>
-        <w:t>Controleur</w:t>
+        <w:t xml:space="preserve"> Controleur</w:t>
       </w:r>
       <w:bookmarkEnd w:id="25"/>
-      <w:proofErr w:type="spellEnd"/>
     </w:p>
     <w:p/>
     <w:p>
       <w:r>
         <w:t xml:space="preserve">La classe </w:t>
       </w:r>
-      <w:proofErr w:type="spellStart"/>
       <w:r>
         <w:rPr>
           <w:i/>
@@ -5275,7 +5298,6 @@
         </w:rPr>
         <w:t>Controleur</w:t>
       </w:r>
-      <w:proofErr w:type="spellEnd"/>
       <w:r>
         <w:t xml:space="preserve"> assure la liaison entre la vue (</w:t>
       </w:r>
@@ -5291,13 +5313,9 @@
       <w:r>
         <w:t xml:space="preserve">) et le modèle, en gérant la création de la fenêtre d'affichage et le traitement des formes à dessiner. Elle implémente le design pattern Chain of </w:t>
       </w:r>
-      <w:proofErr w:type="spellStart"/>
-      <w:r>
-        <w:t>Responsibility</w:t>
-      </w:r>
-      <w:proofErr w:type="spellEnd"/>
-      <w:r>
-        <w:t xml:space="preserve"> (COR) à travers la méthode </w:t>
+      <w:r>
+        <w:lastRenderedPageBreak/>
+        <w:t xml:space="preserve">Responsibility (COR) à travers la méthode </w:t>
       </w:r>
       <w:proofErr w:type="spellStart"/>
       <w:r>
@@ -5360,7 +5378,6 @@
       <w:r>
         <w:t xml:space="preserve">en extrayant ses dimensions et la couleur des formes à partir d'une expression régulière. Ensuite, chaque ligne suivante est interprétée comme une forme géométrique et transmise au </w:t>
       </w:r>
-      <w:proofErr w:type="spellStart"/>
       <w:r>
         <w:rPr>
           <w:i/>
@@ -5368,7 +5385,6 @@
         </w:rPr>
         <w:t>Controleur</w:t>
       </w:r>
-      <w:proofErr w:type="spellEnd"/>
       <w:r>
         <w:t xml:space="preserve">, qui la parse avec </w:t>
       </w:r>
@@ -5519,6 +5535,7 @@
       </w:r>
     </w:p>
     <w:p/>
+    <w:p/>
     <w:p>
       <w:pPr>
         <w:pStyle w:val="Titre3"/>
@@ -5529,7 +5546,6 @@
       </w:pPr>
       <w:bookmarkStart w:id="30" w:name="_Toc192422006"/>
       <w:r>
-        <w:lastRenderedPageBreak/>
         <w:t>Modèle</w:t>
       </w:r>
       <w:bookmarkEnd w:id="30"/>
@@ -5555,6 +5571,7 @@
     </w:p>
     <w:p>
       <w:r>
+        <w:lastRenderedPageBreak/>
         <w:t>GLAD est un chargeur de fonctions OpenGL. Il est nécessaire pour charger dynamiquement les fonctions OpenGL dont nous avons besoins étant donné qu’OpenGL n’expose pas directement toutes ses fonctions.</w:t>
       </w:r>
     </w:p>
@@ -5599,7 +5616,6 @@
     </w:p>
     <w:p/>
     <w:p/>
-    <w:p/>
     <w:p>
       <w:pPr>
         <w:pStyle w:val="Titre3"/>
@@ -5621,6 +5637,7 @@
       </w:r>
     </w:p>
     <w:p/>
+    <w:p/>
     <w:p>
       <w:pPr>
         <w:pStyle w:val="Titre3"/>
@@ -5644,22 +5661,6 @@
         <w:t xml:space="preserve"> se charge de créer la fenêtre d’affichage et de lancer son exécution.</w:t>
       </w:r>
     </w:p>
-    <w:p/>
-    <w:p>
-      <w:pPr>
-        <w:pStyle w:val="Titre2"/>
-        <w:numPr>
-          <w:ilvl w:val="0"/>
-          <w:numId w:val="30"/>
-        </w:numPr>
-      </w:pPr>
-      <w:bookmarkStart w:id="33" w:name="_Toc192422009"/>
-      <w:r>
-        <w:t>Fonctionnement</w:t>
-      </w:r>
-      <w:bookmarkEnd w:id="33"/>
-    </w:p>
-    <w:p/>
     <w:p/>
     <w:p/>
     <w:p/>

</xml_diff>

<commit_message>
doc: modification du rapport
</commit_message>
<xml_diff>
--- a/Rapport.docx
+++ b/Rapport.docx
@@ -396,7 +396,7 @@
           <w:r>
             <w:fldChar w:fldCharType="separate"/>
           </w:r>
-          <w:hyperlink w:anchor="_Toc192421976" w:history="1">
+          <w:hyperlink w:anchor="_Toc192438376" w:history="1">
             <w:r>
               <w:rPr>
                 <w:rStyle w:val="Lienhypertexte"/>
@@ -440,7 +440,7 @@
                 <w:noProof/>
                 <w:webHidden/>
               </w:rPr>
-              <w:instrText xml:space="preserve"> PAGEREF _Toc192421976 \h </w:instrText>
+              <w:instrText xml:space="preserve"> PAGEREF _Toc192438376 \h </w:instrText>
             </w:r>
             <w:r>
               <w:rPr>
@@ -486,7 +486,7 @@
               <w:lang w:eastAsia="fr-FR"/>
             </w:rPr>
           </w:pPr>
-          <w:hyperlink w:anchor="_Toc192421977" w:history="1">
+          <w:hyperlink w:anchor="_Toc192438377" w:history="1">
             <w:r>
               <w:rPr>
                 <w:rStyle w:val="Lienhypertexte"/>
@@ -530,7 +530,7 @@
                 <w:noProof/>
                 <w:webHidden/>
               </w:rPr>
-              <w:instrText xml:space="preserve"> PAGEREF _Toc192421977 \h </w:instrText>
+              <w:instrText xml:space="preserve"> PAGEREF _Toc192438377 \h </w:instrText>
             </w:r>
             <w:r>
               <w:rPr>
@@ -576,7 +576,7 @@
               <w:lang w:eastAsia="fr-FR"/>
             </w:rPr>
           </w:pPr>
-          <w:hyperlink w:anchor="_Toc192421978" w:history="1">
+          <w:hyperlink w:anchor="_Toc192438378" w:history="1">
             <w:r>
               <w:rPr>
                 <w:rStyle w:val="Lienhypertexte"/>
@@ -620,7 +620,7 @@
                 <w:noProof/>
                 <w:webHidden/>
               </w:rPr>
-              <w:instrText xml:space="preserve"> PAGEREF _Toc192421978 \h </w:instrText>
+              <w:instrText xml:space="preserve"> PAGEREF _Toc192438378 \h </w:instrText>
             </w:r>
             <w:r>
               <w:rPr>
@@ -666,7 +666,7 @@
               <w:lang w:eastAsia="fr-FR"/>
             </w:rPr>
           </w:pPr>
-          <w:hyperlink w:anchor="_Toc192421979" w:history="1">
+          <w:hyperlink w:anchor="_Toc192438379" w:history="1">
             <w:r>
               <w:rPr>
                 <w:rStyle w:val="Lienhypertexte"/>
@@ -710,7 +710,7 @@
                 <w:noProof/>
                 <w:webHidden/>
               </w:rPr>
-              <w:instrText xml:space="preserve"> PAGEREF _Toc192421979 \h </w:instrText>
+              <w:instrText xml:space="preserve"> PAGEREF _Toc192438379 \h </w:instrText>
             </w:r>
             <w:r>
               <w:rPr>
@@ -756,7 +756,7 @@
               <w:lang w:eastAsia="fr-FR"/>
             </w:rPr>
           </w:pPr>
-          <w:hyperlink w:anchor="_Toc192421980" w:history="1">
+          <w:hyperlink w:anchor="_Toc192438380" w:history="1">
             <w:r>
               <w:rPr>
                 <w:rStyle w:val="Lienhypertexte"/>
@@ -800,7 +800,7 @@
                 <w:noProof/>
                 <w:webHidden/>
               </w:rPr>
-              <w:instrText xml:space="preserve"> PAGEREF _Toc192421980 \h </w:instrText>
+              <w:instrText xml:space="preserve"> PAGEREF _Toc192438380 \h </w:instrText>
             </w:r>
             <w:r>
               <w:rPr>
@@ -846,7 +846,7 @@
               <w:lang w:eastAsia="fr-FR"/>
             </w:rPr>
           </w:pPr>
-          <w:hyperlink w:anchor="_Toc192421981" w:history="1">
+          <w:hyperlink w:anchor="_Toc192438381" w:history="1">
             <w:r>
               <w:rPr>
                 <w:rStyle w:val="Lienhypertexte"/>
@@ -890,7 +890,7 @@
                 <w:noProof/>
                 <w:webHidden/>
               </w:rPr>
-              <w:instrText xml:space="preserve"> PAGEREF _Toc192421981 \h </w:instrText>
+              <w:instrText xml:space="preserve"> PAGEREF _Toc192438381 \h </w:instrText>
             </w:r>
             <w:r>
               <w:rPr>
@@ -936,7 +936,7 @@
               <w:lang w:eastAsia="fr-FR"/>
             </w:rPr>
           </w:pPr>
-          <w:hyperlink w:anchor="_Toc192421982" w:history="1">
+          <w:hyperlink w:anchor="_Toc192438382" w:history="1">
             <w:r>
               <w:rPr>
                 <w:rStyle w:val="Lienhypertexte"/>
@@ -980,7 +980,7 @@
                 <w:noProof/>
                 <w:webHidden/>
               </w:rPr>
-              <w:instrText xml:space="preserve"> PAGEREF _Toc192421982 \h </w:instrText>
+              <w:instrText xml:space="preserve"> PAGEREF _Toc192438382 \h </w:instrText>
             </w:r>
             <w:r>
               <w:rPr>
@@ -1026,7 +1026,7 @@
               <w:lang w:eastAsia="fr-FR"/>
             </w:rPr>
           </w:pPr>
-          <w:hyperlink w:anchor="_Toc192421983" w:history="1">
+          <w:hyperlink w:anchor="_Toc192438383" w:history="1">
             <w:r>
               <w:rPr>
                 <w:rStyle w:val="Lienhypertexte"/>
@@ -1070,7 +1070,7 @@
                 <w:noProof/>
                 <w:webHidden/>
               </w:rPr>
-              <w:instrText xml:space="preserve"> PAGEREF _Toc192421983 \h </w:instrText>
+              <w:instrText xml:space="preserve"> PAGEREF _Toc192438383 \h </w:instrText>
             </w:r>
             <w:r>
               <w:rPr>
@@ -1116,7 +1116,7 @@
               <w:lang w:eastAsia="fr-FR"/>
             </w:rPr>
           </w:pPr>
-          <w:hyperlink w:anchor="_Toc192421984" w:history="1">
+          <w:hyperlink w:anchor="_Toc192438384" w:history="1">
             <w:r>
               <w:rPr>
                 <w:rStyle w:val="Lienhypertexte"/>
@@ -1160,7 +1160,7 @@
                 <w:noProof/>
                 <w:webHidden/>
               </w:rPr>
-              <w:instrText xml:space="preserve"> PAGEREF _Toc192421984 \h </w:instrText>
+              <w:instrText xml:space="preserve"> PAGEREF _Toc192438384 \h </w:instrText>
             </w:r>
             <w:r>
               <w:rPr>
@@ -1206,7 +1206,7 @@
               <w:lang w:eastAsia="fr-FR"/>
             </w:rPr>
           </w:pPr>
-          <w:hyperlink w:anchor="_Toc192421985" w:history="1">
+          <w:hyperlink w:anchor="_Toc192438385" w:history="1">
             <w:r>
               <w:rPr>
                 <w:rStyle w:val="Lienhypertexte"/>
@@ -1250,7 +1250,7 @@
                 <w:noProof/>
                 <w:webHidden/>
               </w:rPr>
-              <w:instrText xml:space="preserve"> PAGEREF _Toc192421985 \h </w:instrText>
+              <w:instrText xml:space="preserve"> PAGEREF _Toc192438385 \h </w:instrText>
             </w:r>
             <w:r>
               <w:rPr>
@@ -1270,7 +1270,7 @@
                 <w:noProof/>
                 <w:webHidden/>
               </w:rPr>
-              <w:t>6</w:t>
+              <w:t>5</w:t>
             </w:r>
             <w:r>
               <w:rPr>
@@ -1296,7 +1296,7 @@
               <w:lang w:eastAsia="fr-FR"/>
             </w:rPr>
           </w:pPr>
-          <w:hyperlink w:anchor="_Toc192421986" w:history="1">
+          <w:hyperlink w:anchor="_Toc192438386" w:history="1">
             <w:r>
               <w:rPr>
                 <w:rStyle w:val="Lienhypertexte"/>
@@ -1340,7 +1340,7 @@
                 <w:noProof/>
                 <w:webHidden/>
               </w:rPr>
-              <w:instrText xml:space="preserve"> PAGEREF _Toc192421986 \h </w:instrText>
+              <w:instrText xml:space="preserve"> PAGEREF _Toc192438386 \h </w:instrText>
             </w:r>
             <w:r>
               <w:rPr>
@@ -1386,7 +1386,7 @@
               <w:lang w:eastAsia="fr-FR"/>
             </w:rPr>
           </w:pPr>
-          <w:hyperlink w:anchor="_Toc192421987" w:history="1">
+          <w:hyperlink w:anchor="_Toc192438387" w:history="1">
             <w:r>
               <w:rPr>
                 <w:rStyle w:val="Lienhypertexte"/>
@@ -1430,7 +1430,7 @@
                 <w:noProof/>
                 <w:webHidden/>
               </w:rPr>
-              <w:instrText xml:space="preserve"> PAGEREF _Toc192421987 \h </w:instrText>
+              <w:instrText xml:space="preserve"> PAGEREF _Toc192438387 \h </w:instrText>
             </w:r>
             <w:r>
               <w:rPr>
@@ -1476,7 +1476,7 @@
               <w:lang w:eastAsia="fr-FR"/>
             </w:rPr>
           </w:pPr>
-          <w:hyperlink w:anchor="_Toc192421988" w:history="1">
+          <w:hyperlink w:anchor="_Toc192438388" w:history="1">
             <w:r>
               <w:rPr>
                 <w:rStyle w:val="Lienhypertexte"/>
@@ -1520,7 +1520,7 @@
                 <w:noProof/>
                 <w:webHidden/>
               </w:rPr>
-              <w:instrText xml:space="preserve"> PAGEREF _Toc192421988 \h </w:instrText>
+              <w:instrText xml:space="preserve"> PAGEREF _Toc192438388 \h </w:instrText>
             </w:r>
             <w:r>
               <w:rPr>
@@ -1566,7 +1566,7 @@
               <w:lang w:eastAsia="fr-FR"/>
             </w:rPr>
           </w:pPr>
-          <w:hyperlink w:anchor="_Toc192421989" w:history="1">
+          <w:hyperlink w:anchor="_Toc192438389" w:history="1">
             <w:r>
               <w:rPr>
                 <w:rStyle w:val="Lienhypertexte"/>
@@ -1610,7 +1610,7 @@
                 <w:noProof/>
                 <w:webHidden/>
               </w:rPr>
-              <w:instrText xml:space="preserve"> PAGEREF _Toc192421989 \h </w:instrText>
+              <w:instrText xml:space="preserve"> PAGEREF _Toc192438389 \h </w:instrText>
             </w:r>
             <w:r>
               <w:rPr>
@@ -1656,7 +1656,7 @@
               <w:lang w:eastAsia="fr-FR"/>
             </w:rPr>
           </w:pPr>
-          <w:hyperlink w:anchor="_Toc192421990" w:history="1">
+          <w:hyperlink w:anchor="_Toc192438390" w:history="1">
             <w:r>
               <w:rPr>
                 <w:rStyle w:val="Lienhypertexte"/>
@@ -1700,7 +1700,7 @@
                 <w:noProof/>
                 <w:webHidden/>
               </w:rPr>
-              <w:instrText xml:space="preserve"> PAGEREF _Toc192421990 \h </w:instrText>
+              <w:instrText xml:space="preserve"> PAGEREF _Toc192438390 \h </w:instrText>
             </w:r>
             <w:r>
               <w:rPr>
@@ -1746,7 +1746,7 @@
               <w:lang w:eastAsia="fr-FR"/>
             </w:rPr>
           </w:pPr>
-          <w:hyperlink w:anchor="_Toc192421991" w:history="1">
+          <w:hyperlink w:anchor="_Toc192438391" w:history="1">
             <w:r>
               <w:rPr>
                 <w:rStyle w:val="Lienhypertexte"/>
@@ -1792,7 +1792,7 @@
                 <w:noProof/>
                 <w:webHidden/>
               </w:rPr>
-              <w:instrText xml:space="preserve"> PAGEREF _Toc192421991 \h </w:instrText>
+              <w:instrText xml:space="preserve"> PAGEREF _Toc192438391 \h </w:instrText>
             </w:r>
             <w:r>
               <w:rPr>
@@ -1812,7 +1812,7 @@
                 <w:noProof/>
                 <w:webHidden/>
               </w:rPr>
-              <w:t>8</w:t>
+              <w:t>7</w:t>
             </w:r>
             <w:r>
               <w:rPr>
@@ -1838,7 +1838,7 @@
               <w:lang w:eastAsia="fr-FR"/>
             </w:rPr>
           </w:pPr>
-          <w:hyperlink w:anchor="_Toc192421992" w:history="1">
+          <w:hyperlink w:anchor="_Toc192438392" w:history="1">
             <w:r>
               <w:rPr>
                 <w:rStyle w:val="Lienhypertexte"/>
@@ -1882,7 +1882,7 @@
                 <w:noProof/>
                 <w:webHidden/>
               </w:rPr>
-              <w:instrText xml:space="preserve"> PAGEREF _Toc192421992 \h </w:instrText>
+              <w:instrText xml:space="preserve"> PAGEREF _Toc192438392 \h </w:instrText>
             </w:r>
             <w:r>
               <w:rPr>
@@ -1928,7 +1928,7 @@
               <w:lang w:eastAsia="fr-FR"/>
             </w:rPr>
           </w:pPr>
-          <w:hyperlink w:anchor="_Toc192421993" w:history="1">
+          <w:hyperlink w:anchor="_Toc192438393" w:history="1">
             <w:r>
               <w:rPr>
                 <w:rStyle w:val="Lienhypertexte"/>
@@ -1972,7 +1972,7 @@
                 <w:noProof/>
                 <w:webHidden/>
               </w:rPr>
-              <w:instrText xml:space="preserve"> PAGEREF _Toc192421993 \h </w:instrText>
+              <w:instrText xml:space="preserve"> PAGEREF _Toc192438393 \h </w:instrText>
             </w:r>
             <w:r>
               <w:rPr>
@@ -2018,7 +2018,7 @@
               <w:lang w:eastAsia="fr-FR"/>
             </w:rPr>
           </w:pPr>
-          <w:hyperlink w:anchor="_Toc192421994" w:history="1">
+          <w:hyperlink w:anchor="_Toc192438394" w:history="1">
             <w:r>
               <w:rPr>
                 <w:rStyle w:val="Lienhypertexte"/>
@@ -2062,7 +2062,7 @@
                 <w:noProof/>
                 <w:webHidden/>
               </w:rPr>
-              <w:instrText xml:space="preserve"> PAGEREF _Toc192421994 \h </w:instrText>
+              <w:instrText xml:space="preserve"> PAGEREF _Toc192438394 \h </w:instrText>
             </w:r>
             <w:r>
               <w:rPr>
@@ -2108,7 +2108,7 @@
               <w:lang w:eastAsia="fr-FR"/>
             </w:rPr>
           </w:pPr>
-          <w:hyperlink w:anchor="_Toc192421995" w:history="1">
+          <w:hyperlink w:anchor="_Toc192438395" w:history="1">
             <w:r>
               <w:rPr>
                 <w:rStyle w:val="Lienhypertexte"/>
@@ -2152,7 +2152,7 @@
                 <w:noProof/>
                 <w:webHidden/>
               </w:rPr>
-              <w:instrText xml:space="preserve"> PAGEREF _Toc192421995 \h </w:instrText>
+              <w:instrText xml:space="preserve"> PAGEREF _Toc192438395 \h </w:instrText>
             </w:r>
             <w:r>
               <w:rPr>
@@ -2198,7 +2198,7 @@
               <w:lang w:eastAsia="fr-FR"/>
             </w:rPr>
           </w:pPr>
-          <w:hyperlink w:anchor="_Toc192421996" w:history="1">
+          <w:hyperlink w:anchor="_Toc192438396" w:history="1">
             <w:r>
               <w:rPr>
                 <w:rStyle w:val="Lienhypertexte"/>
@@ -2242,7 +2242,7 @@
                 <w:noProof/>
                 <w:webHidden/>
               </w:rPr>
-              <w:instrText xml:space="preserve"> PAGEREF _Toc192421996 \h </w:instrText>
+              <w:instrText xml:space="preserve"> PAGEREF _Toc192438396 \h </w:instrText>
             </w:r>
             <w:r>
               <w:rPr>
@@ -2262,7 +2262,7 @@
                 <w:noProof/>
                 <w:webHidden/>
               </w:rPr>
-              <w:t>11</w:t>
+              <w:t>10</w:t>
             </w:r>
             <w:r>
               <w:rPr>
@@ -2288,7 +2288,7 @@
               <w:lang w:eastAsia="fr-FR"/>
             </w:rPr>
           </w:pPr>
-          <w:hyperlink w:anchor="_Toc192421997" w:history="1">
+          <w:hyperlink w:anchor="_Toc192438397" w:history="1">
             <w:r>
               <w:rPr>
                 <w:rStyle w:val="Lienhypertexte"/>
@@ -2332,7 +2332,7 @@
                 <w:noProof/>
                 <w:webHidden/>
               </w:rPr>
-              <w:instrText xml:space="preserve"> PAGEREF _Toc192421997 \h </w:instrText>
+              <w:instrText xml:space="preserve"> PAGEREF _Toc192438397 \h </w:instrText>
             </w:r>
             <w:r>
               <w:rPr>
@@ -2378,7 +2378,7 @@
               <w:lang w:eastAsia="fr-FR"/>
             </w:rPr>
           </w:pPr>
-          <w:hyperlink w:anchor="_Toc192421998" w:history="1">
+          <w:hyperlink w:anchor="_Toc192438398" w:history="1">
             <w:r>
               <w:rPr>
                 <w:rStyle w:val="Lienhypertexte"/>
@@ -2422,7 +2422,7 @@
                 <w:noProof/>
                 <w:webHidden/>
               </w:rPr>
-              <w:instrText xml:space="preserve"> PAGEREF _Toc192421998 \h </w:instrText>
+              <w:instrText xml:space="preserve"> PAGEREF _Toc192438398 \h </w:instrText>
             </w:r>
             <w:r>
               <w:rPr>
@@ -2468,7 +2468,7 @@
               <w:lang w:eastAsia="fr-FR"/>
             </w:rPr>
           </w:pPr>
-          <w:hyperlink w:anchor="_Toc192421999" w:history="1">
+          <w:hyperlink w:anchor="_Toc192438399" w:history="1">
             <w:r>
               <w:rPr>
                 <w:rStyle w:val="Lienhypertexte"/>
@@ -2514,7 +2514,7 @@
                 <w:noProof/>
                 <w:webHidden/>
               </w:rPr>
-              <w:instrText xml:space="preserve"> PAGEREF _Toc192421999 \h </w:instrText>
+              <w:instrText xml:space="preserve"> PAGEREF _Toc192438399 \h </w:instrText>
             </w:r>
             <w:r>
               <w:rPr>
@@ -2560,7 +2560,7 @@
               <w:lang w:eastAsia="fr-FR"/>
             </w:rPr>
           </w:pPr>
-          <w:hyperlink w:anchor="_Toc192422000" w:history="1">
+          <w:hyperlink w:anchor="_Toc192438400" w:history="1">
             <w:r>
               <w:rPr>
                 <w:rStyle w:val="Lienhypertexte"/>
@@ -2604,7 +2604,7 @@
                 <w:noProof/>
                 <w:webHidden/>
               </w:rPr>
-              <w:instrText xml:space="preserve"> PAGEREF _Toc192422000 \h </w:instrText>
+              <w:instrText xml:space="preserve"> PAGEREF _Toc192438400 \h </w:instrText>
             </w:r>
             <w:r>
               <w:rPr>
@@ -2650,7 +2650,7 @@
               <w:lang w:eastAsia="fr-FR"/>
             </w:rPr>
           </w:pPr>
-          <w:hyperlink w:anchor="_Toc192422001" w:history="1">
+          <w:hyperlink w:anchor="_Toc192438401" w:history="1">
             <w:r>
               <w:rPr>
                 <w:rStyle w:val="Lienhypertexte"/>
@@ -2694,7 +2694,7 @@
                 <w:noProof/>
                 <w:webHidden/>
               </w:rPr>
-              <w:instrText xml:space="preserve"> PAGEREF _Toc192422001 \h </w:instrText>
+              <w:instrText xml:space="preserve"> PAGEREF _Toc192438401 \h </w:instrText>
             </w:r>
             <w:r>
               <w:rPr>
@@ -2714,7 +2714,7 @@
                 <w:noProof/>
                 <w:webHidden/>
               </w:rPr>
-              <w:t>12</w:t>
+              <w:t>11</w:t>
             </w:r>
             <w:r>
               <w:rPr>
@@ -2740,7 +2740,7 @@
               <w:lang w:eastAsia="fr-FR"/>
             </w:rPr>
           </w:pPr>
-          <w:hyperlink w:anchor="_Toc192422002" w:history="1">
+          <w:hyperlink w:anchor="_Toc192438402" w:history="1">
             <w:r>
               <w:rPr>
                 <w:rStyle w:val="Lienhypertexte"/>
@@ -2784,7 +2784,7 @@
                 <w:noProof/>
                 <w:webHidden/>
               </w:rPr>
-              <w:instrText xml:space="preserve"> PAGEREF _Toc192422002 \h </w:instrText>
+              <w:instrText xml:space="preserve"> PAGEREF _Toc192438402 \h </w:instrText>
             </w:r>
             <w:r>
               <w:rPr>
@@ -2830,7 +2830,7 @@
               <w:lang w:eastAsia="fr-FR"/>
             </w:rPr>
           </w:pPr>
-          <w:hyperlink w:anchor="_Toc192422003" w:history="1">
+          <w:hyperlink w:anchor="_Toc192438403" w:history="1">
             <w:r>
               <w:rPr>
                 <w:rStyle w:val="Lienhypertexte"/>
@@ -2874,7 +2874,7 @@
                 <w:noProof/>
                 <w:webHidden/>
               </w:rPr>
-              <w:instrText xml:space="preserve"> PAGEREF _Toc192422003 \h </w:instrText>
+              <w:instrText xml:space="preserve"> PAGEREF _Toc192438403 \h </w:instrText>
             </w:r>
             <w:r>
               <w:rPr>
@@ -2920,7 +2920,7 @@
               <w:lang w:eastAsia="fr-FR"/>
             </w:rPr>
           </w:pPr>
-          <w:hyperlink w:anchor="_Toc192422004" w:history="1">
+          <w:hyperlink w:anchor="_Toc192438404" w:history="1">
             <w:r>
               <w:rPr>
                 <w:rStyle w:val="Lienhypertexte"/>
@@ -2964,7 +2964,7 @@
                 <w:noProof/>
                 <w:webHidden/>
               </w:rPr>
-              <w:instrText xml:space="preserve"> PAGEREF _Toc192422004 \h </w:instrText>
+              <w:instrText xml:space="preserve"> PAGEREF _Toc192438404 \h </w:instrText>
             </w:r>
             <w:r>
               <w:rPr>
@@ -3010,7 +3010,7 @@
               <w:lang w:eastAsia="fr-FR"/>
             </w:rPr>
           </w:pPr>
-          <w:hyperlink w:anchor="_Toc192422005" w:history="1">
+          <w:hyperlink w:anchor="_Toc192438405" w:history="1">
             <w:r>
               <w:rPr>
                 <w:rStyle w:val="Lienhypertexte"/>
@@ -3054,7 +3054,7 @@
                 <w:noProof/>
                 <w:webHidden/>
               </w:rPr>
-              <w:instrText xml:space="preserve"> PAGEREF _Toc192422005 \h </w:instrText>
+              <w:instrText xml:space="preserve"> PAGEREF _Toc192438405 \h </w:instrText>
             </w:r>
             <w:r>
               <w:rPr>
@@ -3100,7 +3100,7 @@
               <w:lang w:eastAsia="fr-FR"/>
             </w:rPr>
           </w:pPr>
-          <w:hyperlink w:anchor="_Toc192422006" w:history="1">
+          <w:hyperlink w:anchor="_Toc192438406" w:history="1">
             <w:r>
               <w:rPr>
                 <w:rStyle w:val="Lienhypertexte"/>
@@ -3144,7 +3144,7 @@
                 <w:noProof/>
                 <w:webHidden/>
               </w:rPr>
-              <w:instrText xml:space="preserve"> PAGEREF _Toc192422006 \h </w:instrText>
+              <w:instrText xml:space="preserve"> PAGEREF _Toc192438406 \h </w:instrText>
             </w:r>
             <w:r>
               <w:rPr>
@@ -3164,7 +3164,7 @@
                 <w:noProof/>
                 <w:webHidden/>
               </w:rPr>
-              <w:t>13</w:t>
+              <w:t>12</w:t>
             </w:r>
             <w:r>
               <w:rPr>
@@ -3190,7 +3190,7 @@
               <w:lang w:eastAsia="fr-FR"/>
             </w:rPr>
           </w:pPr>
-          <w:hyperlink w:anchor="_Toc192422007" w:history="1">
+          <w:hyperlink w:anchor="_Toc192438407" w:history="1">
             <w:r>
               <w:rPr>
                 <w:rStyle w:val="Lienhypertexte"/>
@@ -3234,7 +3234,7 @@
                 <w:noProof/>
                 <w:webHidden/>
               </w:rPr>
-              <w:instrText xml:space="preserve"> PAGEREF _Toc192422007 \h </w:instrText>
+              <w:instrText xml:space="preserve"> PAGEREF _Toc192438407 \h </w:instrText>
             </w:r>
             <w:r>
               <w:rPr>
@@ -3280,7 +3280,7 @@
               <w:lang w:eastAsia="fr-FR"/>
             </w:rPr>
           </w:pPr>
-          <w:hyperlink w:anchor="_Toc192422008" w:history="1">
+          <w:hyperlink w:anchor="_Toc192438408" w:history="1">
             <w:r>
               <w:rPr>
                 <w:rStyle w:val="Lienhypertexte"/>
@@ -3324,97 +3324,7 @@
                 <w:noProof/>
                 <w:webHidden/>
               </w:rPr>
-              <w:instrText xml:space="preserve"> PAGEREF _Toc192422008 \h </w:instrText>
-            </w:r>
-            <w:r>
-              <w:rPr>
-                <w:noProof/>
-                <w:webHidden/>
-              </w:rPr>
-            </w:r>
-            <w:r>
-              <w:rPr>
-                <w:noProof/>
-                <w:webHidden/>
-              </w:rPr>
-              <w:fldChar w:fldCharType="separate"/>
-            </w:r>
-            <w:r>
-              <w:rPr>
-                <w:noProof/>
-                <w:webHidden/>
-              </w:rPr>
-              <w:t>13</w:t>
-            </w:r>
-            <w:r>
-              <w:rPr>
-                <w:noProof/>
-                <w:webHidden/>
-              </w:rPr>
-              <w:fldChar w:fldCharType="end"/>
-            </w:r>
-          </w:hyperlink>
-        </w:p>
-        <w:p>
-          <w:pPr>
-            <w:pStyle w:val="TM2"/>
-            <w:tabs>
-              <w:tab w:val="left" w:pos="720"/>
-              <w:tab w:val="right" w:leader="dot" w:pos="9062"/>
-            </w:tabs>
-            <w:rPr>
-              <w:rFonts w:asciiTheme="minorHAnsi" w:eastAsiaTheme="minorEastAsia" w:hAnsiTheme="minorHAnsi"/>
-              <w:noProof/>
-              <w:sz w:val="24"/>
-              <w:szCs w:val="24"/>
-              <w:lang w:eastAsia="fr-FR"/>
-            </w:rPr>
-          </w:pPr>
-          <w:hyperlink w:anchor="_Toc192422009" w:history="1">
-            <w:r>
-              <w:rPr>
-                <w:rStyle w:val="Lienhypertexte"/>
-                <w:noProof/>
-              </w:rPr>
-              <w:t>d.</w:t>
-            </w:r>
-            <w:r>
-              <w:rPr>
-                <w:rFonts w:asciiTheme="minorHAnsi" w:eastAsiaTheme="minorEastAsia" w:hAnsiTheme="minorHAnsi"/>
-                <w:noProof/>
-                <w:sz w:val="24"/>
-                <w:szCs w:val="24"/>
-                <w:lang w:eastAsia="fr-FR"/>
-              </w:rPr>
-              <w:tab/>
-            </w:r>
-            <w:r>
-              <w:rPr>
-                <w:rStyle w:val="Lienhypertexte"/>
-                <w:noProof/>
-              </w:rPr>
-              <w:t>Fonctionnement</w:t>
-            </w:r>
-            <w:r>
-              <w:rPr>
-                <w:noProof/>
-                <w:webHidden/>
-              </w:rPr>
-              <w:tab/>
-            </w:r>
-            <w:r>
-              <w:rPr>
-                <w:noProof/>
-                <w:webHidden/>
-              </w:rPr>
-              <w:fldChar w:fldCharType="begin"/>
-            </w:r>
-            <w:r>
-              <w:rPr>
-                <w:noProof/>
-                <w:webHidden/>
-              </w:rPr>
-              <w:instrText xml:space="preserve"> PAGEREF _Toc192422009 \h </w:instrText>
+              <w:instrText xml:space="preserve"> PAGEREF _Toc192438408 \h </w:instrText>
             </w:r>
             <w:r>
               <w:rPr>
@@ -3457,7 +3367,6 @@
               <w:b/>
               <w:bCs/>
             </w:rPr>
-            <w:lastRenderedPageBreak/>
             <w:fldChar w:fldCharType="end"/>
           </w:r>
         </w:p>
@@ -3471,8 +3380,9 @@
           <w:numId w:val="10"/>
         </w:numPr>
       </w:pPr>
-      <w:bookmarkStart w:id="0" w:name="_Toc192421976"/>
-      <w:r>
+      <w:bookmarkStart w:id="0" w:name="_Toc192438376"/>
+      <w:r>
+        <w:lastRenderedPageBreak/>
         <w:t>Introduction</w:t>
       </w:r>
       <w:bookmarkEnd w:id="0"/>
@@ -3486,7 +3396,7 @@
           <w:numId w:val="12"/>
         </w:numPr>
       </w:pPr>
-      <w:bookmarkStart w:id="1" w:name="_Toc192421977"/>
+      <w:bookmarkStart w:id="1" w:name="_Toc192438377"/>
       <w:r>
         <w:t>Objectifs du projet</w:t>
       </w:r>
@@ -3550,6 +3460,7 @@
     <w:p/>
     <w:p/>
     <w:p/>
+    <w:p/>
     <w:p>
       <w:pPr>
         <w:pStyle w:val="Titre1"/>
@@ -3558,7 +3469,7 @@
           <w:numId w:val="10"/>
         </w:numPr>
       </w:pPr>
-      <w:bookmarkStart w:id="2" w:name="_Toc192421978"/>
+      <w:bookmarkStart w:id="2" w:name="_Toc192438378"/>
       <w:r>
         <w:lastRenderedPageBreak/>
         <w:t>Partie C++ (Client)</w:t>
@@ -3574,7 +3485,7 @@
           <w:numId w:val="13"/>
         </w:numPr>
       </w:pPr>
-      <w:bookmarkStart w:id="3" w:name="_Toc192421979"/>
+      <w:bookmarkStart w:id="3" w:name="_Toc192438379"/>
       <w:r>
         <w:t xml:space="preserve">Présentation de la partie </w:t>
       </w:r>
@@ -3598,7 +3509,7 @@
           <w:numId w:val="13"/>
         </w:numPr>
       </w:pPr>
-      <w:bookmarkStart w:id="4" w:name="_Toc192421980"/>
+      <w:bookmarkStart w:id="4" w:name="_Toc192438380"/>
       <w:r>
         <w:t>Gestion des formes géométriques</w:t>
       </w:r>
@@ -3613,7 +3524,7 @@
           <w:numId w:val="14"/>
         </w:numPr>
       </w:pPr>
-      <w:bookmarkStart w:id="5" w:name="_Toc192421981"/>
+      <w:bookmarkStart w:id="5" w:name="_Toc192438381"/>
       <w:r>
         <w:t>Représentation d’un point</w:t>
       </w:r>
@@ -3659,7 +3570,7 @@
           <w:numId w:val="14"/>
         </w:numPr>
       </w:pPr>
-      <w:bookmarkStart w:id="6" w:name="_Toc192421982"/>
+      <w:bookmarkStart w:id="6" w:name="_Toc192438382"/>
       <w:r>
         <w:t>Représentation de formes</w:t>
       </w:r>
@@ -3903,7 +3814,7 @@
           <w:numId w:val="13"/>
         </w:numPr>
       </w:pPr>
-      <w:bookmarkStart w:id="7" w:name="_Toc192421983"/>
+      <w:bookmarkStart w:id="7" w:name="_Toc192438383"/>
       <w:r>
         <w:t>Gestion du Viewport</w:t>
       </w:r>
@@ -3918,7 +3829,7 @@
           <w:numId w:val="18"/>
         </w:numPr>
       </w:pPr>
-      <w:bookmarkStart w:id="8" w:name="_Toc192421984"/>
+      <w:bookmarkStart w:id="8" w:name="_Toc192438384"/>
       <w:r>
         <w:t>Rôle du Viewport</w:t>
       </w:r>
@@ -3942,7 +3853,7 @@
           <w:numId w:val="18"/>
         </w:numPr>
       </w:pPr>
-      <w:bookmarkStart w:id="9" w:name="_Toc192421985"/>
+      <w:bookmarkStart w:id="9" w:name="_Toc192438385"/>
       <w:r>
         <w:t>Attributs du Viewport</w:t>
       </w:r>
@@ -4223,7 +4134,7 @@
           <w:rFonts w:eastAsiaTheme="minorEastAsia"/>
         </w:rPr>
       </w:pPr>
-      <w:bookmarkStart w:id="10" w:name="_Toc192421986"/>
+      <w:bookmarkStart w:id="10" w:name="_Toc192438386"/>
       <w:r>
         <w:rPr>
           <w:rFonts w:eastAsiaTheme="minorEastAsia"/>
@@ -4315,7 +4226,7 @@
           <w:numId w:val="13"/>
         </w:numPr>
       </w:pPr>
-      <w:bookmarkStart w:id="11" w:name="_Toc192421987"/>
+      <w:bookmarkStart w:id="11" w:name="_Toc192438387"/>
       <w:r>
         <w:t>Client TCP/IP</w:t>
       </w:r>
@@ -4330,7 +4241,7 @@
           <w:numId w:val="22"/>
         </w:numPr>
       </w:pPr>
-      <w:bookmarkStart w:id="12" w:name="_Toc192421988"/>
+      <w:bookmarkStart w:id="12" w:name="_Toc192438388"/>
       <w:r>
         <w:t>Rôle du Client TCP/IP</w:t>
       </w:r>
@@ -4351,7 +4262,7 @@
           <w:numId w:val="22"/>
         </w:numPr>
       </w:pPr>
-      <w:bookmarkStart w:id="13" w:name="_Toc192421989"/>
+      <w:bookmarkStart w:id="13" w:name="_Toc192438389"/>
       <w:r>
         <w:t>Attributs du Client</w:t>
       </w:r>
@@ -4373,7 +4284,7 @@
           <w:numId w:val="13"/>
         </w:numPr>
       </w:pPr>
-      <w:bookmarkStart w:id="14" w:name="_Toc192421990"/>
+      <w:bookmarkStart w:id="14" w:name="_Toc192438390"/>
       <w:r>
         <w:t>Design Patterns</w:t>
       </w:r>
@@ -4391,7 +4302,7 @@
           <w:lang w:val="en-US"/>
         </w:rPr>
       </w:pPr>
-      <w:bookmarkStart w:id="15" w:name="_Toc192421991"/>
+      <w:bookmarkStart w:id="15" w:name="_Toc192438391"/>
       <w:r>
         <w:rPr>
           <w:lang w:val="en-US"/>
@@ -4633,7 +4544,7 @@
           <w:numId w:val="20"/>
         </w:numPr>
       </w:pPr>
-      <w:bookmarkStart w:id="16" w:name="_Toc192421992"/>
+      <w:bookmarkStart w:id="16" w:name="_Toc192438392"/>
       <w:r>
         <w:t>Pattern Visitor</w:t>
       </w:r>
@@ -4815,7 +4726,7 @@
           <w:numId w:val="20"/>
         </w:numPr>
       </w:pPr>
-      <w:bookmarkStart w:id="17" w:name="_Toc192421993"/>
+      <w:bookmarkStart w:id="17" w:name="_Toc192438393"/>
       <w:r>
         <w:lastRenderedPageBreak/>
         <w:t>Pattern Singleton</w:t>
@@ -4893,7 +4804,7 @@
           <w:numId w:val="10"/>
         </w:numPr>
       </w:pPr>
-      <w:bookmarkStart w:id="18" w:name="_Toc192421994"/>
+      <w:bookmarkStart w:id="18" w:name="_Toc192438394"/>
       <w:r>
         <w:t>Partie Java (Serveur)</w:t>
       </w:r>
@@ -4908,7 +4819,7 @@
           <w:numId w:val="23"/>
         </w:numPr>
       </w:pPr>
-      <w:bookmarkStart w:id="19" w:name="_Toc192421995"/>
+      <w:bookmarkStart w:id="19" w:name="_Toc192438395"/>
       <w:r>
         <w:t>Présentation de la partie Java</w:t>
       </w:r>
@@ -4929,7 +4840,7 @@
           <w:numId w:val="23"/>
         </w:numPr>
       </w:pPr>
-      <w:bookmarkStart w:id="20" w:name="_Toc192421996"/>
+      <w:bookmarkStart w:id="20" w:name="_Toc192438396"/>
       <w:r>
         <w:t>Connexion au client</w:t>
       </w:r>
@@ -4970,7 +4881,7 @@
           <w:numId w:val="23"/>
         </w:numPr>
       </w:pPr>
-      <w:bookmarkStart w:id="21" w:name="_Toc192421997"/>
+      <w:bookmarkStart w:id="21" w:name="_Toc192438397"/>
       <w:r>
         <w:lastRenderedPageBreak/>
         <w:t>Réception des données</w:t>
@@ -5035,7 +4946,7 @@
           <w:numId w:val="23"/>
         </w:numPr>
       </w:pPr>
-      <w:bookmarkStart w:id="22" w:name="_Toc192421998"/>
+      <w:bookmarkStart w:id="22" w:name="_Toc192438398"/>
       <w:r>
         <w:t xml:space="preserve">Design </w:t>
       </w:r>
@@ -5060,7 +4971,7 @@
           <w:lang w:val="en-US"/>
         </w:rPr>
       </w:pPr>
-      <w:bookmarkStart w:id="23" w:name="_Toc192421999"/>
+      <w:bookmarkStart w:id="23" w:name="_Toc192438399"/>
       <w:r>
         <w:rPr>
           <w:lang w:val="en-US"/>
@@ -5198,7 +5109,7 @@
           <w:numId w:val="23"/>
         </w:numPr>
       </w:pPr>
-      <w:bookmarkStart w:id="24" w:name="_Toc192422000"/>
+      <w:bookmarkStart w:id="24" w:name="_Toc192438400"/>
       <w:r>
         <w:t>Gestion de l’</w:t>
       </w:r>
@@ -5277,7 +5188,7 @@
           <w:numId w:val="23"/>
         </w:numPr>
       </w:pPr>
-      <w:bookmarkStart w:id="25" w:name="_Toc192422001"/>
+      <w:bookmarkStart w:id="25" w:name="_Toc192438401"/>
       <w:r>
         <w:t>Fonctionnement de</w:t>
       </w:r>
@@ -5339,7 +5250,7 @@
           <w:numId w:val="23"/>
         </w:numPr>
       </w:pPr>
-      <w:bookmarkStart w:id="26" w:name="_Toc192422002"/>
+      <w:bookmarkStart w:id="26" w:name="_Toc192438402"/>
       <w:r>
         <w:t>Fonctionnement d’</w:t>
       </w:r>
@@ -5462,7 +5373,7 @@
           <w:numId w:val="10"/>
         </w:numPr>
       </w:pPr>
-      <w:bookmarkStart w:id="27" w:name="_Toc192422003"/>
+      <w:bookmarkStart w:id="27" w:name="_Toc192438403"/>
       <w:r>
         <w:t>Extension OpenGL</w:t>
       </w:r>
@@ -5483,7 +5394,7 @@
           <w:numId w:val="30"/>
         </w:numPr>
       </w:pPr>
-      <w:bookmarkStart w:id="28" w:name="_Toc192422004"/>
+      <w:bookmarkStart w:id="28" w:name="_Toc192438404"/>
       <w:r>
         <w:t>Présentation de l’extension</w:t>
       </w:r>
@@ -5522,7 +5433,7 @@
           <w:numId w:val="30"/>
         </w:numPr>
       </w:pPr>
-      <w:bookmarkStart w:id="29" w:name="_Toc192422005"/>
+      <w:bookmarkStart w:id="29" w:name="_Toc192438405"/>
       <w:r>
         <w:t>Structure et Classes</w:t>
       </w:r>
@@ -5544,7 +5455,7 @@
           <w:numId w:val="26"/>
         </w:numPr>
       </w:pPr>
-      <w:bookmarkStart w:id="30" w:name="_Toc192422006"/>
+      <w:bookmarkStart w:id="30" w:name="_Toc192438406"/>
       <w:r>
         <w:t>Modèle</w:t>
       </w:r>
@@ -5624,7 +5535,7 @@
           <w:numId w:val="26"/>
         </w:numPr>
       </w:pPr>
-      <w:bookmarkStart w:id="31" w:name="_Toc192422007"/>
+      <w:bookmarkStart w:id="31" w:name="_Toc192438407"/>
       <w:r>
         <w:t>Vue</w:t>
       </w:r>
@@ -5646,7 +5557,7 @@
           <w:numId w:val="26"/>
         </w:numPr>
       </w:pPr>
-      <w:bookmarkStart w:id="32" w:name="_Toc192422008"/>
+      <w:bookmarkStart w:id="32" w:name="_Toc192438408"/>
       <w:r>
         <w:t>Contrôleur</w:t>
       </w:r>

</xml_diff>